<commit_message>
Documentation: use Bharadhwaj B, as corrected in the README
</commit_message>
<xml_diff>
--- a/docs/HomeMesh_Panel_Project_Documentation.docx
+++ b/docs/HomeMesh_Panel_Project_Documentation.docx
@@ -254,7 +254,7 @@
               <w:rPr>
                 <w:sz w:val="20"/>
               </w:rPr>
-              <w:t>Bharadhwaj</w:t>
+              <w:t>Bharadhwaj B</w:t>
             </w:r>
           </w:p>
           <w:p>
@@ -325,7 +325,7 @@
               <w:rPr>
                 <w:sz w:val="20"/>
               </w:rPr>
-              <w:t>24BCE1959  (Bharadhwaj)</w:t>
+              <w:t>24BCE1959  (Bharadhwaj B)</w:t>
             </w:r>
           </w:p>
           <w:p>
@@ -513,7 +513,7 @@
       <w:r>
         <w:fldChar w:fldCharType="separate"/>
       </w:r>
-      <w:hyperlink w:anchor="_Toc243427072" w:history="1">
+      <w:hyperlink w:anchor="_Toc243427184" w:history="1">
         <w:r>
           <w:rPr>
             <w:rStyle w:val="Hyperlink"/>
@@ -540,7 +540,7 @@
             <w:noProof/>
             <w:webHidden/>
           </w:rPr>
-          <w:instrText xml:space="preserve"> PAGEREF _Toc243427072 \h </w:instrText>
+          <w:instrText xml:space="preserve"> PAGEREF _Toc243427184 \h </w:instrText>
         </w:r>
         <w:r>
           <w:rPr>
@@ -581,7 +581,7 @@
           <w:noProof/>
         </w:rPr>
       </w:pPr>
-      <w:hyperlink w:anchor="_Toc243427073" w:history="1">
+      <w:hyperlink w:anchor="_Toc243427185" w:history="1">
         <w:r>
           <w:rPr>
             <w:rStyle w:val="Hyperlink"/>
@@ -608,7 +608,7 @@
             <w:noProof/>
             <w:webHidden/>
           </w:rPr>
-          <w:instrText xml:space="preserve"> PAGEREF _Toc243427073 \h </w:instrText>
+          <w:instrText xml:space="preserve"> PAGEREF _Toc243427185 \h </w:instrText>
         </w:r>
         <w:r>
           <w:rPr>
@@ -649,7 +649,7 @@
           <w:noProof/>
         </w:rPr>
       </w:pPr>
-      <w:hyperlink w:anchor="_Toc243427074" w:history="1">
+      <w:hyperlink w:anchor="_Toc243427186" w:history="1">
         <w:r>
           <w:rPr>
             <w:rStyle w:val="Hyperlink"/>
@@ -676,7 +676,7 @@
             <w:noProof/>
             <w:webHidden/>
           </w:rPr>
-          <w:instrText xml:space="preserve"> PAGEREF _Toc243427074 \h </w:instrText>
+          <w:instrText xml:space="preserve"> PAGEREF _Toc243427186 \h </w:instrText>
         </w:r>
         <w:r>
           <w:rPr>
@@ -717,7 +717,7 @@
           <w:noProof/>
         </w:rPr>
       </w:pPr>
-      <w:hyperlink w:anchor="_Toc243427075" w:history="1">
+      <w:hyperlink w:anchor="_Toc243427187" w:history="1">
         <w:r>
           <w:rPr>
             <w:rStyle w:val="Hyperlink"/>
@@ -744,7 +744,7 @@
             <w:noProof/>
             <w:webHidden/>
           </w:rPr>
-          <w:instrText xml:space="preserve"> PAGEREF _Toc243427075 \h </w:instrText>
+          <w:instrText xml:space="preserve"> PAGEREF _Toc243427187 \h </w:instrText>
         </w:r>
         <w:r>
           <w:rPr>
@@ -785,7 +785,7 @@
           <w:noProof/>
         </w:rPr>
       </w:pPr>
-      <w:hyperlink w:anchor="_Toc243427076" w:history="1">
+      <w:hyperlink w:anchor="_Toc243427188" w:history="1">
         <w:r>
           <w:rPr>
             <w:rStyle w:val="Hyperlink"/>
@@ -812,7 +812,7 @@
             <w:noProof/>
             <w:webHidden/>
           </w:rPr>
-          <w:instrText xml:space="preserve"> PAGEREF _Toc243427076 \h </w:instrText>
+          <w:instrText xml:space="preserve"> PAGEREF _Toc243427188 \h </w:instrText>
         </w:r>
         <w:r>
           <w:rPr>
@@ -853,7 +853,7 @@
           <w:noProof/>
         </w:rPr>
       </w:pPr>
-      <w:hyperlink w:anchor="_Toc243427077" w:history="1">
+      <w:hyperlink w:anchor="_Toc243427189" w:history="1">
         <w:r>
           <w:rPr>
             <w:rStyle w:val="Hyperlink"/>
@@ -880,7 +880,7 @@
             <w:noProof/>
             <w:webHidden/>
           </w:rPr>
-          <w:instrText xml:space="preserve"> PAGEREF _Toc243427077 \h </w:instrText>
+          <w:instrText xml:space="preserve"> PAGEREF _Toc243427189 \h </w:instrText>
         </w:r>
         <w:r>
           <w:rPr>
@@ -921,7 +921,7 @@
           <w:noProof/>
         </w:rPr>
       </w:pPr>
-      <w:hyperlink w:anchor="_Toc243427078" w:history="1">
+      <w:hyperlink w:anchor="_Toc243427190" w:history="1">
         <w:r>
           <w:rPr>
             <w:rStyle w:val="Hyperlink"/>
@@ -948,7 +948,7 @@
             <w:noProof/>
             <w:webHidden/>
           </w:rPr>
-          <w:instrText xml:space="preserve"> PAGEREF _Toc243427078 \h </w:instrText>
+          <w:instrText xml:space="preserve"> PAGEREF _Toc243427190 \h </w:instrText>
         </w:r>
         <w:r>
           <w:rPr>
@@ -989,7 +989,7 @@
           <w:noProof/>
         </w:rPr>
       </w:pPr>
-      <w:hyperlink w:anchor="_Toc243427079" w:history="1">
+      <w:hyperlink w:anchor="_Toc243427191" w:history="1">
         <w:r>
           <w:rPr>
             <w:rStyle w:val="Hyperlink"/>
@@ -1016,7 +1016,7 @@
             <w:noProof/>
             <w:webHidden/>
           </w:rPr>
-          <w:instrText xml:space="preserve"> PAGEREF _Toc243427079 \h </w:instrText>
+          <w:instrText xml:space="preserve"> PAGEREF _Toc243427191 \h </w:instrText>
         </w:r>
         <w:r>
           <w:rPr>
@@ -1057,7 +1057,7 @@
           <w:noProof/>
         </w:rPr>
       </w:pPr>
-      <w:hyperlink w:anchor="_Toc243427080" w:history="1">
+      <w:hyperlink w:anchor="_Toc243427192" w:history="1">
         <w:r>
           <w:rPr>
             <w:rStyle w:val="Hyperlink"/>
@@ -1084,7 +1084,7 @@
             <w:noProof/>
             <w:webHidden/>
           </w:rPr>
-          <w:instrText xml:space="preserve"> PAGEREF _Toc243427080 \h </w:instrText>
+          <w:instrText xml:space="preserve"> PAGEREF _Toc243427192 \h </w:instrText>
         </w:r>
         <w:r>
           <w:rPr>
@@ -1125,7 +1125,7 @@
           <w:noProof/>
         </w:rPr>
       </w:pPr>
-      <w:hyperlink w:anchor="_Toc243427081" w:history="1">
+      <w:hyperlink w:anchor="_Toc243427193" w:history="1">
         <w:r>
           <w:rPr>
             <w:rStyle w:val="Hyperlink"/>
@@ -1152,7 +1152,7 @@
             <w:noProof/>
             <w:webHidden/>
           </w:rPr>
-          <w:instrText xml:space="preserve"> PAGEREF _Toc243427081 \h </w:instrText>
+          <w:instrText xml:space="preserve"> PAGEREF _Toc243427193 \h </w:instrText>
         </w:r>
         <w:r>
           <w:rPr>
@@ -1193,7 +1193,7 @@
           <w:noProof/>
         </w:rPr>
       </w:pPr>
-      <w:hyperlink w:anchor="_Toc243427082" w:history="1">
+      <w:hyperlink w:anchor="_Toc243427194" w:history="1">
         <w:r>
           <w:rPr>
             <w:rStyle w:val="Hyperlink"/>
@@ -1220,7 +1220,7 @@
             <w:noProof/>
             <w:webHidden/>
           </w:rPr>
-          <w:instrText xml:space="preserve"> PAGEREF _Toc243427082 \h </w:instrText>
+          <w:instrText xml:space="preserve"> PAGEREF _Toc243427194 \h </w:instrText>
         </w:r>
         <w:r>
           <w:rPr>
@@ -1261,7 +1261,7 @@
           <w:noProof/>
         </w:rPr>
       </w:pPr>
-      <w:hyperlink w:anchor="_Toc243427083" w:history="1">
+      <w:hyperlink w:anchor="_Toc243427195" w:history="1">
         <w:r>
           <w:rPr>
             <w:rStyle w:val="Hyperlink"/>
@@ -1288,7 +1288,7 @@
             <w:noProof/>
             <w:webHidden/>
           </w:rPr>
-          <w:instrText xml:space="preserve"> PAGEREF _Toc243427083 \h </w:instrText>
+          <w:instrText xml:space="preserve"> PAGEREF _Toc243427195 \h </w:instrText>
         </w:r>
         <w:r>
           <w:rPr>
@@ -1329,7 +1329,7 @@
           <w:noProof/>
         </w:rPr>
       </w:pPr>
-      <w:hyperlink w:anchor="_Toc243427084" w:history="1">
+      <w:hyperlink w:anchor="_Toc243427196" w:history="1">
         <w:r>
           <w:rPr>
             <w:rStyle w:val="Hyperlink"/>
@@ -1356,7 +1356,7 @@
             <w:noProof/>
             <w:webHidden/>
           </w:rPr>
-          <w:instrText xml:space="preserve"> PAGEREF _Toc243427084 \h </w:instrText>
+          <w:instrText xml:space="preserve"> PAGEREF _Toc243427196 \h </w:instrText>
         </w:r>
         <w:r>
           <w:rPr>
@@ -1397,7 +1397,7 @@
           <w:noProof/>
         </w:rPr>
       </w:pPr>
-      <w:hyperlink w:anchor="_Toc243427085" w:history="1">
+      <w:hyperlink w:anchor="_Toc243427197" w:history="1">
         <w:r>
           <w:rPr>
             <w:rStyle w:val="Hyperlink"/>
@@ -1424,7 +1424,7 @@
             <w:noProof/>
             <w:webHidden/>
           </w:rPr>
-          <w:instrText xml:space="preserve"> PAGEREF _Toc243427085 \h </w:instrText>
+          <w:instrText xml:space="preserve"> PAGEREF _Toc243427197 \h </w:instrText>
         </w:r>
         <w:r>
           <w:rPr>
@@ -1465,7 +1465,7 @@
           <w:noProof/>
         </w:rPr>
       </w:pPr>
-      <w:hyperlink w:anchor="_Toc243427086" w:history="1">
+      <w:hyperlink w:anchor="_Toc243427198" w:history="1">
         <w:r>
           <w:rPr>
             <w:rStyle w:val="Hyperlink"/>
@@ -1492,7 +1492,7 @@
             <w:noProof/>
             <w:webHidden/>
           </w:rPr>
-          <w:instrText xml:space="preserve"> PAGEREF _Toc243427086 \h </w:instrText>
+          <w:instrText xml:space="preserve"> PAGEREF _Toc243427198 \h </w:instrText>
         </w:r>
         <w:r>
           <w:rPr>
@@ -1533,7 +1533,7 @@
           <w:noProof/>
         </w:rPr>
       </w:pPr>
-      <w:hyperlink w:anchor="_Toc243427087" w:history="1">
+      <w:hyperlink w:anchor="_Toc243427199" w:history="1">
         <w:r>
           <w:rPr>
             <w:rStyle w:val="Hyperlink"/>
@@ -1560,7 +1560,7 @@
             <w:noProof/>
             <w:webHidden/>
           </w:rPr>
-          <w:instrText xml:space="preserve"> PAGEREF _Toc243427087 \h </w:instrText>
+          <w:instrText xml:space="preserve"> PAGEREF _Toc243427199 \h </w:instrText>
         </w:r>
         <w:r>
           <w:rPr>
@@ -1601,7 +1601,7 @@
           <w:noProof/>
         </w:rPr>
       </w:pPr>
-      <w:hyperlink w:anchor="_Toc243427088" w:history="1">
+      <w:hyperlink w:anchor="_Toc243427200" w:history="1">
         <w:r>
           <w:rPr>
             <w:rStyle w:val="Hyperlink"/>
@@ -1628,7 +1628,7 @@
             <w:noProof/>
             <w:webHidden/>
           </w:rPr>
-          <w:instrText xml:space="preserve"> PAGEREF _Toc243427088 \h </w:instrText>
+          <w:instrText xml:space="preserve"> PAGEREF _Toc243427200 \h </w:instrText>
         </w:r>
         <w:r>
           <w:rPr>
@@ -1669,7 +1669,7 @@
           <w:noProof/>
         </w:rPr>
       </w:pPr>
-      <w:hyperlink w:anchor="_Toc243427089" w:history="1">
+      <w:hyperlink w:anchor="_Toc243427201" w:history="1">
         <w:r>
           <w:rPr>
             <w:rStyle w:val="Hyperlink"/>
@@ -1696,7 +1696,7 @@
             <w:noProof/>
             <w:webHidden/>
           </w:rPr>
-          <w:instrText xml:space="preserve"> PAGEREF _Toc243427089 \h </w:instrText>
+          <w:instrText xml:space="preserve"> PAGEREF _Toc243427201 \h </w:instrText>
         </w:r>
         <w:r>
           <w:rPr>
@@ -1737,7 +1737,7 @@
           <w:noProof/>
         </w:rPr>
       </w:pPr>
-      <w:hyperlink w:anchor="_Toc243427090" w:history="1">
+      <w:hyperlink w:anchor="_Toc243427202" w:history="1">
         <w:r>
           <w:rPr>
             <w:rStyle w:val="Hyperlink"/>
@@ -1764,7 +1764,7 @@
             <w:noProof/>
             <w:webHidden/>
           </w:rPr>
-          <w:instrText xml:space="preserve"> PAGEREF _Toc243427090 \h </w:instrText>
+          <w:instrText xml:space="preserve"> PAGEREF _Toc243427202 \h </w:instrText>
         </w:r>
         <w:r>
           <w:rPr>
@@ -1805,7 +1805,7 @@
           <w:noProof/>
         </w:rPr>
       </w:pPr>
-      <w:hyperlink w:anchor="_Toc243427091" w:history="1">
+      <w:hyperlink w:anchor="_Toc243427203" w:history="1">
         <w:r>
           <w:rPr>
             <w:rStyle w:val="Hyperlink"/>
@@ -1832,7 +1832,7 @@
             <w:noProof/>
             <w:webHidden/>
           </w:rPr>
-          <w:instrText xml:space="preserve"> PAGEREF _Toc243427091 \h </w:instrText>
+          <w:instrText xml:space="preserve"> PAGEREF _Toc243427203 \h </w:instrText>
         </w:r>
         <w:r>
           <w:rPr>
@@ -1873,7 +1873,7 @@
           <w:noProof/>
         </w:rPr>
       </w:pPr>
-      <w:hyperlink w:anchor="_Toc243427092" w:history="1">
+      <w:hyperlink w:anchor="_Toc243427204" w:history="1">
         <w:r>
           <w:rPr>
             <w:rStyle w:val="Hyperlink"/>
@@ -1900,7 +1900,7 @@
             <w:noProof/>
             <w:webHidden/>
           </w:rPr>
-          <w:instrText xml:space="preserve"> PAGEREF _Toc243427092 \h </w:instrText>
+          <w:instrText xml:space="preserve"> PAGEREF _Toc243427204 \h </w:instrText>
         </w:r>
         <w:r>
           <w:rPr>
@@ -1941,7 +1941,7 @@
           <w:noProof/>
         </w:rPr>
       </w:pPr>
-      <w:hyperlink w:anchor="_Toc243427093" w:history="1">
+      <w:hyperlink w:anchor="_Toc243427205" w:history="1">
         <w:r>
           <w:rPr>
             <w:rStyle w:val="Hyperlink"/>
@@ -1968,7 +1968,7 @@
             <w:noProof/>
             <w:webHidden/>
           </w:rPr>
-          <w:instrText xml:space="preserve"> PAGEREF _Toc243427093 \h </w:instrText>
+          <w:instrText xml:space="preserve"> PAGEREF _Toc243427205 \h </w:instrText>
         </w:r>
         <w:r>
           <w:rPr>
@@ -2009,7 +2009,7 @@
           <w:noProof/>
         </w:rPr>
       </w:pPr>
-      <w:hyperlink w:anchor="_Toc243427094" w:history="1">
+      <w:hyperlink w:anchor="_Toc243427206" w:history="1">
         <w:r>
           <w:rPr>
             <w:rStyle w:val="Hyperlink"/>
@@ -2036,7 +2036,7 @@
             <w:noProof/>
             <w:webHidden/>
           </w:rPr>
-          <w:instrText xml:space="preserve"> PAGEREF _Toc243427094 \h </w:instrText>
+          <w:instrText xml:space="preserve"> PAGEREF _Toc243427206 \h </w:instrText>
         </w:r>
         <w:r>
           <w:rPr>
@@ -2077,7 +2077,7 @@
           <w:noProof/>
         </w:rPr>
       </w:pPr>
-      <w:hyperlink w:anchor="_Toc243427095" w:history="1">
+      <w:hyperlink w:anchor="_Toc243427207" w:history="1">
         <w:r>
           <w:rPr>
             <w:rStyle w:val="Hyperlink"/>
@@ -2104,7 +2104,7 @@
             <w:noProof/>
             <w:webHidden/>
           </w:rPr>
-          <w:instrText xml:space="preserve"> PAGEREF _Toc243427095 \h </w:instrText>
+          <w:instrText xml:space="preserve"> PAGEREF _Toc243427207 \h </w:instrText>
         </w:r>
         <w:r>
           <w:rPr>
@@ -2145,7 +2145,7 @@
           <w:noProof/>
         </w:rPr>
       </w:pPr>
-      <w:hyperlink w:anchor="_Toc243427096" w:history="1">
+      <w:hyperlink w:anchor="_Toc243427208" w:history="1">
         <w:r>
           <w:rPr>
             <w:rStyle w:val="Hyperlink"/>
@@ -2172,7 +2172,7 @@
             <w:noProof/>
             <w:webHidden/>
           </w:rPr>
-          <w:instrText xml:space="preserve"> PAGEREF _Toc243427096 \h </w:instrText>
+          <w:instrText xml:space="preserve"> PAGEREF _Toc243427208 \h </w:instrText>
         </w:r>
         <w:r>
           <w:rPr>
@@ -2213,7 +2213,7 @@
           <w:noProof/>
         </w:rPr>
       </w:pPr>
-      <w:hyperlink w:anchor="_Toc243427097" w:history="1">
+      <w:hyperlink w:anchor="_Toc243427209" w:history="1">
         <w:r>
           <w:rPr>
             <w:rStyle w:val="Hyperlink"/>
@@ -2240,7 +2240,7 @@
             <w:noProof/>
             <w:webHidden/>
           </w:rPr>
-          <w:instrText xml:space="preserve"> PAGEREF _Toc243427097 \h </w:instrText>
+          <w:instrText xml:space="preserve"> PAGEREF _Toc243427209 \h </w:instrText>
         </w:r>
         <w:r>
           <w:rPr>
@@ -2281,7 +2281,7 @@
           <w:noProof/>
         </w:rPr>
       </w:pPr>
-      <w:hyperlink w:anchor="_Toc243427098" w:history="1">
+      <w:hyperlink w:anchor="_Toc243427210" w:history="1">
         <w:r>
           <w:rPr>
             <w:rStyle w:val="Hyperlink"/>
@@ -2308,7 +2308,7 @@
             <w:noProof/>
             <w:webHidden/>
           </w:rPr>
-          <w:instrText xml:space="preserve"> PAGEREF _Toc243427098 \h </w:instrText>
+          <w:instrText xml:space="preserve"> PAGEREF _Toc243427210 \h </w:instrText>
         </w:r>
         <w:r>
           <w:rPr>
@@ -2349,7 +2349,7 @@
           <w:noProof/>
         </w:rPr>
       </w:pPr>
-      <w:hyperlink w:anchor="_Toc243427099" w:history="1">
+      <w:hyperlink w:anchor="_Toc243427211" w:history="1">
         <w:r>
           <w:rPr>
             <w:rStyle w:val="Hyperlink"/>
@@ -2376,7 +2376,7 @@
             <w:noProof/>
             <w:webHidden/>
           </w:rPr>
-          <w:instrText xml:space="preserve"> PAGEREF _Toc243427099 \h </w:instrText>
+          <w:instrText xml:space="preserve"> PAGEREF _Toc243427211 \h </w:instrText>
         </w:r>
         <w:r>
           <w:rPr>
@@ -2417,7 +2417,7 @@
           <w:noProof/>
         </w:rPr>
       </w:pPr>
-      <w:hyperlink w:anchor="_Toc243427100" w:history="1">
+      <w:hyperlink w:anchor="_Toc243427212" w:history="1">
         <w:r>
           <w:rPr>
             <w:rStyle w:val="Hyperlink"/>
@@ -2444,7 +2444,7 @@
             <w:noProof/>
             <w:webHidden/>
           </w:rPr>
-          <w:instrText xml:space="preserve"> PAGEREF _Toc243427100 \h </w:instrText>
+          <w:instrText xml:space="preserve"> PAGEREF _Toc243427212 \h </w:instrText>
         </w:r>
         <w:r>
           <w:rPr>
@@ -2485,7 +2485,7 @@
           <w:noProof/>
         </w:rPr>
       </w:pPr>
-      <w:hyperlink w:anchor="_Toc243427101" w:history="1">
+      <w:hyperlink w:anchor="_Toc243427213" w:history="1">
         <w:r>
           <w:rPr>
             <w:rStyle w:val="Hyperlink"/>
@@ -2512,7 +2512,7 @@
             <w:noProof/>
             <w:webHidden/>
           </w:rPr>
-          <w:instrText xml:space="preserve"> PAGEREF _Toc243427101 \h </w:instrText>
+          <w:instrText xml:space="preserve"> PAGEREF _Toc243427213 \h </w:instrText>
         </w:r>
         <w:r>
           <w:rPr>
@@ -2553,7 +2553,7 @@
           <w:noProof/>
         </w:rPr>
       </w:pPr>
-      <w:hyperlink w:anchor="_Toc243427102" w:history="1">
+      <w:hyperlink w:anchor="_Toc243427214" w:history="1">
         <w:r>
           <w:rPr>
             <w:rStyle w:val="Hyperlink"/>
@@ -2580,7 +2580,7 @@
             <w:noProof/>
             <w:webHidden/>
           </w:rPr>
-          <w:instrText xml:space="preserve"> PAGEREF _Toc243427102 \h </w:instrText>
+          <w:instrText xml:space="preserve"> PAGEREF _Toc243427214 \h </w:instrText>
         </w:r>
         <w:r>
           <w:rPr>
@@ -2621,7 +2621,7 @@
           <w:noProof/>
         </w:rPr>
       </w:pPr>
-      <w:hyperlink w:anchor="_Toc243427103" w:history="1">
+      <w:hyperlink w:anchor="_Toc243427215" w:history="1">
         <w:r>
           <w:rPr>
             <w:rStyle w:val="Hyperlink"/>
@@ -2648,7 +2648,7 @@
             <w:noProof/>
             <w:webHidden/>
           </w:rPr>
-          <w:instrText xml:space="preserve"> PAGEREF _Toc243427103 \h </w:instrText>
+          <w:instrText xml:space="preserve"> PAGEREF _Toc243427215 \h </w:instrText>
         </w:r>
         <w:r>
           <w:rPr>
@@ -2689,7 +2689,7 @@
           <w:noProof/>
         </w:rPr>
       </w:pPr>
-      <w:hyperlink w:anchor="_Toc243427104" w:history="1">
+      <w:hyperlink w:anchor="_Toc243427216" w:history="1">
         <w:r>
           <w:rPr>
             <w:rStyle w:val="Hyperlink"/>
@@ -2716,7 +2716,7 @@
             <w:noProof/>
             <w:webHidden/>
           </w:rPr>
-          <w:instrText xml:space="preserve"> PAGEREF _Toc243427104 \h </w:instrText>
+          <w:instrText xml:space="preserve"> PAGEREF _Toc243427216 \h </w:instrText>
         </w:r>
         <w:r>
           <w:rPr>
@@ -2757,7 +2757,7 @@
           <w:noProof/>
         </w:rPr>
       </w:pPr>
-      <w:hyperlink w:anchor="_Toc243427105" w:history="1">
+      <w:hyperlink w:anchor="_Toc243427217" w:history="1">
         <w:r>
           <w:rPr>
             <w:rStyle w:val="Hyperlink"/>
@@ -2784,7 +2784,7 @@
             <w:noProof/>
             <w:webHidden/>
           </w:rPr>
-          <w:instrText xml:space="preserve"> PAGEREF _Toc243427105 \h </w:instrText>
+          <w:instrText xml:space="preserve"> PAGEREF _Toc243427217 \h </w:instrText>
         </w:r>
         <w:r>
           <w:rPr>
@@ -2825,7 +2825,7 @@
           <w:noProof/>
         </w:rPr>
       </w:pPr>
-      <w:hyperlink w:anchor="_Toc243427106" w:history="1">
+      <w:hyperlink w:anchor="_Toc243427218" w:history="1">
         <w:r>
           <w:rPr>
             <w:rStyle w:val="Hyperlink"/>
@@ -2852,7 +2852,7 @@
             <w:noProof/>
             <w:webHidden/>
           </w:rPr>
-          <w:instrText xml:space="preserve"> PAGEREF _Toc243427106 \h </w:instrText>
+          <w:instrText xml:space="preserve"> PAGEREF _Toc243427218 \h </w:instrText>
         </w:r>
         <w:r>
           <w:rPr>
@@ -2893,7 +2893,7 @@
           <w:noProof/>
         </w:rPr>
       </w:pPr>
-      <w:hyperlink w:anchor="_Toc243427107" w:history="1">
+      <w:hyperlink w:anchor="_Toc243427219" w:history="1">
         <w:r>
           <w:rPr>
             <w:rStyle w:val="Hyperlink"/>
@@ -2920,7 +2920,7 @@
             <w:noProof/>
             <w:webHidden/>
           </w:rPr>
-          <w:instrText xml:space="preserve"> PAGEREF _Toc243427107 \h </w:instrText>
+          <w:instrText xml:space="preserve"> PAGEREF _Toc243427219 \h </w:instrText>
         </w:r>
         <w:r>
           <w:rPr>
@@ -2961,7 +2961,7 @@
           <w:noProof/>
         </w:rPr>
       </w:pPr>
-      <w:hyperlink w:anchor="_Toc243427108" w:history="1">
+      <w:hyperlink w:anchor="_Toc243427220" w:history="1">
         <w:r>
           <w:rPr>
             <w:rStyle w:val="Hyperlink"/>
@@ -2988,7 +2988,7 @@
             <w:noProof/>
             <w:webHidden/>
           </w:rPr>
-          <w:instrText xml:space="preserve"> PAGEREF _Toc243427108 \h </w:instrText>
+          <w:instrText xml:space="preserve"> PAGEREF _Toc243427220 \h </w:instrText>
         </w:r>
         <w:r>
           <w:rPr>
@@ -3029,7 +3029,7 @@
           <w:noProof/>
         </w:rPr>
       </w:pPr>
-      <w:hyperlink w:anchor="_Toc243427109" w:history="1">
+      <w:hyperlink w:anchor="_Toc243427221" w:history="1">
         <w:r>
           <w:rPr>
             <w:rStyle w:val="Hyperlink"/>
@@ -3056,7 +3056,7 @@
             <w:noProof/>
             <w:webHidden/>
           </w:rPr>
-          <w:instrText xml:space="preserve"> PAGEREF _Toc243427109 \h </w:instrText>
+          <w:instrText xml:space="preserve"> PAGEREF _Toc243427221 \h </w:instrText>
         </w:r>
         <w:r>
           <w:rPr>
@@ -3097,7 +3097,7 @@
           <w:noProof/>
         </w:rPr>
       </w:pPr>
-      <w:hyperlink w:anchor="_Toc243427110" w:history="1">
+      <w:hyperlink w:anchor="_Toc243427222" w:history="1">
         <w:r>
           <w:rPr>
             <w:rStyle w:val="Hyperlink"/>
@@ -3124,7 +3124,7 @@
             <w:noProof/>
             <w:webHidden/>
           </w:rPr>
-          <w:instrText xml:space="preserve"> PAGEREF _Toc243427110 \h </w:instrText>
+          <w:instrText xml:space="preserve"> PAGEREF _Toc243427222 \h </w:instrText>
         </w:r>
         <w:r>
           <w:rPr>
@@ -3165,7 +3165,7 @@
           <w:noProof/>
         </w:rPr>
       </w:pPr>
-      <w:hyperlink w:anchor="_Toc243427111" w:history="1">
+      <w:hyperlink w:anchor="_Toc243427223" w:history="1">
         <w:r>
           <w:rPr>
             <w:rStyle w:val="Hyperlink"/>
@@ -3192,7 +3192,7 @@
             <w:noProof/>
             <w:webHidden/>
           </w:rPr>
-          <w:instrText xml:space="preserve"> PAGEREF _Toc243427111 \h </w:instrText>
+          <w:instrText xml:space="preserve"> PAGEREF _Toc243427223 \h </w:instrText>
         </w:r>
         <w:r>
           <w:rPr>
@@ -3233,7 +3233,7 @@
           <w:noProof/>
         </w:rPr>
       </w:pPr>
-      <w:hyperlink w:anchor="_Toc243427112" w:history="1">
+      <w:hyperlink w:anchor="_Toc243427224" w:history="1">
         <w:r>
           <w:rPr>
             <w:rStyle w:val="Hyperlink"/>
@@ -3260,7 +3260,7 @@
             <w:noProof/>
             <w:webHidden/>
           </w:rPr>
-          <w:instrText xml:space="preserve"> PAGEREF _Toc243427112 \h </w:instrText>
+          <w:instrText xml:space="preserve"> PAGEREF _Toc243427224 \h </w:instrText>
         </w:r>
         <w:r>
           <w:rPr>
@@ -3301,7 +3301,7 @@
           <w:noProof/>
         </w:rPr>
       </w:pPr>
-      <w:hyperlink w:anchor="_Toc243427113" w:history="1">
+      <w:hyperlink w:anchor="_Toc243427225" w:history="1">
         <w:r>
           <w:rPr>
             <w:rStyle w:val="Hyperlink"/>
@@ -3328,7 +3328,7 @@
             <w:noProof/>
             <w:webHidden/>
           </w:rPr>
-          <w:instrText xml:space="preserve"> PAGEREF _Toc243427113 \h </w:instrText>
+          <w:instrText xml:space="preserve"> PAGEREF _Toc243427225 \h </w:instrText>
         </w:r>
         <w:r>
           <w:rPr>
@@ -3369,7 +3369,7 @@
           <w:noProof/>
         </w:rPr>
       </w:pPr>
-      <w:hyperlink w:anchor="_Toc243427114" w:history="1">
+      <w:hyperlink w:anchor="_Toc243427226" w:history="1">
         <w:r>
           <w:rPr>
             <w:rStyle w:val="Hyperlink"/>
@@ -3396,7 +3396,7 @@
             <w:noProof/>
             <w:webHidden/>
           </w:rPr>
-          <w:instrText xml:space="preserve"> PAGEREF _Toc243427114 \h </w:instrText>
+          <w:instrText xml:space="preserve"> PAGEREF _Toc243427226 \h </w:instrText>
         </w:r>
         <w:r>
           <w:rPr>
@@ -3437,7 +3437,7 @@
           <w:noProof/>
         </w:rPr>
       </w:pPr>
-      <w:hyperlink w:anchor="_Toc243427115" w:history="1">
+      <w:hyperlink w:anchor="_Toc243427227" w:history="1">
         <w:r>
           <w:rPr>
             <w:rStyle w:val="Hyperlink"/>
@@ -3464,7 +3464,7 @@
             <w:noProof/>
             <w:webHidden/>
           </w:rPr>
-          <w:instrText xml:space="preserve"> PAGEREF _Toc243427115 \h </w:instrText>
+          <w:instrText xml:space="preserve"> PAGEREF _Toc243427227 \h </w:instrText>
         </w:r>
         <w:r>
           <w:rPr>
@@ -3505,7 +3505,7 @@
           <w:noProof/>
         </w:rPr>
       </w:pPr>
-      <w:hyperlink w:anchor="_Toc243427116" w:history="1">
+      <w:hyperlink w:anchor="_Toc243427228" w:history="1">
         <w:r>
           <w:rPr>
             <w:rStyle w:val="Hyperlink"/>
@@ -3532,7 +3532,7 @@
             <w:noProof/>
             <w:webHidden/>
           </w:rPr>
-          <w:instrText xml:space="preserve"> PAGEREF _Toc243427116 \h </w:instrText>
+          <w:instrText xml:space="preserve"> PAGEREF _Toc243427228 \h </w:instrText>
         </w:r>
         <w:r>
           <w:rPr>
@@ -3573,7 +3573,7 @@
           <w:noProof/>
         </w:rPr>
       </w:pPr>
-      <w:hyperlink w:anchor="_Toc243427117" w:history="1">
+      <w:hyperlink w:anchor="_Toc243427229" w:history="1">
         <w:r>
           <w:rPr>
             <w:rStyle w:val="Hyperlink"/>
@@ -3600,7 +3600,7 @@
             <w:noProof/>
             <w:webHidden/>
           </w:rPr>
-          <w:instrText xml:space="preserve"> PAGEREF _Toc243427117 \h </w:instrText>
+          <w:instrText xml:space="preserve"> PAGEREF _Toc243427229 \h </w:instrText>
         </w:r>
         <w:r>
           <w:rPr>
@@ -3641,7 +3641,7 @@
           <w:noProof/>
         </w:rPr>
       </w:pPr>
-      <w:hyperlink w:anchor="_Toc243427118" w:history="1">
+      <w:hyperlink w:anchor="_Toc243427230" w:history="1">
         <w:r>
           <w:rPr>
             <w:rStyle w:val="Hyperlink"/>
@@ -3668,7 +3668,7 @@
             <w:noProof/>
             <w:webHidden/>
           </w:rPr>
-          <w:instrText xml:space="preserve"> PAGEREF _Toc243427118 \h </w:instrText>
+          <w:instrText xml:space="preserve"> PAGEREF _Toc243427230 \h </w:instrText>
         </w:r>
         <w:r>
           <w:rPr>
@@ -3709,7 +3709,7 @@
           <w:noProof/>
         </w:rPr>
       </w:pPr>
-      <w:hyperlink w:anchor="_Toc243427119" w:history="1">
+      <w:hyperlink w:anchor="_Toc243427231" w:history="1">
         <w:r>
           <w:rPr>
             <w:rStyle w:val="Hyperlink"/>
@@ -3736,7 +3736,7 @@
             <w:noProof/>
             <w:webHidden/>
           </w:rPr>
-          <w:instrText xml:space="preserve"> PAGEREF _Toc243427119 \h </w:instrText>
+          <w:instrText xml:space="preserve"> PAGEREF _Toc243427231 \h </w:instrText>
         </w:r>
         <w:r>
           <w:rPr>
@@ -3777,7 +3777,7 @@
           <w:noProof/>
         </w:rPr>
       </w:pPr>
-      <w:hyperlink w:anchor="_Toc243427120" w:history="1">
+      <w:hyperlink w:anchor="_Toc243427232" w:history="1">
         <w:r>
           <w:rPr>
             <w:rStyle w:val="Hyperlink"/>
@@ -3804,7 +3804,7 @@
             <w:noProof/>
             <w:webHidden/>
           </w:rPr>
-          <w:instrText xml:space="preserve"> PAGEREF _Toc243427120 \h </w:instrText>
+          <w:instrText xml:space="preserve"> PAGEREF _Toc243427232 \h </w:instrText>
         </w:r>
         <w:r>
           <w:rPr>
@@ -3845,7 +3845,7 @@
           <w:noProof/>
         </w:rPr>
       </w:pPr>
-      <w:hyperlink w:anchor="_Toc243427121" w:history="1">
+      <w:hyperlink w:anchor="_Toc243427233" w:history="1">
         <w:r>
           <w:rPr>
             <w:rStyle w:val="Hyperlink"/>
@@ -3872,7 +3872,7 @@
             <w:noProof/>
             <w:webHidden/>
           </w:rPr>
-          <w:instrText xml:space="preserve"> PAGEREF _Toc243427121 \h </w:instrText>
+          <w:instrText xml:space="preserve"> PAGEREF _Toc243427233 \h </w:instrText>
         </w:r>
         <w:r>
           <w:rPr>
@@ -3913,7 +3913,7 @@
           <w:noProof/>
         </w:rPr>
       </w:pPr>
-      <w:hyperlink w:anchor="_Toc243427122" w:history="1">
+      <w:hyperlink w:anchor="_Toc243427234" w:history="1">
         <w:r>
           <w:rPr>
             <w:rStyle w:val="Hyperlink"/>
@@ -3940,7 +3940,7 @@
             <w:noProof/>
             <w:webHidden/>
           </w:rPr>
-          <w:instrText xml:space="preserve"> PAGEREF _Toc243427122 \h </w:instrText>
+          <w:instrText xml:space="preserve"> PAGEREF _Toc243427234 \h </w:instrText>
         </w:r>
         <w:r>
           <w:rPr>
@@ -3981,7 +3981,7 @@
           <w:noProof/>
         </w:rPr>
       </w:pPr>
-      <w:hyperlink w:anchor="_Toc243427123" w:history="1">
+      <w:hyperlink w:anchor="_Toc243427235" w:history="1">
         <w:r>
           <w:rPr>
             <w:rStyle w:val="Hyperlink"/>
@@ -4008,7 +4008,7 @@
             <w:noProof/>
             <w:webHidden/>
           </w:rPr>
-          <w:instrText xml:space="preserve"> PAGEREF _Toc243427123 \h </w:instrText>
+          <w:instrText xml:space="preserve"> PAGEREF _Toc243427235 \h </w:instrText>
         </w:r>
         <w:r>
           <w:rPr>
@@ -4049,7 +4049,7 @@
           <w:noProof/>
         </w:rPr>
       </w:pPr>
-      <w:hyperlink w:anchor="_Toc243427124" w:history="1">
+      <w:hyperlink w:anchor="_Toc243427236" w:history="1">
         <w:r>
           <w:rPr>
             <w:rStyle w:val="Hyperlink"/>
@@ -4076,7 +4076,7 @@
             <w:noProof/>
             <w:webHidden/>
           </w:rPr>
-          <w:instrText xml:space="preserve"> PAGEREF _Toc243427124 \h </w:instrText>
+          <w:instrText xml:space="preserve"> PAGEREF _Toc243427236 \h </w:instrText>
         </w:r>
         <w:r>
           <w:rPr>
@@ -4117,7 +4117,7 @@
           <w:noProof/>
         </w:rPr>
       </w:pPr>
-      <w:hyperlink w:anchor="_Toc243427125" w:history="1">
+      <w:hyperlink w:anchor="_Toc243427237" w:history="1">
         <w:r>
           <w:rPr>
             <w:rStyle w:val="Hyperlink"/>
@@ -4144,7 +4144,7 @@
             <w:noProof/>
             <w:webHidden/>
           </w:rPr>
-          <w:instrText xml:space="preserve"> PAGEREF _Toc243427125 \h </w:instrText>
+          <w:instrText xml:space="preserve"> PAGEREF _Toc243427237 \h </w:instrText>
         </w:r>
         <w:r>
           <w:rPr>
@@ -4185,7 +4185,7 @@
           <w:noProof/>
         </w:rPr>
       </w:pPr>
-      <w:hyperlink w:anchor="_Toc243427126" w:history="1">
+      <w:hyperlink w:anchor="_Toc243427238" w:history="1">
         <w:r>
           <w:rPr>
             <w:rStyle w:val="Hyperlink"/>
@@ -4212,7 +4212,7 @@
             <w:noProof/>
             <w:webHidden/>
           </w:rPr>
-          <w:instrText xml:space="preserve"> PAGEREF _Toc243427126 \h </w:instrText>
+          <w:instrText xml:space="preserve"> PAGEREF _Toc243427238 \h </w:instrText>
         </w:r>
         <w:r>
           <w:rPr>
@@ -4253,7 +4253,7 @@
           <w:noProof/>
         </w:rPr>
       </w:pPr>
-      <w:hyperlink w:anchor="_Toc243427127" w:history="1">
+      <w:hyperlink w:anchor="_Toc243427239" w:history="1">
         <w:r>
           <w:rPr>
             <w:rStyle w:val="Hyperlink"/>
@@ -4280,7 +4280,7 @@
             <w:noProof/>
             <w:webHidden/>
           </w:rPr>
-          <w:instrText xml:space="preserve"> PAGEREF _Toc243427127 \h </w:instrText>
+          <w:instrText xml:space="preserve"> PAGEREF _Toc243427239 \h </w:instrText>
         </w:r>
         <w:r>
           <w:rPr>
@@ -4321,7 +4321,7 @@
           <w:noProof/>
         </w:rPr>
       </w:pPr>
-      <w:hyperlink w:anchor="_Toc243427128" w:history="1">
+      <w:hyperlink w:anchor="_Toc243427240" w:history="1">
         <w:r>
           <w:rPr>
             <w:rStyle w:val="Hyperlink"/>
@@ -4348,7 +4348,7 @@
             <w:noProof/>
             <w:webHidden/>
           </w:rPr>
-          <w:instrText xml:space="preserve"> PAGEREF _Toc243427128 \h </w:instrText>
+          <w:instrText xml:space="preserve"> PAGEREF _Toc243427240 \h </w:instrText>
         </w:r>
         <w:r>
           <w:rPr>
@@ -4389,7 +4389,7 @@
           <w:noProof/>
         </w:rPr>
       </w:pPr>
-      <w:hyperlink w:anchor="_Toc243427129" w:history="1">
+      <w:hyperlink w:anchor="_Toc243427241" w:history="1">
         <w:r>
           <w:rPr>
             <w:rStyle w:val="Hyperlink"/>
@@ -4416,7 +4416,7 @@
             <w:noProof/>
             <w:webHidden/>
           </w:rPr>
-          <w:instrText xml:space="preserve"> PAGEREF _Toc243427129 \h </w:instrText>
+          <w:instrText xml:space="preserve"> PAGEREF _Toc243427241 \h </w:instrText>
         </w:r>
         <w:r>
           <w:rPr>
@@ -4457,7 +4457,7 @@
           <w:noProof/>
         </w:rPr>
       </w:pPr>
-      <w:hyperlink w:anchor="_Toc243427130" w:history="1">
+      <w:hyperlink w:anchor="_Toc243427242" w:history="1">
         <w:r>
           <w:rPr>
             <w:rStyle w:val="Hyperlink"/>
@@ -4484,7 +4484,7 @@
             <w:noProof/>
             <w:webHidden/>
           </w:rPr>
-          <w:instrText xml:space="preserve"> PAGEREF _Toc243427130 \h </w:instrText>
+          <w:instrText xml:space="preserve"> PAGEREF _Toc243427242 \h </w:instrText>
         </w:r>
         <w:r>
           <w:rPr>
@@ -4525,7 +4525,7 @@
           <w:noProof/>
         </w:rPr>
       </w:pPr>
-      <w:hyperlink w:anchor="_Toc243427131" w:history="1">
+      <w:hyperlink w:anchor="_Toc243427243" w:history="1">
         <w:r>
           <w:rPr>
             <w:rStyle w:val="Hyperlink"/>
@@ -4552,7 +4552,7 @@
             <w:noProof/>
             <w:webHidden/>
           </w:rPr>
-          <w:instrText xml:space="preserve"> PAGEREF _Toc243427131 \h </w:instrText>
+          <w:instrText xml:space="preserve"> PAGEREF _Toc243427243 \h </w:instrText>
         </w:r>
         <w:r>
           <w:rPr>
@@ -4593,7 +4593,7 @@
           <w:noProof/>
         </w:rPr>
       </w:pPr>
-      <w:hyperlink w:anchor="_Toc243427132" w:history="1">
+      <w:hyperlink w:anchor="_Toc243427244" w:history="1">
         <w:r>
           <w:rPr>
             <w:rStyle w:val="Hyperlink"/>
@@ -4620,7 +4620,7 @@
             <w:noProof/>
             <w:webHidden/>
           </w:rPr>
-          <w:instrText xml:space="preserve"> PAGEREF _Toc243427132 \h </w:instrText>
+          <w:instrText xml:space="preserve"> PAGEREF _Toc243427244 \h </w:instrText>
         </w:r>
         <w:r>
           <w:rPr>
@@ -4661,7 +4661,7 @@
           <w:noProof/>
         </w:rPr>
       </w:pPr>
-      <w:hyperlink w:anchor="_Toc243427133" w:history="1">
+      <w:hyperlink w:anchor="_Toc243427245" w:history="1">
         <w:r>
           <w:rPr>
             <w:rStyle w:val="Hyperlink"/>
@@ -4688,7 +4688,7 @@
             <w:noProof/>
             <w:webHidden/>
           </w:rPr>
-          <w:instrText xml:space="preserve"> PAGEREF _Toc243427133 \h </w:instrText>
+          <w:instrText xml:space="preserve"> PAGEREF _Toc243427245 \h </w:instrText>
         </w:r>
         <w:r>
           <w:rPr>
@@ -4729,7 +4729,7 @@
           <w:noProof/>
         </w:rPr>
       </w:pPr>
-      <w:hyperlink w:anchor="_Toc243427134" w:history="1">
+      <w:hyperlink w:anchor="_Toc243427246" w:history="1">
         <w:r>
           <w:rPr>
             <w:rStyle w:val="Hyperlink"/>
@@ -4756,7 +4756,7 @@
             <w:noProof/>
             <w:webHidden/>
           </w:rPr>
-          <w:instrText xml:space="preserve"> PAGEREF _Toc243427134 \h </w:instrText>
+          <w:instrText xml:space="preserve"> PAGEREF _Toc243427246 \h </w:instrText>
         </w:r>
         <w:r>
           <w:rPr>
@@ -4797,7 +4797,7 @@
           <w:noProof/>
         </w:rPr>
       </w:pPr>
-      <w:hyperlink w:anchor="_Toc243427135" w:history="1">
+      <w:hyperlink w:anchor="_Toc243427247" w:history="1">
         <w:r>
           <w:rPr>
             <w:rStyle w:val="Hyperlink"/>
@@ -4824,7 +4824,7 @@
             <w:noProof/>
             <w:webHidden/>
           </w:rPr>
-          <w:instrText xml:space="preserve"> PAGEREF _Toc243427135 \h </w:instrText>
+          <w:instrText xml:space="preserve"> PAGEREF _Toc243427247 \h </w:instrText>
         </w:r>
         <w:r>
           <w:rPr>
@@ -4865,7 +4865,7 @@
           <w:noProof/>
         </w:rPr>
       </w:pPr>
-      <w:hyperlink w:anchor="_Toc243427136" w:history="1">
+      <w:hyperlink w:anchor="_Toc243427248" w:history="1">
         <w:r>
           <w:rPr>
             <w:rStyle w:val="Hyperlink"/>
@@ -4892,7 +4892,7 @@
             <w:noProof/>
             <w:webHidden/>
           </w:rPr>
-          <w:instrText xml:space="preserve"> PAGEREF _Toc243427136 \h </w:instrText>
+          <w:instrText xml:space="preserve"> PAGEREF _Toc243427248 \h </w:instrText>
         </w:r>
         <w:r>
           <w:rPr>
@@ -4933,7 +4933,7 @@
         <w:pStyle w:val="Heading1"/>
         <w:pageBreakBefore/>
       </w:pPr>
-      <w:bookmarkStart w:id="0" w:name="_Toc243427072"/>
+      <w:bookmarkStart w:id="0" w:name="_Toc243427184"/>
       <w:r>
         <w:lastRenderedPageBreak/>
         <w:t>How to Use This Document</w:t>
@@ -5267,7 +5267,7 @@
         <w:pStyle w:val="Heading1"/>
         <w:pageBreakBefore/>
       </w:pPr>
-      <w:bookmarkStart w:id="1" w:name="_Toc243427073"/>
+      <w:bookmarkStart w:id="1" w:name="_Toc243427185"/>
       <w:r>
         <w:lastRenderedPageBreak/>
         <w:t>1. Abstract</w:t>
@@ -5321,7 +5321,7 @@
       <w:pPr>
         <w:pStyle w:val="Heading1"/>
       </w:pPr>
-      <w:bookmarkStart w:id="2" w:name="_Toc243427074"/>
+      <w:bookmarkStart w:id="2" w:name="_Toc243427186"/>
       <w:r>
         <w:t>2. Introduction</w:t>
       </w:r>
@@ -5351,7 +5351,7 @@
       <w:pPr>
         <w:pStyle w:val="Heading2"/>
       </w:pPr>
-      <w:bookmarkStart w:id="3" w:name="_Toc243427075"/>
+      <w:bookmarkStart w:id="3" w:name="_Toc243427187"/>
       <w:r>
         <w:t>2.1 Home Assistant</w:t>
       </w:r>
@@ -5403,7 +5403,7 @@
       <w:pPr>
         <w:pStyle w:val="Heading2"/>
       </w:pPr>
-      <w:bookmarkStart w:id="4" w:name="_Toc243427076"/>
+      <w:bookmarkStart w:id="4" w:name="_Toc243427188"/>
       <w:r>
         <w:t>2.2 Literature survey</w:t>
       </w:r>
@@ -5888,7 +5888,7 @@
       <w:pPr>
         <w:pStyle w:val="Heading1"/>
       </w:pPr>
-      <w:bookmarkStart w:id="5" w:name="_Toc243427077"/>
+      <w:bookmarkStart w:id="5" w:name="_Toc243427189"/>
       <w:r>
         <w:t>3. Problem Statement</w:t>
       </w:r>
@@ -6001,7 +6001,7 @@
       <w:pPr>
         <w:pStyle w:val="Heading1"/>
       </w:pPr>
-      <w:bookmarkStart w:id="6" w:name="_Toc243427078"/>
+      <w:bookmarkStart w:id="6" w:name="_Toc243427190"/>
       <w:r>
         <w:lastRenderedPageBreak/>
         <w:t>4. Objectives</w:t>
@@ -6142,7 +6142,7 @@
       <w:pPr>
         <w:pStyle w:val="Heading1"/>
       </w:pPr>
-      <w:bookmarkStart w:id="7" w:name="_Toc243427079"/>
+      <w:bookmarkStart w:id="7" w:name="_Toc243427191"/>
       <w:r>
         <w:t>5. Existing Systems and Their Limitations</w:t>
       </w:r>
@@ -6411,7 +6411,7 @@
       <w:pPr>
         <w:pStyle w:val="Heading2"/>
       </w:pPr>
-      <w:bookmarkStart w:id="8" w:name="_Toc243427080"/>
+      <w:bookmarkStart w:id="8" w:name="_Toc243427192"/>
       <w:r>
         <w:t>5.1 Why the MQTT approach was rejected</w:t>
       </w:r>
@@ -6449,7 +6449,7 @@
       <w:pPr>
         <w:pStyle w:val="Heading2"/>
       </w:pPr>
-      <w:bookmarkStart w:id="9" w:name="_Toc243427081"/>
+      <w:bookmarkStart w:id="9" w:name="_Toc243427193"/>
       <w:r>
         <w:t>5.2 The three designs the project went through</w:t>
       </w:r>
@@ -6780,7 +6780,7 @@
       <w:pPr>
         <w:pStyle w:val="Heading1"/>
       </w:pPr>
-      <w:bookmarkStart w:id="10" w:name="_Toc243427082"/>
+      <w:bookmarkStart w:id="10" w:name="_Toc243427194"/>
       <w:r>
         <w:t>6. Proposed System</w:t>
       </w:r>
@@ -6858,7 +6858,7 @@
       <w:pPr>
         <w:pStyle w:val="Heading2"/>
       </w:pPr>
-      <w:bookmarkStart w:id="11" w:name="_Toc243427083"/>
+      <w:bookmarkStart w:id="11" w:name="_Toc243427195"/>
       <w:r>
         <w:t>6.1 The memory constraint and the split architecture</w:t>
       </w:r>
@@ -6962,7 +6962,7 @@
       <w:pPr>
         <w:pStyle w:val="Heading2"/>
       </w:pPr>
-      <w:bookmarkStart w:id="12" w:name="_Toc243427084"/>
+      <w:bookmarkStart w:id="12" w:name="_Toc243427196"/>
       <w:r>
         <w:lastRenderedPageBreak/>
         <w:t>6.2 The layout is data, not code</w:t>
@@ -7129,7 +7129,7 @@
         <w:pStyle w:val="Heading1"/>
         <w:pageBreakBefore/>
       </w:pPr>
-      <w:bookmarkStart w:id="13" w:name="_Toc243427085"/>
+      <w:bookmarkStart w:id="13" w:name="_Toc243427197"/>
       <w:r>
         <w:lastRenderedPageBreak/>
         <w:t>7. System Architecture</w:t>
@@ -7145,7 +7145,7 @@
       <w:pPr>
         <w:pStyle w:val="Heading2"/>
       </w:pPr>
-      <w:bookmarkStart w:id="14" w:name="_Toc243427086"/>
+      <w:bookmarkStart w:id="14" w:name="_Toc243427198"/>
       <w:r>
         <w:t>7.1 Overall system diagram</w:t>
       </w:r>
@@ -7162,7 +7162,7 @@
           <w:noProof/>
         </w:rPr>
         <w:drawing>
-          <wp:inline distT="0" distB="0" distL="0" distR="0" wp14:anchorId="26CAE244" wp14:editId="50570239">
+          <wp:inline distT="0" distB="0" distL="0" distR="0" wp14:anchorId="677F1A57" wp14:editId="12225752">
             <wp:extent cx="5760000" cy="3246545"/>
             <wp:effectExtent l="0" t="0" r="0" b="0"/>
             <wp:docPr id="1" name="Picture 1"/>
@@ -7255,7 +7255,7 @@
       <w:pPr>
         <w:pStyle w:val="Heading2"/>
       </w:pPr>
-      <w:bookmarkStart w:id="15" w:name="_Toc243427087"/>
+      <w:bookmarkStart w:id="15" w:name="_Toc243427199"/>
       <w:r>
         <w:lastRenderedPageBreak/>
         <w:t>7.2 Hardware diagram</w:t>
@@ -7273,7 +7273,7 @@
           <w:noProof/>
         </w:rPr>
         <w:drawing>
-          <wp:inline distT="0" distB="0" distL="0" distR="0" wp14:anchorId="34FD3566" wp14:editId="70F66B16">
+          <wp:inline distT="0" distB="0" distL="0" distR="0" wp14:anchorId="4A7CA4DA" wp14:editId="2ACD24A6">
             <wp:extent cx="5580000" cy="3195818"/>
             <wp:effectExtent l="0" t="0" r="0" b="0"/>
             <wp:docPr id="2" name="Picture 2"/>
@@ -7339,7 +7339,7 @@
       <w:pPr>
         <w:pStyle w:val="Heading2"/>
       </w:pPr>
-      <w:bookmarkStart w:id="16" w:name="_Toc243427088"/>
+      <w:bookmarkStart w:id="16" w:name="_Toc243427200"/>
       <w:r>
         <w:t>7.3 Software diagram</w:t>
       </w:r>
@@ -7356,7 +7356,7 @@
           <w:noProof/>
         </w:rPr>
         <w:drawing>
-          <wp:inline distT="0" distB="0" distL="0" distR="0" wp14:anchorId="38770D73" wp14:editId="4A4BC254">
+          <wp:inline distT="0" distB="0" distL="0" distR="0" wp14:anchorId="1B03CBE6" wp14:editId="7BB1F6FD">
             <wp:extent cx="5760000" cy="3015000"/>
             <wp:effectExtent l="0" t="0" r="0" b="0"/>
             <wp:docPr id="3" name="Picture 3"/>
@@ -7426,7 +7426,7 @@
       <w:pPr>
         <w:pStyle w:val="Heading2"/>
       </w:pPr>
-      <w:bookmarkStart w:id="17" w:name="_Toc243427089"/>
+      <w:bookmarkStart w:id="17" w:name="_Toc243427201"/>
       <w:r>
         <w:t>7.4 Block diagram</w:t>
       </w:r>
@@ -7443,7 +7443,7 @@
           <w:noProof/>
         </w:rPr>
         <w:drawing>
-          <wp:inline distT="0" distB="0" distL="0" distR="0" wp14:anchorId="576AEA47" wp14:editId="3BAA96DC">
+          <wp:inline distT="0" distB="0" distL="0" distR="0" wp14:anchorId="755D5034" wp14:editId="17DAC451">
             <wp:extent cx="5760000" cy="2625488"/>
             <wp:effectExtent l="0" t="0" r="0" b="0"/>
             <wp:docPr id="4" name="Picture 4"/>
@@ -7505,7 +7505,7 @@
         <w:pStyle w:val="Heading1"/>
         <w:pageBreakBefore/>
       </w:pPr>
-      <w:bookmarkStart w:id="18" w:name="_Toc243427090"/>
+      <w:bookmarkStart w:id="18" w:name="_Toc243427202"/>
       <w:r>
         <w:lastRenderedPageBreak/>
         <w:t>8. Hardware Description</w:t>
@@ -7530,7 +7530,7 @@
       <w:pPr>
         <w:pStyle w:val="Heading2"/>
       </w:pPr>
-      <w:bookmarkStart w:id="19" w:name="_Toc243427091"/>
+      <w:bookmarkStart w:id="19" w:name="_Toc243427203"/>
       <w:r>
         <w:t>8.1 Components</w:t>
       </w:r>
@@ -8034,7 +8034,7 @@
       <w:pPr>
         <w:pStyle w:val="Heading2"/>
       </w:pPr>
-      <w:bookmarkStart w:id="20" w:name="_Toc243427092"/>
+      <w:bookmarkStart w:id="20" w:name="_Toc243427204"/>
       <w:r>
         <w:t>8.2 Pin assignment</w:t>
       </w:r>
@@ -8806,7 +8806,7 @@
       <w:pPr>
         <w:pStyle w:val="Heading2"/>
       </w:pPr>
-      <w:bookmarkStart w:id="21" w:name="_Toc243427093"/>
+      <w:bookmarkStart w:id="21" w:name="_Toc243427205"/>
       <w:r>
         <w:t>8.3 Batch variation in this board family</w:t>
       </w:r>
@@ -9041,7 +9041,7 @@
         <w:pStyle w:val="Heading1"/>
         <w:pageBreakBefore/>
       </w:pPr>
-      <w:bookmarkStart w:id="22" w:name="_Toc243427094"/>
+      <w:bookmarkStart w:id="22" w:name="_Toc243427206"/>
       <w:r>
         <w:lastRenderedPageBreak/>
         <w:t>9. Software Description</w:t>
@@ -9052,7 +9052,7 @@
       <w:pPr>
         <w:pStyle w:val="Heading2"/>
       </w:pPr>
-      <w:bookmarkStart w:id="23" w:name="_Toc243427095"/>
+      <w:bookmarkStart w:id="23" w:name="_Toc243427207"/>
       <w:r>
         <w:t>9.1 Panel firmware: environment and libraries</w:t>
       </w:r>
@@ -9733,7 +9733,7 @@
       <w:pPr>
         <w:pStyle w:val="Heading2"/>
       </w:pPr>
-      <w:bookmarkStart w:id="24" w:name="_Toc243427096"/>
+      <w:bookmarkStart w:id="24" w:name="_Toc243427208"/>
       <w:r>
         <w:t>9.2 Desktop designer: environment and libraries</w:t>
       </w:r>
@@ -10159,7 +10159,7 @@
       <w:pPr>
         <w:pStyle w:val="Heading2"/>
       </w:pPr>
-      <w:bookmarkStart w:id="25" w:name="_Toc243427097"/>
+      <w:bookmarkStart w:id="25" w:name="_Toc243427209"/>
       <w:r>
         <w:t>9.3 Source code organisation</w:t>
       </w:r>
@@ -10856,7 +10856,7 @@
       <w:pPr>
         <w:pStyle w:val="Heading2"/>
       </w:pPr>
-      <w:bookmarkStart w:id="26" w:name="_Toc243427098"/>
+      <w:bookmarkStart w:id="26" w:name="_Toc243427210"/>
       <w:r>
         <w:t>9.4 The transport interface</w:t>
       </w:r>
@@ -11080,7 +11080,7 @@
         <w:pStyle w:val="Heading1"/>
         <w:pageBreakBefore/>
       </w:pPr>
-      <w:bookmarkStart w:id="27" w:name="_Toc243427099"/>
+      <w:bookmarkStart w:id="27" w:name="_Toc243427211"/>
       <w:r>
         <w:lastRenderedPageBreak/>
         <w:t>10. Implementation</w:t>
@@ -11091,7 +11091,7 @@
       <w:pPr>
         <w:pStyle w:val="Heading2"/>
       </w:pPr>
-      <w:bookmarkStart w:id="28" w:name="_Toc243427100"/>
+      <w:bookmarkStart w:id="28" w:name="_Toc243427212"/>
       <w:r>
         <w:t>10.1 The communication protocol</w:t>
       </w:r>
@@ -11340,7 +11340,7 @@
           <w:noProof/>
         </w:rPr>
         <w:drawing>
-          <wp:inline distT="0" distB="0" distL="0" distR="0" wp14:anchorId="1A6A536F" wp14:editId="7C0F972C">
+          <wp:inline distT="0" distB="0" distL="0" distR="0" wp14:anchorId="3EAA20C8" wp14:editId="1FB86BD4">
             <wp:extent cx="3240000" cy="3536229"/>
             <wp:effectExtent l="0" t="0" r="0" b="0"/>
             <wp:docPr id="5" name="Picture 5"/>
@@ -11412,7 +11412,7 @@
       <w:pPr>
         <w:pStyle w:val="Heading2"/>
       </w:pPr>
-      <w:bookmarkStart w:id="29" w:name="_Toc243427101"/>
+      <w:bookmarkStart w:id="29" w:name="_Toc243427213"/>
       <w:r>
         <w:lastRenderedPageBreak/>
         <w:t>10.2 Task structure and interface responsiveness</w:t>
@@ -11507,7 +11507,7 @@
       <w:pPr>
         <w:pStyle w:val="Heading2"/>
       </w:pPr>
-      <w:bookmarkStart w:id="30" w:name="_Toc243427102"/>
+      <w:bookmarkStart w:id="30" w:name="_Toc243427214"/>
       <w:r>
         <w:t>10.3 Memory strategy</w:t>
       </w:r>
@@ -11612,7 +11612,7 @@
       <w:pPr>
         <w:pStyle w:val="Heading2"/>
       </w:pPr>
-      <w:bookmarkStart w:id="31" w:name="_Toc243427103"/>
+      <w:bookmarkStart w:id="31" w:name="_Toc243427215"/>
       <w:r>
         <w:t>10.4 Touch coordinate handling</w:t>
       </w:r>
@@ -11627,7 +11627,7 @@
       <w:pPr>
         <w:pStyle w:val="Heading2"/>
       </w:pPr>
-      <w:bookmarkStart w:id="32" w:name="_Toc243427104"/>
+      <w:bookmarkStart w:id="32" w:name="_Toc243427216"/>
       <w:r>
         <w:t>10.5 Receiving and storing a layout</w:t>
       </w:r>
@@ -11753,7 +11753,7 @@
       <w:pPr>
         <w:pStyle w:val="Heading2"/>
       </w:pPr>
-      <w:bookmarkStart w:id="33" w:name="_Toc243427105"/>
+      <w:bookmarkStart w:id="33" w:name="_Toc243427217"/>
       <w:r>
         <w:t>10.6 The user interface</w:t>
       </w:r>
@@ -11775,7 +11775,7 @@
           <w:noProof/>
         </w:rPr>
         <w:drawing>
-          <wp:inline distT="0" distB="0" distL="0" distR="0" wp14:anchorId="7D27689E" wp14:editId="6BE57C7E">
+          <wp:inline distT="0" distB="0" distL="0" distR="0" wp14:anchorId="010D6F53" wp14:editId="7B746551">
             <wp:extent cx="5400000" cy="2006192"/>
             <wp:effectExtent l="0" t="0" r="0" b="0"/>
             <wp:docPr id="6" name="Picture 6"/>
@@ -11919,7 +11919,7 @@
         </w:rPr>
         <w:lastRenderedPageBreak/>
         <w:drawing>
-          <wp:inline distT="0" distB="0" distL="0" distR="0" wp14:anchorId="5DE5DACB" wp14:editId="560782AC">
+          <wp:inline distT="0" distB="0" distL="0" distR="0" wp14:anchorId="3B5FCE09" wp14:editId="65700D27">
             <wp:extent cx="4860000" cy="3667362"/>
             <wp:effectExtent l="0" t="0" r="0" b="0"/>
             <wp:docPr id="7" name="Picture 7"/>
@@ -11980,7 +11980,7 @@
       <w:pPr>
         <w:pStyle w:val="Heading2"/>
       </w:pPr>
-      <w:bookmarkStart w:id="34" w:name="_Toc243427106"/>
+      <w:bookmarkStart w:id="34" w:name="_Toc243427218"/>
       <w:r>
         <w:t>10.7 Themes</w:t>
       </w:r>
@@ -12003,7 +12003,7 @@
         </w:rPr>
         <w:lastRenderedPageBreak/>
         <w:drawing>
-          <wp:inline distT="0" distB="0" distL="0" distR="0" wp14:anchorId="792CF405" wp14:editId="4C9A6777">
+          <wp:inline distT="0" distB="0" distL="0" distR="0" wp14:anchorId="16B581DD" wp14:editId="4C43B5F4">
             <wp:extent cx="4500000" cy="5739130"/>
             <wp:effectExtent l="0" t="0" r="0" b="0"/>
             <wp:docPr id="8" name="Picture 8"/>
@@ -12064,7 +12064,7 @@
       <w:pPr>
         <w:pStyle w:val="Heading2"/>
       </w:pPr>
-      <w:bookmarkStart w:id="35" w:name="_Toc243427107"/>
+      <w:bookmarkStart w:id="35" w:name="_Toc243427219"/>
       <w:r>
         <w:t>10.8 A panel that explains its own failures</w:t>
       </w:r>
@@ -12090,7 +12090,7 @@
         <w:pStyle w:val="Heading1"/>
         <w:pageBreakBefore/>
       </w:pPr>
-      <w:bookmarkStart w:id="36" w:name="_Toc243427108"/>
+      <w:bookmarkStart w:id="36" w:name="_Toc243427220"/>
       <w:r>
         <w:lastRenderedPageBreak/>
         <w:t>11. The HomeMesh Designer (Desktop App)</w:t>
@@ -12113,7 +12113,7 @@
           <w:noProof/>
         </w:rPr>
         <w:drawing>
-          <wp:inline distT="0" distB="0" distL="0" distR="0" wp14:anchorId="5A801F9D" wp14:editId="0049ACA5">
+          <wp:inline distT="0" distB="0" distL="0" distR="0" wp14:anchorId="5CA83418" wp14:editId="3BE3707C">
             <wp:extent cx="5760000" cy="3637895"/>
             <wp:effectExtent l="0" t="0" r="0" b="0"/>
             <wp:docPr id="9" name="Picture 9"/>
@@ -12174,7 +12174,7 @@
       <w:pPr>
         <w:pStyle w:val="Heading2"/>
       </w:pPr>
-      <w:bookmarkStart w:id="37" w:name="_Toc243427109"/>
+      <w:bookmarkStart w:id="37" w:name="_Toc243427221"/>
       <w:r>
         <w:t>11.1 What it does</w:t>
       </w:r>
@@ -12292,7 +12292,7 @@
       <w:pPr>
         <w:pStyle w:val="Heading2"/>
       </w:pPr>
-      <w:bookmarkStart w:id="38" w:name="_Toc243427110"/>
+      <w:bookmarkStart w:id="38" w:name="_Toc243427222"/>
       <w:r>
         <w:t>11.2 The simulator is the real interface</w:t>
       </w:r>
@@ -12326,7 +12326,7 @@
       <w:pPr>
         <w:pStyle w:val="Heading2"/>
       </w:pPr>
-      <w:bookmarkStart w:id="39" w:name="_Toc243427111"/>
+      <w:bookmarkStart w:id="39" w:name="_Toc243427223"/>
       <w:r>
         <w:t>11.3 How the designer is tested</w:t>
       </w:r>
@@ -12392,7 +12392,7 @@
         <w:pStyle w:val="Heading1"/>
         <w:pageBreakBefore/>
       </w:pPr>
-      <w:bookmarkStart w:id="40" w:name="_Toc243427112"/>
+      <w:bookmarkStart w:id="40" w:name="_Toc243427224"/>
       <w:r>
         <w:lastRenderedPageBreak/>
         <w:t>12. System Operation</w:t>
@@ -12403,7 +12403,7 @@
       <w:pPr>
         <w:pStyle w:val="Heading2"/>
       </w:pPr>
-      <w:bookmarkStart w:id="41" w:name="_Toc243427113"/>
+      <w:bookmarkStart w:id="41" w:name="_Toc243427225"/>
       <w:r>
         <w:t>12.1 Network configuration</w:t>
       </w:r>
@@ -12731,7 +12731,7 @@
       <w:pPr>
         <w:pStyle w:val="Heading2"/>
       </w:pPr>
-      <w:bookmarkStart w:id="42" w:name="_Toc243427114"/>
+      <w:bookmarkStart w:id="42" w:name="_Toc243427226"/>
       <w:r>
         <w:t>12.2 Devices on the panel</w:t>
       </w:r>
@@ -13037,7 +13037,7 @@
       <w:pPr>
         <w:pStyle w:val="Heading2"/>
       </w:pPr>
-      <w:bookmarkStart w:id="43" w:name="_Toc243427115"/>
+      <w:bookmarkStart w:id="43" w:name="_Toc243427227"/>
       <w:r>
         <w:t>12.3 Changing what the panel shows</w:t>
       </w:r>
@@ -13130,7 +13130,7 @@
         <w:pStyle w:val="Heading1"/>
         <w:pageBreakBefore/>
       </w:pPr>
-      <w:bookmarkStart w:id="44" w:name="_Toc243427116"/>
+      <w:bookmarkStart w:id="44" w:name="_Toc243427228"/>
       <w:r>
         <w:lastRenderedPageBreak/>
         <w:t>13. Testing and Results</w:t>
@@ -13146,7 +13146,7 @@
       <w:pPr>
         <w:pStyle w:val="Heading2"/>
       </w:pPr>
-      <w:bookmarkStart w:id="45" w:name="_Toc243427117"/>
+      <w:bookmarkStart w:id="45" w:name="_Toc243427229"/>
       <w:r>
         <w:t>13.1 Message size and latency</w:t>
       </w:r>
@@ -13540,7 +13540,7 @@
           <w:noProof/>
         </w:rPr>
         <w:drawing>
-          <wp:inline distT="0" distB="0" distL="0" distR="0" wp14:anchorId="2570EAEB" wp14:editId="77F0FCF4">
+          <wp:inline distT="0" distB="0" distL="0" distR="0" wp14:anchorId="1F5F10E0" wp14:editId="1D173453">
             <wp:extent cx="3960000" cy="1998857"/>
             <wp:effectExtent l="0" t="0" r="0" b="0"/>
             <wp:docPr id="10" name="Picture 10"/>
@@ -13606,7 +13606,7 @@
       <w:pPr>
         <w:pStyle w:val="Heading2"/>
       </w:pPr>
-      <w:bookmarkStart w:id="46" w:name="_Toc243427118"/>
+      <w:bookmarkStart w:id="46" w:name="_Toc243427230"/>
       <w:r>
         <w:t>13.2 Resource usage</w:t>
       </w:r>
@@ -13918,7 +13918,7 @@
       <w:pPr>
         <w:pStyle w:val="Heading2"/>
       </w:pPr>
-      <w:bookmarkStart w:id="47" w:name="_Toc243427119"/>
+      <w:bookmarkStart w:id="47" w:name="_Toc243427231"/>
       <w:r>
         <w:t>13.3 Functional verification</w:t>
       </w:r>
@@ -14495,7 +14495,7 @@
       <w:pPr>
         <w:pStyle w:val="Heading2"/>
       </w:pPr>
-      <w:bookmarkStart w:id="48" w:name="_Toc243427120"/>
+      <w:bookmarkStart w:id="48" w:name="_Toc243427232"/>
       <w:r>
         <w:t>13.4 Field case study: the connection that kept dropping</w:t>
       </w:r>
@@ -14591,7 +14591,7 @@
       <w:pPr>
         <w:pStyle w:val="Heading2"/>
       </w:pPr>
-      <w:bookmarkStart w:id="49" w:name="_Toc243427121"/>
+      <w:bookmarkStart w:id="49" w:name="_Toc243427233"/>
       <w:r>
         <w:lastRenderedPageBreak/>
         <w:t>13.5 Other challenges and their resolution</w:t>
@@ -15131,7 +15131,7 @@
       <w:pPr>
         <w:pStyle w:val="Heading1"/>
       </w:pPr>
-      <w:bookmarkStart w:id="50" w:name="_Toc243427122"/>
+      <w:bookmarkStart w:id="50" w:name="_Toc243427234"/>
       <w:r>
         <w:t>14. Future Scope</w:t>
       </w:r>
@@ -15249,7 +15249,7 @@
       <w:pPr>
         <w:pStyle w:val="Heading1"/>
       </w:pPr>
-      <w:bookmarkStart w:id="51" w:name="_Toc243427123"/>
+      <w:bookmarkStart w:id="51" w:name="_Toc243427235"/>
       <w:r>
         <w:t>15. Conclusion</w:t>
       </w:r>
@@ -15305,7 +15305,7 @@
       <w:pPr>
         <w:pStyle w:val="Heading1"/>
       </w:pPr>
-      <w:bookmarkStart w:id="52" w:name="_Toc243427124"/>
+      <w:bookmarkStart w:id="52" w:name="_Toc243427236"/>
       <w:r>
         <w:t>16. References</w:t>
       </w:r>
@@ -15315,7 +15315,7 @@
       <w:pPr>
         <w:pStyle w:val="Heading2"/>
       </w:pPr>
-      <w:bookmarkStart w:id="53" w:name="_Toc243427125"/>
+      <w:bookmarkStart w:id="53" w:name="_Toc243427237"/>
       <w:r>
         <w:t>16.1 Published literature</w:t>
       </w:r>
@@ -15760,7 +15760,7 @@
       <w:pPr>
         <w:pStyle w:val="Heading2"/>
       </w:pPr>
-      <w:bookmarkStart w:id="54" w:name="_Toc243427126"/>
+      <w:bookmarkStart w:id="54" w:name="_Toc243427238"/>
       <w:r>
         <w:t>16.2 Technical documentation</w:t>
       </w:r>
@@ -15939,7 +15939,7 @@
         <w:pStyle w:val="Heading1"/>
         <w:pageBreakBefore/>
       </w:pPr>
-      <w:bookmarkStart w:id="55" w:name="_Toc243427127"/>
+      <w:bookmarkStart w:id="55" w:name="_Toc243427239"/>
       <w:r>
         <w:lastRenderedPageBreak/>
         <w:t>Appendix A — Suggested Presentation Plan</w:t>
@@ -17507,7 +17507,7 @@
       <w:pPr>
         <w:pStyle w:val="Heading2"/>
       </w:pPr>
-      <w:bookmarkStart w:id="56" w:name="_Toc243427128"/>
+      <w:bookmarkStart w:id="56" w:name="_Toc243427240"/>
       <w:r>
         <w:t>Figure files</w:t>
       </w:r>
@@ -17971,7 +17971,7 @@
       <w:pPr>
         <w:pStyle w:val="Heading2"/>
       </w:pPr>
-      <w:bookmarkStart w:id="57" w:name="_Toc243427129"/>
+      <w:bookmarkStart w:id="57" w:name="_Toc243427241"/>
       <w:r>
         <w:t>Presentation notes</w:t>
       </w:r>
@@ -18017,7 +18017,7 @@
       <w:pPr>
         <w:pStyle w:val="Heading2"/>
       </w:pPr>
-      <w:bookmarkStart w:id="58" w:name="_Toc243427130"/>
+      <w:bookmarkStart w:id="58" w:name="_Toc243427242"/>
       <w:r>
         <w:t>Anticipated questions</w:t>
       </w:r>
@@ -18558,7 +18558,7 @@
         <w:pStyle w:val="Heading1"/>
         <w:pageBreakBefore/>
       </w:pPr>
-      <w:bookmarkStart w:id="59" w:name="_Toc243427131"/>
+      <w:bookmarkStart w:id="59" w:name="_Toc243427243"/>
       <w:r>
         <w:lastRenderedPageBreak/>
         <w:t>Appendix B — Internal Note (Not for Presentation)</w:t>
@@ -18633,7 +18633,7 @@
       <w:pPr>
         <w:pStyle w:val="Heading2"/>
       </w:pPr>
-      <w:bookmarkStart w:id="60" w:name="_Toc243427132"/>
+      <w:bookmarkStart w:id="60" w:name="_Toc243427244"/>
       <w:r>
         <w:t>What is genuinely working</w:t>
       </w:r>
@@ -18702,7 +18702,7 @@
       <w:pPr>
         <w:pStyle w:val="Heading2"/>
       </w:pPr>
-      <w:bookmarkStart w:id="61" w:name="_Toc243427133"/>
+      <w:bookmarkStart w:id="61" w:name="_Toc243427245"/>
       <w:r>
         <w:t>What must not be claimed</w:t>
       </w:r>
@@ -19051,7 +19051,7 @@
       <w:pPr>
         <w:pStyle w:val="Heading2"/>
       </w:pPr>
-      <w:bookmarkStart w:id="62" w:name="_Toc243427134"/>
+      <w:bookmarkStart w:id="62" w:name="_Toc243427246"/>
       <w:r>
         <w:lastRenderedPageBreak/>
         <w:t>Check before the review: firmware on the board</w:t>
@@ -19224,7 +19224,7 @@
       <w:pPr>
         <w:pStyle w:val="Heading2"/>
       </w:pPr>
-      <w:bookmarkStart w:id="63" w:name="_Toc243427135"/>
+      <w:bookmarkStart w:id="63" w:name="_Toc243427247"/>
       <w:r>
         <w:t>Two quirks that may be noticed, and how to answer</w:t>
       </w:r>
@@ -19383,7 +19383,7 @@
       <w:pPr>
         <w:pStyle w:val="Heading2"/>
       </w:pPr>
-      <w:bookmarkStart w:id="64" w:name="_Toc243427136"/>
+      <w:bookmarkStart w:id="64" w:name="_Toc243427248"/>
       <w:r>
         <w:t>Before the presentation</w:t>
       </w:r>
@@ -19797,31 +19797,31 @@
       </w:rPr>
     </w:lvl>
   </w:abstractNum>
-  <w:num w:numId="1" w16cid:durableId="575365460">
+  <w:num w:numId="1" w16cid:durableId="1512378437">
     <w:abstractNumId w:val="8"/>
   </w:num>
-  <w:num w:numId="2" w16cid:durableId="2127239278">
+  <w:num w:numId="2" w16cid:durableId="1845824254">
     <w:abstractNumId w:val="6"/>
   </w:num>
-  <w:num w:numId="3" w16cid:durableId="1395160170">
+  <w:num w:numId="3" w16cid:durableId="1079058590">
     <w:abstractNumId w:val="5"/>
   </w:num>
-  <w:num w:numId="4" w16cid:durableId="1754277413">
+  <w:num w:numId="4" w16cid:durableId="347610491">
     <w:abstractNumId w:val="4"/>
   </w:num>
-  <w:num w:numId="5" w16cid:durableId="1648975780">
+  <w:num w:numId="5" w16cid:durableId="1873692737">
     <w:abstractNumId w:val="7"/>
   </w:num>
-  <w:num w:numId="6" w16cid:durableId="423646898">
+  <w:num w:numId="6" w16cid:durableId="1074546381">
     <w:abstractNumId w:val="3"/>
   </w:num>
-  <w:num w:numId="7" w16cid:durableId="1633439686">
+  <w:num w:numId="7" w16cid:durableId="1567495678">
     <w:abstractNumId w:val="2"/>
   </w:num>
-  <w:num w:numId="8" w16cid:durableId="389304057">
+  <w:num w:numId="8" w16cid:durableId="842016319">
     <w:abstractNumId w:val="1"/>
   </w:num>
-  <w:num w:numId="9" w16cid:durableId="1848862004">
+  <w:num w:numId="9" w16cid:durableId="399795308">
     <w:abstractNumId w:val="0"/>
   </w:num>
 </w:numbering>
@@ -31214,7 +31214,7 @@
     <w:autoRedefine/>
     <w:uiPriority w:val="39"/>
     <w:unhideWhenUsed/>
-    <w:rsid w:val="00C94B66"/>
+    <w:rsid w:val="0040649D"/>
     <w:pPr>
       <w:spacing w:after="100"/>
     </w:pPr>
@@ -31226,7 +31226,7 @@
     <w:autoRedefine/>
     <w:uiPriority w:val="39"/>
     <w:unhideWhenUsed/>
-    <w:rsid w:val="00C94B66"/>
+    <w:rsid w:val="0040649D"/>
     <w:pPr>
       <w:spacing w:after="100"/>
       <w:ind w:left="210"/>
@@ -31237,7 +31237,7 @@
     <w:basedOn w:val="DefaultParagraphFont"/>
     <w:uiPriority w:val="99"/>
     <w:unhideWhenUsed/>
-    <w:rsid w:val="00C94B66"/>
+    <w:rsid w:val="0040649D"/>
     <w:rPr>
       <w:color w:val="0000FF" w:themeColor="hyperlink"/>
       <w:u w:val="single"/>

</xml_diff>

<commit_message>
Designer: pages of your own, and devices with no room
A page is only a name to the panel - a layout's areas are strings that
entities point at by index - so placing a device somewhere other than
its Home Assistant room needs no firmware change. select_layout() gains
pages= (device -> page, overriding its area) and sensor_pages= (sensor
-> page, "" hides it); with neither, the output is unchanged, and the
byte-identity tests now cover three page cases too.

The designer gets a page chooser for every device and header sensor,
add / rename / remove pages, dragging a tile onto another page, and a
warning when a page title would run into the header's temperature,
measured with the panel's own font (sim_text_width). Devices with no
room in Home Assistant can now be placed by choosing a page.

Also records that the 20 Oct firmware is on the board.
</commit_message>
<xml_diff>
--- a/docs/HomeMesh_Panel_Project_Documentation.docx
+++ b/docs/HomeMesh_Panel_Project_Documentation.docx
@@ -513,7 +513,7 @@
       <w:r>
         <w:fldChar w:fldCharType="separate"/>
       </w:r>
-      <w:hyperlink w:anchor="_Toc243427184" w:history="1">
+      <w:hyperlink w:anchor="_Toc243429598" w:history="1">
         <w:r>
           <w:rPr>
             <w:rStyle w:val="Hyperlink"/>
@@ -540,7 +540,7 @@
             <w:noProof/>
             <w:webHidden/>
           </w:rPr>
-          <w:instrText xml:space="preserve"> PAGEREF _Toc243427184 \h </w:instrText>
+          <w:instrText xml:space="preserve"> PAGEREF _Toc243429598 \h </w:instrText>
         </w:r>
         <w:r>
           <w:rPr>
@@ -581,7 +581,7 @@
           <w:noProof/>
         </w:rPr>
       </w:pPr>
-      <w:hyperlink w:anchor="_Toc243427185" w:history="1">
+      <w:hyperlink w:anchor="_Toc243429599" w:history="1">
         <w:r>
           <w:rPr>
             <w:rStyle w:val="Hyperlink"/>
@@ -608,7 +608,7 @@
             <w:noProof/>
             <w:webHidden/>
           </w:rPr>
-          <w:instrText xml:space="preserve"> PAGEREF _Toc243427185 \h </w:instrText>
+          <w:instrText xml:space="preserve"> PAGEREF _Toc243429599 \h </w:instrText>
         </w:r>
         <w:r>
           <w:rPr>
@@ -649,7 +649,7 @@
           <w:noProof/>
         </w:rPr>
       </w:pPr>
-      <w:hyperlink w:anchor="_Toc243427186" w:history="1">
+      <w:hyperlink w:anchor="_Toc243429600" w:history="1">
         <w:r>
           <w:rPr>
             <w:rStyle w:val="Hyperlink"/>
@@ -676,7 +676,7 @@
             <w:noProof/>
             <w:webHidden/>
           </w:rPr>
-          <w:instrText xml:space="preserve"> PAGEREF _Toc243427186 \h </w:instrText>
+          <w:instrText xml:space="preserve"> PAGEREF _Toc243429600 \h </w:instrText>
         </w:r>
         <w:r>
           <w:rPr>
@@ -717,7 +717,7 @@
           <w:noProof/>
         </w:rPr>
       </w:pPr>
-      <w:hyperlink w:anchor="_Toc243427187" w:history="1">
+      <w:hyperlink w:anchor="_Toc243429601" w:history="1">
         <w:r>
           <w:rPr>
             <w:rStyle w:val="Hyperlink"/>
@@ -744,7 +744,7 @@
             <w:noProof/>
             <w:webHidden/>
           </w:rPr>
-          <w:instrText xml:space="preserve"> PAGEREF _Toc243427187 \h </w:instrText>
+          <w:instrText xml:space="preserve"> PAGEREF _Toc243429601 \h </w:instrText>
         </w:r>
         <w:r>
           <w:rPr>
@@ -785,7 +785,7 @@
           <w:noProof/>
         </w:rPr>
       </w:pPr>
-      <w:hyperlink w:anchor="_Toc243427188" w:history="1">
+      <w:hyperlink w:anchor="_Toc243429602" w:history="1">
         <w:r>
           <w:rPr>
             <w:rStyle w:val="Hyperlink"/>
@@ -812,7 +812,7 @@
             <w:noProof/>
             <w:webHidden/>
           </w:rPr>
-          <w:instrText xml:space="preserve"> PAGEREF _Toc243427188 \h </w:instrText>
+          <w:instrText xml:space="preserve"> PAGEREF _Toc243429602 \h </w:instrText>
         </w:r>
         <w:r>
           <w:rPr>
@@ -853,7 +853,7 @@
           <w:noProof/>
         </w:rPr>
       </w:pPr>
-      <w:hyperlink w:anchor="_Toc243427189" w:history="1">
+      <w:hyperlink w:anchor="_Toc243429603" w:history="1">
         <w:r>
           <w:rPr>
             <w:rStyle w:val="Hyperlink"/>
@@ -880,7 +880,7 @@
             <w:noProof/>
             <w:webHidden/>
           </w:rPr>
-          <w:instrText xml:space="preserve"> PAGEREF _Toc243427189 \h </w:instrText>
+          <w:instrText xml:space="preserve"> PAGEREF _Toc243429603 \h </w:instrText>
         </w:r>
         <w:r>
           <w:rPr>
@@ -921,7 +921,7 @@
           <w:noProof/>
         </w:rPr>
       </w:pPr>
-      <w:hyperlink w:anchor="_Toc243427190" w:history="1">
+      <w:hyperlink w:anchor="_Toc243429604" w:history="1">
         <w:r>
           <w:rPr>
             <w:rStyle w:val="Hyperlink"/>
@@ -948,7 +948,7 @@
             <w:noProof/>
             <w:webHidden/>
           </w:rPr>
-          <w:instrText xml:space="preserve"> PAGEREF _Toc243427190 \h </w:instrText>
+          <w:instrText xml:space="preserve"> PAGEREF _Toc243429604 \h </w:instrText>
         </w:r>
         <w:r>
           <w:rPr>
@@ -989,7 +989,7 @@
           <w:noProof/>
         </w:rPr>
       </w:pPr>
-      <w:hyperlink w:anchor="_Toc243427191" w:history="1">
+      <w:hyperlink w:anchor="_Toc243429605" w:history="1">
         <w:r>
           <w:rPr>
             <w:rStyle w:val="Hyperlink"/>
@@ -1016,7 +1016,7 @@
             <w:noProof/>
             <w:webHidden/>
           </w:rPr>
-          <w:instrText xml:space="preserve"> PAGEREF _Toc243427191 \h </w:instrText>
+          <w:instrText xml:space="preserve"> PAGEREF _Toc243429605 \h </w:instrText>
         </w:r>
         <w:r>
           <w:rPr>
@@ -1057,7 +1057,7 @@
           <w:noProof/>
         </w:rPr>
       </w:pPr>
-      <w:hyperlink w:anchor="_Toc243427192" w:history="1">
+      <w:hyperlink w:anchor="_Toc243429606" w:history="1">
         <w:r>
           <w:rPr>
             <w:rStyle w:val="Hyperlink"/>
@@ -1084,7 +1084,7 @@
             <w:noProof/>
             <w:webHidden/>
           </w:rPr>
-          <w:instrText xml:space="preserve"> PAGEREF _Toc243427192 \h </w:instrText>
+          <w:instrText xml:space="preserve"> PAGEREF _Toc243429606 \h </w:instrText>
         </w:r>
         <w:r>
           <w:rPr>
@@ -1125,7 +1125,7 @@
           <w:noProof/>
         </w:rPr>
       </w:pPr>
-      <w:hyperlink w:anchor="_Toc243427193" w:history="1">
+      <w:hyperlink w:anchor="_Toc243429607" w:history="1">
         <w:r>
           <w:rPr>
             <w:rStyle w:val="Hyperlink"/>
@@ -1152,7 +1152,7 @@
             <w:noProof/>
             <w:webHidden/>
           </w:rPr>
-          <w:instrText xml:space="preserve"> PAGEREF _Toc243427193 \h </w:instrText>
+          <w:instrText xml:space="preserve"> PAGEREF _Toc243429607 \h </w:instrText>
         </w:r>
         <w:r>
           <w:rPr>
@@ -1193,7 +1193,7 @@
           <w:noProof/>
         </w:rPr>
       </w:pPr>
-      <w:hyperlink w:anchor="_Toc243427194" w:history="1">
+      <w:hyperlink w:anchor="_Toc243429608" w:history="1">
         <w:r>
           <w:rPr>
             <w:rStyle w:val="Hyperlink"/>
@@ -1220,7 +1220,7 @@
             <w:noProof/>
             <w:webHidden/>
           </w:rPr>
-          <w:instrText xml:space="preserve"> PAGEREF _Toc243427194 \h </w:instrText>
+          <w:instrText xml:space="preserve"> PAGEREF _Toc243429608 \h </w:instrText>
         </w:r>
         <w:r>
           <w:rPr>
@@ -1261,7 +1261,7 @@
           <w:noProof/>
         </w:rPr>
       </w:pPr>
-      <w:hyperlink w:anchor="_Toc243427195" w:history="1">
+      <w:hyperlink w:anchor="_Toc243429609" w:history="1">
         <w:r>
           <w:rPr>
             <w:rStyle w:val="Hyperlink"/>
@@ -1288,7 +1288,7 @@
             <w:noProof/>
             <w:webHidden/>
           </w:rPr>
-          <w:instrText xml:space="preserve"> PAGEREF _Toc243427195 \h </w:instrText>
+          <w:instrText xml:space="preserve"> PAGEREF _Toc243429609 \h </w:instrText>
         </w:r>
         <w:r>
           <w:rPr>
@@ -1329,7 +1329,7 @@
           <w:noProof/>
         </w:rPr>
       </w:pPr>
-      <w:hyperlink w:anchor="_Toc243427196" w:history="1">
+      <w:hyperlink w:anchor="_Toc243429610" w:history="1">
         <w:r>
           <w:rPr>
             <w:rStyle w:val="Hyperlink"/>
@@ -1356,7 +1356,7 @@
             <w:noProof/>
             <w:webHidden/>
           </w:rPr>
-          <w:instrText xml:space="preserve"> PAGEREF _Toc243427196 \h </w:instrText>
+          <w:instrText xml:space="preserve"> PAGEREF _Toc243429610 \h </w:instrText>
         </w:r>
         <w:r>
           <w:rPr>
@@ -1397,7 +1397,7 @@
           <w:noProof/>
         </w:rPr>
       </w:pPr>
-      <w:hyperlink w:anchor="_Toc243427197" w:history="1">
+      <w:hyperlink w:anchor="_Toc243429611" w:history="1">
         <w:r>
           <w:rPr>
             <w:rStyle w:val="Hyperlink"/>
@@ -1424,7 +1424,7 @@
             <w:noProof/>
             <w:webHidden/>
           </w:rPr>
-          <w:instrText xml:space="preserve"> PAGEREF _Toc243427197 \h </w:instrText>
+          <w:instrText xml:space="preserve"> PAGEREF _Toc243429611 \h </w:instrText>
         </w:r>
         <w:r>
           <w:rPr>
@@ -1465,7 +1465,7 @@
           <w:noProof/>
         </w:rPr>
       </w:pPr>
-      <w:hyperlink w:anchor="_Toc243427198" w:history="1">
+      <w:hyperlink w:anchor="_Toc243429612" w:history="1">
         <w:r>
           <w:rPr>
             <w:rStyle w:val="Hyperlink"/>
@@ -1492,7 +1492,7 @@
             <w:noProof/>
             <w:webHidden/>
           </w:rPr>
-          <w:instrText xml:space="preserve"> PAGEREF _Toc243427198 \h </w:instrText>
+          <w:instrText xml:space="preserve"> PAGEREF _Toc243429612 \h </w:instrText>
         </w:r>
         <w:r>
           <w:rPr>
@@ -1533,7 +1533,7 @@
           <w:noProof/>
         </w:rPr>
       </w:pPr>
-      <w:hyperlink w:anchor="_Toc243427199" w:history="1">
+      <w:hyperlink w:anchor="_Toc243429613" w:history="1">
         <w:r>
           <w:rPr>
             <w:rStyle w:val="Hyperlink"/>
@@ -1560,7 +1560,7 @@
             <w:noProof/>
             <w:webHidden/>
           </w:rPr>
-          <w:instrText xml:space="preserve"> PAGEREF _Toc243427199 \h </w:instrText>
+          <w:instrText xml:space="preserve"> PAGEREF _Toc243429613 \h </w:instrText>
         </w:r>
         <w:r>
           <w:rPr>
@@ -1601,7 +1601,7 @@
           <w:noProof/>
         </w:rPr>
       </w:pPr>
-      <w:hyperlink w:anchor="_Toc243427200" w:history="1">
+      <w:hyperlink w:anchor="_Toc243429614" w:history="1">
         <w:r>
           <w:rPr>
             <w:rStyle w:val="Hyperlink"/>
@@ -1628,7 +1628,7 @@
             <w:noProof/>
             <w:webHidden/>
           </w:rPr>
-          <w:instrText xml:space="preserve"> PAGEREF _Toc243427200 \h </w:instrText>
+          <w:instrText xml:space="preserve"> PAGEREF _Toc243429614 \h </w:instrText>
         </w:r>
         <w:r>
           <w:rPr>
@@ -1669,7 +1669,7 @@
           <w:noProof/>
         </w:rPr>
       </w:pPr>
-      <w:hyperlink w:anchor="_Toc243427201" w:history="1">
+      <w:hyperlink w:anchor="_Toc243429615" w:history="1">
         <w:r>
           <w:rPr>
             <w:rStyle w:val="Hyperlink"/>
@@ -1696,7 +1696,7 @@
             <w:noProof/>
             <w:webHidden/>
           </w:rPr>
-          <w:instrText xml:space="preserve"> PAGEREF _Toc243427201 \h </w:instrText>
+          <w:instrText xml:space="preserve"> PAGEREF _Toc243429615 \h </w:instrText>
         </w:r>
         <w:r>
           <w:rPr>
@@ -1737,7 +1737,7 @@
           <w:noProof/>
         </w:rPr>
       </w:pPr>
-      <w:hyperlink w:anchor="_Toc243427202" w:history="1">
+      <w:hyperlink w:anchor="_Toc243429616" w:history="1">
         <w:r>
           <w:rPr>
             <w:rStyle w:val="Hyperlink"/>
@@ -1764,7 +1764,7 @@
             <w:noProof/>
             <w:webHidden/>
           </w:rPr>
-          <w:instrText xml:space="preserve"> PAGEREF _Toc243427202 \h </w:instrText>
+          <w:instrText xml:space="preserve"> PAGEREF _Toc243429616 \h </w:instrText>
         </w:r>
         <w:r>
           <w:rPr>
@@ -1805,7 +1805,7 @@
           <w:noProof/>
         </w:rPr>
       </w:pPr>
-      <w:hyperlink w:anchor="_Toc243427203" w:history="1">
+      <w:hyperlink w:anchor="_Toc243429617" w:history="1">
         <w:r>
           <w:rPr>
             <w:rStyle w:val="Hyperlink"/>
@@ -1832,7 +1832,7 @@
             <w:noProof/>
             <w:webHidden/>
           </w:rPr>
-          <w:instrText xml:space="preserve"> PAGEREF _Toc243427203 \h </w:instrText>
+          <w:instrText xml:space="preserve"> PAGEREF _Toc243429617 \h </w:instrText>
         </w:r>
         <w:r>
           <w:rPr>
@@ -1873,7 +1873,7 @@
           <w:noProof/>
         </w:rPr>
       </w:pPr>
-      <w:hyperlink w:anchor="_Toc243427204" w:history="1">
+      <w:hyperlink w:anchor="_Toc243429618" w:history="1">
         <w:r>
           <w:rPr>
             <w:rStyle w:val="Hyperlink"/>
@@ -1900,7 +1900,7 @@
             <w:noProof/>
             <w:webHidden/>
           </w:rPr>
-          <w:instrText xml:space="preserve"> PAGEREF _Toc243427204 \h </w:instrText>
+          <w:instrText xml:space="preserve"> PAGEREF _Toc243429618 \h </w:instrText>
         </w:r>
         <w:r>
           <w:rPr>
@@ -1941,7 +1941,7 @@
           <w:noProof/>
         </w:rPr>
       </w:pPr>
-      <w:hyperlink w:anchor="_Toc243427205" w:history="1">
+      <w:hyperlink w:anchor="_Toc243429619" w:history="1">
         <w:r>
           <w:rPr>
             <w:rStyle w:val="Hyperlink"/>
@@ -1968,7 +1968,7 @@
             <w:noProof/>
             <w:webHidden/>
           </w:rPr>
-          <w:instrText xml:space="preserve"> PAGEREF _Toc243427205 \h </w:instrText>
+          <w:instrText xml:space="preserve"> PAGEREF _Toc243429619 \h </w:instrText>
         </w:r>
         <w:r>
           <w:rPr>
@@ -2009,7 +2009,7 @@
           <w:noProof/>
         </w:rPr>
       </w:pPr>
-      <w:hyperlink w:anchor="_Toc243427206" w:history="1">
+      <w:hyperlink w:anchor="_Toc243429620" w:history="1">
         <w:r>
           <w:rPr>
             <w:rStyle w:val="Hyperlink"/>
@@ -2036,7 +2036,7 @@
             <w:noProof/>
             <w:webHidden/>
           </w:rPr>
-          <w:instrText xml:space="preserve"> PAGEREF _Toc243427206 \h </w:instrText>
+          <w:instrText xml:space="preserve"> PAGEREF _Toc243429620 \h </w:instrText>
         </w:r>
         <w:r>
           <w:rPr>
@@ -2077,7 +2077,7 @@
           <w:noProof/>
         </w:rPr>
       </w:pPr>
-      <w:hyperlink w:anchor="_Toc243427207" w:history="1">
+      <w:hyperlink w:anchor="_Toc243429621" w:history="1">
         <w:r>
           <w:rPr>
             <w:rStyle w:val="Hyperlink"/>
@@ -2104,7 +2104,7 @@
             <w:noProof/>
             <w:webHidden/>
           </w:rPr>
-          <w:instrText xml:space="preserve"> PAGEREF _Toc243427207 \h </w:instrText>
+          <w:instrText xml:space="preserve"> PAGEREF _Toc243429621 \h </w:instrText>
         </w:r>
         <w:r>
           <w:rPr>
@@ -2145,7 +2145,7 @@
           <w:noProof/>
         </w:rPr>
       </w:pPr>
-      <w:hyperlink w:anchor="_Toc243427208" w:history="1">
+      <w:hyperlink w:anchor="_Toc243429622" w:history="1">
         <w:r>
           <w:rPr>
             <w:rStyle w:val="Hyperlink"/>
@@ -2172,7 +2172,7 @@
             <w:noProof/>
             <w:webHidden/>
           </w:rPr>
-          <w:instrText xml:space="preserve"> PAGEREF _Toc243427208 \h </w:instrText>
+          <w:instrText xml:space="preserve"> PAGEREF _Toc243429622 \h </w:instrText>
         </w:r>
         <w:r>
           <w:rPr>
@@ -2213,7 +2213,7 @@
           <w:noProof/>
         </w:rPr>
       </w:pPr>
-      <w:hyperlink w:anchor="_Toc243427209" w:history="1">
+      <w:hyperlink w:anchor="_Toc243429623" w:history="1">
         <w:r>
           <w:rPr>
             <w:rStyle w:val="Hyperlink"/>
@@ -2240,7 +2240,7 @@
             <w:noProof/>
             <w:webHidden/>
           </w:rPr>
-          <w:instrText xml:space="preserve"> PAGEREF _Toc243427209 \h </w:instrText>
+          <w:instrText xml:space="preserve"> PAGEREF _Toc243429623 \h </w:instrText>
         </w:r>
         <w:r>
           <w:rPr>
@@ -2281,7 +2281,7 @@
           <w:noProof/>
         </w:rPr>
       </w:pPr>
-      <w:hyperlink w:anchor="_Toc243427210" w:history="1">
+      <w:hyperlink w:anchor="_Toc243429624" w:history="1">
         <w:r>
           <w:rPr>
             <w:rStyle w:val="Hyperlink"/>
@@ -2308,7 +2308,7 @@
             <w:noProof/>
             <w:webHidden/>
           </w:rPr>
-          <w:instrText xml:space="preserve"> PAGEREF _Toc243427210 \h </w:instrText>
+          <w:instrText xml:space="preserve"> PAGEREF _Toc243429624 \h </w:instrText>
         </w:r>
         <w:r>
           <w:rPr>
@@ -2349,7 +2349,7 @@
           <w:noProof/>
         </w:rPr>
       </w:pPr>
-      <w:hyperlink w:anchor="_Toc243427211" w:history="1">
+      <w:hyperlink w:anchor="_Toc243429625" w:history="1">
         <w:r>
           <w:rPr>
             <w:rStyle w:val="Hyperlink"/>
@@ -2376,7 +2376,7 @@
             <w:noProof/>
             <w:webHidden/>
           </w:rPr>
-          <w:instrText xml:space="preserve"> PAGEREF _Toc243427211 \h </w:instrText>
+          <w:instrText xml:space="preserve"> PAGEREF _Toc243429625 \h </w:instrText>
         </w:r>
         <w:r>
           <w:rPr>
@@ -2417,7 +2417,7 @@
           <w:noProof/>
         </w:rPr>
       </w:pPr>
-      <w:hyperlink w:anchor="_Toc243427212" w:history="1">
+      <w:hyperlink w:anchor="_Toc243429626" w:history="1">
         <w:r>
           <w:rPr>
             <w:rStyle w:val="Hyperlink"/>
@@ -2444,7 +2444,7 @@
             <w:noProof/>
             <w:webHidden/>
           </w:rPr>
-          <w:instrText xml:space="preserve"> PAGEREF _Toc243427212 \h </w:instrText>
+          <w:instrText xml:space="preserve"> PAGEREF _Toc243429626 \h </w:instrText>
         </w:r>
         <w:r>
           <w:rPr>
@@ -2485,7 +2485,7 @@
           <w:noProof/>
         </w:rPr>
       </w:pPr>
-      <w:hyperlink w:anchor="_Toc243427213" w:history="1">
+      <w:hyperlink w:anchor="_Toc243429627" w:history="1">
         <w:r>
           <w:rPr>
             <w:rStyle w:val="Hyperlink"/>
@@ -2512,7 +2512,7 @@
             <w:noProof/>
             <w:webHidden/>
           </w:rPr>
-          <w:instrText xml:space="preserve"> PAGEREF _Toc243427213 \h </w:instrText>
+          <w:instrText xml:space="preserve"> PAGEREF _Toc243429627 \h </w:instrText>
         </w:r>
         <w:r>
           <w:rPr>
@@ -2553,7 +2553,7 @@
           <w:noProof/>
         </w:rPr>
       </w:pPr>
-      <w:hyperlink w:anchor="_Toc243427214" w:history="1">
+      <w:hyperlink w:anchor="_Toc243429628" w:history="1">
         <w:r>
           <w:rPr>
             <w:rStyle w:val="Hyperlink"/>
@@ -2580,7 +2580,7 @@
             <w:noProof/>
             <w:webHidden/>
           </w:rPr>
-          <w:instrText xml:space="preserve"> PAGEREF _Toc243427214 \h </w:instrText>
+          <w:instrText xml:space="preserve"> PAGEREF _Toc243429628 \h </w:instrText>
         </w:r>
         <w:r>
           <w:rPr>
@@ -2621,7 +2621,7 @@
           <w:noProof/>
         </w:rPr>
       </w:pPr>
-      <w:hyperlink w:anchor="_Toc243427215" w:history="1">
+      <w:hyperlink w:anchor="_Toc243429629" w:history="1">
         <w:r>
           <w:rPr>
             <w:rStyle w:val="Hyperlink"/>
@@ -2648,7 +2648,7 @@
             <w:noProof/>
             <w:webHidden/>
           </w:rPr>
-          <w:instrText xml:space="preserve"> PAGEREF _Toc243427215 \h </w:instrText>
+          <w:instrText xml:space="preserve"> PAGEREF _Toc243429629 \h </w:instrText>
         </w:r>
         <w:r>
           <w:rPr>
@@ -2689,7 +2689,7 @@
           <w:noProof/>
         </w:rPr>
       </w:pPr>
-      <w:hyperlink w:anchor="_Toc243427216" w:history="1">
+      <w:hyperlink w:anchor="_Toc243429630" w:history="1">
         <w:r>
           <w:rPr>
             <w:rStyle w:val="Hyperlink"/>
@@ -2716,7 +2716,7 @@
             <w:noProof/>
             <w:webHidden/>
           </w:rPr>
-          <w:instrText xml:space="preserve"> PAGEREF _Toc243427216 \h </w:instrText>
+          <w:instrText xml:space="preserve"> PAGEREF _Toc243429630 \h </w:instrText>
         </w:r>
         <w:r>
           <w:rPr>
@@ -2757,7 +2757,7 @@
           <w:noProof/>
         </w:rPr>
       </w:pPr>
-      <w:hyperlink w:anchor="_Toc243427217" w:history="1">
+      <w:hyperlink w:anchor="_Toc243429631" w:history="1">
         <w:r>
           <w:rPr>
             <w:rStyle w:val="Hyperlink"/>
@@ -2784,7 +2784,7 @@
             <w:noProof/>
             <w:webHidden/>
           </w:rPr>
-          <w:instrText xml:space="preserve"> PAGEREF _Toc243427217 \h </w:instrText>
+          <w:instrText xml:space="preserve"> PAGEREF _Toc243429631 \h </w:instrText>
         </w:r>
         <w:r>
           <w:rPr>
@@ -2825,7 +2825,7 @@
           <w:noProof/>
         </w:rPr>
       </w:pPr>
-      <w:hyperlink w:anchor="_Toc243427218" w:history="1">
+      <w:hyperlink w:anchor="_Toc243429632" w:history="1">
         <w:r>
           <w:rPr>
             <w:rStyle w:val="Hyperlink"/>
@@ -2852,7 +2852,7 @@
             <w:noProof/>
             <w:webHidden/>
           </w:rPr>
-          <w:instrText xml:space="preserve"> PAGEREF _Toc243427218 \h </w:instrText>
+          <w:instrText xml:space="preserve"> PAGEREF _Toc243429632 \h </w:instrText>
         </w:r>
         <w:r>
           <w:rPr>
@@ -2893,7 +2893,7 @@
           <w:noProof/>
         </w:rPr>
       </w:pPr>
-      <w:hyperlink w:anchor="_Toc243427219" w:history="1">
+      <w:hyperlink w:anchor="_Toc243429633" w:history="1">
         <w:r>
           <w:rPr>
             <w:rStyle w:val="Hyperlink"/>
@@ -2920,7 +2920,7 @@
             <w:noProof/>
             <w:webHidden/>
           </w:rPr>
-          <w:instrText xml:space="preserve"> PAGEREF _Toc243427219 \h </w:instrText>
+          <w:instrText xml:space="preserve"> PAGEREF _Toc243429633 \h </w:instrText>
         </w:r>
         <w:r>
           <w:rPr>
@@ -2961,7 +2961,7 @@
           <w:noProof/>
         </w:rPr>
       </w:pPr>
-      <w:hyperlink w:anchor="_Toc243427220" w:history="1">
+      <w:hyperlink w:anchor="_Toc243429634" w:history="1">
         <w:r>
           <w:rPr>
             <w:rStyle w:val="Hyperlink"/>
@@ -2988,7 +2988,7 @@
             <w:noProof/>
             <w:webHidden/>
           </w:rPr>
-          <w:instrText xml:space="preserve"> PAGEREF _Toc243427220 \h </w:instrText>
+          <w:instrText xml:space="preserve"> PAGEREF _Toc243429634 \h </w:instrText>
         </w:r>
         <w:r>
           <w:rPr>
@@ -3029,7 +3029,7 @@
           <w:noProof/>
         </w:rPr>
       </w:pPr>
-      <w:hyperlink w:anchor="_Toc243427221" w:history="1">
+      <w:hyperlink w:anchor="_Toc243429635" w:history="1">
         <w:r>
           <w:rPr>
             <w:rStyle w:val="Hyperlink"/>
@@ -3056,7 +3056,7 @@
             <w:noProof/>
             <w:webHidden/>
           </w:rPr>
-          <w:instrText xml:space="preserve"> PAGEREF _Toc243427221 \h </w:instrText>
+          <w:instrText xml:space="preserve"> PAGEREF _Toc243429635 \h </w:instrText>
         </w:r>
         <w:r>
           <w:rPr>
@@ -3097,7 +3097,7 @@
           <w:noProof/>
         </w:rPr>
       </w:pPr>
-      <w:hyperlink w:anchor="_Toc243427222" w:history="1">
+      <w:hyperlink w:anchor="_Toc243429636" w:history="1">
         <w:r>
           <w:rPr>
             <w:rStyle w:val="Hyperlink"/>
@@ -3124,7 +3124,7 @@
             <w:noProof/>
             <w:webHidden/>
           </w:rPr>
-          <w:instrText xml:space="preserve"> PAGEREF _Toc243427222 \h </w:instrText>
+          <w:instrText xml:space="preserve"> PAGEREF _Toc243429636 \h </w:instrText>
         </w:r>
         <w:r>
           <w:rPr>
@@ -3144,7 +3144,7 @@
             <w:noProof/>
             <w:webHidden/>
           </w:rPr>
-          <w:t>22</w:t>
+          <w:t>23</w:t>
         </w:r>
         <w:r>
           <w:rPr>
@@ -3165,7 +3165,7 @@
           <w:noProof/>
         </w:rPr>
       </w:pPr>
-      <w:hyperlink w:anchor="_Toc243427223" w:history="1">
+      <w:hyperlink w:anchor="_Toc243429637" w:history="1">
         <w:r>
           <w:rPr>
             <w:rStyle w:val="Hyperlink"/>
@@ -3192,7 +3192,7 @@
             <w:noProof/>
             <w:webHidden/>
           </w:rPr>
-          <w:instrText xml:space="preserve"> PAGEREF _Toc243427223 \h </w:instrText>
+          <w:instrText xml:space="preserve"> PAGEREF _Toc243429637 \h </w:instrText>
         </w:r>
         <w:r>
           <w:rPr>
@@ -3233,7 +3233,7 @@
           <w:noProof/>
         </w:rPr>
       </w:pPr>
-      <w:hyperlink w:anchor="_Toc243427224" w:history="1">
+      <w:hyperlink w:anchor="_Toc243429638" w:history="1">
         <w:r>
           <w:rPr>
             <w:rStyle w:val="Hyperlink"/>
@@ -3260,7 +3260,7 @@
             <w:noProof/>
             <w:webHidden/>
           </w:rPr>
-          <w:instrText xml:space="preserve"> PAGEREF _Toc243427224 \h </w:instrText>
+          <w:instrText xml:space="preserve"> PAGEREF _Toc243429638 \h </w:instrText>
         </w:r>
         <w:r>
           <w:rPr>
@@ -3301,7 +3301,7 @@
           <w:noProof/>
         </w:rPr>
       </w:pPr>
-      <w:hyperlink w:anchor="_Toc243427225" w:history="1">
+      <w:hyperlink w:anchor="_Toc243429639" w:history="1">
         <w:r>
           <w:rPr>
             <w:rStyle w:val="Hyperlink"/>
@@ -3328,7 +3328,7 @@
             <w:noProof/>
             <w:webHidden/>
           </w:rPr>
-          <w:instrText xml:space="preserve"> PAGEREF _Toc243427225 \h </w:instrText>
+          <w:instrText xml:space="preserve"> PAGEREF _Toc243429639 \h </w:instrText>
         </w:r>
         <w:r>
           <w:rPr>
@@ -3369,7 +3369,7 @@
           <w:noProof/>
         </w:rPr>
       </w:pPr>
-      <w:hyperlink w:anchor="_Toc243427226" w:history="1">
+      <w:hyperlink w:anchor="_Toc243429640" w:history="1">
         <w:r>
           <w:rPr>
             <w:rStyle w:val="Hyperlink"/>
@@ -3396,7 +3396,7 @@
             <w:noProof/>
             <w:webHidden/>
           </w:rPr>
-          <w:instrText xml:space="preserve"> PAGEREF _Toc243427226 \h </w:instrText>
+          <w:instrText xml:space="preserve"> PAGEREF _Toc243429640 \h </w:instrText>
         </w:r>
         <w:r>
           <w:rPr>
@@ -3437,7 +3437,7 @@
           <w:noProof/>
         </w:rPr>
       </w:pPr>
-      <w:hyperlink w:anchor="_Toc243427227" w:history="1">
+      <w:hyperlink w:anchor="_Toc243429641" w:history="1">
         <w:r>
           <w:rPr>
             <w:rStyle w:val="Hyperlink"/>
@@ -3464,7 +3464,7 @@
             <w:noProof/>
             <w:webHidden/>
           </w:rPr>
-          <w:instrText xml:space="preserve"> PAGEREF _Toc243427227 \h </w:instrText>
+          <w:instrText xml:space="preserve"> PAGEREF _Toc243429641 \h </w:instrText>
         </w:r>
         <w:r>
           <w:rPr>
@@ -3505,7 +3505,7 @@
           <w:noProof/>
         </w:rPr>
       </w:pPr>
-      <w:hyperlink w:anchor="_Toc243427228" w:history="1">
+      <w:hyperlink w:anchor="_Toc243429642" w:history="1">
         <w:r>
           <w:rPr>
             <w:rStyle w:val="Hyperlink"/>
@@ -3532,7 +3532,7 @@
             <w:noProof/>
             <w:webHidden/>
           </w:rPr>
-          <w:instrText xml:space="preserve"> PAGEREF _Toc243427228 \h </w:instrText>
+          <w:instrText xml:space="preserve"> PAGEREF _Toc243429642 \h </w:instrText>
         </w:r>
         <w:r>
           <w:rPr>
@@ -3573,7 +3573,7 @@
           <w:noProof/>
         </w:rPr>
       </w:pPr>
-      <w:hyperlink w:anchor="_Toc243427229" w:history="1">
+      <w:hyperlink w:anchor="_Toc243429643" w:history="1">
         <w:r>
           <w:rPr>
             <w:rStyle w:val="Hyperlink"/>
@@ -3600,7 +3600,7 @@
             <w:noProof/>
             <w:webHidden/>
           </w:rPr>
-          <w:instrText xml:space="preserve"> PAGEREF _Toc243427229 \h </w:instrText>
+          <w:instrText xml:space="preserve"> PAGEREF _Toc243429643 \h </w:instrText>
         </w:r>
         <w:r>
           <w:rPr>
@@ -3641,7 +3641,7 @@
           <w:noProof/>
         </w:rPr>
       </w:pPr>
-      <w:hyperlink w:anchor="_Toc243427230" w:history="1">
+      <w:hyperlink w:anchor="_Toc243429644" w:history="1">
         <w:r>
           <w:rPr>
             <w:rStyle w:val="Hyperlink"/>
@@ -3668,7 +3668,7 @@
             <w:noProof/>
             <w:webHidden/>
           </w:rPr>
-          <w:instrText xml:space="preserve"> PAGEREF _Toc243427230 \h </w:instrText>
+          <w:instrText xml:space="preserve"> PAGEREF _Toc243429644 \h </w:instrText>
         </w:r>
         <w:r>
           <w:rPr>
@@ -3709,7 +3709,7 @@
           <w:noProof/>
         </w:rPr>
       </w:pPr>
-      <w:hyperlink w:anchor="_Toc243427231" w:history="1">
+      <w:hyperlink w:anchor="_Toc243429645" w:history="1">
         <w:r>
           <w:rPr>
             <w:rStyle w:val="Hyperlink"/>
@@ -3736,7 +3736,7 @@
             <w:noProof/>
             <w:webHidden/>
           </w:rPr>
-          <w:instrText xml:space="preserve"> PAGEREF _Toc243427231 \h </w:instrText>
+          <w:instrText xml:space="preserve"> PAGEREF _Toc243429645 \h </w:instrText>
         </w:r>
         <w:r>
           <w:rPr>
@@ -3777,7 +3777,7 @@
           <w:noProof/>
         </w:rPr>
       </w:pPr>
-      <w:hyperlink w:anchor="_Toc243427232" w:history="1">
+      <w:hyperlink w:anchor="_Toc243429646" w:history="1">
         <w:r>
           <w:rPr>
             <w:rStyle w:val="Hyperlink"/>
@@ -3804,7 +3804,7 @@
             <w:noProof/>
             <w:webHidden/>
           </w:rPr>
-          <w:instrText xml:space="preserve"> PAGEREF _Toc243427232 \h </w:instrText>
+          <w:instrText xml:space="preserve"> PAGEREF _Toc243429646 \h </w:instrText>
         </w:r>
         <w:r>
           <w:rPr>
@@ -3845,7 +3845,7 @@
           <w:noProof/>
         </w:rPr>
       </w:pPr>
-      <w:hyperlink w:anchor="_Toc243427233" w:history="1">
+      <w:hyperlink w:anchor="_Toc243429647" w:history="1">
         <w:r>
           <w:rPr>
             <w:rStyle w:val="Hyperlink"/>
@@ -3872,7 +3872,7 @@
             <w:noProof/>
             <w:webHidden/>
           </w:rPr>
-          <w:instrText xml:space="preserve"> PAGEREF _Toc243427233 \h </w:instrText>
+          <w:instrText xml:space="preserve"> PAGEREF _Toc243429647 \h </w:instrText>
         </w:r>
         <w:r>
           <w:rPr>
@@ -3913,7 +3913,7 @@
           <w:noProof/>
         </w:rPr>
       </w:pPr>
-      <w:hyperlink w:anchor="_Toc243427234" w:history="1">
+      <w:hyperlink w:anchor="_Toc243429648" w:history="1">
         <w:r>
           <w:rPr>
             <w:rStyle w:val="Hyperlink"/>
@@ -3940,7 +3940,7 @@
             <w:noProof/>
             <w:webHidden/>
           </w:rPr>
-          <w:instrText xml:space="preserve"> PAGEREF _Toc243427234 \h </w:instrText>
+          <w:instrText xml:space="preserve"> PAGEREF _Toc243429648 \h </w:instrText>
         </w:r>
         <w:r>
           <w:rPr>
@@ -3981,7 +3981,7 @@
           <w:noProof/>
         </w:rPr>
       </w:pPr>
-      <w:hyperlink w:anchor="_Toc243427235" w:history="1">
+      <w:hyperlink w:anchor="_Toc243429649" w:history="1">
         <w:r>
           <w:rPr>
             <w:rStyle w:val="Hyperlink"/>
@@ -4008,7 +4008,7 @@
             <w:noProof/>
             <w:webHidden/>
           </w:rPr>
-          <w:instrText xml:space="preserve"> PAGEREF _Toc243427235 \h </w:instrText>
+          <w:instrText xml:space="preserve"> PAGEREF _Toc243429649 \h </w:instrText>
         </w:r>
         <w:r>
           <w:rPr>
@@ -4049,7 +4049,7 @@
           <w:noProof/>
         </w:rPr>
       </w:pPr>
-      <w:hyperlink w:anchor="_Toc243427236" w:history="1">
+      <w:hyperlink w:anchor="_Toc243429650" w:history="1">
         <w:r>
           <w:rPr>
             <w:rStyle w:val="Hyperlink"/>
@@ -4076,7 +4076,7 @@
             <w:noProof/>
             <w:webHidden/>
           </w:rPr>
-          <w:instrText xml:space="preserve"> PAGEREF _Toc243427236 \h </w:instrText>
+          <w:instrText xml:space="preserve"> PAGEREF _Toc243429650 \h </w:instrText>
         </w:r>
         <w:r>
           <w:rPr>
@@ -4117,7 +4117,7 @@
           <w:noProof/>
         </w:rPr>
       </w:pPr>
-      <w:hyperlink w:anchor="_Toc243427237" w:history="1">
+      <w:hyperlink w:anchor="_Toc243429651" w:history="1">
         <w:r>
           <w:rPr>
             <w:rStyle w:val="Hyperlink"/>
@@ -4144,7 +4144,7 @@
             <w:noProof/>
             <w:webHidden/>
           </w:rPr>
-          <w:instrText xml:space="preserve"> PAGEREF _Toc243427237 \h </w:instrText>
+          <w:instrText xml:space="preserve"> PAGEREF _Toc243429651 \h </w:instrText>
         </w:r>
         <w:r>
           <w:rPr>
@@ -4185,7 +4185,7 @@
           <w:noProof/>
         </w:rPr>
       </w:pPr>
-      <w:hyperlink w:anchor="_Toc243427238" w:history="1">
+      <w:hyperlink w:anchor="_Toc243429652" w:history="1">
         <w:r>
           <w:rPr>
             <w:rStyle w:val="Hyperlink"/>
@@ -4212,7 +4212,7 @@
             <w:noProof/>
             <w:webHidden/>
           </w:rPr>
-          <w:instrText xml:space="preserve"> PAGEREF _Toc243427238 \h </w:instrText>
+          <w:instrText xml:space="preserve"> PAGEREF _Toc243429652 \h </w:instrText>
         </w:r>
         <w:r>
           <w:rPr>
@@ -4253,7 +4253,7 @@
           <w:noProof/>
         </w:rPr>
       </w:pPr>
-      <w:hyperlink w:anchor="_Toc243427239" w:history="1">
+      <w:hyperlink w:anchor="_Toc243429653" w:history="1">
         <w:r>
           <w:rPr>
             <w:rStyle w:val="Hyperlink"/>
@@ -4280,7 +4280,7 @@
             <w:noProof/>
             <w:webHidden/>
           </w:rPr>
-          <w:instrText xml:space="preserve"> PAGEREF _Toc243427239 \h </w:instrText>
+          <w:instrText xml:space="preserve"> PAGEREF _Toc243429653 \h </w:instrText>
         </w:r>
         <w:r>
           <w:rPr>
@@ -4321,7 +4321,7 @@
           <w:noProof/>
         </w:rPr>
       </w:pPr>
-      <w:hyperlink w:anchor="_Toc243427240" w:history="1">
+      <w:hyperlink w:anchor="_Toc243429654" w:history="1">
         <w:r>
           <w:rPr>
             <w:rStyle w:val="Hyperlink"/>
@@ -4348,7 +4348,7 @@
             <w:noProof/>
             <w:webHidden/>
           </w:rPr>
-          <w:instrText xml:space="preserve"> PAGEREF _Toc243427240 \h </w:instrText>
+          <w:instrText xml:space="preserve"> PAGEREF _Toc243429654 \h </w:instrText>
         </w:r>
         <w:r>
           <w:rPr>
@@ -4389,7 +4389,7 @@
           <w:noProof/>
         </w:rPr>
       </w:pPr>
-      <w:hyperlink w:anchor="_Toc243427241" w:history="1">
+      <w:hyperlink w:anchor="_Toc243429655" w:history="1">
         <w:r>
           <w:rPr>
             <w:rStyle w:val="Hyperlink"/>
@@ -4416,7 +4416,7 @@
             <w:noProof/>
             <w:webHidden/>
           </w:rPr>
-          <w:instrText xml:space="preserve"> PAGEREF _Toc243427241 \h </w:instrText>
+          <w:instrText xml:space="preserve"> PAGEREF _Toc243429655 \h </w:instrText>
         </w:r>
         <w:r>
           <w:rPr>
@@ -4457,7 +4457,7 @@
           <w:noProof/>
         </w:rPr>
       </w:pPr>
-      <w:hyperlink w:anchor="_Toc243427242" w:history="1">
+      <w:hyperlink w:anchor="_Toc243429656" w:history="1">
         <w:r>
           <w:rPr>
             <w:rStyle w:val="Hyperlink"/>
@@ -4484,7 +4484,7 @@
             <w:noProof/>
             <w:webHidden/>
           </w:rPr>
-          <w:instrText xml:space="preserve"> PAGEREF _Toc243427242 \h </w:instrText>
+          <w:instrText xml:space="preserve"> PAGEREF _Toc243429656 \h </w:instrText>
         </w:r>
         <w:r>
           <w:rPr>
@@ -4525,7 +4525,7 @@
           <w:noProof/>
         </w:rPr>
       </w:pPr>
-      <w:hyperlink w:anchor="_Toc243427243" w:history="1">
+      <w:hyperlink w:anchor="_Toc243429657" w:history="1">
         <w:r>
           <w:rPr>
             <w:rStyle w:val="Hyperlink"/>
@@ -4552,7 +4552,7 @@
             <w:noProof/>
             <w:webHidden/>
           </w:rPr>
-          <w:instrText xml:space="preserve"> PAGEREF _Toc243427243 \h </w:instrText>
+          <w:instrText xml:space="preserve"> PAGEREF _Toc243429657 \h </w:instrText>
         </w:r>
         <w:r>
           <w:rPr>
@@ -4593,7 +4593,7 @@
           <w:noProof/>
         </w:rPr>
       </w:pPr>
-      <w:hyperlink w:anchor="_Toc243427244" w:history="1">
+      <w:hyperlink w:anchor="_Toc243429658" w:history="1">
         <w:r>
           <w:rPr>
             <w:rStyle w:val="Hyperlink"/>
@@ -4620,7 +4620,7 @@
             <w:noProof/>
             <w:webHidden/>
           </w:rPr>
-          <w:instrText xml:space="preserve"> PAGEREF _Toc243427244 \h </w:instrText>
+          <w:instrText xml:space="preserve"> PAGEREF _Toc243429658 \h </w:instrText>
         </w:r>
         <w:r>
           <w:rPr>
@@ -4661,7 +4661,7 @@
           <w:noProof/>
         </w:rPr>
       </w:pPr>
-      <w:hyperlink w:anchor="_Toc243427245" w:history="1">
+      <w:hyperlink w:anchor="_Toc243429659" w:history="1">
         <w:r>
           <w:rPr>
             <w:rStyle w:val="Hyperlink"/>
@@ -4688,7 +4688,7 @@
             <w:noProof/>
             <w:webHidden/>
           </w:rPr>
-          <w:instrText xml:space="preserve"> PAGEREF _Toc243427245 \h </w:instrText>
+          <w:instrText xml:space="preserve"> PAGEREF _Toc243429659 \h </w:instrText>
         </w:r>
         <w:r>
           <w:rPr>
@@ -4729,7 +4729,7 @@
           <w:noProof/>
         </w:rPr>
       </w:pPr>
-      <w:hyperlink w:anchor="_Toc243427246" w:history="1">
+      <w:hyperlink w:anchor="_Toc243429660" w:history="1">
         <w:r>
           <w:rPr>
             <w:rStyle w:val="Hyperlink"/>
@@ -4756,7 +4756,7 @@
             <w:noProof/>
             <w:webHidden/>
           </w:rPr>
-          <w:instrText xml:space="preserve"> PAGEREF _Toc243427246 \h </w:instrText>
+          <w:instrText xml:space="preserve"> PAGEREF _Toc243429660 \h </w:instrText>
         </w:r>
         <w:r>
           <w:rPr>
@@ -4776,7 +4776,7 @@
             <w:noProof/>
             <w:webHidden/>
           </w:rPr>
-          <w:t>34</w:t>
+          <w:t>33</w:t>
         </w:r>
         <w:r>
           <w:rPr>
@@ -4797,7 +4797,7 @@
           <w:noProof/>
         </w:rPr>
       </w:pPr>
-      <w:hyperlink w:anchor="_Toc243427247" w:history="1">
+      <w:hyperlink w:anchor="_Toc243429661" w:history="1">
         <w:r>
           <w:rPr>
             <w:rStyle w:val="Hyperlink"/>
@@ -4824,7 +4824,7 @@
             <w:noProof/>
             <w:webHidden/>
           </w:rPr>
-          <w:instrText xml:space="preserve"> PAGEREF _Toc243427247 \h </w:instrText>
+          <w:instrText xml:space="preserve"> PAGEREF _Toc243429661 \h </w:instrText>
         </w:r>
         <w:r>
           <w:rPr>
@@ -4865,7 +4865,7 @@
           <w:noProof/>
         </w:rPr>
       </w:pPr>
-      <w:hyperlink w:anchor="_Toc243427248" w:history="1">
+      <w:hyperlink w:anchor="_Toc243429662" w:history="1">
         <w:r>
           <w:rPr>
             <w:rStyle w:val="Hyperlink"/>
@@ -4892,7 +4892,7 @@
             <w:noProof/>
             <w:webHidden/>
           </w:rPr>
-          <w:instrText xml:space="preserve"> PAGEREF _Toc243427248 \h </w:instrText>
+          <w:instrText xml:space="preserve"> PAGEREF _Toc243429662 \h </w:instrText>
         </w:r>
         <w:r>
           <w:rPr>
@@ -4933,7 +4933,7 @@
         <w:pStyle w:val="Heading1"/>
         <w:pageBreakBefore/>
       </w:pPr>
-      <w:bookmarkStart w:id="0" w:name="_Toc243427184"/>
+      <w:bookmarkStart w:id="0" w:name="_Toc243429598"/>
       <w:r>
         <w:lastRenderedPageBreak/>
         <w:t>How to Use This Document</w:t>
@@ -5267,7 +5267,7 @@
         <w:pStyle w:val="Heading1"/>
         <w:pageBreakBefore/>
       </w:pPr>
-      <w:bookmarkStart w:id="1" w:name="_Toc243427185"/>
+      <w:bookmarkStart w:id="1" w:name="_Toc243429599"/>
       <w:r>
         <w:lastRenderedPageBreak/>
         <w:t>1. Abstract</w:t>
@@ -5321,7 +5321,7 @@
       <w:pPr>
         <w:pStyle w:val="Heading1"/>
       </w:pPr>
-      <w:bookmarkStart w:id="2" w:name="_Toc243427186"/>
+      <w:bookmarkStart w:id="2" w:name="_Toc243429600"/>
       <w:r>
         <w:t>2. Introduction</w:t>
       </w:r>
@@ -5351,7 +5351,7 @@
       <w:pPr>
         <w:pStyle w:val="Heading2"/>
       </w:pPr>
-      <w:bookmarkStart w:id="3" w:name="_Toc243427187"/>
+      <w:bookmarkStart w:id="3" w:name="_Toc243429601"/>
       <w:r>
         <w:t>2.1 Home Assistant</w:t>
       </w:r>
@@ -5403,7 +5403,7 @@
       <w:pPr>
         <w:pStyle w:val="Heading2"/>
       </w:pPr>
-      <w:bookmarkStart w:id="4" w:name="_Toc243427188"/>
+      <w:bookmarkStart w:id="4" w:name="_Toc243429602"/>
       <w:r>
         <w:t>2.2 Literature survey</w:t>
       </w:r>
@@ -5888,7 +5888,7 @@
       <w:pPr>
         <w:pStyle w:val="Heading1"/>
       </w:pPr>
-      <w:bookmarkStart w:id="5" w:name="_Toc243427189"/>
+      <w:bookmarkStart w:id="5" w:name="_Toc243429603"/>
       <w:r>
         <w:t>3. Problem Statement</w:t>
       </w:r>
@@ -6001,7 +6001,7 @@
       <w:pPr>
         <w:pStyle w:val="Heading1"/>
       </w:pPr>
-      <w:bookmarkStart w:id="6" w:name="_Toc243427190"/>
+      <w:bookmarkStart w:id="6" w:name="_Toc243429604"/>
       <w:r>
         <w:lastRenderedPageBreak/>
         <w:t>4. Objectives</w:t>
@@ -6142,7 +6142,7 @@
       <w:pPr>
         <w:pStyle w:val="Heading1"/>
       </w:pPr>
-      <w:bookmarkStart w:id="7" w:name="_Toc243427191"/>
+      <w:bookmarkStart w:id="7" w:name="_Toc243429605"/>
       <w:r>
         <w:t>5. Existing Systems and Their Limitations</w:t>
       </w:r>
@@ -6411,7 +6411,7 @@
       <w:pPr>
         <w:pStyle w:val="Heading2"/>
       </w:pPr>
-      <w:bookmarkStart w:id="8" w:name="_Toc243427192"/>
+      <w:bookmarkStart w:id="8" w:name="_Toc243429606"/>
       <w:r>
         <w:t>5.1 Why the MQTT approach was rejected</w:t>
       </w:r>
@@ -6449,7 +6449,7 @@
       <w:pPr>
         <w:pStyle w:val="Heading2"/>
       </w:pPr>
-      <w:bookmarkStart w:id="9" w:name="_Toc243427193"/>
+      <w:bookmarkStart w:id="9" w:name="_Toc243429607"/>
       <w:r>
         <w:t>5.2 The three designs the project went through</w:t>
       </w:r>
@@ -6780,7 +6780,7 @@
       <w:pPr>
         <w:pStyle w:val="Heading1"/>
       </w:pPr>
-      <w:bookmarkStart w:id="10" w:name="_Toc243427194"/>
+      <w:bookmarkStart w:id="10" w:name="_Toc243429608"/>
       <w:r>
         <w:t>6. Proposed System</w:t>
       </w:r>
@@ -6858,7 +6858,7 @@
       <w:pPr>
         <w:pStyle w:val="Heading2"/>
       </w:pPr>
-      <w:bookmarkStart w:id="11" w:name="_Toc243427195"/>
+      <w:bookmarkStart w:id="11" w:name="_Toc243429609"/>
       <w:r>
         <w:t>6.1 The memory constraint and the split architecture</w:t>
       </w:r>
@@ -6962,7 +6962,7 @@
       <w:pPr>
         <w:pStyle w:val="Heading2"/>
       </w:pPr>
-      <w:bookmarkStart w:id="12" w:name="_Toc243427196"/>
+      <w:bookmarkStart w:id="12" w:name="_Toc243429610"/>
       <w:r>
         <w:lastRenderedPageBreak/>
         <w:t>6.2 The layout is data, not code</w:t>
@@ -7129,7 +7129,7 @@
         <w:pStyle w:val="Heading1"/>
         <w:pageBreakBefore/>
       </w:pPr>
-      <w:bookmarkStart w:id="13" w:name="_Toc243427197"/>
+      <w:bookmarkStart w:id="13" w:name="_Toc243429611"/>
       <w:r>
         <w:lastRenderedPageBreak/>
         <w:t>7. System Architecture</w:t>
@@ -7145,7 +7145,7 @@
       <w:pPr>
         <w:pStyle w:val="Heading2"/>
       </w:pPr>
-      <w:bookmarkStart w:id="14" w:name="_Toc243427198"/>
+      <w:bookmarkStart w:id="14" w:name="_Toc243429612"/>
       <w:r>
         <w:t>7.1 Overall system diagram</w:t>
       </w:r>
@@ -7162,7 +7162,7 @@
           <w:noProof/>
         </w:rPr>
         <w:drawing>
-          <wp:inline distT="0" distB="0" distL="0" distR="0" wp14:anchorId="677F1A57" wp14:editId="12225752">
+          <wp:inline distT="0" distB="0" distL="0" distR="0" wp14:anchorId="05BF5F08" wp14:editId="19AD7C6B">
             <wp:extent cx="5760000" cy="3246545"/>
             <wp:effectExtent l="0" t="0" r="0" b="0"/>
             <wp:docPr id="1" name="Picture 1"/>
@@ -7255,7 +7255,7 @@
       <w:pPr>
         <w:pStyle w:val="Heading2"/>
       </w:pPr>
-      <w:bookmarkStart w:id="15" w:name="_Toc243427199"/>
+      <w:bookmarkStart w:id="15" w:name="_Toc243429613"/>
       <w:r>
         <w:lastRenderedPageBreak/>
         <w:t>7.2 Hardware diagram</w:t>
@@ -7273,7 +7273,7 @@
           <w:noProof/>
         </w:rPr>
         <w:drawing>
-          <wp:inline distT="0" distB="0" distL="0" distR="0" wp14:anchorId="4A7CA4DA" wp14:editId="2ACD24A6">
+          <wp:inline distT="0" distB="0" distL="0" distR="0" wp14:anchorId="2F8AC56D" wp14:editId="79C4B50B">
             <wp:extent cx="5580000" cy="3195818"/>
             <wp:effectExtent l="0" t="0" r="0" b="0"/>
             <wp:docPr id="2" name="Picture 2"/>
@@ -7339,7 +7339,7 @@
       <w:pPr>
         <w:pStyle w:val="Heading2"/>
       </w:pPr>
-      <w:bookmarkStart w:id="16" w:name="_Toc243427200"/>
+      <w:bookmarkStart w:id="16" w:name="_Toc243429614"/>
       <w:r>
         <w:t>7.3 Software diagram</w:t>
       </w:r>
@@ -7356,7 +7356,7 @@
           <w:noProof/>
         </w:rPr>
         <w:drawing>
-          <wp:inline distT="0" distB="0" distL="0" distR="0" wp14:anchorId="1B03CBE6" wp14:editId="7BB1F6FD">
+          <wp:inline distT="0" distB="0" distL="0" distR="0" wp14:anchorId="0A626E05" wp14:editId="7D237594">
             <wp:extent cx="5760000" cy="3015000"/>
             <wp:effectExtent l="0" t="0" r="0" b="0"/>
             <wp:docPr id="3" name="Picture 3"/>
@@ -7426,7 +7426,7 @@
       <w:pPr>
         <w:pStyle w:val="Heading2"/>
       </w:pPr>
-      <w:bookmarkStart w:id="17" w:name="_Toc243427201"/>
+      <w:bookmarkStart w:id="17" w:name="_Toc243429615"/>
       <w:r>
         <w:t>7.4 Block diagram</w:t>
       </w:r>
@@ -7443,7 +7443,7 @@
           <w:noProof/>
         </w:rPr>
         <w:drawing>
-          <wp:inline distT="0" distB="0" distL="0" distR="0" wp14:anchorId="755D5034" wp14:editId="17DAC451">
+          <wp:inline distT="0" distB="0" distL="0" distR="0" wp14:anchorId="54629EB5" wp14:editId="666F6DFA">
             <wp:extent cx="5760000" cy="2625488"/>
             <wp:effectExtent l="0" t="0" r="0" b="0"/>
             <wp:docPr id="4" name="Picture 4"/>
@@ -7505,7 +7505,7 @@
         <w:pStyle w:val="Heading1"/>
         <w:pageBreakBefore/>
       </w:pPr>
-      <w:bookmarkStart w:id="18" w:name="_Toc243427202"/>
+      <w:bookmarkStart w:id="18" w:name="_Toc243429616"/>
       <w:r>
         <w:lastRenderedPageBreak/>
         <w:t>8. Hardware Description</w:t>
@@ -7530,7 +7530,7 @@
       <w:pPr>
         <w:pStyle w:val="Heading2"/>
       </w:pPr>
-      <w:bookmarkStart w:id="19" w:name="_Toc243427203"/>
+      <w:bookmarkStart w:id="19" w:name="_Toc243429617"/>
       <w:r>
         <w:t>8.1 Components</w:t>
       </w:r>
@@ -8034,7 +8034,7 @@
       <w:pPr>
         <w:pStyle w:val="Heading2"/>
       </w:pPr>
-      <w:bookmarkStart w:id="20" w:name="_Toc243427204"/>
+      <w:bookmarkStart w:id="20" w:name="_Toc243429618"/>
       <w:r>
         <w:t>8.2 Pin assignment</w:t>
       </w:r>
@@ -8806,7 +8806,7 @@
       <w:pPr>
         <w:pStyle w:val="Heading2"/>
       </w:pPr>
-      <w:bookmarkStart w:id="21" w:name="_Toc243427205"/>
+      <w:bookmarkStart w:id="21" w:name="_Toc243429619"/>
       <w:r>
         <w:t>8.3 Batch variation in this board family</w:t>
       </w:r>
@@ -9041,7 +9041,7 @@
         <w:pStyle w:val="Heading1"/>
         <w:pageBreakBefore/>
       </w:pPr>
-      <w:bookmarkStart w:id="22" w:name="_Toc243427206"/>
+      <w:bookmarkStart w:id="22" w:name="_Toc243429620"/>
       <w:r>
         <w:lastRenderedPageBreak/>
         <w:t>9. Software Description</w:t>
@@ -9052,7 +9052,7 @@
       <w:pPr>
         <w:pStyle w:val="Heading2"/>
       </w:pPr>
-      <w:bookmarkStart w:id="23" w:name="_Toc243427207"/>
+      <w:bookmarkStart w:id="23" w:name="_Toc243429621"/>
       <w:r>
         <w:t>9.1 Panel firmware: environment and libraries</w:t>
       </w:r>
@@ -9733,7 +9733,7 @@
       <w:pPr>
         <w:pStyle w:val="Heading2"/>
       </w:pPr>
-      <w:bookmarkStart w:id="24" w:name="_Toc243427208"/>
+      <w:bookmarkStart w:id="24" w:name="_Toc243429622"/>
       <w:r>
         <w:t>9.2 Desktop designer: environment and libraries</w:t>
       </w:r>
@@ -10159,7 +10159,7 @@
       <w:pPr>
         <w:pStyle w:val="Heading2"/>
       </w:pPr>
-      <w:bookmarkStart w:id="25" w:name="_Toc243427209"/>
+      <w:bookmarkStart w:id="25" w:name="_Toc243429623"/>
       <w:r>
         <w:t>9.3 Source code organisation</w:t>
       </w:r>
@@ -10856,7 +10856,7 @@
       <w:pPr>
         <w:pStyle w:val="Heading2"/>
       </w:pPr>
-      <w:bookmarkStart w:id="26" w:name="_Toc243427210"/>
+      <w:bookmarkStart w:id="26" w:name="_Toc243429624"/>
       <w:r>
         <w:t>9.4 The transport interface</w:t>
       </w:r>
@@ -11080,7 +11080,7 @@
         <w:pStyle w:val="Heading1"/>
         <w:pageBreakBefore/>
       </w:pPr>
-      <w:bookmarkStart w:id="27" w:name="_Toc243427211"/>
+      <w:bookmarkStart w:id="27" w:name="_Toc243429625"/>
       <w:r>
         <w:lastRenderedPageBreak/>
         <w:t>10. Implementation</w:t>
@@ -11091,7 +11091,7 @@
       <w:pPr>
         <w:pStyle w:val="Heading2"/>
       </w:pPr>
-      <w:bookmarkStart w:id="28" w:name="_Toc243427212"/>
+      <w:bookmarkStart w:id="28" w:name="_Toc243429626"/>
       <w:r>
         <w:t>10.1 The communication protocol</w:t>
       </w:r>
@@ -11340,7 +11340,7 @@
           <w:noProof/>
         </w:rPr>
         <w:drawing>
-          <wp:inline distT="0" distB="0" distL="0" distR="0" wp14:anchorId="3EAA20C8" wp14:editId="1FB86BD4">
+          <wp:inline distT="0" distB="0" distL="0" distR="0" wp14:anchorId="5BDB030F" wp14:editId="7C113E39">
             <wp:extent cx="3240000" cy="3536229"/>
             <wp:effectExtent l="0" t="0" r="0" b="0"/>
             <wp:docPr id="5" name="Picture 5"/>
@@ -11412,7 +11412,7 @@
       <w:pPr>
         <w:pStyle w:val="Heading2"/>
       </w:pPr>
-      <w:bookmarkStart w:id="29" w:name="_Toc243427213"/>
+      <w:bookmarkStart w:id="29" w:name="_Toc243429627"/>
       <w:r>
         <w:lastRenderedPageBreak/>
         <w:t>10.2 Task structure and interface responsiveness</w:t>
@@ -11507,7 +11507,7 @@
       <w:pPr>
         <w:pStyle w:val="Heading2"/>
       </w:pPr>
-      <w:bookmarkStart w:id="30" w:name="_Toc243427214"/>
+      <w:bookmarkStart w:id="30" w:name="_Toc243429628"/>
       <w:r>
         <w:t>10.3 Memory strategy</w:t>
       </w:r>
@@ -11612,7 +11612,7 @@
       <w:pPr>
         <w:pStyle w:val="Heading2"/>
       </w:pPr>
-      <w:bookmarkStart w:id="31" w:name="_Toc243427215"/>
+      <w:bookmarkStart w:id="31" w:name="_Toc243429629"/>
       <w:r>
         <w:t>10.4 Touch coordinate handling</w:t>
       </w:r>
@@ -11627,7 +11627,7 @@
       <w:pPr>
         <w:pStyle w:val="Heading2"/>
       </w:pPr>
-      <w:bookmarkStart w:id="32" w:name="_Toc243427216"/>
+      <w:bookmarkStart w:id="32" w:name="_Toc243429630"/>
       <w:r>
         <w:t>10.5 Receiving and storing a layout</w:t>
       </w:r>
@@ -11753,7 +11753,7 @@
       <w:pPr>
         <w:pStyle w:val="Heading2"/>
       </w:pPr>
-      <w:bookmarkStart w:id="33" w:name="_Toc243427217"/>
+      <w:bookmarkStart w:id="33" w:name="_Toc243429631"/>
       <w:r>
         <w:t>10.6 The user interface</w:t>
       </w:r>
@@ -11761,7 +11761,7 @@
     </w:p>
     <w:p>
       <w:r>
-        <w:t>A header shows the page title, that room's temperature and humidity, and a connection dot (green: online; amber: Wi-Fi but no server; red: no Wi-Fi). Pages swipe sideways: a Home page of favourites, then one page per room, each with up to six tiles in two columns. Swiping up opens an Automations screen for scenes, scripts and automations.</w:t>
+        <w:t>A header shows the page title, that room's temperature and humidity, and a connection dot (green: online; amber: Wi-Fi but no server; red: no Wi-Fi). Pages swipe sideways: a Home page of favourites, then up to six more pages — by default one per room, but any page the designer names — each with up to six tiles in two columns. Swiping up opens an Automations screen for scenes, scripts and automations.</w:t>
       </w:r>
     </w:p>
     <w:p>
@@ -11775,7 +11775,7 @@
           <w:noProof/>
         </w:rPr>
         <w:drawing>
-          <wp:inline distT="0" distB="0" distL="0" distR="0" wp14:anchorId="010D6F53" wp14:editId="7B746551">
+          <wp:inline distT="0" distB="0" distL="0" distR="0" wp14:anchorId="3C8D0080" wp14:editId="085908A4">
             <wp:extent cx="5400000" cy="2006192"/>
             <wp:effectExtent l="0" t="0" r="0" b="0"/>
             <wp:docPr id="6" name="Picture 6"/>
@@ -11919,7 +11919,7 @@
         </w:rPr>
         <w:lastRenderedPageBreak/>
         <w:drawing>
-          <wp:inline distT="0" distB="0" distL="0" distR="0" wp14:anchorId="3B5FCE09" wp14:editId="65700D27">
+          <wp:inline distT="0" distB="0" distL="0" distR="0" wp14:anchorId="5AAD42C2" wp14:editId="43E6FBBF">
             <wp:extent cx="4860000" cy="3667362"/>
             <wp:effectExtent l="0" t="0" r="0" b="0"/>
             <wp:docPr id="7" name="Picture 7"/>
@@ -11980,7 +11980,7 @@
       <w:pPr>
         <w:pStyle w:val="Heading2"/>
       </w:pPr>
-      <w:bookmarkStart w:id="34" w:name="_Toc243427218"/>
+      <w:bookmarkStart w:id="34" w:name="_Toc243429632"/>
       <w:r>
         <w:t>10.7 Themes</w:t>
       </w:r>
@@ -12003,7 +12003,7 @@
         </w:rPr>
         <w:lastRenderedPageBreak/>
         <w:drawing>
-          <wp:inline distT="0" distB="0" distL="0" distR="0" wp14:anchorId="16B581DD" wp14:editId="4C43B5F4">
+          <wp:inline distT="0" distB="0" distL="0" distR="0" wp14:anchorId="0F549E1D" wp14:editId="3C427C34">
             <wp:extent cx="4500000" cy="5739130"/>
             <wp:effectExtent l="0" t="0" r="0" b="0"/>
             <wp:docPr id="8" name="Picture 8"/>
@@ -12064,7 +12064,7 @@
       <w:pPr>
         <w:pStyle w:val="Heading2"/>
       </w:pPr>
-      <w:bookmarkStart w:id="35" w:name="_Toc243427219"/>
+      <w:bookmarkStart w:id="35" w:name="_Toc243429633"/>
       <w:r>
         <w:t>10.8 A panel that explains its own failures</w:t>
       </w:r>
@@ -12090,7 +12090,7 @@
         <w:pStyle w:val="Heading1"/>
         <w:pageBreakBefore/>
       </w:pPr>
-      <w:bookmarkStart w:id="36" w:name="_Toc243427220"/>
+      <w:bookmarkStart w:id="36" w:name="_Toc243429634"/>
       <w:r>
         <w:lastRenderedPageBreak/>
         <w:t>11. The HomeMesh Designer (Desktop App)</w:t>
@@ -12113,7 +12113,7 @@
           <w:noProof/>
         </w:rPr>
         <w:drawing>
-          <wp:inline distT="0" distB="0" distL="0" distR="0" wp14:anchorId="5CA83418" wp14:editId="3BE3707C">
+          <wp:inline distT="0" distB="0" distL="0" distR="0" wp14:anchorId="5DA39D2C" wp14:editId="68D1895B">
             <wp:extent cx="5760000" cy="3637895"/>
             <wp:effectExtent l="0" t="0" r="0" b="0"/>
             <wp:docPr id="9" name="Picture 9"/>
@@ -12174,7 +12174,7 @@
       <w:pPr>
         <w:pStyle w:val="Heading2"/>
       </w:pPr>
-      <w:bookmarkStart w:id="37" w:name="_Toc243427221"/>
+      <w:bookmarkStart w:id="37" w:name="_Toc243429635"/>
       <w:r>
         <w:t>11.1 What it does</w:t>
       </w:r>
@@ -12192,7 +12192,7 @@
         <w:t>Connects to Home Assistant</w:t>
       </w:r>
       <w:r>
-        <w:t xml:space="preserve"> and lists every entity the panel can drive, grouped by room. Lights, switches, fans and helper switches are controllable; scenes, scripts and automations are actions; sensors are kept only if they measure temperature or humidity. Entities with no room are shown but cannot be placed, because the panel's pages are rooms.</w:t>
+        <w:t xml:space="preserve"> and lists every entity the panel can drive, grouped by room. Lights, switches, fans and helper switches are controllable; scenes, scripts and automations are actions; sensors are kept only if they measure temperature or humidity.</w:t>
       </w:r>
     </w:p>
     <w:p>
@@ -12207,7 +12207,22 @@
         <w:t>Pick and arrange:</w:t>
       </w:r>
       <w:r>
-        <w:t xml:space="preserve"> tick a device to place it, star it for the Home page, choose its icon, drag tiles to reorder within a room, and move whole rooms up and down.</w:t>
+        <w:t xml:space="preserve"> tick a device to place it, star it for the Home page, choose its icon, drag tiles to reorder, and move whole pages up and down.</w:t>
+      </w:r>
+    </w:p>
+    <w:p>
+      <w:pPr>
+        <w:pStyle w:val="ListBullet"/>
+        <w:spacing w:after="60"/>
+      </w:pPr>
+      <w:r>
+        <w:rPr>
+          <w:b/>
+        </w:rPr>
+        <w:t>Pages are yours, not just Home Assistant's rooms.</w:t>
+      </w:r>
+      <w:r>
+        <w:t xml:space="preserve"> Each device has a page chooser that starts at its room; put it on any page instead, make new pages, rename them ("Living Room" can be "Lounge" on the panel), or drag a tile onto another page. A device with no room in Home Assistant is placed by choosing a page for it. The temperature and humidity shown in a page's header can be chosen the same way. To the panel a page is just a name, so none of this needed a firmware change.</w:t>
       </w:r>
     </w:p>
     <w:p>
@@ -12292,8 +12307,9 @@
       <w:pPr>
         <w:pStyle w:val="Heading2"/>
       </w:pPr>
-      <w:bookmarkStart w:id="38" w:name="_Toc243427222"/>
-      <w:r>
+      <w:bookmarkStart w:id="38" w:name="_Toc243429636"/>
+      <w:r>
+        <w:lastRenderedPageBreak/>
         <w:t>11.2 The simulator is the real interface</w:t>
       </w:r>
       <w:bookmarkEnd w:id="38"/>
@@ -12310,11 +12326,7 @@
         <w:t>dashboard.cpp</w:t>
       </w:r>
       <w:r>
-        <w:t xml:space="preserve">, LVGL 8.3, the icon fonts and the layout validator — compiled to WebAssembly with Emscripten against the </w:t>
-      </w:r>
-      <w:r>
-        <w:lastRenderedPageBreak/>
-        <w:t>firmware's own configuration. Same pixels, same fonts, same 16-bit colour, the same 40 KB graphics memory, and the same validator: if the simulator rejects a layout, the panel would too, with the same message. Nothing in the firmware source is copied or changed for it.</w:t>
+        <w:t>, LVGL 8.3, the icon fonts and the layout validator — compiled to WebAssembly with Emscripten against the firmware's own configuration. Same pixels, same fonts, same 16-bit colour, the same 40 KB graphics memory, and the same validator: if the simulator rejects a layout, the panel would too, with the same message. Nothing in the firmware source is copied or changed for it.</w:t>
       </w:r>
     </w:p>
     <w:p>
@@ -12326,7 +12338,7 @@
       <w:pPr>
         <w:pStyle w:val="Heading2"/>
       </w:pPr>
-      <w:bookmarkStart w:id="39" w:name="_Toc243427223"/>
+      <w:bookmarkStart w:id="39" w:name="_Toc243429637"/>
       <w:r>
         <w:t>11.3 How the designer is tested</w:t>
       </w:r>
@@ -12392,7 +12404,7 @@
         <w:pStyle w:val="Heading1"/>
         <w:pageBreakBefore/>
       </w:pPr>
-      <w:bookmarkStart w:id="40" w:name="_Toc243427224"/>
+      <w:bookmarkStart w:id="40" w:name="_Toc243429638"/>
       <w:r>
         <w:lastRenderedPageBreak/>
         <w:t>12. System Operation</w:t>
@@ -12403,7 +12415,7 @@
       <w:pPr>
         <w:pStyle w:val="Heading2"/>
       </w:pPr>
-      <w:bookmarkStart w:id="41" w:name="_Toc243427225"/>
+      <w:bookmarkStart w:id="41" w:name="_Toc243429639"/>
       <w:r>
         <w:t>12.1 Network configuration</w:t>
       </w:r>
@@ -12731,7 +12743,7 @@
       <w:pPr>
         <w:pStyle w:val="Heading2"/>
       </w:pPr>
-      <w:bookmarkStart w:id="42" w:name="_Toc243427226"/>
+      <w:bookmarkStart w:id="42" w:name="_Toc243429640"/>
       <w:r>
         <w:t>12.2 Devices on the panel</w:t>
       </w:r>
@@ -13037,7 +13049,7 @@
       <w:pPr>
         <w:pStyle w:val="Heading2"/>
       </w:pPr>
-      <w:bookmarkStart w:id="43" w:name="_Toc243427227"/>
+      <w:bookmarkStart w:id="43" w:name="_Toc243429641"/>
       <w:r>
         <w:t>12.3 Changing what the panel shows</w:t>
       </w:r>
@@ -13072,7 +13084,7 @@
       </w:r>
       <w:r>
         <w:tab/>
-        <w:t>Tick, star, rename, reorder and colour. The simulated panel updates as you go.</w:t>
+        <w:t>Tick, star, rename, reorder and colour; choose or create a page for any device. The simulated panel updates as you go.</w:t>
       </w:r>
     </w:p>
     <w:p>
@@ -13130,7 +13142,7 @@
         <w:pStyle w:val="Heading1"/>
         <w:pageBreakBefore/>
       </w:pPr>
-      <w:bookmarkStart w:id="44" w:name="_Toc243427228"/>
+      <w:bookmarkStart w:id="44" w:name="_Toc243429642"/>
       <w:r>
         <w:lastRenderedPageBreak/>
         <w:t>13. Testing and Results</w:t>
@@ -13146,7 +13158,7 @@
       <w:pPr>
         <w:pStyle w:val="Heading2"/>
       </w:pPr>
-      <w:bookmarkStart w:id="45" w:name="_Toc243427229"/>
+      <w:bookmarkStart w:id="45" w:name="_Toc243429643"/>
       <w:r>
         <w:t>13.1 Message size and latency</w:t>
       </w:r>
@@ -13540,7 +13552,7 @@
           <w:noProof/>
         </w:rPr>
         <w:drawing>
-          <wp:inline distT="0" distB="0" distL="0" distR="0" wp14:anchorId="1F5F10E0" wp14:editId="1D173453">
+          <wp:inline distT="0" distB="0" distL="0" distR="0" wp14:anchorId="498F693C" wp14:editId="1DC50255">
             <wp:extent cx="3960000" cy="1998857"/>
             <wp:effectExtent l="0" t="0" r="0" b="0"/>
             <wp:docPr id="10" name="Picture 10"/>
@@ -13606,7 +13618,7 @@
       <w:pPr>
         <w:pStyle w:val="Heading2"/>
       </w:pPr>
-      <w:bookmarkStart w:id="46" w:name="_Toc243427230"/>
+      <w:bookmarkStart w:id="46" w:name="_Toc243429644"/>
       <w:r>
         <w:t>13.2 Resource usage</w:t>
       </w:r>
@@ -13918,7 +13930,7 @@
       <w:pPr>
         <w:pStyle w:val="Heading2"/>
       </w:pPr>
-      <w:bookmarkStart w:id="47" w:name="_Toc243427231"/>
+      <w:bookmarkStart w:id="47" w:name="_Toc243429645"/>
       <w:r>
         <w:t>13.3 Functional verification</w:t>
       </w:r>
@@ -14495,7 +14507,7 @@
       <w:pPr>
         <w:pStyle w:val="Heading2"/>
       </w:pPr>
-      <w:bookmarkStart w:id="48" w:name="_Toc243427232"/>
+      <w:bookmarkStart w:id="48" w:name="_Toc243429646"/>
       <w:r>
         <w:t>13.4 Field case study: the connection that kept dropping</w:t>
       </w:r>
@@ -14591,7 +14603,7 @@
       <w:pPr>
         <w:pStyle w:val="Heading2"/>
       </w:pPr>
-      <w:bookmarkStart w:id="49" w:name="_Toc243427233"/>
+      <w:bookmarkStart w:id="49" w:name="_Toc243429647"/>
       <w:r>
         <w:lastRenderedPageBreak/>
         <w:t>13.5 Other challenges and their resolution</w:t>
@@ -15131,7 +15143,7 @@
       <w:pPr>
         <w:pStyle w:val="Heading1"/>
       </w:pPr>
-      <w:bookmarkStart w:id="50" w:name="_Toc243427234"/>
+      <w:bookmarkStart w:id="50" w:name="_Toc243429648"/>
       <w:r>
         <w:t>14. Future Scope</w:t>
       </w:r>
@@ -15249,7 +15261,7 @@
       <w:pPr>
         <w:pStyle w:val="Heading1"/>
       </w:pPr>
-      <w:bookmarkStart w:id="51" w:name="_Toc243427235"/>
+      <w:bookmarkStart w:id="51" w:name="_Toc243429649"/>
       <w:r>
         <w:t>15. Conclusion</w:t>
       </w:r>
@@ -15305,7 +15317,7 @@
       <w:pPr>
         <w:pStyle w:val="Heading1"/>
       </w:pPr>
-      <w:bookmarkStart w:id="52" w:name="_Toc243427236"/>
+      <w:bookmarkStart w:id="52" w:name="_Toc243429650"/>
       <w:r>
         <w:t>16. References</w:t>
       </w:r>
@@ -15315,7 +15327,7 @@
       <w:pPr>
         <w:pStyle w:val="Heading2"/>
       </w:pPr>
-      <w:bookmarkStart w:id="53" w:name="_Toc243427237"/>
+      <w:bookmarkStart w:id="53" w:name="_Toc243429651"/>
       <w:r>
         <w:t>16.1 Published literature</w:t>
       </w:r>
@@ -15760,7 +15772,7 @@
       <w:pPr>
         <w:pStyle w:val="Heading2"/>
       </w:pPr>
-      <w:bookmarkStart w:id="54" w:name="_Toc243427238"/>
+      <w:bookmarkStart w:id="54" w:name="_Toc243429652"/>
       <w:r>
         <w:t>16.2 Technical documentation</w:t>
       </w:r>
@@ -15939,7 +15951,7 @@
         <w:pStyle w:val="Heading1"/>
         <w:pageBreakBefore/>
       </w:pPr>
-      <w:bookmarkStart w:id="55" w:name="_Toc243427239"/>
+      <w:bookmarkStart w:id="55" w:name="_Toc243429653"/>
       <w:r>
         <w:lastRenderedPageBreak/>
         <w:t>Appendix A — Suggested Presentation Plan</w:t>
@@ -17507,7 +17519,7 @@
       <w:pPr>
         <w:pStyle w:val="Heading2"/>
       </w:pPr>
-      <w:bookmarkStart w:id="56" w:name="_Toc243427240"/>
+      <w:bookmarkStart w:id="56" w:name="_Toc243429654"/>
       <w:r>
         <w:t>Figure files</w:t>
       </w:r>
@@ -17971,7 +17983,7 @@
       <w:pPr>
         <w:pStyle w:val="Heading2"/>
       </w:pPr>
-      <w:bookmarkStart w:id="57" w:name="_Toc243427241"/>
+      <w:bookmarkStart w:id="57" w:name="_Toc243429655"/>
       <w:r>
         <w:t>Presentation notes</w:t>
       </w:r>
@@ -18017,7 +18029,7 @@
       <w:pPr>
         <w:pStyle w:val="Heading2"/>
       </w:pPr>
-      <w:bookmarkStart w:id="58" w:name="_Toc243427242"/>
+      <w:bookmarkStart w:id="58" w:name="_Toc243429656"/>
       <w:r>
         <w:t>Anticipated questions</w:t>
       </w:r>
@@ -18558,7 +18570,7 @@
         <w:pStyle w:val="Heading1"/>
         <w:pageBreakBefore/>
       </w:pPr>
-      <w:bookmarkStart w:id="59" w:name="_Toc243427243"/>
+      <w:bookmarkStart w:id="59" w:name="_Toc243429657"/>
       <w:r>
         <w:lastRenderedPageBreak/>
         <w:t>Appendix B — Internal Note (Not for Presentation)</w:t>
@@ -18633,7 +18645,7 @@
       <w:pPr>
         <w:pStyle w:val="Heading2"/>
       </w:pPr>
-      <w:bookmarkStart w:id="60" w:name="_Toc243427244"/>
+      <w:bookmarkStart w:id="60" w:name="_Toc243429658"/>
       <w:r>
         <w:t>What is genuinely working</w:t>
       </w:r>
@@ -18702,7 +18714,7 @@
       <w:pPr>
         <w:pStyle w:val="Heading2"/>
       </w:pPr>
-      <w:bookmarkStart w:id="61" w:name="_Toc243427245"/>
+      <w:bookmarkStart w:id="61" w:name="_Toc243429659"/>
       <w:r>
         <w:t>What must not be claimed</w:t>
       </w:r>
@@ -19051,9 +19063,8 @@
       <w:pPr>
         <w:pStyle w:val="Heading2"/>
       </w:pPr>
-      <w:bookmarkStart w:id="62" w:name="_Toc243427246"/>
-      <w:r>
-        <w:lastRenderedPageBreak/>
+      <w:bookmarkStart w:id="62" w:name="_Toc243429660"/>
+      <w:r>
         <w:t>Check before the review: firmware on the board</w:t>
       </w:r>
       <w:bookmarkEnd w:id="62"/>
@@ -19100,7 +19111,7 @@
               <w:rPr>
                 <w:b/>
               </w:rPr>
-              <w:t>The board is running the 18 October firmware</w:t>
+              <w:t>The board is running the 20 October firmware</w:t>
             </w:r>
           </w:p>
           <w:p>
@@ -19111,44 +19122,7 @@
               <w:rPr>
                 <w:sz w:val="20"/>
               </w:rPr>
-              <w:t xml:space="preserve">Fixes made on 20 October are built and tested in the simulator but </w:t>
-            </w:r>
-            <w:r>
-              <w:rPr>
-                <w:b/>
-                <w:sz w:val="20"/>
-              </w:rPr>
-              <w:t>not yet flashed</w:t>
-            </w:r>
-            <w:r>
-              <w:rPr>
-                <w:sz w:val="20"/>
-              </w:rPr>
-              <w:t>: long names wrapping into the icon, and three bugs that only show on the light (Daylight) theme.</w:t>
-            </w:r>
-          </w:p>
-          <w:p>
-            <w:pPr>
-              <w:spacing w:after="40"/>
-            </w:pPr>
-            <w:r>
-              <w:rPr>
-                <w:sz w:val="20"/>
-              </w:rPr>
-              <w:t xml:space="preserve">Either flash </w:t>
-            </w:r>
-            <w:r>
-              <w:rPr>
-                <w:rFonts w:ascii="Consolas" w:hAnsi="Consolas"/>
-                <w:sz w:val="18"/>
-              </w:rPr>
-              <w:t>../homemesh_ha_firmware_20oct.bin</w:t>
-            </w:r>
-            <w:r>
-              <w:rPr>
-                <w:sz w:val="20"/>
-              </w:rPr>
-              <w:t xml:space="preserve"> before the review and check the boot log, or demo with a dark theme and short names.</w:t>
+              <w:t>Flashed on 20 October with the fixes for long names and the light (Daylight) theme; the boot log matched the healthy one. Check the names and the Daylight theme on the real screen once before the review.</w:t>
             </w:r>
           </w:p>
           <w:p>
@@ -19224,7 +19198,7 @@
       <w:pPr>
         <w:pStyle w:val="Heading2"/>
       </w:pPr>
-      <w:bookmarkStart w:id="63" w:name="_Toc243427247"/>
+      <w:bookmarkStart w:id="63" w:name="_Toc243429661"/>
       <w:r>
         <w:t>Two quirks that may be noticed, and how to answer</w:t>
       </w:r>
@@ -19383,7 +19357,7 @@
       <w:pPr>
         <w:pStyle w:val="Heading2"/>
       </w:pPr>
-      <w:bookmarkStart w:id="64" w:name="_Toc243427248"/>
+      <w:bookmarkStart w:id="64" w:name="_Toc243429662"/>
       <w:r>
         <w:t>Before the presentation</w:t>
       </w:r>
@@ -19797,31 +19771,31 @@
       </w:rPr>
     </w:lvl>
   </w:abstractNum>
-  <w:num w:numId="1" w16cid:durableId="1512378437">
+  <w:num w:numId="1" w16cid:durableId="2034308182">
     <w:abstractNumId w:val="8"/>
   </w:num>
-  <w:num w:numId="2" w16cid:durableId="1845824254">
+  <w:num w:numId="2" w16cid:durableId="1788313477">
     <w:abstractNumId w:val="6"/>
   </w:num>
-  <w:num w:numId="3" w16cid:durableId="1079058590">
+  <w:num w:numId="3" w16cid:durableId="1446466367">
     <w:abstractNumId w:val="5"/>
   </w:num>
-  <w:num w:numId="4" w16cid:durableId="347610491">
+  <w:num w:numId="4" w16cid:durableId="2114519922">
     <w:abstractNumId w:val="4"/>
   </w:num>
-  <w:num w:numId="5" w16cid:durableId="1873692737">
+  <w:num w:numId="5" w16cid:durableId="835995615">
     <w:abstractNumId w:val="7"/>
   </w:num>
-  <w:num w:numId="6" w16cid:durableId="1074546381">
+  <w:num w:numId="6" w16cid:durableId="1752391411">
     <w:abstractNumId w:val="3"/>
   </w:num>
-  <w:num w:numId="7" w16cid:durableId="1567495678">
+  <w:num w:numId="7" w16cid:durableId="123818425">
     <w:abstractNumId w:val="2"/>
   </w:num>
-  <w:num w:numId="8" w16cid:durableId="842016319">
+  <w:num w:numId="8" w16cid:durableId="1181509557">
     <w:abstractNumId w:val="1"/>
   </w:num>
-  <w:num w:numId="9" w16cid:durableId="399795308">
+  <w:num w:numId="9" w16cid:durableId="567611854">
     <w:abstractNumId w:val="0"/>
   </w:num>
 </w:numbering>
@@ -31214,7 +31188,7 @@
     <w:autoRedefine/>
     <w:uiPriority w:val="39"/>
     <w:unhideWhenUsed/>
-    <w:rsid w:val="0040649D"/>
+    <w:rsid w:val="00FD2F75"/>
     <w:pPr>
       <w:spacing w:after="100"/>
     </w:pPr>
@@ -31226,7 +31200,7 @@
     <w:autoRedefine/>
     <w:uiPriority w:val="39"/>
     <w:unhideWhenUsed/>
-    <w:rsid w:val="0040649D"/>
+    <w:rsid w:val="00FD2F75"/>
     <w:pPr>
       <w:spacing w:after="100"/>
       <w:ind w:left="210"/>
@@ -31237,7 +31211,7 @@
     <w:basedOn w:val="DefaultParagraphFont"/>
     <w:uiPriority w:val="99"/>
     <w:unhideWhenUsed/>
-    <w:rsid w:val="0040649D"/>
+    <w:rsid w:val="00FD2F75"/>
     <w:rPr>
       <w:color w:val="0000FF" w:themeColor="hyperlink"/>
       <w:u w:val="single"/>

</xml_diff>

<commit_message>
Flash a panel from the designer
A Panel firmware card sets up a new display or updates one over USB
with nothing installed: Web Serial, which Electron has built in, and
esptool-js. It writes a whole-board image from 0x0, has the board check
it, then reopens the port, resets the panel, shows its boot log, and
sends the current layout once the panel is listening.

The image is firmware/homemesh_panel.bin, written after every env:ha
build by tools/flash_image.py with a description beside it. It is
gitignored and read from the project folder rather than packed into the
exe, because secrets.h is compiled into it.

Verified on the board: 1,270,976 bytes written and verified, and the
21 October firmware booted. The notes also record that the hotspot link
to the panel is losing half its packets, which is why a restarted panel
takes minutes to come back.
</commit_message>
<xml_diff>
--- a/docs/HomeMesh_Panel_Project_Documentation.docx
+++ b/docs/HomeMesh_Panel_Project_Documentation.docx
@@ -513,7 +513,7 @@
       <w:r>
         <w:fldChar w:fldCharType="separate"/>
       </w:r>
-      <w:hyperlink w:anchor="_Toc243441190" w:history="1">
+      <w:hyperlink w:anchor="_Toc243542988" w:history="1">
         <w:r>
           <w:rPr>
             <w:rStyle w:val="Hyperlink"/>
@@ -540,7 +540,7 @@
             <w:noProof/>
             <w:webHidden/>
           </w:rPr>
-          <w:instrText xml:space="preserve"> PAGEREF _Toc243441190 \h </w:instrText>
+          <w:instrText xml:space="preserve"> PAGEREF _Toc243542988 \h </w:instrText>
         </w:r>
         <w:r>
           <w:rPr>
@@ -581,7 +581,7 @@
           <w:noProof/>
         </w:rPr>
       </w:pPr>
-      <w:hyperlink w:anchor="_Toc243441191" w:history="1">
+      <w:hyperlink w:anchor="_Toc243542989" w:history="1">
         <w:r>
           <w:rPr>
             <w:rStyle w:val="Hyperlink"/>
@@ -608,7 +608,7 @@
             <w:noProof/>
             <w:webHidden/>
           </w:rPr>
-          <w:instrText xml:space="preserve"> PAGEREF _Toc243441191 \h </w:instrText>
+          <w:instrText xml:space="preserve"> PAGEREF _Toc243542989 \h </w:instrText>
         </w:r>
         <w:r>
           <w:rPr>
@@ -649,7 +649,7 @@
           <w:noProof/>
         </w:rPr>
       </w:pPr>
-      <w:hyperlink w:anchor="_Toc243441192" w:history="1">
+      <w:hyperlink w:anchor="_Toc243542990" w:history="1">
         <w:r>
           <w:rPr>
             <w:rStyle w:val="Hyperlink"/>
@@ -676,7 +676,7 @@
             <w:noProof/>
             <w:webHidden/>
           </w:rPr>
-          <w:instrText xml:space="preserve"> PAGEREF _Toc243441192 \h </w:instrText>
+          <w:instrText xml:space="preserve"> PAGEREF _Toc243542990 \h </w:instrText>
         </w:r>
         <w:r>
           <w:rPr>
@@ -717,7 +717,7 @@
           <w:noProof/>
         </w:rPr>
       </w:pPr>
-      <w:hyperlink w:anchor="_Toc243441193" w:history="1">
+      <w:hyperlink w:anchor="_Toc243542991" w:history="1">
         <w:r>
           <w:rPr>
             <w:rStyle w:val="Hyperlink"/>
@@ -744,7 +744,7 @@
             <w:noProof/>
             <w:webHidden/>
           </w:rPr>
-          <w:instrText xml:space="preserve"> PAGEREF _Toc243441193 \h </w:instrText>
+          <w:instrText xml:space="preserve"> PAGEREF _Toc243542991 \h </w:instrText>
         </w:r>
         <w:r>
           <w:rPr>
@@ -785,7 +785,7 @@
           <w:noProof/>
         </w:rPr>
       </w:pPr>
-      <w:hyperlink w:anchor="_Toc243441194" w:history="1">
+      <w:hyperlink w:anchor="_Toc243542992" w:history="1">
         <w:r>
           <w:rPr>
             <w:rStyle w:val="Hyperlink"/>
@@ -812,7 +812,7 @@
             <w:noProof/>
             <w:webHidden/>
           </w:rPr>
-          <w:instrText xml:space="preserve"> PAGEREF _Toc243441194 \h </w:instrText>
+          <w:instrText xml:space="preserve"> PAGEREF _Toc243542992 \h </w:instrText>
         </w:r>
         <w:r>
           <w:rPr>
@@ -853,7 +853,7 @@
           <w:noProof/>
         </w:rPr>
       </w:pPr>
-      <w:hyperlink w:anchor="_Toc243441195" w:history="1">
+      <w:hyperlink w:anchor="_Toc243542993" w:history="1">
         <w:r>
           <w:rPr>
             <w:rStyle w:val="Hyperlink"/>
@@ -880,7 +880,7 @@
             <w:noProof/>
             <w:webHidden/>
           </w:rPr>
-          <w:instrText xml:space="preserve"> PAGEREF _Toc243441195 \h </w:instrText>
+          <w:instrText xml:space="preserve"> PAGEREF _Toc243542993 \h </w:instrText>
         </w:r>
         <w:r>
           <w:rPr>
@@ -921,7 +921,7 @@
           <w:noProof/>
         </w:rPr>
       </w:pPr>
-      <w:hyperlink w:anchor="_Toc243441196" w:history="1">
+      <w:hyperlink w:anchor="_Toc243542994" w:history="1">
         <w:r>
           <w:rPr>
             <w:rStyle w:val="Hyperlink"/>
@@ -948,7 +948,7 @@
             <w:noProof/>
             <w:webHidden/>
           </w:rPr>
-          <w:instrText xml:space="preserve"> PAGEREF _Toc243441196 \h </w:instrText>
+          <w:instrText xml:space="preserve"> PAGEREF _Toc243542994 \h </w:instrText>
         </w:r>
         <w:r>
           <w:rPr>
@@ -989,7 +989,7 @@
           <w:noProof/>
         </w:rPr>
       </w:pPr>
-      <w:hyperlink w:anchor="_Toc243441197" w:history="1">
+      <w:hyperlink w:anchor="_Toc243542995" w:history="1">
         <w:r>
           <w:rPr>
             <w:rStyle w:val="Hyperlink"/>
@@ -1016,7 +1016,7 @@
             <w:noProof/>
             <w:webHidden/>
           </w:rPr>
-          <w:instrText xml:space="preserve"> PAGEREF _Toc243441197 \h </w:instrText>
+          <w:instrText xml:space="preserve"> PAGEREF _Toc243542995 \h </w:instrText>
         </w:r>
         <w:r>
           <w:rPr>
@@ -1057,7 +1057,7 @@
           <w:noProof/>
         </w:rPr>
       </w:pPr>
-      <w:hyperlink w:anchor="_Toc243441198" w:history="1">
+      <w:hyperlink w:anchor="_Toc243542996" w:history="1">
         <w:r>
           <w:rPr>
             <w:rStyle w:val="Hyperlink"/>
@@ -1084,7 +1084,7 @@
             <w:noProof/>
             <w:webHidden/>
           </w:rPr>
-          <w:instrText xml:space="preserve"> PAGEREF _Toc243441198 \h </w:instrText>
+          <w:instrText xml:space="preserve"> PAGEREF _Toc243542996 \h </w:instrText>
         </w:r>
         <w:r>
           <w:rPr>
@@ -1125,7 +1125,7 @@
           <w:noProof/>
         </w:rPr>
       </w:pPr>
-      <w:hyperlink w:anchor="_Toc243441199" w:history="1">
+      <w:hyperlink w:anchor="_Toc243542997" w:history="1">
         <w:r>
           <w:rPr>
             <w:rStyle w:val="Hyperlink"/>
@@ -1152,7 +1152,7 @@
             <w:noProof/>
             <w:webHidden/>
           </w:rPr>
-          <w:instrText xml:space="preserve"> PAGEREF _Toc243441199 \h </w:instrText>
+          <w:instrText xml:space="preserve"> PAGEREF _Toc243542997 \h </w:instrText>
         </w:r>
         <w:r>
           <w:rPr>
@@ -1193,7 +1193,7 @@
           <w:noProof/>
         </w:rPr>
       </w:pPr>
-      <w:hyperlink w:anchor="_Toc243441200" w:history="1">
+      <w:hyperlink w:anchor="_Toc243542998" w:history="1">
         <w:r>
           <w:rPr>
             <w:rStyle w:val="Hyperlink"/>
@@ -1220,7 +1220,7 @@
             <w:noProof/>
             <w:webHidden/>
           </w:rPr>
-          <w:instrText xml:space="preserve"> PAGEREF _Toc243441200 \h </w:instrText>
+          <w:instrText xml:space="preserve"> PAGEREF _Toc243542998 \h </w:instrText>
         </w:r>
         <w:r>
           <w:rPr>
@@ -1261,7 +1261,7 @@
           <w:noProof/>
         </w:rPr>
       </w:pPr>
-      <w:hyperlink w:anchor="_Toc243441201" w:history="1">
+      <w:hyperlink w:anchor="_Toc243542999" w:history="1">
         <w:r>
           <w:rPr>
             <w:rStyle w:val="Hyperlink"/>
@@ -1288,7 +1288,7 @@
             <w:noProof/>
             <w:webHidden/>
           </w:rPr>
-          <w:instrText xml:space="preserve"> PAGEREF _Toc243441201 \h </w:instrText>
+          <w:instrText xml:space="preserve"> PAGEREF _Toc243542999 \h </w:instrText>
         </w:r>
         <w:r>
           <w:rPr>
@@ -1329,7 +1329,7 @@
           <w:noProof/>
         </w:rPr>
       </w:pPr>
-      <w:hyperlink w:anchor="_Toc243441202" w:history="1">
+      <w:hyperlink w:anchor="_Toc243543000" w:history="1">
         <w:r>
           <w:rPr>
             <w:rStyle w:val="Hyperlink"/>
@@ -1356,7 +1356,7 @@
             <w:noProof/>
             <w:webHidden/>
           </w:rPr>
-          <w:instrText xml:space="preserve"> PAGEREF _Toc243441202 \h </w:instrText>
+          <w:instrText xml:space="preserve"> PAGEREF _Toc243543000 \h </w:instrText>
         </w:r>
         <w:r>
           <w:rPr>
@@ -1397,7 +1397,7 @@
           <w:noProof/>
         </w:rPr>
       </w:pPr>
-      <w:hyperlink w:anchor="_Toc243441203" w:history="1">
+      <w:hyperlink w:anchor="_Toc243543001" w:history="1">
         <w:r>
           <w:rPr>
             <w:rStyle w:val="Hyperlink"/>
@@ -1424,7 +1424,7 @@
             <w:noProof/>
             <w:webHidden/>
           </w:rPr>
-          <w:instrText xml:space="preserve"> PAGEREF _Toc243441203 \h </w:instrText>
+          <w:instrText xml:space="preserve"> PAGEREF _Toc243543001 \h </w:instrText>
         </w:r>
         <w:r>
           <w:rPr>
@@ -1465,7 +1465,7 @@
           <w:noProof/>
         </w:rPr>
       </w:pPr>
-      <w:hyperlink w:anchor="_Toc243441204" w:history="1">
+      <w:hyperlink w:anchor="_Toc243543002" w:history="1">
         <w:r>
           <w:rPr>
             <w:rStyle w:val="Hyperlink"/>
@@ -1492,7 +1492,7 @@
             <w:noProof/>
             <w:webHidden/>
           </w:rPr>
-          <w:instrText xml:space="preserve"> PAGEREF _Toc243441204 \h </w:instrText>
+          <w:instrText xml:space="preserve"> PAGEREF _Toc243543002 \h </w:instrText>
         </w:r>
         <w:r>
           <w:rPr>
@@ -1533,7 +1533,7 @@
           <w:noProof/>
         </w:rPr>
       </w:pPr>
-      <w:hyperlink w:anchor="_Toc243441205" w:history="1">
+      <w:hyperlink w:anchor="_Toc243543003" w:history="1">
         <w:r>
           <w:rPr>
             <w:rStyle w:val="Hyperlink"/>
@@ -1560,7 +1560,7 @@
             <w:noProof/>
             <w:webHidden/>
           </w:rPr>
-          <w:instrText xml:space="preserve"> PAGEREF _Toc243441205 \h </w:instrText>
+          <w:instrText xml:space="preserve"> PAGEREF _Toc243543003 \h </w:instrText>
         </w:r>
         <w:r>
           <w:rPr>
@@ -1601,7 +1601,7 @@
           <w:noProof/>
         </w:rPr>
       </w:pPr>
-      <w:hyperlink w:anchor="_Toc243441206" w:history="1">
+      <w:hyperlink w:anchor="_Toc243543004" w:history="1">
         <w:r>
           <w:rPr>
             <w:rStyle w:val="Hyperlink"/>
@@ -1628,7 +1628,7 @@
             <w:noProof/>
             <w:webHidden/>
           </w:rPr>
-          <w:instrText xml:space="preserve"> PAGEREF _Toc243441206 \h </w:instrText>
+          <w:instrText xml:space="preserve"> PAGEREF _Toc243543004 \h </w:instrText>
         </w:r>
         <w:r>
           <w:rPr>
@@ -1669,7 +1669,7 @@
           <w:noProof/>
         </w:rPr>
       </w:pPr>
-      <w:hyperlink w:anchor="_Toc243441207" w:history="1">
+      <w:hyperlink w:anchor="_Toc243543005" w:history="1">
         <w:r>
           <w:rPr>
             <w:rStyle w:val="Hyperlink"/>
@@ -1696,7 +1696,7 @@
             <w:noProof/>
             <w:webHidden/>
           </w:rPr>
-          <w:instrText xml:space="preserve"> PAGEREF _Toc243441207 \h </w:instrText>
+          <w:instrText xml:space="preserve"> PAGEREF _Toc243543005 \h </w:instrText>
         </w:r>
         <w:r>
           <w:rPr>
@@ -1737,7 +1737,7 @@
           <w:noProof/>
         </w:rPr>
       </w:pPr>
-      <w:hyperlink w:anchor="_Toc243441208" w:history="1">
+      <w:hyperlink w:anchor="_Toc243543006" w:history="1">
         <w:r>
           <w:rPr>
             <w:rStyle w:val="Hyperlink"/>
@@ -1764,7 +1764,7 @@
             <w:noProof/>
             <w:webHidden/>
           </w:rPr>
-          <w:instrText xml:space="preserve"> PAGEREF _Toc243441208 \h </w:instrText>
+          <w:instrText xml:space="preserve"> PAGEREF _Toc243543006 \h </w:instrText>
         </w:r>
         <w:r>
           <w:rPr>
@@ -1805,7 +1805,7 @@
           <w:noProof/>
         </w:rPr>
       </w:pPr>
-      <w:hyperlink w:anchor="_Toc243441209" w:history="1">
+      <w:hyperlink w:anchor="_Toc243543007" w:history="1">
         <w:r>
           <w:rPr>
             <w:rStyle w:val="Hyperlink"/>
@@ -1832,7 +1832,7 @@
             <w:noProof/>
             <w:webHidden/>
           </w:rPr>
-          <w:instrText xml:space="preserve"> PAGEREF _Toc243441209 \h </w:instrText>
+          <w:instrText xml:space="preserve"> PAGEREF _Toc243543007 \h </w:instrText>
         </w:r>
         <w:r>
           <w:rPr>
@@ -1873,7 +1873,7 @@
           <w:noProof/>
         </w:rPr>
       </w:pPr>
-      <w:hyperlink w:anchor="_Toc243441210" w:history="1">
+      <w:hyperlink w:anchor="_Toc243543008" w:history="1">
         <w:r>
           <w:rPr>
             <w:rStyle w:val="Hyperlink"/>
@@ -1900,7 +1900,7 @@
             <w:noProof/>
             <w:webHidden/>
           </w:rPr>
-          <w:instrText xml:space="preserve"> PAGEREF _Toc243441210 \h </w:instrText>
+          <w:instrText xml:space="preserve"> PAGEREF _Toc243543008 \h </w:instrText>
         </w:r>
         <w:r>
           <w:rPr>
@@ -1941,7 +1941,7 @@
           <w:noProof/>
         </w:rPr>
       </w:pPr>
-      <w:hyperlink w:anchor="_Toc243441211" w:history="1">
+      <w:hyperlink w:anchor="_Toc243543009" w:history="1">
         <w:r>
           <w:rPr>
             <w:rStyle w:val="Hyperlink"/>
@@ -1968,7 +1968,7 @@
             <w:noProof/>
             <w:webHidden/>
           </w:rPr>
-          <w:instrText xml:space="preserve"> PAGEREF _Toc243441211 \h </w:instrText>
+          <w:instrText xml:space="preserve"> PAGEREF _Toc243543009 \h </w:instrText>
         </w:r>
         <w:r>
           <w:rPr>
@@ -2009,7 +2009,7 @@
           <w:noProof/>
         </w:rPr>
       </w:pPr>
-      <w:hyperlink w:anchor="_Toc243441212" w:history="1">
+      <w:hyperlink w:anchor="_Toc243543010" w:history="1">
         <w:r>
           <w:rPr>
             <w:rStyle w:val="Hyperlink"/>
@@ -2036,7 +2036,7 @@
             <w:noProof/>
             <w:webHidden/>
           </w:rPr>
-          <w:instrText xml:space="preserve"> PAGEREF _Toc243441212 \h </w:instrText>
+          <w:instrText xml:space="preserve"> PAGEREF _Toc243543010 \h </w:instrText>
         </w:r>
         <w:r>
           <w:rPr>
@@ -2077,7 +2077,7 @@
           <w:noProof/>
         </w:rPr>
       </w:pPr>
-      <w:hyperlink w:anchor="_Toc243441213" w:history="1">
+      <w:hyperlink w:anchor="_Toc243543011" w:history="1">
         <w:r>
           <w:rPr>
             <w:rStyle w:val="Hyperlink"/>
@@ -2104,7 +2104,7 @@
             <w:noProof/>
             <w:webHidden/>
           </w:rPr>
-          <w:instrText xml:space="preserve"> PAGEREF _Toc243441213 \h </w:instrText>
+          <w:instrText xml:space="preserve"> PAGEREF _Toc243543011 \h </w:instrText>
         </w:r>
         <w:r>
           <w:rPr>
@@ -2145,7 +2145,7 @@
           <w:noProof/>
         </w:rPr>
       </w:pPr>
-      <w:hyperlink w:anchor="_Toc243441214" w:history="1">
+      <w:hyperlink w:anchor="_Toc243543012" w:history="1">
         <w:r>
           <w:rPr>
             <w:rStyle w:val="Hyperlink"/>
@@ -2172,7 +2172,7 @@
             <w:noProof/>
             <w:webHidden/>
           </w:rPr>
-          <w:instrText xml:space="preserve"> PAGEREF _Toc243441214 \h </w:instrText>
+          <w:instrText xml:space="preserve"> PAGEREF _Toc243543012 \h </w:instrText>
         </w:r>
         <w:r>
           <w:rPr>
@@ -2213,7 +2213,7 @@
           <w:noProof/>
         </w:rPr>
       </w:pPr>
-      <w:hyperlink w:anchor="_Toc243441215" w:history="1">
+      <w:hyperlink w:anchor="_Toc243543013" w:history="1">
         <w:r>
           <w:rPr>
             <w:rStyle w:val="Hyperlink"/>
@@ -2240,7 +2240,7 @@
             <w:noProof/>
             <w:webHidden/>
           </w:rPr>
-          <w:instrText xml:space="preserve"> PAGEREF _Toc243441215 \h </w:instrText>
+          <w:instrText xml:space="preserve"> PAGEREF _Toc243543013 \h </w:instrText>
         </w:r>
         <w:r>
           <w:rPr>
@@ -2281,7 +2281,7 @@
           <w:noProof/>
         </w:rPr>
       </w:pPr>
-      <w:hyperlink w:anchor="_Toc243441216" w:history="1">
+      <w:hyperlink w:anchor="_Toc243543014" w:history="1">
         <w:r>
           <w:rPr>
             <w:rStyle w:val="Hyperlink"/>
@@ -2308,7 +2308,7 @@
             <w:noProof/>
             <w:webHidden/>
           </w:rPr>
-          <w:instrText xml:space="preserve"> PAGEREF _Toc243441216 \h </w:instrText>
+          <w:instrText xml:space="preserve"> PAGEREF _Toc243543014 \h </w:instrText>
         </w:r>
         <w:r>
           <w:rPr>
@@ -2349,7 +2349,7 @@
           <w:noProof/>
         </w:rPr>
       </w:pPr>
-      <w:hyperlink w:anchor="_Toc243441217" w:history="1">
+      <w:hyperlink w:anchor="_Toc243543015" w:history="1">
         <w:r>
           <w:rPr>
             <w:rStyle w:val="Hyperlink"/>
@@ -2376,7 +2376,7 @@
             <w:noProof/>
             <w:webHidden/>
           </w:rPr>
-          <w:instrText xml:space="preserve"> PAGEREF _Toc243441217 \h </w:instrText>
+          <w:instrText xml:space="preserve"> PAGEREF _Toc243543015 \h </w:instrText>
         </w:r>
         <w:r>
           <w:rPr>
@@ -2417,7 +2417,7 @@
           <w:noProof/>
         </w:rPr>
       </w:pPr>
-      <w:hyperlink w:anchor="_Toc243441218" w:history="1">
+      <w:hyperlink w:anchor="_Toc243543016" w:history="1">
         <w:r>
           <w:rPr>
             <w:rStyle w:val="Hyperlink"/>
@@ -2444,7 +2444,7 @@
             <w:noProof/>
             <w:webHidden/>
           </w:rPr>
-          <w:instrText xml:space="preserve"> PAGEREF _Toc243441218 \h </w:instrText>
+          <w:instrText xml:space="preserve"> PAGEREF _Toc243543016 \h </w:instrText>
         </w:r>
         <w:r>
           <w:rPr>
@@ -2485,7 +2485,7 @@
           <w:noProof/>
         </w:rPr>
       </w:pPr>
-      <w:hyperlink w:anchor="_Toc243441219" w:history="1">
+      <w:hyperlink w:anchor="_Toc243543017" w:history="1">
         <w:r>
           <w:rPr>
             <w:rStyle w:val="Hyperlink"/>
@@ -2512,7 +2512,7 @@
             <w:noProof/>
             <w:webHidden/>
           </w:rPr>
-          <w:instrText xml:space="preserve"> PAGEREF _Toc243441219 \h </w:instrText>
+          <w:instrText xml:space="preserve"> PAGEREF _Toc243543017 \h </w:instrText>
         </w:r>
         <w:r>
           <w:rPr>
@@ -2553,7 +2553,7 @@
           <w:noProof/>
         </w:rPr>
       </w:pPr>
-      <w:hyperlink w:anchor="_Toc243441220" w:history="1">
+      <w:hyperlink w:anchor="_Toc243543018" w:history="1">
         <w:r>
           <w:rPr>
             <w:rStyle w:val="Hyperlink"/>
@@ -2580,7 +2580,7 @@
             <w:noProof/>
             <w:webHidden/>
           </w:rPr>
-          <w:instrText xml:space="preserve"> PAGEREF _Toc243441220 \h </w:instrText>
+          <w:instrText xml:space="preserve"> PAGEREF _Toc243543018 \h </w:instrText>
         </w:r>
         <w:r>
           <w:rPr>
@@ -2621,7 +2621,7 @@
           <w:noProof/>
         </w:rPr>
       </w:pPr>
-      <w:hyperlink w:anchor="_Toc243441221" w:history="1">
+      <w:hyperlink w:anchor="_Toc243543019" w:history="1">
         <w:r>
           <w:rPr>
             <w:rStyle w:val="Hyperlink"/>
@@ -2648,7 +2648,7 @@
             <w:noProof/>
             <w:webHidden/>
           </w:rPr>
-          <w:instrText xml:space="preserve"> PAGEREF _Toc243441221 \h </w:instrText>
+          <w:instrText xml:space="preserve"> PAGEREF _Toc243543019 \h </w:instrText>
         </w:r>
         <w:r>
           <w:rPr>
@@ -2689,7 +2689,7 @@
           <w:noProof/>
         </w:rPr>
       </w:pPr>
-      <w:hyperlink w:anchor="_Toc243441222" w:history="1">
+      <w:hyperlink w:anchor="_Toc243543020" w:history="1">
         <w:r>
           <w:rPr>
             <w:rStyle w:val="Hyperlink"/>
@@ -2716,7 +2716,7 @@
             <w:noProof/>
             <w:webHidden/>
           </w:rPr>
-          <w:instrText xml:space="preserve"> PAGEREF _Toc243441222 \h </w:instrText>
+          <w:instrText xml:space="preserve"> PAGEREF _Toc243543020 \h </w:instrText>
         </w:r>
         <w:r>
           <w:rPr>
@@ -2757,7 +2757,7 @@
           <w:noProof/>
         </w:rPr>
       </w:pPr>
-      <w:hyperlink w:anchor="_Toc243441223" w:history="1">
+      <w:hyperlink w:anchor="_Toc243543021" w:history="1">
         <w:r>
           <w:rPr>
             <w:rStyle w:val="Hyperlink"/>
@@ -2784,7 +2784,7 @@
             <w:noProof/>
             <w:webHidden/>
           </w:rPr>
-          <w:instrText xml:space="preserve"> PAGEREF _Toc243441223 \h </w:instrText>
+          <w:instrText xml:space="preserve"> PAGEREF _Toc243543021 \h </w:instrText>
         </w:r>
         <w:r>
           <w:rPr>
@@ -2825,7 +2825,7 @@
           <w:noProof/>
         </w:rPr>
       </w:pPr>
-      <w:hyperlink w:anchor="_Toc243441224" w:history="1">
+      <w:hyperlink w:anchor="_Toc243543022" w:history="1">
         <w:r>
           <w:rPr>
             <w:rStyle w:val="Hyperlink"/>
@@ -2852,7 +2852,7 @@
             <w:noProof/>
             <w:webHidden/>
           </w:rPr>
-          <w:instrText xml:space="preserve"> PAGEREF _Toc243441224 \h </w:instrText>
+          <w:instrText xml:space="preserve"> PAGEREF _Toc243543022 \h </w:instrText>
         </w:r>
         <w:r>
           <w:rPr>
@@ -2893,7 +2893,7 @@
           <w:noProof/>
         </w:rPr>
       </w:pPr>
-      <w:hyperlink w:anchor="_Toc243441225" w:history="1">
+      <w:hyperlink w:anchor="_Toc243543023" w:history="1">
         <w:r>
           <w:rPr>
             <w:rStyle w:val="Hyperlink"/>
@@ -2920,7 +2920,7 @@
             <w:noProof/>
             <w:webHidden/>
           </w:rPr>
-          <w:instrText xml:space="preserve"> PAGEREF _Toc243441225 \h </w:instrText>
+          <w:instrText xml:space="preserve"> PAGEREF _Toc243543023 \h </w:instrText>
         </w:r>
         <w:r>
           <w:rPr>
@@ -2961,7 +2961,7 @@
           <w:noProof/>
         </w:rPr>
       </w:pPr>
-      <w:hyperlink w:anchor="_Toc243441226" w:history="1">
+      <w:hyperlink w:anchor="_Toc243543024" w:history="1">
         <w:r>
           <w:rPr>
             <w:rStyle w:val="Hyperlink"/>
@@ -2988,7 +2988,7 @@
             <w:noProof/>
             <w:webHidden/>
           </w:rPr>
-          <w:instrText xml:space="preserve"> PAGEREF _Toc243441226 \h </w:instrText>
+          <w:instrText xml:space="preserve"> PAGEREF _Toc243543024 \h </w:instrText>
         </w:r>
         <w:r>
           <w:rPr>
@@ -3029,7 +3029,7 @@
           <w:noProof/>
         </w:rPr>
       </w:pPr>
-      <w:hyperlink w:anchor="_Toc243441227" w:history="1">
+      <w:hyperlink w:anchor="_Toc243543025" w:history="1">
         <w:r>
           <w:rPr>
             <w:rStyle w:val="Hyperlink"/>
@@ -3056,7 +3056,7 @@
             <w:noProof/>
             <w:webHidden/>
           </w:rPr>
-          <w:instrText xml:space="preserve"> PAGEREF _Toc243441227 \h </w:instrText>
+          <w:instrText xml:space="preserve"> PAGEREF _Toc243543025 \h </w:instrText>
         </w:r>
         <w:r>
           <w:rPr>
@@ -3097,7 +3097,7 @@
           <w:noProof/>
         </w:rPr>
       </w:pPr>
-      <w:hyperlink w:anchor="_Toc243441228" w:history="1">
+      <w:hyperlink w:anchor="_Toc243543026" w:history="1">
         <w:r>
           <w:rPr>
             <w:rStyle w:val="Hyperlink"/>
@@ -3124,7 +3124,7 @@
             <w:noProof/>
             <w:webHidden/>
           </w:rPr>
-          <w:instrText xml:space="preserve"> PAGEREF _Toc243441228 \h </w:instrText>
+          <w:instrText xml:space="preserve"> PAGEREF _Toc243543026 \h </w:instrText>
         </w:r>
         <w:r>
           <w:rPr>
@@ -3165,7 +3165,7 @@
           <w:noProof/>
         </w:rPr>
       </w:pPr>
-      <w:hyperlink w:anchor="_Toc243441229" w:history="1">
+      <w:hyperlink w:anchor="_Toc243543027" w:history="1">
         <w:r>
           <w:rPr>
             <w:rStyle w:val="Hyperlink"/>
@@ -3192,7 +3192,7 @@
             <w:noProof/>
             <w:webHidden/>
           </w:rPr>
-          <w:instrText xml:space="preserve"> PAGEREF _Toc243441229 \h </w:instrText>
+          <w:instrText xml:space="preserve"> PAGEREF _Toc243543027 \h </w:instrText>
         </w:r>
         <w:r>
           <w:rPr>
@@ -3233,7 +3233,7 @@
           <w:noProof/>
         </w:rPr>
       </w:pPr>
-      <w:hyperlink w:anchor="_Toc243441230" w:history="1">
+      <w:hyperlink w:anchor="_Toc243543028" w:history="1">
         <w:r>
           <w:rPr>
             <w:rStyle w:val="Hyperlink"/>
@@ -3260,7 +3260,7 @@
             <w:noProof/>
             <w:webHidden/>
           </w:rPr>
-          <w:instrText xml:space="preserve"> PAGEREF _Toc243441230 \h </w:instrText>
+          <w:instrText xml:space="preserve"> PAGEREF _Toc243543028 \h </w:instrText>
         </w:r>
         <w:r>
           <w:rPr>
@@ -3301,7 +3301,7 @@
           <w:noProof/>
         </w:rPr>
       </w:pPr>
-      <w:hyperlink w:anchor="_Toc243441231" w:history="1">
+      <w:hyperlink w:anchor="_Toc243543029" w:history="1">
         <w:r>
           <w:rPr>
             <w:rStyle w:val="Hyperlink"/>
@@ -3328,7 +3328,7 @@
             <w:noProof/>
             <w:webHidden/>
           </w:rPr>
-          <w:instrText xml:space="preserve"> PAGEREF _Toc243441231 \h </w:instrText>
+          <w:instrText xml:space="preserve"> PAGEREF _Toc243543029 \h </w:instrText>
         </w:r>
         <w:r>
           <w:rPr>
@@ -3369,7 +3369,7 @@
           <w:noProof/>
         </w:rPr>
       </w:pPr>
-      <w:hyperlink w:anchor="_Toc243441232" w:history="1">
+      <w:hyperlink w:anchor="_Toc243543030" w:history="1">
         <w:r>
           <w:rPr>
             <w:rStyle w:val="Hyperlink"/>
@@ -3396,7 +3396,7 @@
             <w:noProof/>
             <w:webHidden/>
           </w:rPr>
-          <w:instrText xml:space="preserve"> PAGEREF _Toc243441232 \h </w:instrText>
+          <w:instrText xml:space="preserve"> PAGEREF _Toc243543030 \h </w:instrText>
         </w:r>
         <w:r>
           <w:rPr>
@@ -3437,7 +3437,7 @@
           <w:noProof/>
         </w:rPr>
       </w:pPr>
-      <w:hyperlink w:anchor="_Toc243441233" w:history="1">
+      <w:hyperlink w:anchor="_Toc243543031" w:history="1">
         <w:r>
           <w:rPr>
             <w:rStyle w:val="Hyperlink"/>
@@ -3464,7 +3464,7 @@
             <w:noProof/>
             <w:webHidden/>
           </w:rPr>
-          <w:instrText xml:space="preserve"> PAGEREF _Toc243441233 \h </w:instrText>
+          <w:instrText xml:space="preserve"> PAGEREF _Toc243543031 \h </w:instrText>
         </w:r>
         <w:r>
           <w:rPr>
@@ -3505,7 +3505,7 @@
           <w:noProof/>
         </w:rPr>
       </w:pPr>
-      <w:hyperlink w:anchor="_Toc243441234" w:history="1">
+      <w:hyperlink w:anchor="_Toc243543032" w:history="1">
         <w:r>
           <w:rPr>
             <w:rStyle w:val="Hyperlink"/>
@@ -3532,7 +3532,7 @@
             <w:noProof/>
             <w:webHidden/>
           </w:rPr>
-          <w:instrText xml:space="preserve"> PAGEREF _Toc243441234 \h </w:instrText>
+          <w:instrText xml:space="preserve"> PAGEREF _Toc243543032 \h </w:instrText>
         </w:r>
         <w:r>
           <w:rPr>
@@ -3573,7 +3573,7 @@
           <w:noProof/>
         </w:rPr>
       </w:pPr>
-      <w:hyperlink w:anchor="_Toc243441235" w:history="1">
+      <w:hyperlink w:anchor="_Toc243543033" w:history="1">
         <w:r>
           <w:rPr>
             <w:rStyle w:val="Hyperlink"/>
@@ -3600,7 +3600,7 @@
             <w:noProof/>
             <w:webHidden/>
           </w:rPr>
-          <w:instrText xml:space="preserve"> PAGEREF _Toc243441235 \h </w:instrText>
+          <w:instrText xml:space="preserve"> PAGEREF _Toc243543033 \h </w:instrText>
         </w:r>
         <w:r>
           <w:rPr>
@@ -3641,7 +3641,7 @@
           <w:noProof/>
         </w:rPr>
       </w:pPr>
-      <w:hyperlink w:anchor="_Toc243441236" w:history="1">
+      <w:hyperlink w:anchor="_Toc243543034" w:history="1">
         <w:r>
           <w:rPr>
             <w:rStyle w:val="Hyperlink"/>
@@ -3668,7 +3668,7 @@
             <w:noProof/>
             <w:webHidden/>
           </w:rPr>
-          <w:instrText xml:space="preserve"> PAGEREF _Toc243441236 \h </w:instrText>
+          <w:instrText xml:space="preserve"> PAGEREF _Toc243543034 \h </w:instrText>
         </w:r>
         <w:r>
           <w:rPr>
@@ -3709,7 +3709,7 @@
           <w:noProof/>
         </w:rPr>
       </w:pPr>
-      <w:hyperlink w:anchor="_Toc243441237" w:history="1">
+      <w:hyperlink w:anchor="_Toc243543035" w:history="1">
         <w:r>
           <w:rPr>
             <w:rStyle w:val="Hyperlink"/>
@@ -3736,7 +3736,7 @@
             <w:noProof/>
             <w:webHidden/>
           </w:rPr>
-          <w:instrText xml:space="preserve"> PAGEREF _Toc243441237 \h </w:instrText>
+          <w:instrText xml:space="preserve"> PAGEREF _Toc243543035 \h </w:instrText>
         </w:r>
         <w:r>
           <w:rPr>
@@ -3777,7 +3777,7 @@
           <w:noProof/>
         </w:rPr>
       </w:pPr>
-      <w:hyperlink w:anchor="_Toc243441238" w:history="1">
+      <w:hyperlink w:anchor="_Toc243543036" w:history="1">
         <w:r>
           <w:rPr>
             <w:rStyle w:val="Hyperlink"/>
@@ -3804,7 +3804,7 @@
             <w:noProof/>
             <w:webHidden/>
           </w:rPr>
-          <w:instrText xml:space="preserve"> PAGEREF _Toc243441238 \h </w:instrText>
+          <w:instrText xml:space="preserve"> PAGEREF _Toc243543036 \h </w:instrText>
         </w:r>
         <w:r>
           <w:rPr>
@@ -3845,7 +3845,7 @@
           <w:noProof/>
         </w:rPr>
       </w:pPr>
-      <w:hyperlink w:anchor="_Toc243441239" w:history="1">
+      <w:hyperlink w:anchor="_Toc243543037" w:history="1">
         <w:r>
           <w:rPr>
             <w:rStyle w:val="Hyperlink"/>
@@ -3872,7 +3872,7 @@
             <w:noProof/>
             <w:webHidden/>
           </w:rPr>
-          <w:instrText xml:space="preserve"> PAGEREF _Toc243441239 \h </w:instrText>
+          <w:instrText xml:space="preserve"> PAGEREF _Toc243543037 \h </w:instrText>
         </w:r>
         <w:r>
           <w:rPr>
@@ -3913,7 +3913,7 @@
           <w:noProof/>
         </w:rPr>
       </w:pPr>
-      <w:hyperlink w:anchor="_Toc243441240" w:history="1">
+      <w:hyperlink w:anchor="_Toc243543038" w:history="1">
         <w:r>
           <w:rPr>
             <w:rStyle w:val="Hyperlink"/>
@@ -3940,7 +3940,7 @@
             <w:noProof/>
             <w:webHidden/>
           </w:rPr>
-          <w:instrText xml:space="preserve"> PAGEREF _Toc243441240 \h </w:instrText>
+          <w:instrText xml:space="preserve"> PAGEREF _Toc243543038 \h </w:instrText>
         </w:r>
         <w:r>
           <w:rPr>
@@ -3981,7 +3981,7 @@
           <w:noProof/>
         </w:rPr>
       </w:pPr>
-      <w:hyperlink w:anchor="_Toc243441241" w:history="1">
+      <w:hyperlink w:anchor="_Toc243543039" w:history="1">
         <w:r>
           <w:rPr>
             <w:rStyle w:val="Hyperlink"/>
@@ -4008,7 +4008,7 @@
             <w:noProof/>
             <w:webHidden/>
           </w:rPr>
-          <w:instrText xml:space="preserve"> PAGEREF _Toc243441241 \h </w:instrText>
+          <w:instrText xml:space="preserve"> PAGEREF _Toc243543039 \h </w:instrText>
         </w:r>
         <w:r>
           <w:rPr>
@@ -4049,7 +4049,7 @@
           <w:noProof/>
         </w:rPr>
       </w:pPr>
-      <w:hyperlink w:anchor="_Toc243441242" w:history="1">
+      <w:hyperlink w:anchor="_Toc243543040" w:history="1">
         <w:r>
           <w:rPr>
             <w:rStyle w:val="Hyperlink"/>
@@ -4076,7 +4076,7 @@
             <w:noProof/>
             <w:webHidden/>
           </w:rPr>
-          <w:instrText xml:space="preserve"> PAGEREF _Toc243441242 \h </w:instrText>
+          <w:instrText xml:space="preserve"> PAGEREF _Toc243543040 \h </w:instrText>
         </w:r>
         <w:r>
           <w:rPr>
@@ -4117,7 +4117,7 @@
           <w:noProof/>
         </w:rPr>
       </w:pPr>
-      <w:hyperlink w:anchor="_Toc243441243" w:history="1">
+      <w:hyperlink w:anchor="_Toc243543041" w:history="1">
         <w:r>
           <w:rPr>
             <w:rStyle w:val="Hyperlink"/>
@@ -4144,7 +4144,7 @@
             <w:noProof/>
             <w:webHidden/>
           </w:rPr>
-          <w:instrText xml:space="preserve"> PAGEREF _Toc243441243 \h </w:instrText>
+          <w:instrText xml:space="preserve"> PAGEREF _Toc243543041 \h </w:instrText>
         </w:r>
         <w:r>
           <w:rPr>
@@ -4185,7 +4185,7 @@
           <w:noProof/>
         </w:rPr>
       </w:pPr>
-      <w:hyperlink w:anchor="_Toc243441244" w:history="1">
+      <w:hyperlink w:anchor="_Toc243543042" w:history="1">
         <w:r>
           <w:rPr>
             <w:rStyle w:val="Hyperlink"/>
@@ -4212,7 +4212,7 @@
             <w:noProof/>
             <w:webHidden/>
           </w:rPr>
-          <w:instrText xml:space="preserve"> PAGEREF _Toc243441244 \h </w:instrText>
+          <w:instrText xml:space="preserve"> PAGEREF _Toc243543042 \h </w:instrText>
         </w:r>
         <w:r>
           <w:rPr>
@@ -4253,7 +4253,7 @@
           <w:noProof/>
         </w:rPr>
       </w:pPr>
-      <w:hyperlink w:anchor="_Toc243441245" w:history="1">
+      <w:hyperlink w:anchor="_Toc243543043" w:history="1">
         <w:r>
           <w:rPr>
             <w:rStyle w:val="Hyperlink"/>
@@ -4280,7 +4280,7 @@
             <w:noProof/>
             <w:webHidden/>
           </w:rPr>
-          <w:instrText xml:space="preserve"> PAGEREF _Toc243441245 \h </w:instrText>
+          <w:instrText xml:space="preserve"> PAGEREF _Toc243543043 \h </w:instrText>
         </w:r>
         <w:r>
           <w:rPr>
@@ -4321,7 +4321,7 @@
           <w:noProof/>
         </w:rPr>
       </w:pPr>
-      <w:hyperlink w:anchor="_Toc243441246" w:history="1">
+      <w:hyperlink w:anchor="_Toc243543044" w:history="1">
         <w:r>
           <w:rPr>
             <w:rStyle w:val="Hyperlink"/>
@@ -4348,7 +4348,7 @@
             <w:noProof/>
             <w:webHidden/>
           </w:rPr>
-          <w:instrText xml:space="preserve"> PAGEREF _Toc243441246 \h </w:instrText>
+          <w:instrText xml:space="preserve"> PAGEREF _Toc243543044 \h </w:instrText>
         </w:r>
         <w:r>
           <w:rPr>
@@ -4389,7 +4389,7 @@
           <w:noProof/>
         </w:rPr>
       </w:pPr>
-      <w:hyperlink w:anchor="_Toc243441247" w:history="1">
+      <w:hyperlink w:anchor="_Toc243543045" w:history="1">
         <w:r>
           <w:rPr>
             <w:rStyle w:val="Hyperlink"/>
@@ -4416,7 +4416,7 @@
             <w:noProof/>
             <w:webHidden/>
           </w:rPr>
-          <w:instrText xml:space="preserve"> PAGEREF _Toc243441247 \h </w:instrText>
+          <w:instrText xml:space="preserve"> PAGEREF _Toc243543045 \h </w:instrText>
         </w:r>
         <w:r>
           <w:rPr>
@@ -4457,7 +4457,7 @@
           <w:noProof/>
         </w:rPr>
       </w:pPr>
-      <w:hyperlink w:anchor="_Toc243441248" w:history="1">
+      <w:hyperlink w:anchor="_Toc243543046" w:history="1">
         <w:r>
           <w:rPr>
             <w:rStyle w:val="Hyperlink"/>
@@ -4484,7 +4484,7 @@
             <w:noProof/>
             <w:webHidden/>
           </w:rPr>
-          <w:instrText xml:space="preserve"> PAGEREF _Toc243441248 \h </w:instrText>
+          <w:instrText xml:space="preserve"> PAGEREF _Toc243543046 \h </w:instrText>
         </w:r>
         <w:r>
           <w:rPr>
@@ -4525,7 +4525,7 @@
           <w:noProof/>
         </w:rPr>
       </w:pPr>
-      <w:hyperlink w:anchor="_Toc243441249" w:history="1">
+      <w:hyperlink w:anchor="_Toc243543047" w:history="1">
         <w:r>
           <w:rPr>
             <w:rStyle w:val="Hyperlink"/>
@@ -4552,7 +4552,7 @@
             <w:noProof/>
             <w:webHidden/>
           </w:rPr>
-          <w:instrText xml:space="preserve"> PAGEREF _Toc243441249 \h </w:instrText>
+          <w:instrText xml:space="preserve"> PAGEREF _Toc243543047 \h </w:instrText>
         </w:r>
         <w:r>
           <w:rPr>
@@ -4593,7 +4593,7 @@
           <w:noProof/>
         </w:rPr>
       </w:pPr>
-      <w:hyperlink w:anchor="_Toc243441250" w:history="1">
+      <w:hyperlink w:anchor="_Toc243543048" w:history="1">
         <w:r>
           <w:rPr>
             <w:rStyle w:val="Hyperlink"/>
@@ -4620,7 +4620,7 @@
             <w:noProof/>
             <w:webHidden/>
           </w:rPr>
-          <w:instrText xml:space="preserve"> PAGEREF _Toc243441250 \h </w:instrText>
+          <w:instrText xml:space="preserve"> PAGEREF _Toc243543048 \h </w:instrText>
         </w:r>
         <w:r>
           <w:rPr>
@@ -4661,7 +4661,7 @@
           <w:noProof/>
         </w:rPr>
       </w:pPr>
-      <w:hyperlink w:anchor="_Toc243441251" w:history="1">
+      <w:hyperlink w:anchor="_Toc243543049" w:history="1">
         <w:r>
           <w:rPr>
             <w:rStyle w:val="Hyperlink"/>
@@ -4688,7 +4688,7 @@
             <w:noProof/>
             <w:webHidden/>
           </w:rPr>
-          <w:instrText xml:space="preserve"> PAGEREF _Toc243441251 \h </w:instrText>
+          <w:instrText xml:space="preserve"> PAGEREF _Toc243543049 \h </w:instrText>
         </w:r>
         <w:r>
           <w:rPr>
@@ -4729,7 +4729,7 @@
           <w:noProof/>
         </w:rPr>
       </w:pPr>
-      <w:hyperlink w:anchor="_Toc243441252" w:history="1">
+      <w:hyperlink w:anchor="_Toc243543050" w:history="1">
         <w:r>
           <w:rPr>
             <w:rStyle w:val="Hyperlink"/>
@@ -4756,7 +4756,7 @@
             <w:noProof/>
             <w:webHidden/>
           </w:rPr>
-          <w:instrText xml:space="preserve"> PAGEREF _Toc243441252 \h </w:instrText>
+          <w:instrText xml:space="preserve"> PAGEREF _Toc243543050 \h </w:instrText>
         </w:r>
         <w:r>
           <w:rPr>
@@ -4797,7 +4797,7 @@
           <w:noProof/>
         </w:rPr>
       </w:pPr>
-      <w:hyperlink w:anchor="_Toc243441253" w:history="1">
+      <w:hyperlink w:anchor="_Toc243543051" w:history="1">
         <w:r>
           <w:rPr>
             <w:rStyle w:val="Hyperlink"/>
@@ -4824,7 +4824,7 @@
             <w:noProof/>
             <w:webHidden/>
           </w:rPr>
-          <w:instrText xml:space="preserve"> PAGEREF _Toc243441253 \h </w:instrText>
+          <w:instrText xml:space="preserve"> PAGEREF _Toc243543051 \h </w:instrText>
         </w:r>
         <w:r>
           <w:rPr>
@@ -4865,7 +4865,7 @@
           <w:noProof/>
         </w:rPr>
       </w:pPr>
-      <w:hyperlink w:anchor="_Toc243441254" w:history="1">
+      <w:hyperlink w:anchor="_Toc243543052" w:history="1">
         <w:r>
           <w:rPr>
             <w:rStyle w:val="Hyperlink"/>
@@ -4892,7 +4892,7 @@
             <w:noProof/>
             <w:webHidden/>
           </w:rPr>
-          <w:instrText xml:space="preserve"> PAGEREF _Toc243441254 \h </w:instrText>
+          <w:instrText xml:space="preserve"> PAGEREF _Toc243543052 \h </w:instrText>
         </w:r>
         <w:r>
           <w:rPr>
@@ -4933,7 +4933,7 @@
           <w:noProof/>
         </w:rPr>
       </w:pPr>
-      <w:hyperlink w:anchor="_Toc243441255" w:history="1">
+      <w:hyperlink w:anchor="_Toc243543053" w:history="1">
         <w:r>
           <w:rPr>
             <w:rStyle w:val="Hyperlink"/>
@@ -4960,7 +4960,7 @@
             <w:noProof/>
             <w:webHidden/>
           </w:rPr>
-          <w:instrText xml:space="preserve"> PAGEREF _Toc243441255 \h </w:instrText>
+          <w:instrText xml:space="preserve"> PAGEREF _Toc243543053 \h </w:instrText>
         </w:r>
         <w:r>
           <w:rPr>
@@ -5001,7 +5001,7 @@
           <w:noProof/>
         </w:rPr>
       </w:pPr>
-      <w:hyperlink w:anchor="_Toc243441256" w:history="1">
+      <w:hyperlink w:anchor="_Toc243543054" w:history="1">
         <w:r>
           <w:rPr>
             <w:rStyle w:val="Hyperlink"/>
@@ -5028,7 +5028,7 @@
             <w:noProof/>
             <w:webHidden/>
           </w:rPr>
-          <w:instrText xml:space="preserve"> PAGEREF _Toc243441256 \h </w:instrText>
+          <w:instrText xml:space="preserve"> PAGEREF _Toc243543054 \h </w:instrText>
         </w:r>
         <w:r>
           <w:rPr>
@@ -5069,7 +5069,7 @@
         <w:pStyle w:val="Heading1"/>
         <w:pageBreakBefore/>
       </w:pPr>
-      <w:bookmarkStart w:id="0" w:name="_Toc243441190"/>
+      <w:bookmarkStart w:id="0" w:name="_Toc243542988"/>
       <w:r>
         <w:lastRenderedPageBreak/>
         <w:t>How to Use This Document</w:t>
@@ -5403,7 +5403,7 @@
         <w:pStyle w:val="Heading1"/>
         <w:pageBreakBefore/>
       </w:pPr>
-      <w:bookmarkStart w:id="1" w:name="_Toc243441191"/>
+      <w:bookmarkStart w:id="1" w:name="_Toc243542989"/>
       <w:r>
         <w:lastRenderedPageBreak/>
         <w:t>1. Abstract</w:t>
@@ -5457,7 +5457,7 @@
       <w:pPr>
         <w:pStyle w:val="Heading1"/>
       </w:pPr>
-      <w:bookmarkStart w:id="2" w:name="_Toc243441192"/>
+      <w:bookmarkStart w:id="2" w:name="_Toc243542990"/>
       <w:r>
         <w:t>2. Introduction</w:t>
       </w:r>
@@ -5487,7 +5487,7 @@
       <w:pPr>
         <w:pStyle w:val="Heading2"/>
       </w:pPr>
-      <w:bookmarkStart w:id="3" w:name="_Toc243441193"/>
+      <w:bookmarkStart w:id="3" w:name="_Toc243542991"/>
       <w:r>
         <w:t>2.1 Home Assistant</w:t>
       </w:r>
@@ -5539,7 +5539,7 @@
       <w:pPr>
         <w:pStyle w:val="Heading2"/>
       </w:pPr>
-      <w:bookmarkStart w:id="4" w:name="_Toc243441194"/>
+      <w:bookmarkStart w:id="4" w:name="_Toc243542992"/>
       <w:r>
         <w:t>2.2 Literature survey</w:t>
       </w:r>
@@ -6024,7 +6024,7 @@
       <w:pPr>
         <w:pStyle w:val="Heading1"/>
       </w:pPr>
-      <w:bookmarkStart w:id="5" w:name="_Toc243441195"/>
+      <w:bookmarkStart w:id="5" w:name="_Toc243542993"/>
       <w:r>
         <w:t>3. Problem Statement</w:t>
       </w:r>
@@ -6137,7 +6137,7 @@
       <w:pPr>
         <w:pStyle w:val="Heading1"/>
       </w:pPr>
-      <w:bookmarkStart w:id="6" w:name="_Toc243441196"/>
+      <w:bookmarkStart w:id="6" w:name="_Toc243542994"/>
       <w:r>
         <w:lastRenderedPageBreak/>
         <w:t>4. Objectives</w:t>
@@ -6278,7 +6278,7 @@
       <w:pPr>
         <w:pStyle w:val="Heading1"/>
       </w:pPr>
-      <w:bookmarkStart w:id="7" w:name="_Toc243441197"/>
+      <w:bookmarkStart w:id="7" w:name="_Toc243542995"/>
       <w:r>
         <w:t>5. Existing Systems and Their Limitations</w:t>
       </w:r>
@@ -6547,7 +6547,7 @@
       <w:pPr>
         <w:pStyle w:val="Heading2"/>
       </w:pPr>
-      <w:bookmarkStart w:id="8" w:name="_Toc243441198"/>
+      <w:bookmarkStart w:id="8" w:name="_Toc243542996"/>
       <w:r>
         <w:t>5.1 Why the MQTT approach was rejected</w:t>
       </w:r>
@@ -6585,7 +6585,7 @@
       <w:pPr>
         <w:pStyle w:val="Heading2"/>
       </w:pPr>
-      <w:bookmarkStart w:id="9" w:name="_Toc243441199"/>
+      <w:bookmarkStart w:id="9" w:name="_Toc243542997"/>
       <w:r>
         <w:t>5.2 The three designs the project went through</w:t>
       </w:r>
@@ -6916,7 +6916,7 @@
       <w:pPr>
         <w:pStyle w:val="Heading1"/>
       </w:pPr>
-      <w:bookmarkStart w:id="10" w:name="_Toc243441200"/>
+      <w:bookmarkStart w:id="10" w:name="_Toc243542998"/>
       <w:r>
         <w:t>6. Proposed System</w:t>
       </w:r>
@@ -6994,7 +6994,7 @@
       <w:pPr>
         <w:pStyle w:val="Heading2"/>
       </w:pPr>
-      <w:bookmarkStart w:id="11" w:name="_Toc243441201"/>
+      <w:bookmarkStart w:id="11" w:name="_Toc243542999"/>
       <w:r>
         <w:t>6.1 The memory constraint and the split architecture</w:t>
       </w:r>
@@ -7098,7 +7098,7 @@
       <w:pPr>
         <w:pStyle w:val="Heading2"/>
       </w:pPr>
-      <w:bookmarkStart w:id="12" w:name="_Toc243441202"/>
+      <w:bookmarkStart w:id="12" w:name="_Toc243543000"/>
       <w:r>
         <w:lastRenderedPageBreak/>
         <w:t>6.2 The layout is data, not code</w:t>
@@ -7265,7 +7265,7 @@
         <w:pStyle w:val="Heading1"/>
         <w:pageBreakBefore/>
       </w:pPr>
-      <w:bookmarkStart w:id="13" w:name="_Toc243441203"/>
+      <w:bookmarkStart w:id="13" w:name="_Toc243543001"/>
       <w:r>
         <w:lastRenderedPageBreak/>
         <w:t>7. System Architecture</w:t>
@@ -7281,7 +7281,7 @@
       <w:pPr>
         <w:pStyle w:val="Heading2"/>
       </w:pPr>
-      <w:bookmarkStart w:id="14" w:name="_Toc243441204"/>
+      <w:bookmarkStart w:id="14" w:name="_Toc243543002"/>
       <w:r>
         <w:t>7.1 Overall system diagram</w:t>
       </w:r>
@@ -7298,7 +7298,7 @@
           <w:noProof/>
         </w:rPr>
         <w:drawing>
-          <wp:inline distT="0" distB="0" distL="0" distR="0" wp14:anchorId="199D166E" wp14:editId="3A723947">
+          <wp:inline distT="0" distB="0" distL="0" distR="0" wp14:anchorId="6BDBFF63" wp14:editId="71E162E9">
             <wp:extent cx="5760000" cy="3246545"/>
             <wp:effectExtent l="0" t="0" r="0" b="0"/>
             <wp:docPr id="1" name="Picture 1"/>
@@ -7391,7 +7391,7 @@
       <w:pPr>
         <w:pStyle w:val="Heading2"/>
       </w:pPr>
-      <w:bookmarkStart w:id="15" w:name="_Toc243441205"/>
+      <w:bookmarkStart w:id="15" w:name="_Toc243543003"/>
       <w:r>
         <w:lastRenderedPageBreak/>
         <w:t>7.2 Hardware diagram</w:t>
@@ -7409,7 +7409,7 @@
           <w:noProof/>
         </w:rPr>
         <w:drawing>
-          <wp:inline distT="0" distB="0" distL="0" distR="0" wp14:anchorId="4B0C1EED" wp14:editId="2B0B448A">
+          <wp:inline distT="0" distB="0" distL="0" distR="0" wp14:anchorId="6E9C7EDA" wp14:editId="04BB54EE">
             <wp:extent cx="5580000" cy="3195818"/>
             <wp:effectExtent l="0" t="0" r="0" b="0"/>
             <wp:docPr id="2" name="Picture 2"/>
@@ -7475,7 +7475,7 @@
       <w:pPr>
         <w:pStyle w:val="Heading2"/>
       </w:pPr>
-      <w:bookmarkStart w:id="16" w:name="_Toc243441206"/>
+      <w:bookmarkStart w:id="16" w:name="_Toc243543004"/>
       <w:r>
         <w:t>7.3 Software diagram</w:t>
       </w:r>
@@ -7492,7 +7492,7 @@
           <w:noProof/>
         </w:rPr>
         <w:drawing>
-          <wp:inline distT="0" distB="0" distL="0" distR="0" wp14:anchorId="6A511ED3" wp14:editId="45186370">
+          <wp:inline distT="0" distB="0" distL="0" distR="0" wp14:anchorId="21B5D8F3" wp14:editId="58509561">
             <wp:extent cx="5760000" cy="3015000"/>
             <wp:effectExtent l="0" t="0" r="0" b="0"/>
             <wp:docPr id="3" name="Picture 3"/>
@@ -7562,7 +7562,7 @@
       <w:pPr>
         <w:pStyle w:val="Heading2"/>
       </w:pPr>
-      <w:bookmarkStart w:id="17" w:name="_Toc243441207"/>
+      <w:bookmarkStart w:id="17" w:name="_Toc243543005"/>
       <w:r>
         <w:t>7.4 Block diagram</w:t>
       </w:r>
@@ -7579,7 +7579,7 @@
           <w:noProof/>
         </w:rPr>
         <w:drawing>
-          <wp:inline distT="0" distB="0" distL="0" distR="0" wp14:anchorId="53AB90E9" wp14:editId="77E31096">
+          <wp:inline distT="0" distB="0" distL="0" distR="0" wp14:anchorId="267F7F6F" wp14:editId="04488CF6">
             <wp:extent cx="5760000" cy="2625488"/>
             <wp:effectExtent l="0" t="0" r="0" b="0"/>
             <wp:docPr id="4" name="Picture 4"/>
@@ -7641,7 +7641,7 @@
         <w:pStyle w:val="Heading1"/>
         <w:pageBreakBefore/>
       </w:pPr>
-      <w:bookmarkStart w:id="18" w:name="_Toc243441208"/>
+      <w:bookmarkStart w:id="18" w:name="_Toc243543006"/>
       <w:r>
         <w:lastRenderedPageBreak/>
         <w:t>8. Hardware Description</w:t>
@@ -7666,7 +7666,7 @@
       <w:pPr>
         <w:pStyle w:val="Heading2"/>
       </w:pPr>
-      <w:bookmarkStart w:id="19" w:name="_Toc243441209"/>
+      <w:bookmarkStart w:id="19" w:name="_Toc243543007"/>
       <w:r>
         <w:t>8.1 Components</w:t>
       </w:r>
@@ -8170,7 +8170,7 @@
       <w:pPr>
         <w:pStyle w:val="Heading2"/>
       </w:pPr>
-      <w:bookmarkStart w:id="20" w:name="_Toc243441210"/>
+      <w:bookmarkStart w:id="20" w:name="_Toc243543008"/>
       <w:r>
         <w:t>8.2 Pin assignment</w:t>
       </w:r>
@@ -8942,7 +8942,7 @@
       <w:pPr>
         <w:pStyle w:val="Heading2"/>
       </w:pPr>
-      <w:bookmarkStart w:id="21" w:name="_Toc243441211"/>
+      <w:bookmarkStart w:id="21" w:name="_Toc243543009"/>
       <w:r>
         <w:t>8.3 Batch variation in this board family</w:t>
       </w:r>
@@ -9177,7 +9177,7 @@
         <w:pStyle w:val="Heading1"/>
         <w:pageBreakBefore/>
       </w:pPr>
-      <w:bookmarkStart w:id="22" w:name="_Toc243441212"/>
+      <w:bookmarkStart w:id="22" w:name="_Toc243543010"/>
       <w:r>
         <w:lastRenderedPageBreak/>
         <w:t>9. Software Description</w:t>
@@ -9188,7 +9188,7 @@
       <w:pPr>
         <w:pStyle w:val="Heading2"/>
       </w:pPr>
-      <w:bookmarkStart w:id="23" w:name="_Toc243441213"/>
+      <w:bookmarkStart w:id="23" w:name="_Toc243543011"/>
       <w:r>
         <w:t>9.1 Panel firmware: environment and libraries</w:t>
       </w:r>
@@ -9869,7 +9869,7 @@
       <w:pPr>
         <w:pStyle w:val="Heading2"/>
       </w:pPr>
-      <w:bookmarkStart w:id="24" w:name="_Toc243441214"/>
+      <w:bookmarkStart w:id="24" w:name="_Toc243543012"/>
       <w:r>
         <w:t>9.2 Desktop designer: environment and libraries</w:t>
       </w:r>
@@ -10295,7 +10295,7 @@
       <w:pPr>
         <w:pStyle w:val="Heading2"/>
       </w:pPr>
-      <w:bookmarkStart w:id="25" w:name="_Toc243441215"/>
+      <w:bookmarkStart w:id="25" w:name="_Toc243543013"/>
       <w:r>
         <w:t>9.3 Source code organisation</w:t>
       </w:r>
@@ -10992,7 +10992,7 @@
       <w:pPr>
         <w:pStyle w:val="Heading2"/>
       </w:pPr>
-      <w:bookmarkStart w:id="26" w:name="_Toc243441216"/>
+      <w:bookmarkStart w:id="26" w:name="_Toc243543014"/>
       <w:r>
         <w:t>9.4 The transport interface</w:t>
       </w:r>
@@ -11216,7 +11216,7 @@
         <w:pStyle w:val="Heading1"/>
         <w:pageBreakBefore/>
       </w:pPr>
-      <w:bookmarkStart w:id="27" w:name="_Toc243441217"/>
+      <w:bookmarkStart w:id="27" w:name="_Toc243543015"/>
       <w:r>
         <w:lastRenderedPageBreak/>
         <w:t>10. Implementation</w:t>
@@ -11227,7 +11227,7 @@
       <w:pPr>
         <w:pStyle w:val="Heading2"/>
       </w:pPr>
-      <w:bookmarkStart w:id="28" w:name="_Toc243441218"/>
+      <w:bookmarkStart w:id="28" w:name="_Toc243543016"/>
       <w:r>
         <w:t>10.1 The communication protocol</w:t>
       </w:r>
@@ -11476,7 +11476,7 @@
           <w:noProof/>
         </w:rPr>
         <w:drawing>
-          <wp:inline distT="0" distB="0" distL="0" distR="0" wp14:anchorId="5D003171" wp14:editId="6B75AC11">
+          <wp:inline distT="0" distB="0" distL="0" distR="0" wp14:anchorId="6E545F5A" wp14:editId="35DB036C">
             <wp:extent cx="3240000" cy="3536229"/>
             <wp:effectExtent l="0" t="0" r="0" b="0"/>
             <wp:docPr id="5" name="Picture 5"/>
@@ -11548,7 +11548,7 @@
       <w:pPr>
         <w:pStyle w:val="Heading2"/>
       </w:pPr>
-      <w:bookmarkStart w:id="29" w:name="_Toc243441219"/>
+      <w:bookmarkStart w:id="29" w:name="_Toc243543017"/>
       <w:r>
         <w:lastRenderedPageBreak/>
         <w:t>10.2 Task structure and interface responsiveness</w:t>
@@ -11643,7 +11643,7 @@
       <w:pPr>
         <w:pStyle w:val="Heading2"/>
       </w:pPr>
-      <w:bookmarkStart w:id="30" w:name="_Toc243441220"/>
+      <w:bookmarkStart w:id="30" w:name="_Toc243543018"/>
       <w:r>
         <w:t>10.3 Memory strategy</w:t>
       </w:r>
@@ -11748,7 +11748,7 @@
       <w:pPr>
         <w:pStyle w:val="Heading2"/>
       </w:pPr>
-      <w:bookmarkStart w:id="31" w:name="_Toc243441221"/>
+      <w:bookmarkStart w:id="31" w:name="_Toc243543019"/>
       <w:r>
         <w:t>10.4 Touch coordinate handling</w:t>
       </w:r>
@@ -11763,7 +11763,7 @@
       <w:pPr>
         <w:pStyle w:val="Heading2"/>
       </w:pPr>
-      <w:bookmarkStart w:id="32" w:name="_Toc243441222"/>
+      <w:bookmarkStart w:id="32" w:name="_Toc243543020"/>
       <w:r>
         <w:t>10.5 Receiving and storing a layout</w:t>
       </w:r>
@@ -11889,7 +11889,7 @@
       <w:pPr>
         <w:pStyle w:val="Heading2"/>
       </w:pPr>
-      <w:bookmarkStart w:id="33" w:name="_Toc243441223"/>
+      <w:bookmarkStart w:id="33" w:name="_Toc243543021"/>
       <w:r>
         <w:t>10.6 The user interface</w:t>
       </w:r>
@@ -11911,7 +11911,7 @@
           <w:noProof/>
         </w:rPr>
         <w:drawing>
-          <wp:inline distT="0" distB="0" distL="0" distR="0" wp14:anchorId="1C56F739" wp14:editId="4F5700AD">
+          <wp:inline distT="0" distB="0" distL="0" distR="0" wp14:anchorId="2E1F064D" wp14:editId="7741770F">
             <wp:extent cx="5400000" cy="2006192"/>
             <wp:effectExtent l="0" t="0" r="0" b="0"/>
             <wp:docPr id="6" name="Picture 6"/>
@@ -12095,7 +12095,7 @@
         </w:rPr>
         <w:lastRenderedPageBreak/>
         <w:drawing>
-          <wp:inline distT="0" distB="0" distL="0" distR="0" wp14:anchorId="57C1C4D0" wp14:editId="3FA842D8">
+          <wp:inline distT="0" distB="0" distL="0" distR="0" wp14:anchorId="25817868" wp14:editId="72F4EE4B">
             <wp:extent cx="4860000" cy="3667362"/>
             <wp:effectExtent l="0" t="0" r="0" b="0"/>
             <wp:docPr id="7" name="Picture 7"/>
@@ -12156,7 +12156,7 @@
       <w:pPr>
         <w:pStyle w:val="Heading2"/>
       </w:pPr>
-      <w:bookmarkStart w:id="34" w:name="_Toc243441224"/>
+      <w:bookmarkStart w:id="34" w:name="_Toc243543022"/>
       <w:r>
         <w:t>10.7 Themes</w:t>
       </w:r>
@@ -12179,7 +12179,7 @@
         </w:rPr>
         <w:lastRenderedPageBreak/>
         <w:drawing>
-          <wp:inline distT="0" distB="0" distL="0" distR="0" wp14:anchorId="351925CC" wp14:editId="20CBC7F9">
+          <wp:inline distT="0" distB="0" distL="0" distR="0" wp14:anchorId="39669C25" wp14:editId="30811CAC">
             <wp:extent cx="4500000" cy="5739130"/>
             <wp:effectExtent l="0" t="0" r="0" b="0"/>
             <wp:docPr id="8" name="Picture 8"/>
@@ -12240,7 +12240,7 @@
       <w:pPr>
         <w:pStyle w:val="Heading2"/>
       </w:pPr>
-      <w:bookmarkStart w:id="35" w:name="_Toc243441225"/>
+      <w:bookmarkStart w:id="35" w:name="_Toc243543023"/>
       <w:r>
         <w:t>10.8 A panel that explains its own failures</w:t>
       </w:r>
@@ -12266,7 +12266,7 @@
         <w:pStyle w:val="Heading1"/>
         <w:pageBreakBefore/>
       </w:pPr>
-      <w:bookmarkStart w:id="36" w:name="_Toc243441226"/>
+      <w:bookmarkStart w:id="36" w:name="_Toc243543024"/>
       <w:r>
         <w:lastRenderedPageBreak/>
         <w:t>11. The HomeMesh Designer (Desktop App)</w:t>
@@ -12289,7 +12289,7 @@
           <w:noProof/>
         </w:rPr>
         <w:drawing>
-          <wp:inline distT="0" distB="0" distL="0" distR="0" wp14:anchorId="44C34C29" wp14:editId="134D9D49">
+          <wp:inline distT="0" distB="0" distL="0" distR="0" wp14:anchorId="6435B52B" wp14:editId="7B7425C8">
             <wp:extent cx="5760000" cy="3637895"/>
             <wp:effectExtent l="0" t="0" r="0" b="0"/>
             <wp:docPr id="9" name="Picture 9"/>
@@ -12350,7 +12350,7 @@
       <w:pPr>
         <w:pStyle w:val="Heading2"/>
       </w:pPr>
-      <w:bookmarkStart w:id="37" w:name="_Toc243441227"/>
+      <w:bookmarkStart w:id="37" w:name="_Toc243543025"/>
       <w:r>
         <w:t>11.1 What it does</w:t>
       </w:r>
@@ -12483,7 +12483,7 @@
       <w:pPr>
         <w:pStyle w:val="Heading2"/>
       </w:pPr>
-      <w:bookmarkStart w:id="38" w:name="_Toc243441228"/>
+      <w:bookmarkStart w:id="38" w:name="_Toc243543026"/>
       <w:r>
         <w:lastRenderedPageBreak/>
         <w:t>11.2 The simulator is the real interface</w:t>
@@ -12514,7 +12514,7 @@
       <w:pPr>
         <w:pStyle w:val="Heading2"/>
       </w:pPr>
-      <w:bookmarkStart w:id="39" w:name="_Toc243441229"/>
+      <w:bookmarkStart w:id="39" w:name="_Toc243543027"/>
       <w:r>
         <w:t>11.3 How the designer is tested</w:t>
       </w:r>
@@ -12580,7 +12580,7 @@
         <w:pStyle w:val="Heading1"/>
         <w:pageBreakBefore/>
       </w:pPr>
-      <w:bookmarkStart w:id="40" w:name="_Toc243441230"/>
+      <w:bookmarkStart w:id="40" w:name="_Toc243543028"/>
       <w:r>
         <w:lastRenderedPageBreak/>
         <w:t>12. System Operation</w:t>
@@ -12591,7 +12591,7 @@
       <w:pPr>
         <w:pStyle w:val="Heading2"/>
       </w:pPr>
-      <w:bookmarkStart w:id="41" w:name="_Toc243441231"/>
+      <w:bookmarkStart w:id="41" w:name="_Toc243543029"/>
       <w:r>
         <w:t>12.1 Network configuration</w:t>
       </w:r>
@@ -12919,7 +12919,7 @@
       <w:pPr>
         <w:pStyle w:val="Heading2"/>
       </w:pPr>
-      <w:bookmarkStart w:id="42" w:name="_Toc243441232"/>
+      <w:bookmarkStart w:id="42" w:name="_Toc243543030"/>
       <w:r>
         <w:t>12.2 Devices on the panel</w:t>
       </w:r>
@@ -13225,7 +13225,7 @@
       <w:pPr>
         <w:pStyle w:val="Heading2"/>
       </w:pPr>
-      <w:bookmarkStart w:id="43" w:name="_Toc243441233"/>
+      <w:bookmarkStart w:id="43" w:name="_Toc243543031"/>
       <w:r>
         <w:t>12.3 Changing what the panel shows</w:t>
       </w:r>
@@ -13318,7 +13318,7 @@
         <w:pStyle w:val="Heading1"/>
         <w:pageBreakBefore/>
       </w:pPr>
-      <w:bookmarkStart w:id="44" w:name="_Toc243441234"/>
+      <w:bookmarkStart w:id="44" w:name="_Toc243543032"/>
       <w:r>
         <w:lastRenderedPageBreak/>
         <w:t>13. Testing and Results</w:t>
@@ -13334,7 +13334,7 @@
       <w:pPr>
         <w:pStyle w:val="Heading2"/>
       </w:pPr>
-      <w:bookmarkStart w:id="45" w:name="_Toc243441235"/>
+      <w:bookmarkStart w:id="45" w:name="_Toc243543033"/>
       <w:r>
         <w:t>13.1 Message size and latency</w:t>
       </w:r>
@@ -13728,7 +13728,7 @@
           <w:noProof/>
         </w:rPr>
         <w:drawing>
-          <wp:inline distT="0" distB="0" distL="0" distR="0" wp14:anchorId="2397AB93" wp14:editId="0C9DE6C5">
+          <wp:inline distT="0" distB="0" distL="0" distR="0" wp14:anchorId="31DA70D4" wp14:editId="24274292">
             <wp:extent cx="3960000" cy="1998857"/>
             <wp:effectExtent l="0" t="0" r="0" b="0"/>
             <wp:docPr id="10" name="Picture 10"/>
@@ -13794,7 +13794,7 @@
       <w:pPr>
         <w:pStyle w:val="Heading2"/>
       </w:pPr>
-      <w:bookmarkStart w:id="46" w:name="_Toc243441236"/>
+      <w:bookmarkStart w:id="46" w:name="_Toc243543034"/>
       <w:r>
         <w:t>13.2 Resource usage</w:t>
       </w:r>
@@ -14106,7 +14106,7 @@
       <w:pPr>
         <w:pStyle w:val="Heading2"/>
       </w:pPr>
-      <w:bookmarkStart w:id="47" w:name="_Toc243441237"/>
+      <w:bookmarkStart w:id="47" w:name="_Toc243543035"/>
       <w:r>
         <w:t>13.3 Functional verification</w:t>
       </w:r>
@@ -14683,7 +14683,7 @@
       <w:pPr>
         <w:pStyle w:val="Heading2"/>
       </w:pPr>
-      <w:bookmarkStart w:id="48" w:name="_Toc243441238"/>
+      <w:bookmarkStart w:id="48" w:name="_Toc243543036"/>
       <w:r>
         <w:t>13.4 Field case study: the connection that kept dropping</w:t>
       </w:r>
@@ -14779,7 +14779,7 @@
       <w:pPr>
         <w:pStyle w:val="Heading2"/>
       </w:pPr>
-      <w:bookmarkStart w:id="49" w:name="_Toc243441239"/>
+      <w:bookmarkStart w:id="49" w:name="_Toc243543037"/>
       <w:r>
         <w:lastRenderedPageBreak/>
         <w:t>13.5 Other challenges and their resolution</w:t>
@@ -15319,7 +15319,7 @@
       <w:pPr>
         <w:pStyle w:val="Heading1"/>
       </w:pPr>
-      <w:bookmarkStart w:id="50" w:name="_Toc243441240"/>
+      <w:bookmarkStart w:id="50" w:name="_Toc243543038"/>
       <w:r>
         <w:t>14. Future Scope</w:t>
       </w:r>
@@ -15437,7 +15437,7 @@
       <w:pPr>
         <w:pStyle w:val="Heading1"/>
       </w:pPr>
-      <w:bookmarkStart w:id="51" w:name="_Toc243441241"/>
+      <w:bookmarkStart w:id="51" w:name="_Toc243543039"/>
       <w:r>
         <w:t>15. Conclusion</w:t>
       </w:r>
@@ -15493,7 +15493,7 @@
       <w:pPr>
         <w:pStyle w:val="Heading1"/>
       </w:pPr>
-      <w:bookmarkStart w:id="52" w:name="_Toc243441242"/>
+      <w:bookmarkStart w:id="52" w:name="_Toc243543040"/>
       <w:r>
         <w:t>16. References</w:t>
       </w:r>
@@ -15503,7 +15503,7 @@
       <w:pPr>
         <w:pStyle w:val="Heading2"/>
       </w:pPr>
-      <w:bookmarkStart w:id="53" w:name="_Toc243441243"/>
+      <w:bookmarkStart w:id="53" w:name="_Toc243543041"/>
       <w:r>
         <w:t>16.1 Published literature</w:t>
       </w:r>
@@ -15948,7 +15948,7 @@
       <w:pPr>
         <w:pStyle w:val="Heading2"/>
       </w:pPr>
-      <w:bookmarkStart w:id="54" w:name="_Toc243441244"/>
+      <w:bookmarkStart w:id="54" w:name="_Toc243543042"/>
       <w:r>
         <w:t>16.2 Technical documentation</w:t>
       </w:r>
@@ -16127,7 +16127,7 @@
         <w:pStyle w:val="Heading1"/>
         <w:pageBreakBefore/>
       </w:pPr>
-      <w:bookmarkStart w:id="55" w:name="_Toc243441245"/>
+      <w:bookmarkStart w:id="55" w:name="_Toc243543043"/>
       <w:r>
         <w:lastRenderedPageBreak/>
         <w:t>Appendix A — Suggested Presentation Plan</w:t>
@@ -16138,7 +16138,7 @@
       <w:pPr>
         <w:pStyle w:val="Heading2"/>
       </w:pPr>
-      <w:bookmarkStart w:id="56" w:name="_Toc243441246"/>
+      <w:bookmarkStart w:id="56" w:name="_Toc243543044"/>
       <w:r>
         <w:t>Team roles</w:t>
       </w:r>
@@ -16630,7 +16630,7 @@
       <w:pPr>
         <w:pStyle w:val="Heading2"/>
       </w:pPr>
-      <w:bookmarkStart w:id="57" w:name="_Toc243441247"/>
+      <w:bookmarkStart w:id="57" w:name="_Toc243543045"/>
       <w:r>
         <w:t>Slides</w:t>
       </w:r>
@@ -18537,7 +18537,7 @@
       <w:pPr>
         <w:pStyle w:val="Heading2"/>
       </w:pPr>
-      <w:bookmarkStart w:id="58" w:name="_Toc243441248"/>
+      <w:bookmarkStart w:id="58" w:name="_Toc243543046"/>
       <w:r>
         <w:t>Figure files</w:t>
       </w:r>
@@ -19001,7 +19001,7 @@
       <w:pPr>
         <w:pStyle w:val="Heading2"/>
       </w:pPr>
-      <w:bookmarkStart w:id="59" w:name="_Toc243441249"/>
+      <w:bookmarkStart w:id="59" w:name="_Toc243543047"/>
       <w:r>
         <w:t>Presentation notes</w:t>
       </w:r>
@@ -19047,7 +19047,7 @@
       <w:pPr>
         <w:pStyle w:val="Heading2"/>
       </w:pPr>
-      <w:bookmarkStart w:id="60" w:name="_Toc243441250"/>
+      <w:bookmarkStart w:id="60" w:name="_Toc243543048"/>
       <w:r>
         <w:t>Anticipated questions</w:t>
       </w:r>
@@ -19799,7 +19799,7 @@
         <w:pStyle w:val="Heading1"/>
         <w:pageBreakBefore/>
       </w:pPr>
-      <w:bookmarkStart w:id="61" w:name="_Toc243441251"/>
+      <w:bookmarkStart w:id="61" w:name="_Toc243543049"/>
       <w:r>
         <w:lastRenderedPageBreak/>
         <w:t>Appendix B — Internal Note (Not for Presentation)</w:t>
@@ -19874,7 +19874,7 @@
       <w:pPr>
         <w:pStyle w:val="Heading2"/>
       </w:pPr>
-      <w:bookmarkStart w:id="62" w:name="_Toc243441252"/>
+      <w:bookmarkStart w:id="62" w:name="_Toc243543050"/>
       <w:r>
         <w:t>What is genuinely working</w:t>
       </w:r>
@@ -19943,7 +19943,7 @@
       <w:pPr>
         <w:pStyle w:val="Heading2"/>
       </w:pPr>
-      <w:bookmarkStart w:id="63" w:name="_Toc243441253"/>
+      <w:bookmarkStart w:id="63" w:name="_Toc243543051"/>
       <w:r>
         <w:t>What must not be claimed</w:t>
       </w:r>
@@ -20292,7 +20292,7 @@
       <w:pPr>
         <w:pStyle w:val="Heading2"/>
       </w:pPr>
-      <w:bookmarkStart w:id="64" w:name="_Toc243441254"/>
+      <w:bookmarkStart w:id="64" w:name="_Toc243543052"/>
       <w:r>
         <w:lastRenderedPageBreak/>
         <w:t>Check before the review: firmware on the board</w:t>
@@ -20341,7 +20341,7 @@
               <w:rPr>
                 <w:b/>
               </w:rPr>
-              <w:t>The board is running the 20 October firmware — flash the 21 October one</w:t>
+              <w:t>The board is running the 21 October firmware</w:t>
             </w:r>
           </w:p>
           <w:p>
@@ -20352,7 +20352,7 @@
               <w:rPr>
                 <w:sz w:val="20"/>
               </w:rPr>
-              <w:t>Flashed on 20 October with the fixes for long names and the light (Daylight) theme; the boot log matched the healthy one. Check the names and the Daylight theme on the real screen once before the review.</w:t>
+              <w:t>Flashed on 22 October from the designer's Panel firmware card, with fan speed, automation colours and the fixes for long names and the light (Daylight) theme. Check the names and the Daylight theme on the real screen once before the review, and push your layout again: flashing erased the one stored on the panel.</w:t>
             </w:r>
           </w:p>
           <w:p>
@@ -20364,52 +20364,13 @@
                 <w:b/>
                 <w:sz w:val="20"/>
               </w:rPr>
-              <w:t>The 21 October firmware adds fan speed and automation colours and is not flashed yet</w:t>
+              <w:t>The Wi-Fi link from the laptop to the panel is currently poor</w:t>
             </w:r>
             <w:r>
               <w:rPr>
                 <w:sz w:val="20"/>
               </w:rPr>
-              <w:t xml:space="preserve"> (the board was unplugged). Flash it (</w:t>
-            </w:r>
-            <w:r>
-              <w:rPr>
-                <w:rFonts w:ascii="Consolas" w:hAnsi="Consolas"/>
-                <w:sz w:val="18"/>
-              </w:rPr>
-              <w:t>pio run -e ha -t upload</w:t>
-            </w:r>
-            <w:r>
-              <w:rPr>
-                <w:sz w:val="20"/>
-              </w:rPr>
-              <w:t xml:space="preserve">, or </w:t>
-            </w:r>
-            <w:r>
-              <w:rPr>
-                <w:rFonts w:ascii="Consolas" w:hAnsi="Consolas"/>
-                <w:sz w:val="18"/>
-              </w:rPr>
-              <w:t>../homemesh_ha_firmware_21oct.bin</w:t>
-            </w:r>
-            <w:r>
-              <w:rPr>
-                <w:sz w:val="20"/>
-              </w:rPr>
-              <w:t xml:space="preserve">), check the boot log, then push the layout again. </w:t>
-            </w:r>
-            <w:r>
-              <w:rPr>
-                <w:b/>
-                <w:sz w:val="20"/>
-              </w:rPr>
-              <w:t>Until then, do not push a layout with a speed-controlled fan on it</w:t>
-            </w:r>
-            <w:r>
-              <w:rPr>
-                <w:sz w:val="20"/>
-              </w:rPr>
-              <w:t>: the old firmware would send the fan a light's brightness command, which Home Assistant rejects.</w:t>
+              <w:t xml:space="preserve"> (half the pings lost on 22 October; 0% on 18 October). After a push or a restart the panel can take minutes to reconnect. Test the demo in the room it will run in, with the panel's log open, and if it is slow try the phone hotspot route in "Before the presentation".</w:t>
             </w:r>
           </w:p>
           <w:p>
@@ -20485,7 +20446,7 @@
       <w:pPr>
         <w:pStyle w:val="Heading2"/>
       </w:pPr>
-      <w:bookmarkStart w:id="65" w:name="_Toc243441255"/>
+      <w:bookmarkStart w:id="65" w:name="_Toc243543053"/>
       <w:r>
         <w:t>Two quirks that may be noticed, and how to answer</w:t>
       </w:r>
@@ -20644,7 +20605,7 @@
       <w:pPr>
         <w:pStyle w:val="Heading2"/>
       </w:pPr>
-      <w:bookmarkStart w:id="66" w:name="_Toc243441256"/>
+      <w:bookmarkStart w:id="66" w:name="_Toc243543054"/>
       <w:r>
         <w:t>Before the presentation</w:t>
       </w:r>
@@ -21058,31 +21019,31 @@
       </w:rPr>
     </w:lvl>
   </w:abstractNum>
-  <w:num w:numId="1" w16cid:durableId="2059160341">
+  <w:num w:numId="1" w16cid:durableId="1789278889">
     <w:abstractNumId w:val="8"/>
   </w:num>
-  <w:num w:numId="2" w16cid:durableId="978729694">
+  <w:num w:numId="2" w16cid:durableId="1216354812">
     <w:abstractNumId w:val="6"/>
   </w:num>
-  <w:num w:numId="3" w16cid:durableId="1804080672">
+  <w:num w:numId="3" w16cid:durableId="1318536881">
     <w:abstractNumId w:val="5"/>
   </w:num>
-  <w:num w:numId="4" w16cid:durableId="1185249720">
+  <w:num w:numId="4" w16cid:durableId="551187735">
     <w:abstractNumId w:val="4"/>
   </w:num>
-  <w:num w:numId="5" w16cid:durableId="1350377364">
+  <w:num w:numId="5" w16cid:durableId="1990400501">
     <w:abstractNumId w:val="7"/>
   </w:num>
-  <w:num w:numId="6" w16cid:durableId="1333020863">
+  <w:num w:numId="6" w16cid:durableId="1130592092">
     <w:abstractNumId w:val="3"/>
   </w:num>
-  <w:num w:numId="7" w16cid:durableId="261888297">
+  <w:num w:numId="7" w16cid:durableId="1721591185">
     <w:abstractNumId w:val="2"/>
   </w:num>
-  <w:num w:numId="8" w16cid:durableId="1019812779">
+  <w:num w:numId="8" w16cid:durableId="681712215">
     <w:abstractNumId w:val="1"/>
   </w:num>
-  <w:num w:numId="9" w16cid:durableId="1201480509">
+  <w:num w:numId="9" w16cid:durableId="1775320396">
     <w:abstractNumId w:val="0"/>
   </w:num>
 </w:numbering>
@@ -32475,7 +32436,7 @@
     <w:autoRedefine/>
     <w:uiPriority w:val="39"/>
     <w:unhideWhenUsed/>
-    <w:rsid w:val="00CA124C"/>
+    <w:rsid w:val="005F5779"/>
     <w:pPr>
       <w:spacing w:after="100"/>
     </w:pPr>
@@ -32487,7 +32448,7 @@
     <w:autoRedefine/>
     <w:uiPriority w:val="39"/>
     <w:unhideWhenUsed/>
-    <w:rsid w:val="00CA124C"/>
+    <w:rsid w:val="005F5779"/>
     <w:pPr>
       <w:spacing w:after="100"/>
       <w:ind w:left="210"/>
@@ -32498,7 +32459,7 @@
     <w:basedOn w:val="DefaultParagraphFont"/>
     <w:uiPriority w:val="99"/>
     <w:unhideWhenUsed/>
-    <w:rsid w:val="00CA124C"/>
+    <w:rsid w:val="005F5779"/>
     <w:rPr>
       <w:color w:val="0000FF" w:themeColor="hyperlink"/>
       <w:u w:val="single"/>

</xml_diff>

<commit_message>
Revert "Flash a panel from the designer"
Undone at the user's request. The notes keep what was learned while it
was in: the panel runs the 21 October firmware since 22 October, and the
hotspot link to it is losing half its packets.
</commit_message>
<xml_diff>
--- a/docs/HomeMesh_Panel_Project_Documentation.docx
+++ b/docs/HomeMesh_Panel_Project_Documentation.docx
@@ -513,7 +513,7 @@
       <w:r>
         <w:fldChar w:fldCharType="separate"/>
       </w:r>
-      <w:hyperlink w:anchor="_Toc243542988" w:history="1">
+      <w:hyperlink w:anchor="_Toc243441190" w:history="1">
         <w:r>
           <w:rPr>
             <w:rStyle w:val="Hyperlink"/>
@@ -540,7 +540,7 @@
             <w:noProof/>
             <w:webHidden/>
           </w:rPr>
-          <w:instrText xml:space="preserve"> PAGEREF _Toc243542988 \h </w:instrText>
+          <w:instrText xml:space="preserve"> PAGEREF _Toc243441190 \h </w:instrText>
         </w:r>
         <w:r>
           <w:rPr>
@@ -581,7 +581,7 @@
           <w:noProof/>
         </w:rPr>
       </w:pPr>
-      <w:hyperlink w:anchor="_Toc243542989" w:history="1">
+      <w:hyperlink w:anchor="_Toc243441191" w:history="1">
         <w:r>
           <w:rPr>
             <w:rStyle w:val="Hyperlink"/>
@@ -608,7 +608,7 @@
             <w:noProof/>
             <w:webHidden/>
           </w:rPr>
-          <w:instrText xml:space="preserve"> PAGEREF _Toc243542989 \h </w:instrText>
+          <w:instrText xml:space="preserve"> PAGEREF _Toc243441191 \h </w:instrText>
         </w:r>
         <w:r>
           <w:rPr>
@@ -649,7 +649,7 @@
           <w:noProof/>
         </w:rPr>
       </w:pPr>
-      <w:hyperlink w:anchor="_Toc243542990" w:history="1">
+      <w:hyperlink w:anchor="_Toc243441192" w:history="1">
         <w:r>
           <w:rPr>
             <w:rStyle w:val="Hyperlink"/>
@@ -676,7 +676,7 @@
             <w:noProof/>
             <w:webHidden/>
           </w:rPr>
-          <w:instrText xml:space="preserve"> PAGEREF _Toc243542990 \h </w:instrText>
+          <w:instrText xml:space="preserve"> PAGEREF _Toc243441192 \h </w:instrText>
         </w:r>
         <w:r>
           <w:rPr>
@@ -717,7 +717,7 @@
           <w:noProof/>
         </w:rPr>
       </w:pPr>
-      <w:hyperlink w:anchor="_Toc243542991" w:history="1">
+      <w:hyperlink w:anchor="_Toc243441193" w:history="1">
         <w:r>
           <w:rPr>
             <w:rStyle w:val="Hyperlink"/>
@@ -744,7 +744,7 @@
             <w:noProof/>
             <w:webHidden/>
           </w:rPr>
-          <w:instrText xml:space="preserve"> PAGEREF _Toc243542991 \h </w:instrText>
+          <w:instrText xml:space="preserve"> PAGEREF _Toc243441193 \h </w:instrText>
         </w:r>
         <w:r>
           <w:rPr>
@@ -785,7 +785,7 @@
           <w:noProof/>
         </w:rPr>
       </w:pPr>
-      <w:hyperlink w:anchor="_Toc243542992" w:history="1">
+      <w:hyperlink w:anchor="_Toc243441194" w:history="1">
         <w:r>
           <w:rPr>
             <w:rStyle w:val="Hyperlink"/>
@@ -812,7 +812,7 @@
             <w:noProof/>
             <w:webHidden/>
           </w:rPr>
-          <w:instrText xml:space="preserve"> PAGEREF _Toc243542992 \h </w:instrText>
+          <w:instrText xml:space="preserve"> PAGEREF _Toc243441194 \h </w:instrText>
         </w:r>
         <w:r>
           <w:rPr>
@@ -853,7 +853,7 @@
           <w:noProof/>
         </w:rPr>
       </w:pPr>
-      <w:hyperlink w:anchor="_Toc243542993" w:history="1">
+      <w:hyperlink w:anchor="_Toc243441195" w:history="1">
         <w:r>
           <w:rPr>
             <w:rStyle w:val="Hyperlink"/>
@@ -880,7 +880,7 @@
             <w:noProof/>
             <w:webHidden/>
           </w:rPr>
-          <w:instrText xml:space="preserve"> PAGEREF _Toc243542993 \h </w:instrText>
+          <w:instrText xml:space="preserve"> PAGEREF _Toc243441195 \h </w:instrText>
         </w:r>
         <w:r>
           <w:rPr>
@@ -921,7 +921,7 @@
           <w:noProof/>
         </w:rPr>
       </w:pPr>
-      <w:hyperlink w:anchor="_Toc243542994" w:history="1">
+      <w:hyperlink w:anchor="_Toc243441196" w:history="1">
         <w:r>
           <w:rPr>
             <w:rStyle w:val="Hyperlink"/>
@@ -948,7 +948,7 @@
             <w:noProof/>
             <w:webHidden/>
           </w:rPr>
-          <w:instrText xml:space="preserve"> PAGEREF _Toc243542994 \h </w:instrText>
+          <w:instrText xml:space="preserve"> PAGEREF _Toc243441196 \h </w:instrText>
         </w:r>
         <w:r>
           <w:rPr>
@@ -989,7 +989,7 @@
           <w:noProof/>
         </w:rPr>
       </w:pPr>
-      <w:hyperlink w:anchor="_Toc243542995" w:history="1">
+      <w:hyperlink w:anchor="_Toc243441197" w:history="1">
         <w:r>
           <w:rPr>
             <w:rStyle w:val="Hyperlink"/>
@@ -1016,7 +1016,7 @@
             <w:noProof/>
             <w:webHidden/>
           </w:rPr>
-          <w:instrText xml:space="preserve"> PAGEREF _Toc243542995 \h </w:instrText>
+          <w:instrText xml:space="preserve"> PAGEREF _Toc243441197 \h </w:instrText>
         </w:r>
         <w:r>
           <w:rPr>
@@ -1057,7 +1057,7 @@
           <w:noProof/>
         </w:rPr>
       </w:pPr>
-      <w:hyperlink w:anchor="_Toc243542996" w:history="1">
+      <w:hyperlink w:anchor="_Toc243441198" w:history="1">
         <w:r>
           <w:rPr>
             <w:rStyle w:val="Hyperlink"/>
@@ -1084,7 +1084,7 @@
             <w:noProof/>
             <w:webHidden/>
           </w:rPr>
-          <w:instrText xml:space="preserve"> PAGEREF _Toc243542996 \h </w:instrText>
+          <w:instrText xml:space="preserve"> PAGEREF _Toc243441198 \h </w:instrText>
         </w:r>
         <w:r>
           <w:rPr>
@@ -1125,7 +1125,7 @@
           <w:noProof/>
         </w:rPr>
       </w:pPr>
-      <w:hyperlink w:anchor="_Toc243542997" w:history="1">
+      <w:hyperlink w:anchor="_Toc243441199" w:history="1">
         <w:r>
           <w:rPr>
             <w:rStyle w:val="Hyperlink"/>
@@ -1152,7 +1152,7 @@
             <w:noProof/>
             <w:webHidden/>
           </w:rPr>
-          <w:instrText xml:space="preserve"> PAGEREF _Toc243542997 \h </w:instrText>
+          <w:instrText xml:space="preserve"> PAGEREF _Toc243441199 \h </w:instrText>
         </w:r>
         <w:r>
           <w:rPr>
@@ -1193,7 +1193,7 @@
           <w:noProof/>
         </w:rPr>
       </w:pPr>
-      <w:hyperlink w:anchor="_Toc243542998" w:history="1">
+      <w:hyperlink w:anchor="_Toc243441200" w:history="1">
         <w:r>
           <w:rPr>
             <w:rStyle w:val="Hyperlink"/>
@@ -1220,7 +1220,7 @@
             <w:noProof/>
             <w:webHidden/>
           </w:rPr>
-          <w:instrText xml:space="preserve"> PAGEREF _Toc243542998 \h </w:instrText>
+          <w:instrText xml:space="preserve"> PAGEREF _Toc243441200 \h </w:instrText>
         </w:r>
         <w:r>
           <w:rPr>
@@ -1261,7 +1261,7 @@
           <w:noProof/>
         </w:rPr>
       </w:pPr>
-      <w:hyperlink w:anchor="_Toc243542999" w:history="1">
+      <w:hyperlink w:anchor="_Toc243441201" w:history="1">
         <w:r>
           <w:rPr>
             <w:rStyle w:val="Hyperlink"/>
@@ -1288,7 +1288,7 @@
             <w:noProof/>
             <w:webHidden/>
           </w:rPr>
-          <w:instrText xml:space="preserve"> PAGEREF _Toc243542999 \h </w:instrText>
+          <w:instrText xml:space="preserve"> PAGEREF _Toc243441201 \h </w:instrText>
         </w:r>
         <w:r>
           <w:rPr>
@@ -1329,7 +1329,7 @@
           <w:noProof/>
         </w:rPr>
       </w:pPr>
-      <w:hyperlink w:anchor="_Toc243543000" w:history="1">
+      <w:hyperlink w:anchor="_Toc243441202" w:history="1">
         <w:r>
           <w:rPr>
             <w:rStyle w:val="Hyperlink"/>
@@ -1356,7 +1356,7 @@
             <w:noProof/>
             <w:webHidden/>
           </w:rPr>
-          <w:instrText xml:space="preserve"> PAGEREF _Toc243543000 \h </w:instrText>
+          <w:instrText xml:space="preserve"> PAGEREF _Toc243441202 \h </w:instrText>
         </w:r>
         <w:r>
           <w:rPr>
@@ -1397,7 +1397,7 @@
           <w:noProof/>
         </w:rPr>
       </w:pPr>
-      <w:hyperlink w:anchor="_Toc243543001" w:history="1">
+      <w:hyperlink w:anchor="_Toc243441203" w:history="1">
         <w:r>
           <w:rPr>
             <w:rStyle w:val="Hyperlink"/>
@@ -1424,7 +1424,7 @@
             <w:noProof/>
             <w:webHidden/>
           </w:rPr>
-          <w:instrText xml:space="preserve"> PAGEREF _Toc243543001 \h </w:instrText>
+          <w:instrText xml:space="preserve"> PAGEREF _Toc243441203 \h </w:instrText>
         </w:r>
         <w:r>
           <w:rPr>
@@ -1465,7 +1465,7 @@
           <w:noProof/>
         </w:rPr>
       </w:pPr>
-      <w:hyperlink w:anchor="_Toc243543002" w:history="1">
+      <w:hyperlink w:anchor="_Toc243441204" w:history="1">
         <w:r>
           <w:rPr>
             <w:rStyle w:val="Hyperlink"/>
@@ -1492,7 +1492,7 @@
             <w:noProof/>
             <w:webHidden/>
           </w:rPr>
-          <w:instrText xml:space="preserve"> PAGEREF _Toc243543002 \h </w:instrText>
+          <w:instrText xml:space="preserve"> PAGEREF _Toc243441204 \h </w:instrText>
         </w:r>
         <w:r>
           <w:rPr>
@@ -1533,7 +1533,7 @@
           <w:noProof/>
         </w:rPr>
       </w:pPr>
-      <w:hyperlink w:anchor="_Toc243543003" w:history="1">
+      <w:hyperlink w:anchor="_Toc243441205" w:history="1">
         <w:r>
           <w:rPr>
             <w:rStyle w:val="Hyperlink"/>
@@ -1560,7 +1560,7 @@
             <w:noProof/>
             <w:webHidden/>
           </w:rPr>
-          <w:instrText xml:space="preserve"> PAGEREF _Toc243543003 \h </w:instrText>
+          <w:instrText xml:space="preserve"> PAGEREF _Toc243441205 \h </w:instrText>
         </w:r>
         <w:r>
           <w:rPr>
@@ -1601,7 +1601,7 @@
           <w:noProof/>
         </w:rPr>
       </w:pPr>
-      <w:hyperlink w:anchor="_Toc243543004" w:history="1">
+      <w:hyperlink w:anchor="_Toc243441206" w:history="1">
         <w:r>
           <w:rPr>
             <w:rStyle w:val="Hyperlink"/>
@@ -1628,7 +1628,7 @@
             <w:noProof/>
             <w:webHidden/>
           </w:rPr>
-          <w:instrText xml:space="preserve"> PAGEREF _Toc243543004 \h </w:instrText>
+          <w:instrText xml:space="preserve"> PAGEREF _Toc243441206 \h </w:instrText>
         </w:r>
         <w:r>
           <w:rPr>
@@ -1669,7 +1669,7 @@
           <w:noProof/>
         </w:rPr>
       </w:pPr>
-      <w:hyperlink w:anchor="_Toc243543005" w:history="1">
+      <w:hyperlink w:anchor="_Toc243441207" w:history="1">
         <w:r>
           <w:rPr>
             <w:rStyle w:val="Hyperlink"/>
@@ -1696,7 +1696,7 @@
             <w:noProof/>
             <w:webHidden/>
           </w:rPr>
-          <w:instrText xml:space="preserve"> PAGEREF _Toc243543005 \h </w:instrText>
+          <w:instrText xml:space="preserve"> PAGEREF _Toc243441207 \h </w:instrText>
         </w:r>
         <w:r>
           <w:rPr>
@@ -1737,7 +1737,7 @@
           <w:noProof/>
         </w:rPr>
       </w:pPr>
-      <w:hyperlink w:anchor="_Toc243543006" w:history="1">
+      <w:hyperlink w:anchor="_Toc243441208" w:history="1">
         <w:r>
           <w:rPr>
             <w:rStyle w:val="Hyperlink"/>
@@ -1764,7 +1764,7 @@
             <w:noProof/>
             <w:webHidden/>
           </w:rPr>
-          <w:instrText xml:space="preserve"> PAGEREF _Toc243543006 \h </w:instrText>
+          <w:instrText xml:space="preserve"> PAGEREF _Toc243441208 \h </w:instrText>
         </w:r>
         <w:r>
           <w:rPr>
@@ -1805,7 +1805,7 @@
           <w:noProof/>
         </w:rPr>
       </w:pPr>
-      <w:hyperlink w:anchor="_Toc243543007" w:history="1">
+      <w:hyperlink w:anchor="_Toc243441209" w:history="1">
         <w:r>
           <w:rPr>
             <w:rStyle w:val="Hyperlink"/>
@@ -1832,7 +1832,7 @@
             <w:noProof/>
             <w:webHidden/>
           </w:rPr>
-          <w:instrText xml:space="preserve"> PAGEREF _Toc243543007 \h </w:instrText>
+          <w:instrText xml:space="preserve"> PAGEREF _Toc243441209 \h </w:instrText>
         </w:r>
         <w:r>
           <w:rPr>
@@ -1873,7 +1873,7 @@
           <w:noProof/>
         </w:rPr>
       </w:pPr>
-      <w:hyperlink w:anchor="_Toc243543008" w:history="1">
+      <w:hyperlink w:anchor="_Toc243441210" w:history="1">
         <w:r>
           <w:rPr>
             <w:rStyle w:val="Hyperlink"/>
@@ -1900,7 +1900,7 @@
             <w:noProof/>
             <w:webHidden/>
           </w:rPr>
-          <w:instrText xml:space="preserve"> PAGEREF _Toc243543008 \h </w:instrText>
+          <w:instrText xml:space="preserve"> PAGEREF _Toc243441210 \h </w:instrText>
         </w:r>
         <w:r>
           <w:rPr>
@@ -1941,7 +1941,7 @@
           <w:noProof/>
         </w:rPr>
       </w:pPr>
-      <w:hyperlink w:anchor="_Toc243543009" w:history="1">
+      <w:hyperlink w:anchor="_Toc243441211" w:history="1">
         <w:r>
           <w:rPr>
             <w:rStyle w:val="Hyperlink"/>
@@ -1968,7 +1968,7 @@
             <w:noProof/>
             <w:webHidden/>
           </w:rPr>
-          <w:instrText xml:space="preserve"> PAGEREF _Toc243543009 \h </w:instrText>
+          <w:instrText xml:space="preserve"> PAGEREF _Toc243441211 \h </w:instrText>
         </w:r>
         <w:r>
           <w:rPr>
@@ -2009,7 +2009,7 @@
           <w:noProof/>
         </w:rPr>
       </w:pPr>
-      <w:hyperlink w:anchor="_Toc243543010" w:history="1">
+      <w:hyperlink w:anchor="_Toc243441212" w:history="1">
         <w:r>
           <w:rPr>
             <w:rStyle w:val="Hyperlink"/>
@@ -2036,7 +2036,7 @@
             <w:noProof/>
             <w:webHidden/>
           </w:rPr>
-          <w:instrText xml:space="preserve"> PAGEREF _Toc243543010 \h </w:instrText>
+          <w:instrText xml:space="preserve"> PAGEREF _Toc243441212 \h </w:instrText>
         </w:r>
         <w:r>
           <w:rPr>
@@ -2077,7 +2077,7 @@
           <w:noProof/>
         </w:rPr>
       </w:pPr>
-      <w:hyperlink w:anchor="_Toc243543011" w:history="1">
+      <w:hyperlink w:anchor="_Toc243441213" w:history="1">
         <w:r>
           <w:rPr>
             <w:rStyle w:val="Hyperlink"/>
@@ -2104,7 +2104,7 @@
             <w:noProof/>
             <w:webHidden/>
           </w:rPr>
-          <w:instrText xml:space="preserve"> PAGEREF _Toc243543011 \h </w:instrText>
+          <w:instrText xml:space="preserve"> PAGEREF _Toc243441213 \h </w:instrText>
         </w:r>
         <w:r>
           <w:rPr>
@@ -2145,7 +2145,7 @@
           <w:noProof/>
         </w:rPr>
       </w:pPr>
-      <w:hyperlink w:anchor="_Toc243543012" w:history="1">
+      <w:hyperlink w:anchor="_Toc243441214" w:history="1">
         <w:r>
           <w:rPr>
             <w:rStyle w:val="Hyperlink"/>
@@ -2172,7 +2172,7 @@
             <w:noProof/>
             <w:webHidden/>
           </w:rPr>
-          <w:instrText xml:space="preserve"> PAGEREF _Toc243543012 \h </w:instrText>
+          <w:instrText xml:space="preserve"> PAGEREF _Toc243441214 \h </w:instrText>
         </w:r>
         <w:r>
           <w:rPr>
@@ -2213,7 +2213,7 @@
           <w:noProof/>
         </w:rPr>
       </w:pPr>
-      <w:hyperlink w:anchor="_Toc243543013" w:history="1">
+      <w:hyperlink w:anchor="_Toc243441215" w:history="1">
         <w:r>
           <w:rPr>
             <w:rStyle w:val="Hyperlink"/>
@@ -2240,7 +2240,7 @@
             <w:noProof/>
             <w:webHidden/>
           </w:rPr>
-          <w:instrText xml:space="preserve"> PAGEREF _Toc243543013 \h </w:instrText>
+          <w:instrText xml:space="preserve"> PAGEREF _Toc243441215 \h </w:instrText>
         </w:r>
         <w:r>
           <w:rPr>
@@ -2281,7 +2281,7 @@
           <w:noProof/>
         </w:rPr>
       </w:pPr>
-      <w:hyperlink w:anchor="_Toc243543014" w:history="1">
+      <w:hyperlink w:anchor="_Toc243441216" w:history="1">
         <w:r>
           <w:rPr>
             <w:rStyle w:val="Hyperlink"/>
@@ -2308,7 +2308,7 @@
             <w:noProof/>
             <w:webHidden/>
           </w:rPr>
-          <w:instrText xml:space="preserve"> PAGEREF _Toc243543014 \h </w:instrText>
+          <w:instrText xml:space="preserve"> PAGEREF _Toc243441216 \h </w:instrText>
         </w:r>
         <w:r>
           <w:rPr>
@@ -2349,7 +2349,7 @@
           <w:noProof/>
         </w:rPr>
       </w:pPr>
-      <w:hyperlink w:anchor="_Toc243543015" w:history="1">
+      <w:hyperlink w:anchor="_Toc243441217" w:history="1">
         <w:r>
           <w:rPr>
             <w:rStyle w:val="Hyperlink"/>
@@ -2376,7 +2376,7 @@
             <w:noProof/>
             <w:webHidden/>
           </w:rPr>
-          <w:instrText xml:space="preserve"> PAGEREF _Toc243543015 \h </w:instrText>
+          <w:instrText xml:space="preserve"> PAGEREF _Toc243441217 \h </w:instrText>
         </w:r>
         <w:r>
           <w:rPr>
@@ -2417,7 +2417,7 @@
           <w:noProof/>
         </w:rPr>
       </w:pPr>
-      <w:hyperlink w:anchor="_Toc243543016" w:history="1">
+      <w:hyperlink w:anchor="_Toc243441218" w:history="1">
         <w:r>
           <w:rPr>
             <w:rStyle w:val="Hyperlink"/>
@@ -2444,7 +2444,7 @@
             <w:noProof/>
             <w:webHidden/>
           </w:rPr>
-          <w:instrText xml:space="preserve"> PAGEREF _Toc243543016 \h </w:instrText>
+          <w:instrText xml:space="preserve"> PAGEREF _Toc243441218 \h </w:instrText>
         </w:r>
         <w:r>
           <w:rPr>
@@ -2485,7 +2485,7 @@
           <w:noProof/>
         </w:rPr>
       </w:pPr>
-      <w:hyperlink w:anchor="_Toc243543017" w:history="1">
+      <w:hyperlink w:anchor="_Toc243441219" w:history="1">
         <w:r>
           <w:rPr>
             <w:rStyle w:val="Hyperlink"/>
@@ -2512,7 +2512,7 @@
             <w:noProof/>
             <w:webHidden/>
           </w:rPr>
-          <w:instrText xml:space="preserve"> PAGEREF _Toc243543017 \h </w:instrText>
+          <w:instrText xml:space="preserve"> PAGEREF _Toc243441219 \h </w:instrText>
         </w:r>
         <w:r>
           <w:rPr>
@@ -2553,7 +2553,7 @@
           <w:noProof/>
         </w:rPr>
       </w:pPr>
-      <w:hyperlink w:anchor="_Toc243543018" w:history="1">
+      <w:hyperlink w:anchor="_Toc243441220" w:history="1">
         <w:r>
           <w:rPr>
             <w:rStyle w:val="Hyperlink"/>
@@ -2580,7 +2580,7 @@
             <w:noProof/>
             <w:webHidden/>
           </w:rPr>
-          <w:instrText xml:space="preserve"> PAGEREF _Toc243543018 \h </w:instrText>
+          <w:instrText xml:space="preserve"> PAGEREF _Toc243441220 \h </w:instrText>
         </w:r>
         <w:r>
           <w:rPr>
@@ -2621,7 +2621,7 @@
           <w:noProof/>
         </w:rPr>
       </w:pPr>
-      <w:hyperlink w:anchor="_Toc243543019" w:history="1">
+      <w:hyperlink w:anchor="_Toc243441221" w:history="1">
         <w:r>
           <w:rPr>
             <w:rStyle w:val="Hyperlink"/>
@@ -2648,7 +2648,7 @@
             <w:noProof/>
             <w:webHidden/>
           </w:rPr>
-          <w:instrText xml:space="preserve"> PAGEREF _Toc243543019 \h </w:instrText>
+          <w:instrText xml:space="preserve"> PAGEREF _Toc243441221 \h </w:instrText>
         </w:r>
         <w:r>
           <w:rPr>
@@ -2689,7 +2689,7 @@
           <w:noProof/>
         </w:rPr>
       </w:pPr>
-      <w:hyperlink w:anchor="_Toc243543020" w:history="1">
+      <w:hyperlink w:anchor="_Toc243441222" w:history="1">
         <w:r>
           <w:rPr>
             <w:rStyle w:val="Hyperlink"/>
@@ -2716,7 +2716,7 @@
             <w:noProof/>
             <w:webHidden/>
           </w:rPr>
-          <w:instrText xml:space="preserve"> PAGEREF _Toc243543020 \h </w:instrText>
+          <w:instrText xml:space="preserve"> PAGEREF _Toc243441222 \h </w:instrText>
         </w:r>
         <w:r>
           <w:rPr>
@@ -2757,7 +2757,7 @@
           <w:noProof/>
         </w:rPr>
       </w:pPr>
-      <w:hyperlink w:anchor="_Toc243543021" w:history="1">
+      <w:hyperlink w:anchor="_Toc243441223" w:history="1">
         <w:r>
           <w:rPr>
             <w:rStyle w:val="Hyperlink"/>
@@ -2784,7 +2784,7 @@
             <w:noProof/>
             <w:webHidden/>
           </w:rPr>
-          <w:instrText xml:space="preserve"> PAGEREF _Toc243543021 \h </w:instrText>
+          <w:instrText xml:space="preserve"> PAGEREF _Toc243441223 \h </w:instrText>
         </w:r>
         <w:r>
           <w:rPr>
@@ -2825,7 +2825,7 @@
           <w:noProof/>
         </w:rPr>
       </w:pPr>
-      <w:hyperlink w:anchor="_Toc243543022" w:history="1">
+      <w:hyperlink w:anchor="_Toc243441224" w:history="1">
         <w:r>
           <w:rPr>
             <w:rStyle w:val="Hyperlink"/>
@@ -2852,7 +2852,7 @@
             <w:noProof/>
             <w:webHidden/>
           </w:rPr>
-          <w:instrText xml:space="preserve"> PAGEREF _Toc243543022 \h </w:instrText>
+          <w:instrText xml:space="preserve"> PAGEREF _Toc243441224 \h </w:instrText>
         </w:r>
         <w:r>
           <w:rPr>
@@ -2893,7 +2893,7 @@
           <w:noProof/>
         </w:rPr>
       </w:pPr>
-      <w:hyperlink w:anchor="_Toc243543023" w:history="1">
+      <w:hyperlink w:anchor="_Toc243441225" w:history="1">
         <w:r>
           <w:rPr>
             <w:rStyle w:val="Hyperlink"/>
@@ -2920,7 +2920,7 @@
             <w:noProof/>
             <w:webHidden/>
           </w:rPr>
-          <w:instrText xml:space="preserve"> PAGEREF _Toc243543023 \h </w:instrText>
+          <w:instrText xml:space="preserve"> PAGEREF _Toc243441225 \h </w:instrText>
         </w:r>
         <w:r>
           <w:rPr>
@@ -2961,7 +2961,7 @@
           <w:noProof/>
         </w:rPr>
       </w:pPr>
-      <w:hyperlink w:anchor="_Toc243543024" w:history="1">
+      <w:hyperlink w:anchor="_Toc243441226" w:history="1">
         <w:r>
           <w:rPr>
             <w:rStyle w:val="Hyperlink"/>
@@ -2988,7 +2988,7 @@
             <w:noProof/>
             <w:webHidden/>
           </w:rPr>
-          <w:instrText xml:space="preserve"> PAGEREF _Toc243543024 \h </w:instrText>
+          <w:instrText xml:space="preserve"> PAGEREF _Toc243441226 \h </w:instrText>
         </w:r>
         <w:r>
           <w:rPr>
@@ -3029,7 +3029,7 @@
           <w:noProof/>
         </w:rPr>
       </w:pPr>
-      <w:hyperlink w:anchor="_Toc243543025" w:history="1">
+      <w:hyperlink w:anchor="_Toc243441227" w:history="1">
         <w:r>
           <w:rPr>
             <w:rStyle w:val="Hyperlink"/>
@@ -3056,7 +3056,7 @@
             <w:noProof/>
             <w:webHidden/>
           </w:rPr>
-          <w:instrText xml:space="preserve"> PAGEREF _Toc243543025 \h </w:instrText>
+          <w:instrText xml:space="preserve"> PAGEREF _Toc243441227 \h </w:instrText>
         </w:r>
         <w:r>
           <w:rPr>
@@ -3097,7 +3097,7 @@
           <w:noProof/>
         </w:rPr>
       </w:pPr>
-      <w:hyperlink w:anchor="_Toc243543026" w:history="1">
+      <w:hyperlink w:anchor="_Toc243441228" w:history="1">
         <w:r>
           <w:rPr>
             <w:rStyle w:val="Hyperlink"/>
@@ -3124,7 +3124,7 @@
             <w:noProof/>
             <w:webHidden/>
           </w:rPr>
-          <w:instrText xml:space="preserve"> PAGEREF _Toc243543026 \h </w:instrText>
+          <w:instrText xml:space="preserve"> PAGEREF _Toc243441228 \h </w:instrText>
         </w:r>
         <w:r>
           <w:rPr>
@@ -3165,7 +3165,7 @@
           <w:noProof/>
         </w:rPr>
       </w:pPr>
-      <w:hyperlink w:anchor="_Toc243543027" w:history="1">
+      <w:hyperlink w:anchor="_Toc243441229" w:history="1">
         <w:r>
           <w:rPr>
             <w:rStyle w:val="Hyperlink"/>
@@ -3192,7 +3192,7 @@
             <w:noProof/>
             <w:webHidden/>
           </w:rPr>
-          <w:instrText xml:space="preserve"> PAGEREF _Toc243543027 \h </w:instrText>
+          <w:instrText xml:space="preserve"> PAGEREF _Toc243441229 \h </w:instrText>
         </w:r>
         <w:r>
           <w:rPr>
@@ -3233,7 +3233,7 @@
           <w:noProof/>
         </w:rPr>
       </w:pPr>
-      <w:hyperlink w:anchor="_Toc243543028" w:history="1">
+      <w:hyperlink w:anchor="_Toc243441230" w:history="1">
         <w:r>
           <w:rPr>
             <w:rStyle w:val="Hyperlink"/>
@@ -3260,7 +3260,7 @@
             <w:noProof/>
             <w:webHidden/>
           </w:rPr>
-          <w:instrText xml:space="preserve"> PAGEREF _Toc243543028 \h </w:instrText>
+          <w:instrText xml:space="preserve"> PAGEREF _Toc243441230 \h </w:instrText>
         </w:r>
         <w:r>
           <w:rPr>
@@ -3301,7 +3301,7 @@
           <w:noProof/>
         </w:rPr>
       </w:pPr>
-      <w:hyperlink w:anchor="_Toc243543029" w:history="1">
+      <w:hyperlink w:anchor="_Toc243441231" w:history="1">
         <w:r>
           <w:rPr>
             <w:rStyle w:val="Hyperlink"/>
@@ -3328,7 +3328,7 @@
             <w:noProof/>
             <w:webHidden/>
           </w:rPr>
-          <w:instrText xml:space="preserve"> PAGEREF _Toc243543029 \h </w:instrText>
+          <w:instrText xml:space="preserve"> PAGEREF _Toc243441231 \h </w:instrText>
         </w:r>
         <w:r>
           <w:rPr>
@@ -3369,7 +3369,7 @@
           <w:noProof/>
         </w:rPr>
       </w:pPr>
-      <w:hyperlink w:anchor="_Toc243543030" w:history="1">
+      <w:hyperlink w:anchor="_Toc243441232" w:history="1">
         <w:r>
           <w:rPr>
             <w:rStyle w:val="Hyperlink"/>
@@ -3396,7 +3396,7 @@
             <w:noProof/>
             <w:webHidden/>
           </w:rPr>
-          <w:instrText xml:space="preserve"> PAGEREF _Toc243543030 \h </w:instrText>
+          <w:instrText xml:space="preserve"> PAGEREF _Toc243441232 \h </w:instrText>
         </w:r>
         <w:r>
           <w:rPr>
@@ -3437,7 +3437,7 @@
           <w:noProof/>
         </w:rPr>
       </w:pPr>
-      <w:hyperlink w:anchor="_Toc243543031" w:history="1">
+      <w:hyperlink w:anchor="_Toc243441233" w:history="1">
         <w:r>
           <w:rPr>
             <w:rStyle w:val="Hyperlink"/>
@@ -3464,7 +3464,7 @@
             <w:noProof/>
             <w:webHidden/>
           </w:rPr>
-          <w:instrText xml:space="preserve"> PAGEREF _Toc243543031 \h </w:instrText>
+          <w:instrText xml:space="preserve"> PAGEREF _Toc243441233 \h </w:instrText>
         </w:r>
         <w:r>
           <w:rPr>
@@ -3505,7 +3505,7 @@
           <w:noProof/>
         </w:rPr>
       </w:pPr>
-      <w:hyperlink w:anchor="_Toc243543032" w:history="1">
+      <w:hyperlink w:anchor="_Toc243441234" w:history="1">
         <w:r>
           <w:rPr>
             <w:rStyle w:val="Hyperlink"/>
@@ -3532,7 +3532,7 @@
             <w:noProof/>
             <w:webHidden/>
           </w:rPr>
-          <w:instrText xml:space="preserve"> PAGEREF _Toc243543032 \h </w:instrText>
+          <w:instrText xml:space="preserve"> PAGEREF _Toc243441234 \h </w:instrText>
         </w:r>
         <w:r>
           <w:rPr>
@@ -3573,7 +3573,7 @@
           <w:noProof/>
         </w:rPr>
       </w:pPr>
-      <w:hyperlink w:anchor="_Toc243543033" w:history="1">
+      <w:hyperlink w:anchor="_Toc243441235" w:history="1">
         <w:r>
           <w:rPr>
             <w:rStyle w:val="Hyperlink"/>
@@ -3600,7 +3600,7 @@
             <w:noProof/>
             <w:webHidden/>
           </w:rPr>
-          <w:instrText xml:space="preserve"> PAGEREF _Toc243543033 \h </w:instrText>
+          <w:instrText xml:space="preserve"> PAGEREF _Toc243441235 \h </w:instrText>
         </w:r>
         <w:r>
           <w:rPr>
@@ -3641,7 +3641,7 @@
           <w:noProof/>
         </w:rPr>
       </w:pPr>
-      <w:hyperlink w:anchor="_Toc243543034" w:history="1">
+      <w:hyperlink w:anchor="_Toc243441236" w:history="1">
         <w:r>
           <w:rPr>
             <w:rStyle w:val="Hyperlink"/>
@@ -3668,7 +3668,7 @@
             <w:noProof/>
             <w:webHidden/>
           </w:rPr>
-          <w:instrText xml:space="preserve"> PAGEREF _Toc243543034 \h </w:instrText>
+          <w:instrText xml:space="preserve"> PAGEREF _Toc243441236 \h </w:instrText>
         </w:r>
         <w:r>
           <w:rPr>
@@ -3709,7 +3709,7 @@
           <w:noProof/>
         </w:rPr>
       </w:pPr>
-      <w:hyperlink w:anchor="_Toc243543035" w:history="1">
+      <w:hyperlink w:anchor="_Toc243441237" w:history="1">
         <w:r>
           <w:rPr>
             <w:rStyle w:val="Hyperlink"/>
@@ -3736,7 +3736,7 @@
             <w:noProof/>
             <w:webHidden/>
           </w:rPr>
-          <w:instrText xml:space="preserve"> PAGEREF _Toc243543035 \h </w:instrText>
+          <w:instrText xml:space="preserve"> PAGEREF _Toc243441237 \h </w:instrText>
         </w:r>
         <w:r>
           <w:rPr>
@@ -3777,7 +3777,7 @@
           <w:noProof/>
         </w:rPr>
       </w:pPr>
-      <w:hyperlink w:anchor="_Toc243543036" w:history="1">
+      <w:hyperlink w:anchor="_Toc243441238" w:history="1">
         <w:r>
           <w:rPr>
             <w:rStyle w:val="Hyperlink"/>
@@ -3804,7 +3804,7 @@
             <w:noProof/>
             <w:webHidden/>
           </w:rPr>
-          <w:instrText xml:space="preserve"> PAGEREF _Toc243543036 \h </w:instrText>
+          <w:instrText xml:space="preserve"> PAGEREF _Toc243441238 \h </w:instrText>
         </w:r>
         <w:r>
           <w:rPr>
@@ -3845,7 +3845,7 @@
           <w:noProof/>
         </w:rPr>
       </w:pPr>
-      <w:hyperlink w:anchor="_Toc243543037" w:history="1">
+      <w:hyperlink w:anchor="_Toc243441239" w:history="1">
         <w:r>
           <w:rPr>
             <w:rStyle w:val="Hyperlink"/>
@@ -3872,7 +3872,7 @@
             <w:noProof/>
             <w:webHidden/>
           </w:rPr>
-          <w:instrText xml:space="preserve"> PAGEREF _Toc243543037 \h </w:instrText>
+          <w:instrText xml:space="preserve"> PAGEREF _Toc243441239 \h </w:instrText>
         </w:r>
         <w:r>
           <w:rPr>
@@ -3913,7 +3913,7 @@
           <w:noProof/>
         </w:rPr>
       </w:pPr>
-      <w:hyperlink w:anchor="_Toc243543038" w:history="1">
+      <w:hyperlink w:anchor="_Toc243441240" w:history="1">
         <w:r>
           <w:rPr>
             <w:rStyle w:val="Hyperlink"/>
@@ -3940,7 +3940,7 @@
             <w:noProof/>
             <w:webHidden/>
           </w:rPr>
-          <w:instrText xml:space="preserve"> PAGEREF _Toc243543038 \h </w:instrText>
+          <w:instrText xml:space="preserve"> PAGEREF _Toc243441240 \h </w:instrText>
         </w:r>
         <w:r>
           <w:rPr>
@@ -3981,7 +3981,7 @@
           <w:noProof/>
         </w:rPr>
       </w:pPr>
-      <w:hyperlink w:anchor="_Toc243543039" w:history="1">
+      <w:hyperlink w:anchor="_Toc243441241" w:history="1">
         <w:r>
           <w:rPr>
             <w:rStyle w:val="Hyperlink"/>
@@ -4008,7 +4008,7 @@
             <w:noProof/>
             <w:webHidden/>
           </w:rPr>
-          <w:instrText xml:space="preserve"> PAGEREF _Toc243543039 \h </w:instrText>
+          <w:instrText xml:space="preserve"> PAGEREF _Toc243441241 \h </w:instrText>
         </w:r>
         <w:r>
           <w:rPr>
@@ -4049,7 +4049,7 @@
           <w:noProof/>
         </w:rPr>
       </w:pPr>
-      <w:hyperlink w:anchor="_Toc243543040" w:history="1">
+      <w:hyperlink w:anchor="_Toc243441242" w:history="1">
         <w:r>
           <w:rPr>
             <w:rStyle w:val="Hyperlink"/>
@@ -4076,7 +4076,7 @@
             <w:noProof/>
             <w:webHidden/>
           </w:rPr>
-          <w:instrText xml:space="preserve"> PAGEREF _Toc243543040 \h </w:instrText>
+          <w:instrText xml:space="preserve"> PAGEREF _Toc243441242 \h </w:instrText>
         </w:r>
         <w:r>
           <w:rPr>
@@ -4117,7 +4117,7 @@
           <w:noProof/>
         </w:rPr>
       </w:pPr>
-      <w:hyperlink w:anchor="_Toc243543041" w:history="1">
+      <w:hyperlink w:anchor="_Toc243441243" w:history="1">
         <w:r>
           <w:rPr>
             <w:rStyle w:val="Hyperlink"/>
@@ -4144,7 +4144,7 @@
             <w:noProof/>
             <w:webHidden/>
           </w:rPr>
-          <w:instrText xml:space="preserve"> PAGEREF _Toc243543041 \h </w:instrText>
+          <w:instrText xml:space="preserve"> PAGEREF _Toc243441243 \h </w:instrText>
         </w:r>
         <w:r>
           <w:rPr>
@@ -4185,7 +4185,7 @@
           <w:noProof/>
         </w:rPr>
       </w:pPr>
-      <w:hyperlink w:anchor="_Toc243543042" w:history="1">
+      <w:hyperlink w:anchor="_Toc243441244" w:history="1">
         <w:r>
           <w:rPr>
             <w:rStyle w:val="Hyperlink"/>
@@ -4212,7 +4212,7 @@
             <w:noProof/>
             <w:webHidden/>
           </w:rPr>
-          <w:instrText xml:space="preserve"> PAGEREF _Toc243543042 \h </w:instrText>
+          <w:instrText xml:space="preserve"> PAGEREF _Toc243441244 \h </w:instrText>
         </w:r>
         <w:r>
           <w:rPr>
@@ -4253,7 +4253,7 @@
           <w:noProof/>
         </w:rPr>
       </w:pPr>
-      <w:hyperlink w:anchor="_Toc243543043" w:history="1">
+      <w:hyperlink w:anchor="_Toc243441245" w:history="1">
         <w:r>
           <w:rPr>
             <w:rStyle w:val="Hyperlink"/>
@@ -4280,7 +4280,7 @@
             <w:noProof/>
             <w:webHidden/>
           </w:rPr>
-          <w:instrText xml:space="preserve"> PAGEREF _Toc243543043 \h </w:instrText>
+          <w:instrText xml:space="preserve"> PAGEREF _Toc243441245 \h </w:instrText>
         </w:r>
         <w:r>
           <w:rPr>
@@ -4321,7 +4321,7 @@
           <w:noProof/>
         </w:rPr>
       </w:pPr>
-      <w:hyperlink w:anchor="_Toc243543044" w:history="1">
+      <w:hyperlink w:anchor="_Toc243441246" w:history="1">
         <w:r>
           <w:rPr>
             <w:rStyle w:val="Hyperlink"/>
@@ -4348,7 +4348,7 @@
             <w:noProof/>
             <w:webHidden/>
           </w:rPr>
-          <w:instrText xml:space="preserve"> PAGEREF _Toc243543044 \h </w:instrText>
+          <w:instrText xml:space="preserve"> PAGEREF _Toc243441246 \h </w:instrText>
         </w:r>
         <w:r>
           <w:rPr>
@@ -4389,7 +4389,7 @@
           <w:noProof/>
         </w:rPr>
       </w:pPr>
-      <w:hyperlink w:anchor="_Toc243543045" w:history="1">
+      <w:hyperlink w:anchor="_Toc243441247" w:history="1">
         <w:r>
           <w:rPr>
             <w:rStyle w:val="Hyperlink"/>
@@ -4416,7 +4416,7 @@
             <w:noProof/>
             <w:webHidden/>
           </w:rPr>
-          <w:instrText xml:space="preserve"> PAGEREF _Toc243543045 \h </w:instrText>
+          <w:instrText xml:space="preserve"> PAGEREF _Toc243441247 \h </w:instrText>
         </w:r>
         <w:r>
           <w:rPr>
@@ -4457,7 +4457,7 @@
           <w:noProof/>
         </w:rPr>
       </w:pPr>
-      <w:hyperlink w:anchor="_Toc243543046" w:history="1">
+      <w:hyperlink w:anchor="_Toc243441248" w:history="1">
         <w:r>
           <w:rPr>
             <w:rStyle w:val="Hyperlink"/>
@@ -4484,7 +4484,7 @@
             <w:noProof/>
             <w:webHidden/>
           </w:rPr>
-          <w:instrText xml:space="preserve"> PAGEREF _Toc243543046 \h </w:instrText>
+          <w:instrText xml:space="preserve"> PAGEREF _Toc243441248 \h </w:instrText>
         </w:r>
         <w:r>
           <w:rPr>
@@ -4525,7 +4525,7 @@
           <w:noProof/>
         </w:rPr>
       </w:pPr>
-      <w:hyperlink w:anchor="_Toc243543047" w:history="1">
+      <w:hyperlink w:anchor="_Toc243441249" w:history="1">
         <w:r>
           <w:rPr>
             <w:rStyle w:val="Hyperlink"/>
@@ -4552,7 +4552,7 @@
             <w:noProof/>
             <w:webHidden/>
           </w:rPr>
-          <w:instrText xml:space="preserve"> PAGEREF _Toc243543047 \h </w:instrText>
+          <w:instrText xml:space="preserve"> PAGEREF _Toc243441249 \h </w:instrText>
         </w:r>
         <w:r>
           <w:rPr>
@@ -4593,7 +4593,7 @@
           <w:noProof/>
         </w:rPr>
       </w:pPr>
-      <w:hyperlink w:anchor="_Toc243543048" w:history="1">
+      <w:hyperlink w:anchor="_Toc243441250" w:history="1">
         <w:r>
           <w:rPr>
             <w:rStyle w:val="Hyperlink"/>
@@ -4620,7 +4620,7 @@
             <w:noProof/>
             <w:webHidden/>
           </w:rPr>
-          <w:instrText xml:space="preserve"> PAGEREF _Toc243543048 \h </w:instrText>
+          <w:instrText xml:space="preserve"> PAGEREF _Toc243441250 \h </w:instrText>
         </w:r>
         <w:r>
           <w:rPr>
@@ -4661,7 +4661,7 @@
           <w:noProof/>
         </w:rPr>
       </w:pPr>
-      <w:hyperlink w:anchor="_Toc243543049" w:history="1">
+      <w:hyperlink w:anchor="_Toc243441251" w:history="1">
         <w:r>
           <w:rPr>
             <w:rStyle w:val="Hyperlink"/>
@@ -4688,7 +4688,7 @@
             <w:noProof/>
             <w:webHidden/>
           </w:rPr>
-          <w:instrText xml:space="preserve"> PAGEREF _Toc243543049 \h </w:instrText>
+          <w:instrText xml:space="preserve"> PAGEREF _Toc243441251 \h </w:instrText>
         </w:r>
         <w:r>
           <w:rPr>
@@ -4729,7 +4729,7 @@
           <w:noProof/>
         </w:rPr>
       </w:pPr>
-      <w:hyperlink w:anchor="_Toc243543050" w:history="1">
+      <w:hyperlink w:anchor="_Toc243441252" w:history="1">
         <w:r>
           <w:rPr>
             <w:rStyle w:val="Hyperlink"/>
@@ -4756,7 +4756,7 @@
             <w:noProof/>
             <w:webHidden/>
           </w:rPr>
-          <w:instrText xml:space="preserve"> PAGEREF _Toc243543050 \h </w:instrText>
+          <w:instrText xml:space="preserve"> PAGEREF _Toc243441252 \h </w:instrText>
         </w:r>
         <w:r>
           <w:rPr>
@@ -4797,7 +4797,7 @@
           <w:noProof/>
         </w:rPr>
       </w:pPr>
-      <w:hyperlink w:anchor="_Toc243543051" w:history="1">
+      <w:hyperlink w:anchor="_Toc243441253" w:history="1">
         <w:r>
           <w:rPr>
             <w:rStyle w:val="Hyperlink"/>
@@ -4824,7 +4824,7 @@
             <w:noProof/>
             <w:webHidden/>
           </w:rPr>
-          <w:instrText xml:space="preserve"> PAGEREF _Toc243543051 \h </w:instrText>
+          <w:instrText xml:space="preserve"> PAGEREF _Toc243441253 \h </w:instrText>
         </w:r>
         <w:r>
           <w:rPr>
@@ -4865,7 +4865,7 @@
           <w:noProof/>
         </w:rPr>
       </w:pPr>
-      <w:hyperlink w:anchor="_Toc243543052" w:history="1">
+      <w:hyperlink w:anchor="_Toc243441254" w:history="1">
         <w:r>
           <w:rPr>
             <w:rStyle w:val="Hyperlink"/>
@@ -4892,7 +4892,7 @@
             <w:noProof/>
             <w:webHidden/>
           </w:rPr>
-          <w:instrText xml:space="preserve"> PAGEREF _Toc243543052 \h </w:instrText>
+          <w:instrText xml:space="preserve"> PAGEREF _Toc243441254 \h </w:instrText>
         </w:r>
         <w:r>
           <w:rPr>
@@ -4933,7 +4933,7 @@
           <w:noProof/>
         </w:rPr>
       </w:pPr>
-      <w:hyperlink w:anchor="_Toc243543053" w:history="1">
+      <w:hyperlink w:anchor="_Toc243441255" w:history="1">
         <w:r>
           <w:rPr>
             <w:rStyle w:val="Hyperlink"/>
@@ -4960,7 +4960,7 @@
             <w:noProof/>
             <w:webHidden/>
           </w:rPr>
-          <w:instrText xml:space="preserve"> PAGEREF _Toc243543053 \h </w:instrText>
+          <w:instrText xml:space="preserve"> PAGEREF _Toc243441255 \h </w:instrText>
         </w:r>
         <w:r>
           <w:rPr>
@@ -5001,7 +5001,7 @@
           <w:noProof/>
         </w:rPr>
       </w:pPr>
-      <w:hyperlink w:anchor="_Toc243543054" w:history="1">
+      <w:hyperlink w:anchor="_Toc243441256" w:history="1">
         <w:r>
           <w:rPr>
             <w:rStyle w:val="Hyperlink"/>
@@ -5028,7 +5028,7 @@
             <w:noProof/>
             <w:webHidden/>
           </w:rPr>
-          <w:instrText xml:space="preserve"> PAGEREF _Toc243543054 \h </w:instrText>
+          <w:instrText xml:space="preserve"> PAGEREF _Toc243441256 \h </w:instrText>
         </w:r>
         <w:r>
           <w:rPr>
@@ -5069,7 +5069,7 @@
         <w:pStyle w:val="Heading1"/>
         <w:pageBreakBefore/>
       </w:pPr>
-      <w:bookmarkStart w:id="0" w:name="_Toc243542988"/>
+      <w:bookmarkStart w:id="0" w:name="_Toc243441190"/>
       <w:r>
         <w:lastRenderedPageBreak/>
         <w:t>How to Use This Document</w:t>
@@ -5403,7 +5403,7 @@
         <w:pStyle w:val="Heading1"/>
         <w:pageBreakBefore/>
       </w:pPr>
-      <w:bookmarkStart w:id="1" w:name="_Toc243542989"/>
+      <w:bookmarkStart w:id="1" w:name="_Toc243441191"/>
       <w:r>
         <w:lastRenderedPageBreak/>
         <w:t>1. Abstract</w:t>
@@ -5457,7 +5457,7 @@
       <w:pPr>
         <w:pStyle w:val="Heading1"/>
       </w:pPr>
-      <w:bookmarkStart w:id="2" w:name="_Toc243542990"/>
+      <w:bookmarkStart w:id="2" w:name="_Toc243441192"/>
       <w:r>
         <w:t>2. Introduction</w:t>
       </w:r>
@@ -5487,7 +5487,7 @@
       <w:pPr>
         <w:pStyle w:val="Heading2"/>
       </w:pPr>
-      <w:bookmarkStart w:id="3" w:name="_Toc243542991"/>
+      <w:bookmarkStart w:id="3" w:name="_Toc243441193"/>
       <w:r>
         <w:t>2.1 Home Assistant</w:t>
       </w:r>
@@ -5539,7 +5539,7 @@
       <w:pPr>
         <w:pStyle w:val="Heading2"/>
       </w:pPr>
-      <w:bookmarkStart w:id="4" w:name="_Toc243542992"/>
+      <w:bookmarkStart w:id="4" w:name="_Toc243441194"/>
       <w:r>
         <w:t>2.2 Literature survey</w:t>
       </w:r>
@@ -6024,7 +6024,7 @@
       <w:pPr>
         <w:pStyle w:val="Heading1"/>
       </w:pPr>
-      <w:bookmarkStart w:id="5" w:name="_Toc243542993"/>
+      <w:bookmarkStart w:id="5" w:name="_Toc243441195"/>
       <w:r>
         <w:t>3. Problem Statement</w:t>
       </w:r>
@@ -6137,7 +6137,7 @@
       <w:pPr>
         <w:pStyle w:val="Heading1"/>
       </w:pPr>
-      <w:bookmarkStart w:id="6" w:name="_Toc243542994"/>
+      <w:bookmarkStart w:id="6" w:name="_Toc243441196"/>
       <w:r>
         <w:lastRenderedPageBreak/>
         <w:t>4. Objectives</w:t>
@@ -6278,7 +6278,7 @@
       <w:pPr>
         <w:pStyle w:val="Heading1"/>
       </w:pPr>
-      <w:bookmarkStart w:id="7" w:name="_Toc243542995"/>
+      <w:bookmarkStart w:id="7" w:name="_Toc243441197"/>
       <w:r>
         <w:t>5. Existing Systems and Their Limitations</w:t>
       </w:r>
@@ -6547,7 +6547,7 @@
       <w:pPr>
         <w:pStyle w:val="Heading2"/>
       </w:pPr>
-      <w:bookmarkStart w:id="8" w:name="_Toc243542996"/>
+      <w:bookmarkStart w:id="8" w:name="_Toc243441198"/>
       <w:r>
         <w:t>5.1 Why the MQTT approach was rejected</w:t>
       </w:r>
@@ -6585,7 +6585,7 @@
       <w:pPr>
         <w:pStyle w:val="Heading2"/>
       </w:pPr>
-      <w:bookmarkStart w:id="9" w:name="_Toc243542997"/>
+      <w:bookmarkStart w:id="9" w:name="_Toc243441199"/>
       <w:r>
         <w:t>5.2 The three designs the project went through</w:t>
       </w:r>
@@ -6916,7 +6916,7 @@
       <w:pPr>
         <w:pStyle w:val="Heading1"/>
       </w:pPr>
-      <w:bookmarkStart w:id="10" w:name="_Toc243542998"/>
+      <w:bookmarkStart w:id="10" w:name="_Toc243441200"/>
       <w:r>
         <w:t>6. Proposed System</w:t>
       </w:r>
@@ -6994,7 +6994,7 @@
       <w:pPr>
         <w:pStyle w:val="Heading2"/>
       </w:pPr>
-      <w:bookmarkStart w:id="11" w:name="_Toc243542999"/>
+      <w:bookmarkStart w:id="11" w:name="_Toc243441201"/>
       <w:r>
         <w:t>6.1 The memory constraint and the split architecture</w:t>
       </w:r>
@@ -7098,7 +7098,7 @@
       <w:pPr>
         <w:pStyle w:val="Heading2"/>
       </w:pPr>
-      <w:bookmarkStart w:id="12" w:name="_Toc243543000"/>
+      <w:bookmarkStart w:id="12" w:name="_Toc243441202"/>
       <w:r>
         <w:lastRenderedPageBreak/>
         <w:t>6.2 The layout is data, not code</w:t>
@@ -7265,7 +7265,7 @@
         <w:pStyle w:val="Heading1"/>
         <w:pageBreakBefore/>
       </w:pPr>
-      <w:bookmarkStart w:id="13" w:name="_Toc243543001"/>
+      <w:bookmarkStart w:id="13" w:name="_Toc243441203"/>
       <w:r>
         <w:lastRenderedPageBreak/>
         <w:t>7. System Architecture</w:t>
@@ -7281,7 +7281,7 @@
       <w:pPr>
         <w:pStyle w:val="Heading2"/>
       </w:pPr>
-      <w:bookmarkStart w:id="14" w:name="_Toc243543002"/>
+      <w:bookmarkStart w:id="14" w:name="_Toc243441204"/>
       <w:r>
         <w:t>7.1 Overall system diagram</w:t>
       </w:r>
@@ -7298,7 +7298,7 @@
           <w:noProof/>
         </w:rPr>
         <w:drawing>
-          <wp:inline distT="0" distB="0" distL="0" distR="0" wp14:anchorId="6BDBFF63" wp14:editId="71E162E9">
+          <wp:inline distT="0" distB="0" distL="0" distR="0" wp14:anchorId="199D166E" wp14:editId="3A723947">
             <wp:extent cx="5760000" cy="3246545"/>
             <wp:effectExtent l="0" t="0" r="0" b="0"/>
             <wp:docPr id="1" name="Picture 1"/>
@@ -7391,7 +7391,7 @@
       <w:pPr>
         <w:pStyle w:val="Heading2"/>
       </w:pPr>
-      <w:bookmarkStart w:id="15" w:name="_Toc243543003"/>
+      <w:bookmarkStart w:id="15" w:name="_Toc243441205"/>
       <w:r>
         <w:lastRenderedPageBreak/>
         <w:t>7.2 Hardware diagram</w:t>
@@ -7409,7 +7409,7 @@
           <w:noProof/>
         </w:rPr>
         <w:drawing>
-          <wp:inline distT="0" distB="0" distL="0" distR="0" wp14:anchorId="6E9C7EDA" wp14:editId="04BB54EE">
+          <wp:inline distT="0" distB="0" distL="0" distR="0" wp14:anchorId="4B0C1EED" wp14:editId="2B0B448A">
             <wp:extent cx="5580000" cy="3195818"/>
             <wp:effectExtent l="0" t="0" r="0" b="0"/>
             <wp:docPr id="2" name="Picture 2"/>
@@ -7475,7 +7475,7 @@
       <w:pPr>
         <w:pStyle w:val="Heading2"/>
       </w:pPr>
-      <w:bookmarkStart w:id="16" w:name="_Toc243543004"/>
+      <w:bookmarkStart w:id="16" w:name="_Toc243441206"/>
       <w:r>
         <w:t>7.3 Software diagram</w:t>
       </w:r>
@@ -7492,7 +7492,7 @@
           <w:noProof/>
         </w:rPr>
         <w:drawing>
-          <wp:inline distT="0" distB="0" distL="0" distR="0" wp14:anchorId="21B5D8F3" wp14:editId="58509561">
+          <wp:inline distT="0" distB="0" distL="0" distR="0" wp14:anchorId="6A511ED3" wp14:editId="45186370">
             <wp:extent cx="5760000" cy="3015000"/>
             <wp:effectExtent l="0" t="0" r="0" b="0"/>
             <wp:docPr id="3" name="Picture 3"/>
@@ -7562,7 +7562,7 @@
       <w:pPr>
         <w:pStyle w:val="Heading2"/>
       </w:pPr>
-      <w:bookmarkStart w:id="17" w:name="_Toc243543005"/>
+      <w:bookmarkStart w:id="17" w:name="_Toc243441207"/>
       <w:r>
         <w:t>7.4 Block diagram</w:t>
       </w:r>
@@ -7579,7 +7579,7 @@
           <w:noProof/>
         </w:rPr>
         <w:drawing>
-          <wp:inline distT="0" distB="0" distL="0" distR="0" wp14:anchorId="267F7F6F" wp14:editId="04488CF6">
+          <wp:inline distT="0" distB="0" distL="0" distR="0" wp14:anchorId="53AB90E9" wp14:editId="77E31096">
             <wp:extent cx="5760000" cy="2625488"/>
             <wp:effectExtent l="0" t="0" r="0" b="0"/>
             <wp:docPr id="4" name="Picture 4"/>
@@ -7641,7 +7641,7 @@
         <w:pStyle w:val="Heading1"/>
         <w:pageBreakBefore/>
       </w:pPr>
-      <w:bookmarkStart w:id="18" w:name="_Toc243543006"/>
+      <w:bookmarkStart w:id="18" w:name="_Toc243441208"/>
       <w:r>
         <w:lastRenderedPageBreak/>
         <w:t>8. Hardware Description</w:t>
@@ -7666,7 +7666,7 @@
       <w:pPr>
         <w:pStyle w:val="Heading2"/>
       </w:pPr>
-      <w:bookmarkStart w:id="19" w:name="_Toc243543007"/>
+      <w:bookmarkStart w:id="19" w:name="_Toc243441209"/>
       <w:r>
         <w:t>8.1 Components</w:t>
       </w:r>
@@ -8170,7 +8170,7 @@
       <w:pPr>
         <w:pStyle w:val="Heading2"/>
       </w:pPr>
-      <w:bookmarkStart w:id="20" w:name="_Toc243543008"/>
+      <w:bookmarkStart w:id="20" w:name="_Toc243441210"/>
       <w:r>
         <w:t>8.2 Pin assignment</w:t>
       </w:r>
@@ -8942,7 +8942,7 @@
       <w:pPr>
         <w:pStyle w:val="Heading2"/>
       </w:pPr>
-      <w:bookmarkStart w:id="21" w:name="_Toc243543009"/>
+      <w:bookmarkStart w:id="21" w:name="_Toc243441211"/>
       <w:r>
         <w:t>8.3 Batch variation in this board family</w:t>
       </w:r>
@@ -9177,7 +9177,7 @@
         <w:pStyle w:val="Heading1"/>
         <w:pageBreakBefore/>
       </w:pPr>
-      <w:bookmarkStart w:id="22" w:name="_Toc243543010"/>
+      <w:bookmarkStart w:id="22" w:name="_Toc243441212"/>
       <w:r>
         <w:lastRenderedPageBreak/>
         <w:t>9. Software Description</w:t>
@@ -9188,7 +9188,7 @@
       <w:pPr>
         <w:pStyle w:val="Heading2"/>
       </w:pPr>
-      <w:bookmarkStart w:id="23" w:name="_Toc243543011"/>
+      <w:bookmarkStart w:id="23" w:name="_Toc243441213"/>
       <w:r>
         <w:t>9.1 Panel firmware: environment and libraries</w:t>
       </w:r>
@@ -9869,7 +9869,7 @@
       <w:pPr>
         <w:pStyle w:val="Heading2"/>
       </w:pPr>
-      <w:bookmarkStart w:id="24" w:name="_Toc243543012"/>
+      <w:bookmarkStart w:id="24" w:name="_Toc243441214"/>
       <w:r>
         <w:t>9.2 Desktop designer: environment and libraries</w:t>
       </w:r>
@@ -10295,7 +10295,7 @@
       <w:pPr>
         <w:pStyle w:val="Heading2"/>
       </w:pPr>
-      <w:bookmarkStart w:id="25" w:name="_Toc243543013"/>
+      <w:bookmarkStart w:id="25" w:name="_Toc243441215"/>
       <w:r>
         <w:t>9.3 Source code organisation</w:t>
       </w:r>
@@ -10992,7 +10992,7 @@
       <w:pPr>
         <w:pStyle w:val="Heading2"/>
       </w:pPr>
-      <w:bookmarkStart w:id="26" w:name="_Toc243543014"/>
+      <w:bookmarkStart w:id="26" w:name="_Toc243441216"/>
       <w:r>
         <w:t>9.4 The transport interface</w:t>
       </w:r>
@@ -11216,7 +11216,7 @@
         <w:pStyle w:val="Heading1"/>
         <w:pageBreakBefore/>
       </w:pPr>
-      <w:bookmarkStart w:id="27" w:name="_Toc243543015"/>
+      <w:bookmarkStart w:id="27" w:name="_Toc243441217"/>
       <w:r>
         <w:lastRenderedPageBreak/>
         <w:t>10. Implementation</w:t>
@@ -11227,7 +11227,7 @@
       <w:pPr>
         <w:pStyle w:val="Heading2"/>
       </w:pPr>
-      <w:bookmarkStart w:id="28" w:name="_Toc243543016"/>
+      <w:bookmarkStart w:id="28" w:name="_Toc243441218"/>
       <w:r>
         <w:t>10.1 The communication protocol</w:t>
       </w:r>
@@ -11476,7 +11476,7 @@
           <w:noProof/>
         </w:rPr>
         <w:drawing>
-          <wp:inline distT="0" distB="0" distL="0" distR="0" wp14:anchorId="6E545F5A" wp14:editId="35DB036C">
+          <wp:inline distT="0" distB="0" distL="0" distR="0" wp14:anchorId="5D003171" wp14:editId="6B75AC11">
             <wp:extent cx="3240000" cy="3536229"/>
             <wp:effectExtent l="0" t="0" r="0" b="0"/>
             <wp:docPr id="5" name="Picture 5"/>
@@ -11548,7 +11548,7 @@
       <w:pPr>
         <w:pStyle w:val="Heading2"/>
       </w:pPr>
-      <w:bookmarkStart w:id="29" w:name="_Toc243543017"/>
+      <w:bookmarkStart w:id="29" w:name="_Toc243441219"/>
       <w:r>
         <w:lastRenderedPageBreak/>
         <w:t>10.2 Task structure and interface responsiveness</w:t>
@@ -11643,7 +11643,7 @@
       <w:pPr>
         <w:pStyle w:val="Heading2"/>
       </w:pPr>
-      <w:bookmarkStart w:id="30" w:name="_Toc243543018"/>
+      <w:bookmarkStart w:id="30" w:name="_Toc243441220"/>
       <w:r>
         <w:t>10.3 Memory strategy</w:t>
       </w:r>
@@ -11748,7 +11748,7 @@
       <w:pPr>
         <w:pStyle w:val="Heading2"/>
       </w:pPr>
-      <w:bookmarkStart w:id="31" w:name="_Toc243543019"/>
+      <w:bookmarkStart w:id="31" w:name="_Toc243441221"/>
       <w:r>
         <w:t>10.4 Touch coordinate handling</w:t>
       </w:r>
@@ -11763,7 +11763,7 @@
       <w:pPr>
         <w:pStyle w:val="Heading2"/>
       </w:pPr>
-      <w:bookmarkStart w:id="32" w:name="_Toc243543020"/>
+      <w:bookmarkStart w:id="32" w:name="_Toc243441222"/>
       <w:r>
         <w:t>10.5 Receiving and storing a layout</w:t>
       </w:r>
@@ -11889,7 +11889,7 @@
       <w:pPr>
         <w:pStyle w:val="Heading2"/>
       </w:pPr>
-      <w:bookmarkStart w:id="33" w:name="_Toc243543021"/>
+      <w:bookmarkStart w:id="33" w:name="_Toc243441223"/>
       <w:r>
         <w:t>10.6 The user interface</w:t>
       </w:r>
@@ -11911,7 +11911,7 @@
           <w:noProof/>
         </w:rPr>
         <w:drawing>
-          <wp:inline distT="0" distB="0" distL="0" distR="0" wp14:anchorId="2E1F064D" wp14:editId="7741770F">
+          <wp:inline distT="0" distB="0" distL="0" distR="0" wp14:anchorId="1C56F739" wp14:editId="4F5700AD">
             <wp:extent cx="5400000" cy="2006192"/>
             <wp:effectExtent l="0" t="0" r="0" b="0"/>
             <wp:docPr id="6" name="Picture 6"/>
@@ -12095,7 +12095,7 @@
         </w:rPr>
         <w:lastRenderedPageBreak/>
         <w:drawing>
-          <wp:inline distT="0" distB="0" distL="0" distR="0" wp14:anchorId="25817868" wp14:editId="72F4EE4B">
+          <wp:inline distT="0" distB="0" distL="0" distR="0" wp14:anchorId="57C1C4D0" wp14:editId="3FA842D8">
             <wp:extent cx="4860000" cy="3667362"/>
             <wp:effectExtent l="0" t="0" r="0" b="0"/>
             <wp:docPr id="7" name="Picture 7"/>
@@ -12156,7 +12156,7 @@
       <w:pPr>
         <w:pStyle w:val="Heading2"/>
       </w:pPr>
-      <w:bookmarkStart w:id="34" w:name="_Toc243543022"/>
+      <w:bookmarkStart w:id="34" w:name="_Toc243441224"/>
       <w:r>
         <w:t>10.7 Themes</w:t>
       </w:r>
@@ -12179,7 +12179,7 @@
         </w:rPr>
         <w:lastRenderedPageBreak/>
         <w:drawing>
-          <wp:inline distT="0" distB="0" distL="0" distR="0" wp14:anchorId="39669C25" wp14:editId="30811CAC">
+          <wp:inline distT="0" distB="0" distL="0" distR="0" wp14:anchorId="351925CC" wp14:editId="20CBC7F9">
             <wp:extent cx="4500000" cy="5739130"/>
             <wp:effectExtent l="0" t="0" r="0" b="0"/>
             <wp:docPr id="8" name="Picture 8"/>
@@ -12240,7 +12240,7 @@
       <w:pPr>
         <w:pStyle w:val="Heading2"/>
       </w:pPr>
-      <w:bookmarkStart w:id="35" w:name="_Toc243543023"/>
+      <w:bookmarkStart w:id="35" w:name="_Toc243441225"/>
       <w:r>
         <w:t>10.8 A panel that explains its own failures</w:t>
       </w:r>
@@ -12266,7 +12266,7 @@
         <w:pStyle w:val="Heading1"/>
         <w:pageBreakBefore/>
       </w:pPr>
-      <w:bookmarkStart w:id="36" w:name="_Toc243543024"/>
+      <w:bookmarkStart w:id="36" w:name="_Toc243441226"/>
       <w:r>
         <w:lastRenderedPageBreak/>
         <w:t>11. The HomeMesh Designer (Desktop App)</w:t>
@@ -12289,7 +12289,7 @@
           <w:noProof/>
         </w:rPr>
         <w:drawing>
-          <wp:inline distT="0" distB="0" distL="0" distR="0" wp14:anchorId="6435B52B" wp14:editId="7B7425C8">
+          <wp:inline distT="0" distB="0" distL="0" distR="0" wp14:anchorId="44C34C29" wp14:editId="134D9D49">
             <wp:extent cx="5760000" cy="3637895"/>
             <wp:effectExtent l="0" t="0" r="0" b="0"/>
             <wp:docPr id="9" name="Picture 9"/>
@@ -12350,7 +12350,7 @@
       <w:pPr>
         <w:pStyle w:val="Heading2"/>
       </w:pPr>
-      <w:bookmarkStart w:id="37" w:name="_Toc243543025"/>
+      <w:bookmarkStart w:id="37" w:name="_Toc243441227"/>
       <w:r>
         <w:t>11.1 What it does</w:t>
       </w:r>
@@ -12483,7 +12483,7 @@
       <w:pPr>
         <w:pStyle w:val="Heading2"/>
       </w:pPr>
-      <w:bookmarkStart w:id="38" w:name="_Toc243543026"/>
+      <w:bookmarkStart w:id="38" w:name="_Toc243441228"/>
       <w:r>
         <w:lastRenderedPageBreak/>
         <w:t>11.2 The simulator is the real interface</w:t>
@@ -12514,7 +12514,7 @@
       <w:pPr>
         <w:pStyle w:val="Heading2"/>
       </w:pPr>
-      <w:bookmarkStart w:id="39" w:name="_Toc243543027"/>
+      <w:bookmarkStart w:id="39" w:name="_Toc243441229"/>
       <w:r>
         <w:t>11.3 How the designer is tested</w:t>
       </w:r>
@@ -12580,7 +12580,7 @@
         <w:pStyle w:val="Heading1"/>
         <w:pageBreakBefore/>
       </w:pPr>
-      <w:bookmarkStart w:id="40" w:name="_Toc243543028"/>
+      <w:bookmarkStart w:id="40" w:name="_Toc243441230"/>
       <w:r>
         <w:lastRenderedPageBreak/>
         <w:t>12. System Operation</w:t>
@@ -12591,7 +12591,7 @@
       <w:pPr>
         <w:pStyle w:val="Heading2"/>
       </w:pPr>
-      <w:bookmarkStart w:id="41" w:name="_Toc243543029"/>
+      <w:bookmarkStart w:id="41" w:name="_Toc243441231"/>
       <w:r>
         <w:t>12.1 Network configuration</w:t>
       </w:r>
@@ -12919,7 +12919,7 @@
       <w:pPr>
         <w:pStyle w:val="Heading2"/>
       </w:pPr>
-      <w:bookmarkStart w:id="42" w:name="_Toc243543030"/>
+      <w:bookmarkStart w:id="42" w:name="_Toc243441232"/>
       <w:r>
         <w:t>12.2 Devices on the panel</w:t>
       </w:r>
@@ -13225,7 +13225,7 @@
       <w:pPr>
         <w:pStyle w:val="Heading2"/>
       </w:pPr>
-      <w:bookmarkStart w:id="43" w:name="_Toc243543031"/>
+      <w:bookmarkStart w:id="43" w:name="_Toc243441233"/>
       <w:r>
         <w:t>12.3 Changing what the panel shows</w:t>
       </w:r>
@@ -13318,7 +13318,7 @@
         <w:pStyle w:val="Heading1"/>
         <w:pageBreakBefore/>
       </w:pPr>
-      <w:bookmarkStart w:id="44" w:name="_Toc243543032"/>
+      <w:bookmarkStart w:id="44" w:name="_Toc243441234"/>
       <w:r>
         <w:lastRenderedPageBreak/>
         <w:t>13. Testing and Results</w:t>
@@ -13334,7 +13334,7 @@
       <w:pPr>
         <w:pStyle w:val="Heading2"/>
       </w:pPr>
-      <w:bookmarkStart w:id="45" w:name="_Toc243543033"/>
+      <w:bookmarkStart w:id="45" w:name="_Toc243441235"/>
       <w:r>
         <w:t>13.1 Message size and latency</w:t>
       </w:r>
@@ -13728,7 +13728,7 @@
           <w:noProof/>
         </w:rPr>
         <w:drawing>
-          <wp:inline distT="0" distB="0" distL="0" distR="0" wp14:anchorId="31DA70D4" wp14:editId="24274292">
+          <wp:inline distT="0" distB="0" distL="0" distR="0" wp14:anchorId="2397AB93" wp14:editId="0C9DE6C5">
             <wp:extent cx="3960000" cy="1998857"/>
             <wp:effectExtent l="0" t="0" r="0" b="0"/>
             <wp:docPr id="10" name="Picture 10"/>
@@ -13794,7 +13794,7 @@
       <w:pPr>
         <w:pStyle w:val="Heading2"/>
       </w:pPr>
-      <w:bookmarkStart w:id="46" w:name="_Toc243543034"/>
+      <w:bookmarkStart w:id="46" w:name="_Toc243441236"/>
       <w:r>
         <w:t>13.2 Resource usage</w:t>
       </w:r>
@@ -14106,7 +14106,7 @@
       <w:pPr>
         <w:pStyle w:val="Heading2"/>
       </w:pPr>
-      <w:bookmarkStart w:id="47" w:name="_Toc243543035"/>
+      <w:bookmarkStart w:id="47" w:name="_Toc243441237"/>
       <w:r>
         <w:t>13.3 Functional verification</w:t>
       </w:r>
@@ -14683,7 +14683,7 @@
       <w:pPr>
         <w:pStyle w:val="Heading2"/>
       </w:pPr>
-      <w:bookmarkStart w:id="48" w:name="_Toc243543036"/>
+      <w:bookmarkStart w:id="48" w:name="_Toc243441238"/>
       <w:r>
         <w:t>13.4 Field case study: the connection that kept dropping</w:t>
       </w:r>
@@ -14779,7 +14779,7 @@
       <w:pPr>
         <w:pStyle w:val="Heading2"/>
       </w:pPr>
-      <w:bookmarkStart w:id="49" w:name="_Toc243543037"/>
+      <w:bookmarkStart w:id="49" w:name="_Toc243441239"/>
       <w:r>
         <w:lastRenderedPageBreak/>
         <w:t>13.5 Other challenges and their resolution</w:t>
@@ -15319,7 +15319,7 @@
       <w:pPr>
         <w:pStyle w:val="Heading1"/>
       </w:pPr>
-      <w:bookmarkStart w:id="50" w:name="_Toc243543038"/>
+      <w:bookmarkStart w:id="50" w:name="_Toc243441240"/>
       <w:r>
         <w:t>14. Future Scope</w:t>
       </w:r>
@@ -15437,7 +15437,7 @@
       <w:pPr>
         <w:pStyle w:val="Heading1"/>
       </w:pPr>
-      <w:bookmarkStart w:id="51" w:name="_Toc243543039"/>
+      <w:bookmarkStart w:id="51" w:name="_Toc243441241"/>
       <w:r>
         <w:t>15. Conclusion</w:t>
       </w:r>
@@ -15493,7 +15493,7 @@
       <w:pPr>
         <w:pStyle w:val="Heading1"/>
       </w:pPr>
-      <w:bookmarkStart w:id="52" w:name="_Toc243543040"/>
+      <w:bookmarkStart w:id="52" w:name="_Toc243441242"/>
       <w:r>
         <w:t>16. References</w:t>
       </w:r>
@@ -15503,7 +15503,7 @@
       <w:pPr>
         <w:pStyle w:val="Heading2"/>
       </w:pPr>
-      <w:bookmarkStart w:id="53" w:name="_Toc243543041"/>
+      <w:bookmarkStart w:id="53" w:name="_Toc243441243"/>
       <w:r>
         <w:t>16.1 Published literature</w:t>
       </w:r>
@@ -15948,7 +15948,7 @@
       <w:pPr>
         <w:pStyle w:val="Heading2"/>
       </w:pPr>
-      <w:bookmarkStart w:id="54" w:name="_Toc243543042"/>
+      <w:bookmarkStart w:id="54" w:name="_Toc243441244"/>
       <w:r>
         <w:t>16.2 Technical documentation</w:t>
       </w:r>
@@ -16127,7 +16127,7 @@
         <w:pStyle w:val="Heading1"/>
         <w:pageBreakBefore/>
       </w:pPr>
-      <w:bookmarkStart w:id="55" w:name="_Toc243543043"/>
+      <w:bookmarkStart w:id="55" w:name="_Toc243441245"/>
       <w:r>
         <w:lastRenderedPageBreak/>
         <w:t>Appendix A — Suggested Presentation Plan</w:t>
@@ -16138,7 +16138,7 @@
       <w:pPr>
         <w:pStyle w:val="Heading2"/>
       </w:pPr>
-      <w:bookmarkStart w:id="56" w:name="_Toc243543044"/>
+      <w:bookmarkStart w:id="56" w:name="_Toc243441246"/>
       <w:r>
         <w:t>Team roles</w:t>
       </w:r>
@@ -16630,7 +16630,7 @@
       <w:pPr>
         <w:pStyle w:val="Heading2"/>
       </w:pPr>
-      <w:bookmarkStart w:id="57" w:name="_Toc243543045"/>
+      <w:bookmarkStart w:id="57" w:name="_Toc243441247"/>
       <w:r>
         <w:t>Slides</w:t>
       </w:r>
@@ -18537,7 +18537,7 @@
       <w:pPr>
         <w:pStyle w:val="Heading2"/>
       </w:pPr>
-      <w:bookmarkStart w:id="58" w:name="_Toc243543046"/>
+      <w:bookmarkStart w:id="58" w:name="_Toc243441248"/>
       <w:r>
         <w:t>Figure files</w:t>
       </w:r>
@@ -19001,7 +19001,7 @@
       <w:pPr>
         <w:pStyle w:val="Heading2"/>
       </w:pPr>
-      <w:bookmarkStart w:id="59" w:name="_Toc243543047"/>
+      <w:bookmarkStart w:id="59" w:name="_Toc243441249"/>
       <w:r>
         <w:t>Presentation notes</w:t>
       </w:r>
@@ -19047,7 +19047,7 @@
       <w:pPr>
         <w:pStyle w:val="Heading2"/>
       </w:pPr>
-      <w:bookmarkStart w:id="60" w:name="_Toc243543048"/>
+      <w:bookmarkStart w:id="60" w:name="_Toc243441250"/>
       <w:r>
         <w:t>Anticipated questions</w:t>
       </w:r>
@@ -19799,7 +19799,7 @@
         <w:pStyle w:val="Heading1"/>
         <w:pageBreakBefore/>
       </w:pPr>
-      <w:bookmarkStart w:id="61" w:name="_Toc243543049"/>
+      <w:bookmarkStart w:id="61" w:name="_Toc243441251"/>
       <w:r>
         <w:lastRenderedPageBreak/>
         <w:t>Appendix B — Internal Note (Not for Presentation)</w:t>
@@ -19874,7 +19874,7 @@
       <w:pPr>
         <w:pStyle w:val="Heading2"/>
       </w:pPr>
-      <w:bookmarkStart w:id="62" w:name="_Toc243543050"/>
+      <w:bookmarkStart w:id="62" w:name="_Toc243441252"/>
       <w:r>
         <w:t>What is genuinely working</w:t>
       </w:r>
@@ -19943,7 +19943,7 @@
       <w:pPr>
         <w:pStyle w:val="Heading2"/>
       </w:pPr>
-      <w:bookmarkStart w:id="63" w:name="_Toc243543051"/>
+      <w:bookmarkStart w:id="63" w:name="_Toc243441253"/>
       <w:r>
         <w:t>What must not be claimed</w:t>
       </w:r>
@@ -20292,7 +20292,7 @@
       <w:pPr>
         <w:pStyle w:val="Heading2"/>
       </w:pPr>
-      <w:bookmarkStart w:id="64" w:name="_Toc243543052"/>
+      <w:bookmarkStart w:id="64" w:name="_Toc243441254"/>
       <w:r>
         <w:lastRenderedPageBreak/>
         <w:t>Check before the review: firmware on the board</w:t>
@@ -20341,7 +20341,7 @@
               <w:rPr>
                 <w:b/>
               </w:rPr>
-              <w:t>The board is running the 21 October firmware</w:t>
+              <w:t>The board is running the 20 October firmware — flash the 21 October one</w:t>
             </w:r>
           </w:p>
           <w:p>
@@ -20352,7 +20352,7 @@
               <w:rPr>
                 <w:sz w:val="20"/>
               </w:rPr>
-              <w:t>Flashed on 22 October from the designer's Panel firmware card, with fan speed, automation colours and the fixes for long names and the light (Daylight) theme. Check the names and the Daylight theme on the real screen once before the review, and push your layout again: flashing erased the one stored on the panel.</w:t>
+              <w:t>Flashed on 20 October with the fixes for long names and the light (Daylight) theme; the boot log matched the healthy one. Check the names and the Daylight theme on the real screen once before the review.</w:t>
             </w:r>
           </w:p>
           <w:p>
@@ -20364,13 +20364,52 @@
                 <w:b/>
                 <w:sz w:val="20"/>
               </w:rPr>
-              <w:t>The Wi-Fi link from the laptop to the panel is currently poor</w:t>
+              <w:t>The 21 October firmware adds fan speed and automation colours and is not flashed yet</w:t>
             </w:r>
             <w:r>
               <w:rPr>
                 <w:sz w:val="20"/>
               </w:rPr>
-              <w:t xml:space="preserve"> (half the pings lost on 22 October; 0% on 18 October). After a push or a restart the panel can take minutes to reconnect. Test the demo in the room it will run in, with the panel's log open, and if it is slow try the phone hotspot route in "Before the presentation".</w:t>
+              <w:t xml:space="preserve"> (the board was unplugged). Flash it (</w:t>
+            </w:r>
+            <w:r>
+              <w:rPr>
+                <w:rFonts w:ascii="Consolas" w:hAnsi="Consolas"/>
+                <w:sz w:val="18"/>
+              </w:rPr>
+              <w:t>pio run -e ha -t upload</w:t>
+            </w:r>
+            <w:r>
+              <w:rPr>
+                <w:sz w:val="20"/>
+              </w:rPr>
+              <w:t xml:space="preserve">, or </w:t>
+            </w:r>
+            <w:r>
+              <w:rPr>
+                <w:rFonts w:ascii="Consolas" w:hAnsi="Consolas"/>
+                <w:sz w:val="18"/>
+              </w:rPr>
+              <w:t>../homemesh_ha_firmware_21oct.bin</w:t>
+            </w:r>
+            <w:r>
+              <w:rPr>
+                <w:sz w:val="20"/>
+              </w:rPr>
+              <w:t xml:space="preserve">), check the boot log, then push the layout again. </w:t>
+            </w:r>
+            <w:r>
+              <w:rPr>
+                <w:b/>
+                <w:sz w:val="20"/>
+              </w:rPr>
+              <w:t>Until then, do not push a layout with a speed-controlled fan on it</w:t>
+            </w:r>
+            <w:r>
+              <w:rPr>
+                <w:sz w:val="20"/>
+              </w:rPr>
+              <w:t>: the old firmware would send the fan a light's brightness command, which Home Assistant rejects.</w:t>
             </w:r>
           </w:p>
           <w:p>
@@ -20446,7 +20485,7 @@
       <w:pPr>
         <w:pStyle w:val="Heading2"/>
       </w:pPr>
-      <w:bookmarkStart w:id="65" w:name="_Toc243543053"/>
+      <w:bookmarkStart w:id="65" w:name="_Toc243441255"/>
       <w:r>
         <w:t>Two quirks that may be noticed, and how to answer</w:t>
       </w:r>
@@ -20605,7 +20644,7 @@
       <w:pPr>
         <w:pStyle w:val="Heading2"/>
       </w:pPr>
-      <w:bookmarkStart w:id="66" w:name="_Toc243543054"/>
+      <w:bookmarkStart w:id="66" w:name="_Toc243441256"/>
       <w:r>
         <w:t>Before the presentation</w:t>
       </w:r>
@@ -21019,31 +21058,31 @@
       </w:rPr>
     </w:lvl>
   </w:abstractNum>
-  <w:num w:numId="1" w16cid:durableId="1789278889">
+  <w:num w:numId="1" w16cid:durableId="2059160341">
     <w:abstractNumId w:val="8"/>
   </w:num>
-  <w:num w:numId="2" w16cid:durableId="1216354812">
+  <w:num w:numId="2" w16cid:durableId="978729694">
     <w:abstractNumId w:val="6"/>
   </w:num>
-  <w:num w:numId="3" w16cid:durableId="1318536881">
+  <w:num w:numId="3" w16cid:durableId="1804080672">
     <w:abstractNumId w:val="5"/>
   </w:num>
-  <w:num w:numId="4" w16cid:durableId="551187735">
+  <w:num w:numId="4" w16cid:durableId="1185249720">
     <w:abstractNumId w:val="4"/>
   </w:num>
-  <w:num w:numId="5" w16cid:durableId="1990400501">
+  <w:num w:numId="5" w16cid:durableId="1350377364">
     <w:abstractNumId w:val="7"/>
   </w:num>
-  <w:num w:numId="6" w16cid:durableId="1130592092">
+  <w:num w:numId="6" w16cid:durableId="1333020863">
     <w:abstractNumId w:val="3"/>
   </w:num>
-  <w:num w:numId="7" w16cid:durableId="1721591185">
+  <w:num w:numId="7" w16cid:durableId="261888297">
     <w:abstractNumId w:val="2"/>
   </w:num>
-  <w:num w:numId="8" w16cid:durableId="681712215">
+  <w:num w:numId="8" w16cid:durableId="1019812779">
     <w:abstractNumId w:val="1"/>
   </w:num>
-  <w:num w:numId="9" w16cid:durableId="1775320396">
+  <w:num w:numId="9" w16cid:durableId="1201480509">
     <w:abstractNumId w:val="0"/>
   </w:num>
 </w:numbering>
@@ -32436,7 +32475,7 @@
     <w:autoRedefine/>
     <w:uiPriority w:val="39"/>
     <w:unhideWhenUsed/>
-    <w:rsid w:val="005F5779"/>
+    <w:rsid w:val="00CA124C"/>
     <w:pPr>
       <w:spacing w:after="100"/>
     </w:pPr>
@@ -32448,7 +32487,7 @@
     <w:autoRedefine/>
     <w:uiPriority w:val="39"/>
     <w:unhideWhenUsed/>
-    <w:rsid w:val="005F5779"/>
+    <w:rsid w:val="00CA124C"/>
     <w:pPr>
       <w:spacing w:after="100"/>
       <w:ind w:left="210"/>
@@ -32459,7 +32498,7 @@
     <w:basedOn w:val="DefaultParagraphFont"/>
     <w:uiPriority w:val="99"/>
     <w:unhideWhenUsed/>
-    <w:rsid w:val="005F5779"/>
+    <w:rsid w:val="00CA124C"/>
     <w:rPr>
       <w:color w:val="0000FF" w:themeColor="hyperlink"/>
       <w:u w:val="single"/>

</xml_diff>

<commit_message>
Notes: the panel runs the 21 October firmware; the hotspot link is lossy
Kept from the reverted flashing work: what is on the board, how it got
there, and the 22 October Wi-Fi measurements.
</commit_message>
<xml_diff>
--- a/docs/HomeMesh_Panel_Project_Documentation.docx
+++ b/docs/HomeMesh_Panel_Project_Documentation.docx
@@ -513,7 +513,7 @@
       <w:r>
         <w:fldChar w:fldCharType="separate"/>
       </w:r>
-      <w:hyperlink w:anchor="_Toc243441190" w:history="1">
+      <w:hyperlink w:anchor="_Toc243545546" w:history="1">
         <w:r>
           <w:rPr>
             <w:rStyle w:val="Hyperlink"/>
@@ -540,7 +540,7 @@
             <w:noProof/>
             <w:webHidden/>
           </w:rPr>
-          <w:instrText xml:space="preserve"> PAGEREF _Toc243441190 \h </w:instrText>
+          <w:instrText xml:space="preserve"> PAGEREF _Toc243545546 \h </w:instrText>
         </w:r>
         <w:r>
           <w:rPr>
@@ -581,7 +581,7 @@
           <w:noProof/>
         </w:rPr>
       </w:pPr>
-      <w:hyperlink w:anchor="_Toc243441191" w:history="1">
+      <w:hyperlink w:anchor="_Toc243545547" w:history="1">
         <w:r>
           <w:rPr>
             <w:rStyle w:val="Hyperlink"/>
@@ -608,7 +608,7 @@
             <w:noProof/>
             <w:webHidden/>
           </w:rPr>
-          <w:instrText xml:space="preserve"> PAGEREF _Toc243441191 \h </w:instrText>
+          <w:instrText xml:space="preserve"> PAGEREF _Toc243545547 \h </w:instrText>
         </w:r>
         <w:r>
           <w:rPr>
@@ -649,7 +649,7 @@
           <w:noProof/>
         </w:rPr>
       </w:pPr>
-      <w:hyperlink w:anchor="_Toc243441192" w:history="1">
+      <w:hyperlink w:anchor="_Toc243545548" w:history="1">
         <w:r>
           <w:rPr>
             <w:rStyle w:val="Hyperlink"/>
@@ -676,7 +676,7 @@
             <w:noProof/>
             <w:webHidden/>
           </w:rPr>
-          <w:instrText xml:space="preserve"> PAGEREF _Toc243441192 \h </w:instrText>
+          <w:instrText xml:space="preserve"> PAGEREF _Toc243545548 \h </w:instrText>
         </w:r>
         <w:r>
           <w:rPr>
@@ -717,7 +717,7 @@
           <w:noProof/>
         </w:rPr>
       </w:pPr>
-      <w:hyperlink w:anchor="_Toc243441193" w:history="1">
+      <w:hyperlink w:anchor="_Toc243545549" w:history="1">
         <w:r>
           <w:rPr>
             <w:rStyle w:val="Hyperlink"/>
@@ -744,7 +744,7 @@
             <w:noProof/>
             <w:webHidden/>
           </w:rPr>
-          <w:instrText xml:space="preserve"> PAGEREF _Toc243441193 \h </w:instrText>
+          <w:instrText xml:space="preserve"> PAGEREF _Toc243545549 \h </w:instrText>
         </w:r>
         <w:r>
           <w:rPr>
@@ -785,7 +785,7 @@
           <w:noProof/>
         </w:rPr>
       </w:pPr>
-      <w:hyperlink w:anchor="_Toc243441194" w:history="1">
+      <w:hyperlink w:anchor="_Toc243545550" w:history="1">
         <w:r>
           <w:rPr>
             <w:rStyle w:val="Hyperlink"/>
@@ -812,7 +812,7 @@
             <w:noProof/>
             <w:webHidden/>
           </w:rPr>
-          <w:instrText xml:space="preserve"> PAGEREF _Toc243441194 \h </w:instrText>
+          <w:instrText xml:space="preserve"> PAGEREF _Toc243545550 \h </w:instrText>
         </w:r>
         <w:r>
           <w:rPr>
@@ -853,7 +853,7 @@
           <w:noProof/>
         </w:rPr>
       </w:pPr>
-      <w:hyperlink w:anchor="_Toc243441195" w:history="1">
+      <w:hyperlink w:anchor="_Toc243545551" w:history="1">
         <w:r>
           <w:rPr>
             <w:rStyle w:val="Hyperlink"/>
@@ -880,7 +880,7 @@
             <w:noProof/>
             <w:webHidden/>
           </w:rPr>
-          <w:instrText xml:space="preserve"> PAGEREF _Toc243441195 \h </w:instrText>
+          <w:instrText xml:space="preserve"> PAGEREF _Toc243545551 \h </w:instrText>
         </w:r>
         <w:r>
           <w:rPr>
@@ -921,7 +921,7 @@
           <w:noProof/>
         </w:rPr>
       </w:pPr>
-      <w:hyperlink w:anchor="_Toc243441196" w:history="1">
+      <w:hyperlink w:anchor="_Toc243545552" w:history="1">
         <w:r>
           <w:rPr>
             <w:rStyle w:val="Hyperlink"/>
@@ -948,7 +948,7 @@
             <w:noProof/>
             <w:webHidden/>
           </w:rPr>
-          <w:instrText xml:space="preserve"> PAGEREF _Toc243441196 \h </w:instrText>
+          <w:instrText xml:space="preserve"> PAGEREF _Toc243545552 \h </w:instrText>
         </w:r>
         <w:r>
           <w:rPr>
@@ -989,7 +989,7 @@
           <w:noProof/>
         </w:rPr>
       </w:pPr>
-      <w:hyperlink w:anchor="_Toc243441197" w:history="1">
+      <w:hyperlink w:anchor="_Toc243545553" w:history="1">
         <w:r>
           <w:rPr>
             <w:rStyle w:val="Hyperlink"/>
@@ -1016,7 +1016,7 @@
             <w:noProof/>
             <w:webHidden/>
           </w:rPr>
-          <w:instrText xml:space="preserve"> PAGEREF _Toc243441197 \h </w:instrText>
+          <w:instrText xml:space="preserve"> PAGEREF _Toc243545553 \h </w:instrText>
         </w:r>
         <w:r>
           <w:rPr>
@@ -1057,7 +1057,7 @@
           <w:noProof/>
         </w:rPr>
       </w:pPr>
-      <w:hyperlink w:anchor="_Toc243441198" w:history="1">
+      <w:hyperlink w:anchor="_Toc243545554" w:history="1">
         <w:r>
           <w:rPr>
             <w:rStyle w:val="Hyperlink"/>
@@ -1084,7 +1084,7 @@
             <w:noProof/>
             <w:webHidden/>
           </w:rPr>
-          <w:instrText xml:space="preserve"> PAGEREF _Toc243441198 \h </w:instrText>
+          <w:instrText xml:space="preserve"> PAGEREF _Toc243545554 \h </w:instrText>
         </w:r>
         <w:r>
           <w:rPr>
@@ -1125,7 +1125,7 @@
           <w:noProof/>
         </w:rPr>
       </w:pPr>
-      <w:hyperlink w:anchor="_Toc243441199" w:history="1">
+      <w:hyperlink w:anchor="_Toc243545555" w:history="1">
         <w:r>
           <w:rPr>
             <w:rStyle w:val="Hyperlink"/>
@@ -1152,7 +1152,7 @@
             <w:noProof/>
             <w:webHidden/>
           </w:rPr>
-          <w:instrText xml:space="preserve"> PAGEREF _Toc243441199 \h </w:instrText>
+          <w:instrText xml:space="preserve"> PAGEREF _Toc243545555 \h </w:instrText>
         </w:r>
         <w:r>
           <w:rPr>
@@ -1193,7 +1193,7 @@
           <w:noProof/>
         </w:rPr>
       </w:pPr>
-      <w:hyperlink w:anchor="_Toc243441200" w:history="1">
+      <w:hyperlink w:anchor="_Toc243545556" w:history="1">
         <w:r>
           <w:rPr>
             <w:rStyle w:val="Hyperlink"/>
@@ -1220,7 +1220,7 @@
             <w:noProof/>
             <w:webHidden/>
           </w:rPr>
-          <w:instrText xml:space="preserve"> PAGEREF _Toc243441200 \h </w:instrText>
+          <w:instrText xml:space="preserve"> PAGEREF _Toc243545556 \h </w:instrText>
         </w:r>
         <w:r>
           <w:rPr>
@@ -1261,7 +1261,7 @@
           <w:noProof/>
         </w:rPr>
       </w:pPr>
-      <w:hyperlink w:anchor="_Toc243441201" w:history="1">
+      <w:hyperlink w:anchor="_Toc243545557" w:history="1">
         <w:r>
           <w:rPr>
             <w:rStyle w:val="Hyperlink"/>
@@ -1288,7 +1288,7 @@
             <w:noProof/>
             <w:webHidden/>
           </w:rPr>
-          <w:instrText xml:space="preserve"> PAGEREF _Toc243441201 \h </w:instrText>
+          <w:instrText xml:space="preserve"> PAGEREF _Toc243545557 \h </w:instrText>
         </w:r>
         <w:r>
           <w:rPr>
@@ -1329,7 +1329,7 @@
           <w:noProof/>
         </w:rPr>
       </w:pPr>
-      <w:hyperlink w:anchor="_Toc243441202" w:history="1">
+      <w:hyperlink w:anchor="_Toc243545558" w:history="1">
         <w:r>
           <w:rPr>
             <w:rStyle w:val="Hyperlink"/>
@@ -1356,7 +1356,7 @@
             <w:noProof/>
             <w:webHidden/>
           </w:rPr>
-          <w:instrText xml:space="preserve"> PAGEREF _Toc243441202 \h </w:instrText>
+          <w:instrText xml:space="preserve"> PAGEREF _Toc243545558 \h </w:instrText>
         </w:r>
         <w:r>
           <w:rPr>
@@ -1397,7 +1397,7 @@
           <w:noProof/>
         </w:rPr>
       </w:pPr>
-      <w:hyperlink w:anchor="_Toc243441203" w:history="1">
+      <w:hyperlink w:anchor="_Toc243545559" w:history="1">
         <w:r>
           <w:rPr>
             <w:rStyle w:val="Hyperlink"/>
@@ -1424,7 +1424,7 @@
             <w:noProof/>
             <w:webHidden/>
           </w:rPr>
-          <w:instrText xml:space="preserve"> PAGEREF _Toc243441203 \h </w:instrText>
+          <w:instrText xml:space="preserve"> PAGEREF _Toc243545559 \h </w:instrText>
         </w:r>
         <w:r>
           <w:rPr>
@@ -1465,7 +1465,7 @@
           <w:noProof/>
         </w:rPr>
       </w:pPr>
-      <w:hyperlink w:anchor="_Toc243441204" w:history="1">
+      <w:hyperlink w:anchor="_Toc243545560" w:history="1">
         <w:r>
           <w:rPr>
             <w:rStyle w:val="Hyperlink"/>
@@ -1492,7 +1492,7 @@
             <w:noProof/>
             <w:webHidden/>
           </w:rPr>
-          <w:instrText xml:space="preserve"> PAGEREF _Toc243441204 \h </w:instrText>
+          <w:instrText xml:space="preserve"> PAGEREF _Toc243545560 \h </w:instrText>
         </w:r>
         <w:r>
           <w:rPr>
@@ -1533,7 +1533,7 @@
           <w:noProof/>
         </w:rPr>
       </w:pPr>
-      <w:hyperlink w:anchor="_Toc243441205" w:history="1">
+      <w:hyperlink w:anchor="_Toc243545561" w:history="1">
         <w:r>
           <w:rPr>
             <w:rStyle w:val="Hyperlink"/>
@@ -1560,7 +1560,7 @@
             <w:noProof/>
             <w:webHidden/>
           </w:rPr>
-          <w:instrText xml:space="preserve"> PAGEREF _Toc243441205 \h </w:instrText>
+          <w:instrText xml:space="preserve"> PAGEREF _Toc243545561 \h </w:instrText>
         </w:r>
         <w:r>
           <w:rPr>
@@ -1601,7 +1601,7 @@
           <w:noProof/>
         </w:rPr>
       </w:pPr>
-      <w:hyperlink w:anchor="_Toc243441206" w:history="1">
+      <w:hyperlink w:anchor="_Toc243545562" w:history="1">
         <w:r>
           <w:rPr>
             <w:rStyle w:val="Hyperlink"/>
@@ -1628,7 +1628,7 @@
             <w:noProof/>
             <w:webHidden/>
           </w:rPr>
-          <w:instrText xml:space="preserve"> PAGEREF _Toc243441206 \h </w:instrText>
+          <w:instrText xml:space="preserve"> PAGEREF _Toc243545562 \h </w:instrText>
         </w:r>
         <w:r>
           <w:rPr>
@@ -1669,7 +1669,7 @@
           <w:noProof/>
         </w:rPr>
       </w:pPr>
-      <w:hyperlink w:anchor="_Toc243441207" w:history="1">
+      <w:hyperlink w:anchor="_Toc243545563" w:history="1">
         <w:r>
           <w:rPr>
             <w:rStyle w:val="Hyperlink"/>
@@ -1696,7 +1696,7 @@
             <w:noProof/>
             <w:webHidden/>
           </w:rPr>
-          <w:instrText xml:space="preserve"> PAGEREF _Toc243441207 \h </w:instrText>
+          <w:instrText xml:space="preserve"> PAGEREF _Toc243545563 \h </w:instrText>
         </w:r>
         <w:r>
           <w:rPr>
@@ -1737,7 +1737,7 @@
           <w:noProof/>
         </w:rPr>
       </w:pPr>
-      <w:hyperlink w:anchor="_Toc243441208" w:history="1">
+      <w:hyperlink w:anchor="_Toc243545564" w:history="1">
         <w:r>
           <w:rPr>
             <w:rStyle w:val="Hyperlink"/>
@@ -1764,7 +1764,7 @@
             <w:noProof/>
             <w:webHidden/>
           </w:rPr>
-          <w:instrText xml:space="preserve"> PAGEREF _Toc243441208 \h </w:instrText>
+          <w:instrText xml:space="preserve"> PAGEREF _Toc243545564 \h </w:instrText>
         </w:r>
         <w:r>
           <w:rPr>
@@ -1805,7 +1805,7 @@
           <w:noProof/>
         </w:rPr>
       </w:pPr>
-      <w:hyperlink w:anchor="_Toc243441209" w:history="1">
+      <w:hyperlink w:anchor="_Toc243545565" w:history="1">
         <w:r>
           <w:rPr>
             <w:rStyle w:val="Hyperlink"/>
@@ -1832,7 +1832,7 @@
             <w:noProof/>
             <w:webHidden/>
           </w:rPr>
-          <w:instrText xml:space="preserve"> PAGEREF _Toc243441209 \h </w:instrText>
+          <w:instrText xml:space="preserve"> PAGEREF _Toc243545565 \h </w:instrText>
         </w:r>
         <w:r>
           <w:rPr>
@@ -1873,7 +1873,7 @@
           <w:noProof/>
         </w:rPr>
       </w:pPr>
-      <w:hyperlink w:anchor="_Toc243441210" w:history="1">
+      <w:hyperlink w:anchor="_Toc243545566" w:history="1">
         <w:r>
           <w:rPr>
             <w:rStyle w:val="Hyperlink"/>
@@ -1900,7 +1900,7 @@
             <w:noProof/>
             <w:webHidden/>
           </w:rPr>
-          <w:instrText xml:space="preserve"> PAGEREF _Toc243441210 \h </w:instrText>
+          <w:instrText xml:space="preserve"> PAGEREF _Toc243545566 \h </w:instrText>
         </w:r>
         <w:r>
           <w:rPr>
@@ -1941,7 +1941,7 @@
           <w:noProof/>
         </w:rPr>
       </w:pPr>
-      <w:hyperlink w:anchor="_Toc243441211" w:history="1">
+      <w:hyperlink w:anchor="_Toc243545567" w:history="1">
         <w:r>
           <w:rPr>
             <w:rStyle w:val="Hyperlink"/>
@@ -1968,7 +1968,7 @@
             <w:noProof/>
             <w:webHidden/>
           </w:rPr>
-          <w:instrText xml:space="preserve"> PAGEREF _Toc243441211 \h </w:instrText>
+          <w:instrText xml:space="preserve"> PAGEREF _Toc243545567 \h </w:instrText>
         </w:r>
         <w:r>
           <w:rPr>
@@ -2009,7 +2009,7 @@
           <w:noProof/>
         </w:rPr>
       </w:pPr>
-      <w:hyperlink w:anchor="_Toc243441212" w:history="1">
+      <w:hyperlink w:anchor="_Toc243545568" w:history="1">
         <w:r>
           <w:rPr>
             <w:rStyle w:val="Hyperlink"/>
@@ -2036,7 +2036,7 @@
             <w:noProof/>
             <w:webHidden/>
           </w:rPr>
-          <w:instrText xml:space="preserve"> PAGEREF _Toc243441212 \h </w:instrText>
+          <w:instrText xml:space="preserve"> PAGEREF _Toc243545568 \h </w:instrText>
         </w:r>
         <w:r>
           <w:rPr>
@@ -2077,7 +2077,7 @@
           <w:noProof/>
         </w:rPr>
       </w:pPr>
-      <w:hyperlink w:anchor="_Toc243441213" w:history="1">
+      <w:hyperlink w:anchor="_Toc243545569" w:history="1">
         <w:r>
           <w:rPr>
             <w:rStyle w:val="Hyperlink"/>
@@ -2104,7 +2104,7 @@
             <w:noProof/>
             <w:webHidden/>
           </w:rPr>
-          <w:instrText xml:space="preserve"> PAGEREF _Toc243441213 \h </w:instrText>
+          <w:instrText xml:space="preserve"> PAGEREF _Toc243545569 \h </w:instrText>
         </w:r>
         <w:r>
           <w:rPr>
@@ -2145,7 +2145,7 @@
           <w:noProof/>
         </w:rPr>
       </w:pPr>
-      <w:hyperlink w:anchor="_Toc243441214" w:history="1">
+      <w:hyperlink w:anchor="_Toc243545570" w:history="1">
         <w:r>
           <w:rPr>
             <w:rStyle w:val="Hyperlink"/>
@@ -2172,7 +2172,7 @@
             <w:noProof/>
             <w:webHidden/>
           </w:rPr>
-          <w:instrText xml:space="preserve"> PAGEREF _Toc243441214 \h </w:instrText>
+          <w:instrText xml:space="preserve"> PAGEREF _Toc243545570 \h </w:instrText>
         </w:r>
         <w:r>
           <w:rPr>
@@ -2213,7 +2213,7 @@
           <w:noProof/>
         </w:rPr>
       </w:pPr>
-      <w:hyperlink w:anchor="_Toc243441215" w:history="1">
+      <w:hyperlink w:anchor="_Toc243545571" w:history="1">
         <w:r>
           <w:rPr>
             <w:rStyle w:val="Hyperlink"/>
@@ -2240,7 +2240,7 @@
             <w:noProof/>
             <w:webHidden/>
           </w:rPr>
-          <w:instrText xml:space="preserve"> PAGEREF _Toc243441215 \h </w:instrText>
+          <w:instrText xml:space="preserve"> PAGEREF _Toc243545571 \h </w:instrText>
         </w:r>
         <w:r>
           <w:rPr>
@@ -2281,7 +2281,7 @@
           <w:noProof/>
         </w:rPr>
       </w:pPr>
-      <w:hyperlink w:anchor="_Toc243441216" w:history="1">
+      <w:hyperlink w:anchor="_Toc243545572" w:history="1">
         <w:r>
           <w:rPr>
             <w:rStyle w:val="Hyperlink"/>
@@ -2308,7 +2308,7 @@
             <w:noProof/>
             <w:webHidden/>
           </w:rPr>
-          <w:instrText xml:space="preserve"> PAGEREF _Toc243441216 \h </w:instrText>
+          <w:instrText xml:space="preserve"> PAGEREF _Toc243545572 \h </w:instrText>
         </w:r>
         <w:r>
           <w:rPr>
@@ -2349,7 +2349,7 @@
           <w:noProof/>
         </w:rPr>
       </w:pPr>
-      <w:hyperlink w:anchor="_Toc243441217" w:history="1">
+      <w:hyperlink w:anchor="_Toc243545573" w:history="1">
         <w:r>
           <w:rPr>
             <w:rStyle w:val="Hyperlink"/>
@@ -2376,7 +2376,7 @@
             <w:noProof/>
             <w:webHidden/>
           </w:rPr>
-          <w:instrText xml:space="preserve"> PAGEREF _Toc243441217 \h </w:instrText>
+          <w:instrText xml:space="preserve"> PAGEREF _Toc243545573 \h </w:instrText>
         </w:r>
         <w:r>
           <w:rPr>
@@ -2417,7 +2417,7 @@
           <w:noProof/>
         </w:rPr>
       </w:pPr>
-      <w:hyperlink w:anchor="_Toc243441218" w:history="1">
+      <w:hyperlink w:anchor="_Toc243545574" w:history="1">
         <w:r>
           <w:rPr>
             <w:rStyle w:val="Hyperlink"/>
@@ -2444,7 +2444,7 @@
             <w:noProof/>
             <w:webHidden/>
           </w:rPr>
-          <w:instrText xml:space="preserve"> PAGEREF _Toc243441218 \h </w:instrText>
+          <w:instrText xml:space="preserve"> PAGEREF _Toc243545574 \h </w:instrText>
         </w:r>
         <w:r>
           <w:rPr>
@@ -2485,7 +2485,7 @@
           <w:noProof/>
         </w:rPr>
       </w:pPr>
-      <w:hyperlink w:anchor="_Toc243441219" w:history="1">
+      <w:hyperlink w:anchor="_Toc243545575" w:history="1">
         <w:r>
           <w:rPr>
             <w:rStyle w:val="Hyperlink"/>
@@ -2512,7 +2512,7 @@
             <w:noProof/>
             <w:webHidden/>
           </w:rPr>
-          <w:instrText xml:space="preserve"> PAGEREF _Toc243441219 \h </w:instrText>
+          <w:instrText xml:space="preserve"> PAGEREF _Toc243545575 \h </w:instrText>
         </w:r>
         <w:r>
           <w:rPr>
@@ -2553,7 +2553,7 @@
           <w:noProof/>
         </w:rPr>
       </w:pPr>
-      <w:hyperlink w:anchor="_Toc243441220" w:history="1">
+      <w:hyperlink w:anchor="_Toc243545576" w:history="1">
         <w:r>
           <w:rPr>
             <w:rStyle w:val="Hyperlink"/>
@@ -2580,7 +2580,7 @@
             <w:noProof/>
             <w:webHidden/>
           </w:rPr>
-          <w:instrText xml:space="preserve"> PAGEREF _Toc243441220 \h </w:instrText>
+          <w:instrText xml:space="preserve"> PAGEREF _Toc243545576 \h </w:instrText>
         </w:r>
         <w:r>
           <w:rPr>
@@ -2621,7 +2621,7 @@
           <w:noProof/>
         </w:rPr>
       </w:pPr>
-      <w:hyperlink w:anchor="_Toc243441221" w:history="1">
+      <w:hyperlink w:anchor="_Toc243545577" w:history="1">
         <w:r>
           <w:rPr>
             <w:rStyle w:val="Hyperlink"/>
@@ -2648,7 +2648,7 @@
             <w:noProof/>
             <w:webHidden/>
           </w:rPr>
-          <w:instrText xml:space="preserve"> PAGEREF _Toc243441221 \h </w:instrText>
+          <w:instrText xml:space="preserve"> PAGEREF _Toc243545577 \h </w:instrText>
         </w:r>
         <w:r>
           <w:rPr>
@@ -2689,7 +2689,7 @@
           <w:noProof/>
         </w:rPr>
       </w:pPr>
-      <w:hyperlink w:anchor="_Toc243441222" w:history="1">
+      <w:hyperlink w:anchor="_Toc243545578" w:history="1">
         <w:r>
           <w:rPr>
             <w:rStyle w:val="Hyperlink"/>
@@ -2716,7 +2716,7 @@
             <w:noProof/>
             <w:webHidden/>
           </w:rPr>
-          <w:instrText xml:space="preserve"> PAGEREF _Toc243441222 \h </w:instrText>
+          <w:instrText xml:space="preserve"> PAGEREF _Toc243545578 \h </w:instrText>
         </w:r>
         <w:r>
           <w:rPr>
@@ -2757,7 +2757,7 @@
           <w:noProof/>
         </w:rPr>
       </w:pPr>
-      <w:hyperlink w:anchor="_Toc243441223" w:history="1">
+      <w:hyperlink w:anchor="_Toc243545579" w:history="1">
         <w:r>
           <w:rPr>
             <w:rStyle w:val="Hyperlink"/>
@@ -2784,7 +2784,7 @@
             <w:noProof/>
             <w:webHidden/>
           </w:rPr>
-          <w:instrText xml:space="preserve"> PAGEREF _Toc243441223 \h </w:instrText>
+          <w:instrText xml:space="preserve"> PAGEREF _Toc243545579 \h </w:instrText>
         </w:r>
         <w:r>
           <w:rPr>
@@ -2825,7 +2825,7 @@
           <w:noProof/>
         </w:rPr>
       </w:pPr>
-      <w:hyperlink w:anchor="_Toc243441224" w:history="1">
+      <w:hyperlink w:anchor="_Toc243545580" w:history="1">
         <w:r>
           <w:rPr>
             <w:rStyle w:val="Hyperlink"/>
@@ -2852,7 +2852,7 @@
             <w:noProof/>
             <w:webHidden/>
           </w:rPr>
-          <w:instrText xml:space="preserve"> PAGEREF _Toc243441224 \h </w:instrText>
+          <w:instrText xml:space="preserve"> PAGEREF _Toc243545580 \h </w:instrText>
         </w:r>
         <w:r>
           <w:rPr>
@@ -2893,7 +2893,7 @@
           <w:noProof/>
         </w:rPr>
       </w:pPr>
-      <w:hyperlink w:anchor="_Toc243441225" w:history="1">
+      <w:hyperlink w:anchor="_Toc243545581" w:history="1">
         <w:r>
           <w:rPr>
             <w:rStyle w:val="Hyperlink"/>
@@ -2920,7 +2920,7 @@
             <w:noProof/>
             <w:webHidden/>
           </w:rPr>
-          <w:instrText xml:space="preserve"> PAGEREF _Toc243441225 \h </w:instrText>
+          <w:instrText xml:space="preserve"> PAGEREF _Toc243545581 \h </w:instrText>
         </w:r>
         <w:r>
           <w:rPr>
@@ -2961,7 +2961,7 @@
           <w:noProof/>
         </w:rPr>
       </w:pPr>
-      <w:hyperlink w:anchor="_Toc243441226" w:history="1">
+      <w:hyperlink w:anchor="_Toc243545582" w:history="1">
         <w:r>
           <w:rPr>
             <w:rStyle w:val="Hyperlink"/>
@@ -2988,7 +2988,7 @@
             <w:noProof/>
             <w:webHidden/>
           </w:rPr>
-          <w:instrText xml:space="preserve"> PAGEREF _Toc243441226 \h </w:instrText>
+          <w:instrText xml:space="preserve"> PAGEREF _Toc243545582 \h </w:instrText>
         </w:r>
         <w:r>
           <w:rPr>
@@ -3029,7 +3029,7 @@
           <w:noProof/>
         </w:rPr>
       </w:pPr>
-      <w:hyperlink w:anchor="_Toc243441227" w:history="1">
+      <w:hyperlink w:anchor="_Toc243545583" w:history="1">
         <w:r>
           <w:rPr>
             <w:rStyle w:val="Hyperlink"/>
@@ -3056,7 +3056,7 @@
             <w:noProof/>
             <w:webHidden/>
           </w:rPr>
-          <w:instrText xml:space="preserve"> PAGEREF _Toc243441227 \h </w:instrText>
+          <w:instrText xml:space="preserve"> PAGEREF _Toc243545583 \h </w:instrText>
         </w:r>
         <w:r>
           <w:rPr>
@@ -3097,7 +3097,7 @@
           <w:noProof/>
         </w:rPr>
       </w:pPr>
-      <w:hyperlink w:anchor="_Toc243441228" w:history="1">
+      <w:hyperlink w:anchor="_Toc243545584" w:history="1">
         <w:r>
           <w:rPr>
             <w:rStyle w:val="Hyperlink"/>
@@ -3124,7 +3124,7 @@
             <w:noProof/>
             <w:webHidden/>
           </w:rPr>
-          <w:instrText xml:space="preserve"> PAGEREF _Toc243441228 \h </w:instrText>
+          <w:instrText xml:space="preserve"> PAGEREF _Toc243545584 \h </w:instrText>
         </w:r>
         <w:r>
           <w:rPr>
@@ -3165,7 +3165,7 @@
           <w:noProof/>
         </w:rPr>
       </w:pPr>
-      <w:hyperlink w:anchor="_Toc243441229" w:history="1">
+      <w:hyperlink w:anchor="_Toc243545585" w:history="1">
         <w:r>
           <w:rPr>
             <w:rStyle w:val="Hyperlink"/>
@@ -3192,7 +3192,7 @@
             <w:noProof/>
             <w:webHidden/>
           </w:rPr>
-          <w:instrText xml:space="preserve"> PAGEREF _Toc243441229 \h </w:instrText>
+          <w:instrText xml:space="preserve"> PAGEREF _Toc243545585 \h </w:instrText>
         </w:r>
         <w:r>
           <w:rPr>
@@ -3233,7 +3233,7 @@
           <w:noProof/>
         </w:rPr>
       </w:pPr>
-      <w:hyperlink w:anchor="_Toc243441230" w:history="1">
+      <w:hyperlink w:anchor="_Toc243545586" w:history="1">
         <w:r>
           <w:rPr>
             <w:rStyle w:val="Hyperlink"/>
@@ -3260,7 +3260,7 @@
             <w:noProof/>
             <w:webHidden/>
           </w:rPr>
-          <w:instrText xml:space="preserve"> PAGEREF _Toc243441230 \h </w:instrText>
+          <w:instrText xml:space="preserve"> PAGEREF _Toc243545586 \h </w:instrText>
         </w:r>
         <w:r>
           <w:rPr>
@@ -3301,7 +3301,7 @@
           <w:noProof/>
         </w:rPr>
       </w:pPr>
-      <w:hyperlink w:anchor="_Toc243441231" w:history="1">
+      <w:hyperlink w:anchor="_Toc243545587" w:history="1">
         <w:r>
           <w:rPr>
             <w:rStyle w:val="Hyperlink"/>
@@ -3328,7 +3328,7 @@
             <w:noProof/>
             <w:webHidden/>
           </w:rPr>
-          <w:instrText xml:space="preserve"> PAGEREF _Toc243441231 \h </w:instrText>
+          <w:instrText xml:space="preserve"> PAGEREF _Toc243545587 \h </w:instrText>
         </w:r>
         <w:r>
           <w:rPr>
@@ -3369,7 +3369,7 @@
           <w:noProof/>
         </w:rPr>
       </w:pPr>
-      <w:hyperlink w:anchor="_Toc243441232" w:history="1">
+      <w:hyperlink w:anchor="_Toc243545588" w:history="1">
         <w:r>
           <w:rPr>
             <w:rStyle w:val="Hyperlink"/>
@@ -3396,7 +3396,7 @@
             <w:noProof/>
             <w:webHidden/>
           </w:rPr>
-          <w:instrText xml:space="preserve"> PAGEREF _Toc243441232 \h </w:instrText>
+          <w:instrText xml:space="preserve"> PAGEREF _Toc243545588 \h </w:instrText>
         </w:r>
         <w:r>
           <w:rPr>
@@ -3437,7 +3437,7 @@
           <w:noProof/>
         </w:rPr>
       </w:pPr>
-      <w:hyperlink w:anchor="_Toc243441233" w:history="1">
+      <w:hyperlink w:anchor="_Toc243545589" w:history="1">
         <w:r>
           <w:rPr>
             <w:rStyle w:val="Hyperlink"/>
@@ -3464,7 +3464,7 @@
             <w:noProof/>
             <w:webHidden/>
           </w:rPr>
-          <w:instrText xml:space="preserve"> PAGEREF _Toc243441233 \h </w:instrText>
+          <w:instrText xml:space="preserve"> PAGEREF _Toc243545589 \h </w:instrText>
         </w:r>
         <w:r>
           <w:rPr>
@@ -3505,7 +3505,7 @@
           <w:noProof/>
         </w:rPr>
       </w:pPr>
-      <w:hyperlink w:anchor="_Toc243441234" w:history="1">
+      <w:hyperlink w:anchor="_Toc243545590" w:history="1">
         <w:r>
           <w:rPr>
             <w:rStyle w:val="Hyperlink"/>
@@ -3532,7 +3532,7 @@
             <w:noProof/>
             <w:webHidden/>
           </w:rPr>
-          <w:instrText xml:space="preserve"> PAGEREF _Toc243441234 \h </w:instrText>
+          <w:instrText xml:space="preserve"> PAGEREF _Toc243545590 \h </w:instrText>
         </w:r>
         <w:r>
           <w:rPr>
@@ -3573,7 +3573,7 @@
           <w:noProof/>
         </w:rPr>
       </w:pPr>
-      <w:hyperlink w:anchor="_Toc243441235" w:history="1">
+      <w:hyperlink w:anchor="_Toc243545591" w:history="1">
         <w:r>
           <w:rPr>
             <w:rStyle w:val="Hyperlink"/>
@@ -3600,7 +3600,7 @@
             <w:noProof/>
             <w:webHidden/>
           </w:rPr>
-          <w:instrText xml:space="preserve"> PAGEREF _Toc243441235 \h </w:instrText>
+          <w:instrText xml:space="preserve"> PAGEREF _Toc243545591 \h </w:instrText>
         </w:r>
         <w:r>
           <w:rPr>
@@ -3641,7 +3641,7 @@
           <w:noProof/>
         </w:rPr>
       </w:pPr>
-      <w:hyperlink w:anchor="_Toc243441236" w:history="1">
+      <w:hyperlink w:anchor="_Toc243545592" w:history="1">
         <w:r>
           <w:rPr>
             <w:rStyle w:val="Hyperlink"/>
@@ -3668,7 +3668,7 @@
             <w:noProof/>
             <w:webHidden/>
           </w:rPr>
-          <w:instrText xml:space="preserve"> PAGEREF _Toc243441236 \h </w:instrText>
+          <w:instrText xml:space="preserve"> PAGEREF _Toc243545592 \h </w:instrText>
         </w:r>
         <w:r>
           <w:rPr>
@@ -3709,7 +3709,7 @@
           <w:noProof/>
         </w:rPr>
       </w:pPr>
-      <w:hyperlink w:anchor="_Toc243441237" w:history="1">
+      <w:hyperlink w:anchor="_Toc243545593" w:history="1">
         <w:r>
           <w:rPr>
             <w:rStyle w:val="Hyperlink"/>
@@ -3736,7 +3736,7 @@
             <w:noProof/>
             <w:webHidden/>
           </w:rPr>
-          <w:instrText xml:space="preserve"> PAGEREF _Toc243441237 \h </w:instrText>
+          <w:instrText xml:space="preserve"> PAGEREF _Toc243545593 \h </w:instrText>
         </w:r>
         <w:r>
           <w:rPr>
@@ -3777,7 +3777,7 @@
           <w:noProof/>
         </w:rPr>
       </w:pPr>
-      <w:hyperlink w:anchor="_Toc243441238" w:history="1">
+      <w:hyperlink w:anchor="_Toc243545594" w:history="1">
         <w:r>
           <w:rPr>
             <w:rStyle w:val="Hyperlink"/>
@@ -3804,7 +3804,7 @@
             <w:noProof/>
             <w:webHidden/>
           </w:rPr>
-          <w:instrText xml:space="preserve"> PAGEREF _Toc243441238 \h </w:instrText>
+          <w:instrText xml:space="preserve"> PAGEREF _Toc243545594 \h </w:instrText>
         </w:r>
         <w:r>
           <w:rPr>
@@ -3845,7 +3845,7 @@
           <w:noProof/>
         </w:rPr>
       </w:pPr>
-      <w:hyperlink w:anchor="_Toc243441239" w:history="1">
+      <w:hyperlink w:anchor="_Toc243545595" w:history="1">
         <w:r>
           <w:rPr>
             <w:rStyle w:val="Hyperlink"/>
@@ -3872,7 +3872,7 @@
             <w:noProof/>
             <w:webHidden/>
           </w:rPr>
-          <w:instrText xml:space="preserve"> PAGEREF _Toc243441239 \h </w:instrText>
+          <w:instrText xml:space="preserve"> PAGEREF _Toc243545595 \h </w:instrText>
         </w:r>
         <w:r>
           <w:rPr>
@@ -3913,7 +3913,7 @@
           <w:noProof/>
         </w:rPr>
       </w:pPr>
-      <w:hyperlink w:anchor="_Toc243441240" w:history="1">
+      <w:hyperlink w:anchor="_Toc243545596" w:history="1">
         <w:r>
           <w:rPr>
             <w:rStyle w:val="Hyperlink"/>
@@ -3940,7 +3940,7 @@
             <w:noProof/>
             <w:webHidden/>
           </w:rPr>
-          <w:instrText xml:space="preserve"> PAGEREF _Toc243441240 \h </w:instrText>
+          <w:instrText xml:space="preserve"> PAGEREF _Toc243545596 \h </w:instrText>
         </w:r>
         <w:r>
           <w:rPr>
@@ -3981,7 +3981,7 @@
           <w:noProof/>
         </w:rPr>
       </w:pPr>
-      <w:hyperlink w:anchor="_Toc243441241" w:history="1">
+      <w:hyperlink w:anchor="_Toc243545597" w:history="1">
         <w:r>
           <w:rPr>
             <w:rStyle w:val="Hyperlink"/>
@@ -4008,7 +4008,7 @@
             <w:noProof/>
             <w:webHidden/>
           </w:rPr>
-          <w:instrText xml:space="preserve"> PAGEREF _Toc243441241 \h </w:instrText>
+          <w:instrText xml:space="preserve"> PAGEREF _Toc243545597 \h </w:instrText>
         </w:r>
         <w:r>
           <w:rPr>
@@ -4049,7 +4049,7 @@
           <w:noProof/>
         </w:rPr>
       </w:pPr>
-      <w:hyperlink w:anchor="_Toc243441242" w:history="1">
+      <w:hyperlink w:anchor="_Toc243545598" w:history="1">
         <w:r>
           <w:rPr>
             <w:rStyle w:val="Hyperlink"/>
@@ -4076,7 +4076,7 @@
             <w:noProof/>
             <w:webHidden/>
           </w:rPr>
-          <w:instrText xml:space="preserve"> PAGEREF _Toc243441242 \h </w:instrText>
+          <w:instrText xml:space="preserve"> PAGEREF _Toc243545598 \h </w:instrText>
         </w:r>
         <w:r>
           <w:rPr>
@@ -4117,7 +4117,7 @@
           <w:noProof/>
         </w:rPr>
       </w:pPr>
-      <w:hyperlink w:anchor="_Toc243441243" w:history="1">
+      <w:hyperlink w:anchor="_Toc243545599" w:history="1">
         <w:r>
           <w:rPr>
             <w:rStyle w:val="Hyperlink"/>
@@ -4144,7 +4144,7 @@
             <w:noProof/>
             <w:webHidden/>
           </w:rPr>
-          <w:instrText xml:space="preserve"> PAGEREF _Toc243441243 \h </w:instrText>
+          <w:instrText xml:space="preserve"> PAGEREF _Toc243545599 \h </w:instrText>
         </w:r>
         <w:r>
           <w:rPr>
@@ -4185,7 +4185,7 @@
           <w:noProof/>
         </w:rPr>
       </w:pPr>
-      <w:hyperlink w:anchor="_Toc243441244" w:history="1">
+      <w:hyperlink w:anchor="_Toc243545600" w:history="1">
         <w:r>
           <w:rPr>
             <w:rStyle w:val="Hyperlink"/>
@@ -4212,7 +4212,7 @@
             <w:noProof/>
             <w:webHidden/>
           </w:rPr>
-          <w:instrText xml:space="preserve"> PAGEREF _Toc243441244 \h </w:instrText>
+          <w:instrText xml:space="preserve"> PAGEREF _Toc243545600 \h </w:instrText>
         </w:r>
         <w:r>
           <w:rPr>
@@ -4253,7 +4253,7 @@
           <w:noProof/>
         </w:rPr>
       </w:pPr>
-      <w:hyperlink w:anchor="_Toc243441245" w:history="1">
+      <w:hyperlink w:anchor="_Toc243545601" w:history="1">
         <w:r>
           <w:rPr>
             <w:rStyle w:val="Hyperlink"/>
@@ -4280,7 +4280,7 @@
             <w:noProof/>
             <w:webHidden/>
           </w:rPr>
-          <w:instrText xml:space="preserve"> PAGEREF _Toc243441245 \h </w:instrText>
+          <w:instrText xml:space="preserve"> PAGEREF _Toc243545601 \h </w:instrText>
         </w:r>
         <w:r>
           <w:rPr>
@@ -4321,7 +4321,7 @@
           <w:noProof/>
         </w:rPr>
       </w:pPr>
-      <w:hyperlink w:anchor="_Toc243441246" w:history="1">
+      <w:hyperlink w:anchor="_Toc243545602" w:history="1">
         <w:r>
           <w:rPr>
             <w:rStyle w:val="Hyperlink"/>
@@ -4348,7 +4348,7 @@
             <w:noProof/>
             <w:webHidden/>
           </w:rPr>
-          <w:instrText xml:space="preserve"> PAGEREF _Toc243441246 \h </w:instrText>
+          <w:instrText xml:space="preserve"> PAGEREF _Toc243545602 \h </w:instrText>
         </w:r>
         <w:r>
           <w:rPr>
@@ -4389,7 +4389,7 @@
           <w:noProof/>
         </w:rPr>
       </w:pPr>
-      <w:hyperlink w:anchor="_Toc243441247" w:history="1">
+      <w:hyperlink w:anchor="_Toc243545603" w:history="1">
         <w:r>
           <w:rPr>
             <w:rStyle w:val="Hyperlink"/>
@@ -4416,7 +4416,7 @@
             <w:noProof/>
             <w:webHidden/>
           </w:rPr>
-          <w:instrText xml:space="preserve"> PAGEREF _Toc243441247 \h </w:instrText>
+          <w:instrText xml:space="preserve"> PAGEREF _Toc243545603 \h </w:instrText>
         </w:r>
         <w:r>
           <w:rPr>
@@ -4457,7 +4457,7 @@
           <w:noProof/>
         </w:rPr>
       </w:pPr>
-      <w:hyperlink w:anchor="_Toc243441248" w:history="1">
+      <w:hyperlink w:anchor="_Toc243545604" w:history="1">
         <w:r>
           <w:rPr>
             <w:rStyle w:val="Hyperlink"/>
@@ -4484,7 +4484,7 @@
             <w:noProof/>
             <w:webHidden/>
           </w:rPr>
-          <w:instrText xml:space="preserve"> PAGEREF _Toc243441248 \h </w:instrText>
+          <w:instrText xml:space="preserve"> PAGEREF _Toc243545604 \h </w:instrText>
         </w:r>
         <w:r>
           <w:rPr>
@@ -4525,7 +4525,7 @@
           <w:noProof/>
         </w:rPr>
       </w:pPr>
-      <w:hyperlink w:anchor="_Toc243441249" w:history="1">
+      <w:hyperlink w:anchor="_Toc243545605" w:history="1">
         <w:r>
           <w:rPr>
             <w:rStyle w:val="Hyperlink"/>
@@ -4552,7 +4552,7 @@
             <w:noProof/>
             <w:webHidden/>
           </w:rPr>
-          <w:instrText xml:space="preserve"> PAGEREF _Toc243441249 \h </w:instrText>
+          <w:instrText xml:space="preserve"> PAGEREF _Toc243545605 \h </w:instrText>
         </w:r>
         <w:r>
           <w:rPr>
@@ -4593,7 +4593,7 @@
           <w:noProof/>
         </w:rPr>
       </w:pPr>
-      <w:hyperlink w:anchor="_Toc243441250" w:history="1">
+      <w:hyperlink w:anchor="_Toc243545606" w:history="1">
         <w:r>
           <w:rPr>
             <w:rStyle w:val="Hyperlink"/>
@@ -4620,7 +4620,7 @@
             <w:noProof/>
             <w:webHidden/>
           </w:rPr>
-          <w:instrText xml:space="preserve"> PAGEREF _Toc243441250 \h </w:instrText>
+          <w:instrText xml:space="preserve"> PAGEREF _Toc243545606 \h </w:instrText>
         </w:r>
         <w:r>
           <w:rPr>
@@ -4661,7 +4661,7 @@
           <w:noProof/>
         </w:rPr>
       </w:pPr>
-      <w:hyperlink w:anchor="_Toc243441251" w:history="1">
+      <w:hyperlink w:anchor="_Toc243545607" w:history="1">
         <w:r>
           <w:rPr>
             <w:rStyle w:val="Hyperlink"/>
@@ -4688,7 +4688,7 @@
             <w:noProof/>
             <w:webHidden/>
           </w:rPr>
-          <w:instrText xml:space="preserve"> PAGEREF _Toc243441251 \h </w:instrText>
+          <w:instrText xml:space="preserve"> PAGEREF _Toc243545607 \h </w:instrText>
         </w:r>
         <w:r>
           <w:rPr>
@@ -4729,7 +4729,7 @@
           <w:noProof/>
         </w:rPr>
       </w:pPr>
-      <w:hyperlink w:anchor="_Toc243441252" w:history="1">
+      <w:hyperlink w:anchor="_Toc243545608" w:history="1">
         <w:r>
           <w:rPr>
             <w:rStyle w:val="Hyperlink"/>
@@ -4756,7 +4756,7 @@
             <w:noProof/>
             <w:webHidden/>
           </w:rPr>
-          <w:instrText xml:space="preserve"> PAGEREF _Toc243441252 \h </w:instrText>
+          <w:instrText xml:space="preserve"> PAGEREF _Toc243545608 \h </w:instrText>
         </w:r>
         <w:r>
           <w:rPr>
@@ -4797,7 +4797,7 @@
           <w:noProof/>
         </w:rPr>
       </w:pPr>
-      <w:hyperlink w:anchor="_Toc243441253" w:history="1">
+      <w:hyperlink w:anchor="_Toc243545609" w:history="1">
         <w:r>
           <w:rPr>
             <w:rStyle w:val="Hyperlink"/>
@@ -4824,7 +4824,7 @@
             <w:noProof/>
             <w:webHidden/>
           </w:rPr>
-          <w:instrText xml:space="preserve"> PAGEREF _Toc243441253 \h </w:instrText>
+          <w:instrText xml:space="preserve"> PAGEREF _Toc243545609 \h </w:instrText>
         </w:r>
         <w:r>
           <w:rPr>
@@ -4865,7 +4865,7 @@
           <w:noProof/>
         </w:rPr>
       </w:pPr>
-      <w:hyperlink w:anchor="_Toc243441254" w:history="1">
+      <w:hyperlink w:anchor="_Toc243545610" w:history="1">
         <w:r>
           <w:rPr>
             <w:rStyle w:val="Hyperlink"/>
@@ -4892,7 +4892,7 @@
             <w:noProof/>
             <w:webHidden/>
           </w:rPr>
-          <w:instrText xml:space="preserve"> PAGEREF _Toc243441254 \h </w:instrText>
+          <w:instrText xml:space="preserve"> PAGEREF _Toc243545610 \h </w:instrText>
         </w:r>
         <w:r>
           <w:rPr>
@@ -4933,7 +4933,7 @@
           <w:noProof/>
         </w:rPr>
       </w:pPr>
-      <w:hyperlink w:anchor="_Toc243441255" w:history="1">
+      <w:hyperlink w:anchor="_Toc243545611" w:history="1">
         <w:r>
           <w:rPr>
             <w:rStyle w:val="Hyperlink"/>
@@ -4960,7 +4960,7 @@
             <w:noProof/>
             <w:webHidden/>
           </w:rPr>
-          <w:instrText xml:space="preserve"> PAGEREF _Toc243441255 \h </w:instrText>
+          <w:instrText xml:space="preserve"> PAGEREF _Toc243545611 \h </w:instrText>
         </w:r>
         <w:r>
           <w:rPr>
@@ -5001,7 +5001,7 @@
           <w:noProof/>
         </w:rPr>
       </w:pPr>
-      <w:hyperlink w:anchor="_Toc243441256" w:history="1">
+      <w:hyperlink w:anchor="_Toc243545612" w:history="1">
         <w:r>
           <w:rPr>
             <w:rStyle w:val="Hyperlink"/>
@@ -5028,7 +5028,7 @@
             <w:noProof/>
             <w:webHidden/>
           </w:rPr>
-          <w:instrText xml:space="preserve"> PAGEREF _Toc243441256 \h </w:instrText>
+          <w:instrText xml:space="preserve"> PAGEREF _Toc243545612 \h </w:instrText>
         </w:r>
         <w:r>
           <w:rPr>
@@ -5069,7 +5069,7 @@
         <w:pStyle w:val="Heading1"/>
         <w:pageBreakBefore/>
       </w:pPr>
-      <w:bookmarkStart w:id="0" w:name="_Toc243441190"/>
+      <w:bookmarkStart w:id="0" w:name="_Toc243545546"/>
       <w:r>
         <w:lastRenderedPageBreak/>
         <w:t>How to Use This Document</w:t>
@@ -5403,7 +5403,7 @@
         <w:pStyle w:val="Heading1"/>
         <w:pageBreakBefore/>
       </w:pPr>
-      <w:bookmarkStart w:id="1" w:name="_Toc243441191"/>
+      <w:bookmarkStart w:id="1" w:name="_Toc243545547"/>
       <w:r>
         <w:lastRenderedPageBreak/>
         <w:t>1. Abstract</w:t>
@@ -5457,7 +5457,7 @@
       <w:pPr>
         <w:pStyle w:val="Heading1"/>
       </w:pPr>
-      <w:bookmarkStart w:id="2" w:name="_Toc243441192"/>
+      <w:bookmarkStart w:id="2" w:name="_Toc243545548"/>
       <w:r>
         <w:t>2. Introduction</w:t>
       </w:r>
@@ -5487,7 +5487,7 @@
       <w:pPr>
         <w:pStyle w:val="Heading2"/>
       </w:pPr>
-      <w:bookmarkStart w:id="3" w:name="_Toc243441193"/>
+      <w:bookmarkStart w:id="3" w:name="_Toc243545549"/>
       <w:r>
         <w:t>2.1 Home Assistant</w:t>
       </w:r>
@@ -5539,7 +5539,7 @@
       <w:pPr>
         <w:pStyle w:val="Heading2"/>
       </w:pPr>
-      <w:bookmarkStart w:id="4" w:name="_Toc243441194"/>
+      <w:bookmarkStart w:id="4" w:name="_Toc243545550"/>
       <w:r>
         <w:t>2.2 Literature survey</w:t>
       </w:r>
@@ -6024,7 +6024,7 @@
       <w:pPr>
         <w:pStyle w:val="Heading1"/>
       </w:pPr>
-      <w:bookmarkStart w:id="5" w:name="_Toc243441195"/>
+      <w:bookmarkStart w:id="5" w:name="_Toc243545551"/>
       <w:r>
         <w:t>3. Problem Statement</w:t>
       </w:r>
@@ -6137,7 +6137,7 @@
       <w:pPr>
         <w:pStyle w:val="Heading1"/>
       </w:pPr>
-      <w:bookmarkStart w:id="6" w:name="_Toc243441196"/>
+      <w:bookmarkStart w:id="6" w:name="_Toc243545552"/>
       <w:r>
         <w:lastRenderedPageBreak/>
         <w:t>4. Objectives</w:t>
@@ -6278,7 +6278,7 @@
       <w:pPr>
         <w:pStyle w:val="Heading1"/>
       </w:pPr>
-      <w:bookmarkStart w:id="7" w:name="_Toc243441197"/>
+      <w:bookmarkStart w:id="7" w:name="_Toc243545553"/>
       <w:r>
         <w:t>5. Existing Systems and Their Limitations</w:t>
       </w:r>
@@ -6547,7 +6547,7 @@
       <w:pPr>
         <w:pStyle w:val="Heading2"/>
       </w:pPr>
-      <w:bookmarkStart w:id="8" w:name="_Toc243441198"/>
+      <w:bookmarkStart w:id="8" w:name="_Toc243545554"/>
       <w:r>
         <w:t>5.1 Why the MQTT approach was rejected</w:t>
       </w:r>
@@ -6585,7 +6585,7 @@
       <w:pPr>
         <w:pStyle w:val="Heading2"/>
       </w:pPr>
-      <w:bookmarkStart w:id="9" w:name="_Toc243441199"/>
+      <w:bookmarkStart w:id="9" w:name="_Toc243545555"/>
       <w:r>
         <w:t>5.2 The three designs the project went through</w:t>
       </w:r>
@@ -6916,7 +6916,7 @@
       <w:pPr>
         <w:pStyle w:val="Heading1"/>
       </w:pPr>
-      <w:bookmarkStart w:id="10" w:name="_Toc243441200"/>
+      <w:bookmarkStart w:id="10" w:name="_Toc243545556"/>
       <w:r>
         <w:t>6. Proposed System</w:t>
       </w:r>
@@ -6994,7 +6994,7 @@
       <w:pPr>
         <w:pStyle w:val="Heading2"/>
       </w:pPr>
-      <w:bookmarkStart w:id="11" w:name="_Toc243441201"/>
+      <w:bookmarkStart w:id="11" w:name="_Toc243545557"/>
       <w:r>
         <w:t>6.1 The memory constraint and the split architecture</w:t>
       </w:r>
@@ -7098,7 +7098,7 @@
       <w:pPr>
         <w:pStyle w:val="Heading2"/>
       </w:pPr>
-      <w:bookmarkStart w:id="12" w:name="_Toc243441202"/>
+      <w:bookmarkStart w:id="12" w:name="_Toc243545558"/>
       <w:r>
         <w:lastRenderedPageBreak/>
         <w:t>6.2 The layout is data, not code</w:t>
@@ -7265,7 +7265,7 @@
         <w:pStyle w:val="Heading1"/>
         <w:pageBreakBefore/>
       </w:pPr>
-      <w:bookmarkStart w:id="13" w:name="_Toc243441203"/>
+      <w:bookmarkStart w:id="13" w:name="_Toc243545559"/>
       <w:r>
         <w:lastRenderedPageBreak/>
         <w:t>7. System Architecture</w:t>
@@ -7281,7 +7281,7 @@
       <w:pPr>
         <w:pStyle w:val="Heading2"/>
       </w:pPr>
-      <w:bookmarkStart w:id="14" w:name="_Toc243441204"/>
+      <w:bookmarkStart w:id="14" w:name="_Toc243545560"/>
       <w:r>
         <w:t>7.1 Overall system diagram</w:t>
       </w:r>
@@ -7298,7 +7298,7 @@
           <w:noProof/>
         </w:rPr>
         <w:drawing>
-          <wp:inline distT="0" distB="0" distL="0" distR="0" wp14:anchorId="199D166E" wp14:editId="3A723947">
+          <wp:inline distT="0" distB="0" distL="0" distR="0" wp14:anchorId="5BAEB19D" wp14:editId="57E0B13F">
             <wp:extent cx="5760000" cy="3246545"/>
             <wp:effectExtent l="0" t="0" r="0" b="0"/>
             <wp:docPr id="1" name="Picture 1"/>
@@ -7391,7 +7391,7 @@
       <w:pPr>
         <w:pStyle w:val="Heading2"/>
       </w:pPr>
-      <w:bookmarkStart w:id="15" w:name="_Toc243441205"/>
+      <w:bookmarkStart w:id="15" w:name="_Toc243545561"/>
       <w:r>
         <w:lastRenderedPageBreak/>
         <w:t>7.2 Hardware diagram</w:t>
@@ -7409,7 +7409,7 @@
           <w:noProof/>
         </w:rPr>
         <w:drawing>
-          <wp:inline distT="0" distB="0" distL="0" distR="0" wp14:anchorId="4B0C1EED" wp14:editId="2B0B448A">
+          <wp:inline distT="0" distB="0" distL="0" distR="0" wp14:anchorId="61FC963A" wp14:editId="321C0ED4">
             <wp:extent cx="5580000" cy="3195818"/>
             <wp:effectExtent l="0" t="0" r="0" b="0"/>
             <wp:docPr id="2" name="Picture 2"/>
@@ -7475,7 +7475,7 @@
       <w:pPr>
         <w:pStyle w:val="Heading2"/>
       </w:pPr>
-      <w:bookmarkStart w:id="16" w:name="_Toc243441206"/>
+      <w:bookmarkStart w:id="16" w:name="_Toc243545562"/>
       <w:r>
         <w:t>7.3 Software diagram</w:t>
       </w:r>
@@ -7492,7 +7492,7 @@
           <w:noProof/>
         </w:rPr>
         <w:drawing>
-          <wp:inline distT="0" distB="0" distL="0" distR="0" wp14:anchorId="6A511ED3" wp14:editId="45186370">
+          <wp:inline distT="0" distB="0" distL="0" distR="0" wp14:anchorId="7971BA19" wp14:editId="1AFD3E2E">
             <wp:extent cx="5760000" cy="3015000"/>
             <wp:effectExtent l="0" t="0" r="0" b="0"/>
             <wp:docPr id="3" name="Picture 3"/>
@@ -7562,7 +7562,7 @@
       <w:pPr>
         <w:pStyle w:val="Heading2"/>
       </w:pPr>
-      <w:bookmarkStart w:id="17" w:name="_Toc243441207"/>
+      <w:bookmarkStart w:id="17" w:name="_Toc243545563"/>
       <w:r>
         <w:t>7.4 Block diagram</w:t>
       </w:r>
@@ -7579,7 +7579,7 @@
           <w:noProof/>
         </w:rPr>
         <w:drawing>
-          <wp:inline distT="0" distB="0" distL="0" distR="0" wp14:anchorId="53AB90E9" wp14:editId="77E31096">
+          <wp:inline distT="0" distB="0" distL="0" distR="0" wp14:anchorId="0047302C" wp14:editId="460FCA12">
             <wp:extent cx="5760000" cy="2625488"/>
             <wp:effectExtent l="0" t="0" r="0" b="0"/>
             <wp:docPr id="4" name="Picture 4"/>
@@ -7641,7 +7641,7 @@
         <w:pStyle w:val="Heading1"/>
         <w:pageBreakBefore/>
       </w:pPr>
-      <w:bookmarkStart w:id="18" w:name="_Toc243441208"/>
+      <w:bookmarkStart w:id="18" w:name="_Toc243545564"/>
       <w:r>
         <w:lastRenderedPageBreak/>
         <w:t>8. Hardware Description</w:t>
@@ -7666,7 +7666,7 @@
       <w:pPr>
         <w:pStyle w:val="Heading2"/>
       </w:pPr>
-      <w:bookmarkStart w:id="19" w:name="_Toc243441209"/>
+      <w:bookmarkStart w:id="19" w:name="_Toc243545565"/>
       <w:r>
         <w:t>8.1 Components</w:t>
       </w:r>
@@ -8170,7 +8170,7 @@
       <w:pPr>
         <w:pStyle w:val="Heading2"/>
       </w:pPr>
-      <w:bookmarkStart w:id="20" w:name="_Toc243441210"/>
+      <w:bookmarkStart w:id="20" w:name="_Toc243545566"/>
       <w:r>
         <w:t>8.2 Pin assignment</w:t>
       </w:r>
@@ -8942,7 +8942,7 @@
       <w:pPr>
         <w:pStyle w:val="Heading2"/>
       </w:pPr>
-      <w:bookmarkStart w:id="21" w:name="_Toc243441211"/>
+      <w:bookmarkStart w:id="21" w:name="_Toc243545567"/>
       <w:r>
         <w:t>8.3 Batch variation in this board family</w:t>
       </w:r>
@@ -9177,7 +9177,7 @@
         <w:pStyle w:val="Heading1"/>
         <w:pageBreakBefore/>
       </w:pPr>
-      <w:bookmarkStart w:id="22" w:name="_Toc243441212"/>
+      <w:bookmarkStart w:id="22" w:name="_Toc243545568"/>
       <w:r>
         <w:lastRenderedPageBreak/>
         <w:t>9. Software Description</w:t>
@@ -9188,7 +9188,7 @@
       <w:pPr>
         <w:pStyle w:val="Heading2"/>
       </w:pPr>
-      <w:bookmarkStart w:id="23" w:name="_Toc243441213"/>
+      <w:bookmarkStart w:id="23" w:name="_Toc243545569"/>
       <w:r>
         <w:t>9.1 Panel firmware: environment and libraries</w:t>
       </w:r>
@@ -9869,7 +9869,7 @@
       <w:pPr>
         <w:pStyle w:val="Heading2"/>
       </w:pPr>
-      <w:bookmarkStart w:id="24" w:name="_Toc243441214"/>
+      <w:bookmarkStart w:id="24" w:name="_Toc243545570"/>
       <w:r>
         <w:t>9.2 Desktop designer: environment and libraries</w:t>
       </w:r>
@@ -10295,7 +10295,7 @@
       <w:pPr>
         <w:pStyle w:val="Heading2"/>
       </w:pPr>
-      <w:bookmarkStart w:id="25" w:name="_Toc243441215"/>
+      <w:bookmarkStart w:id="25" w:name="_Toc243545571"/>
       <w:r>
         <w:t>9.3 Source code organisation</w:t>
       </w:r>
@@ -10992,7 +10992,7 @@
       <w:pPr>
         <w:pStyle w:val="Heading2"/>
       </w:pPr>
-      <w:bookmarkStart w:id="26" w:name="_Toc243441216"/>
+      <w:bookmarkStart w:id="26" w:name="_Toc243545572"/>
       <w:r>
         <w:t>9.4 The transport interface</w:t>
       </w:r>
@@ -11216,7 +11216,7 @@
         <w:pStyle w:val="Heading1"/>
         <w:pageBreakBefore/>
       </w:pPr>
-      <w:bookmarkStart w:id="27" w:name="_Toc243441217"/>
+      <w:bookmarkStart w:id="27" w:name="_Toc243545573"/>
       <w:r>
         <w:lastRenderedPageBreak/>
         <w:t>10. Implementation</w:t>
@@ -11227,7 +11227,7 @@
       <w:pPr>
         <w:pStyle w:val="Heading2"/>
       </w:pPr>
-      <w:bookmarkStart w:id="28" w:name="_Toc243441218"/>
+      <w:bookmarkStart w:id="28" w:name="_Toc243545574"/>
       <w:r>
         <w:t>10.1 The communication protocol</w:t>
       </w:r>
@@ -11476,7 +11476,7 @@
           <w:noProof/>
         </w:rPr>
         <w:drawing>
-          <wp:inline distT="0" distB="0" distL="0" distR="0" wp14:anchorId="5D003171" wp14:editId="6B75AC11">
+          <wp:inline distT="0" distB="0" distL="0" distR="0" wp14:anchorId="66C7F652" wp14:editId="20419197">
             <wp:extent cx="3240000" cy="3536229"/>
             <wp:effectExtent l="0" t="0" r="0" b="0"/>
             <wp:docPr id="5" name="Picture 5"/>
@@ -11548,7 +11548,7 @@
       <w:pPr>
         <w:pStyle w:val="Heading2"/>
       </w:pPr>
-      <w:bookmarkStart w:id="29" w:name="_Toc243441219"/>
+      <w:bookmarkStart w:id="29" w:name="_Toc243545575"/>
       <w:r>
         <w:lastRenderedPageBreak/>
         <w:t>10.2 Task structure and interface responsiveness</w:t>
@@ -11643,7 +11643,7 @@
       <w:pPr>
         <w:pStyle w:val="Heading2"/>
       </w:pPr>
-      <w:bookmarkStart w:id="30" w:name="_Toc243441220"/>
+      <w:bookmarkStart w:id="30" w:name="_Toc243545576"/>
       <w:r>
         <w:t>10.3 Memory strategy</w:t>
       </w:r>
@@ -11748,7 +11748,7 @@
       <w:pPr>
         <w:pStyle w:val="Heading2"/>
       </w:pPr>
-      <w:bookmarkStart w:id="31" w:name="_Toc243441221"/>
+      <w:bookmarkStart w:id="31" w:name="_Toc243545577"/>
       <w:r>
         <w:t>10.4 Touch coordinate handling</w:t>
       </w:r>
@@ -11763,7 +11763,7 @@
       <w:pPr>
         <w:pStyle w:val="Heading2"/>
       </w:pPr>
-      <w:bookmarkStart w:id="32" w:name="_Toc243441222"/>
+      <w:bookmarkStart w:id="32" w:name="_Toc243545578"/>
       <w:r>
         <w:t>10.5 Receiving and storing a layout</w:t>
       </w:r>
@@ -11889,7 +11889,7 @@
       <w:pPr>
         <w:pStyle w:val="Heading2"/>
       </w:pPr>
-      <w:bookmarkStart w:id="33" w:name="_Toc243441223"/>
+      <w:bookmarkStart w:id="33" w:name="_Toc243545579"/>
       <w:r>
         <w:t>10.6 The user interface</w:t>
       </w:r>
@@ -11911,7 +11911,7 @@
           <w:noProof/>
         </w:rPr>
         <w:drawing>
-          <wp:inline distT="0" distB="0" distL="0" distR="0" wp14:anchorId="1C56F739" wp14:editId="4F5700AD">
+          <wp:inline distT="0" distB="0" distL="0" distR="0" wp14:anchorId="0E7B139E" wp14:editId="22AC4BFF">
             <wp:extent cx="5400000" cy="2006192"/>
             <wp:effectExtent l="0" t="0" r="0" b="0"/>
             <wp:docPr id="6" name="Picture 6"/>
@@ -12095,7 +12095,7 @@
         </w:rPr>
         <w:lastRenderedPageBreak/>
         <w:drawing>
-          <wp:inline distT="0" distB="0" distL="0" distR="0" wp14:anchorId="57C1C4D0" wp14:editId="3FA842D8">
+          <wp:inline distT="0" distB="0" distL="0" distR="0" wp14:anchorId="46EC46EF" wp14:editId="716A1BBC">
             <wp:extent cx="4860000" cy="3667362"/>
             <wp:effectExtent l="0" t="0" r="0" b="0"/>
             <wp:docPr id="7" name="Picture 7"/>
@@ -12156,7 +12156,7 @@
       <w:pPr>
         <w:pStyle w:val="Heading2"/>
       </w:pPr>
-      <w:bookmarkStart w:id="34" w:name="_Toc243441224"/>
+      <w:bookmarkStart w:id="34" w:name="_Toc243545580"/>
       <w:r>
         <w:t>10.7 Themes</w:t>
       </w:r>
@@ -12179,7 +12179,7 @@
         </w:rPr>
         <w:lastRenderedPageBreak/>
         <w:drawing>
-          <wp:inline distT="0" distB="0" distL="0" distR="0" wp14:anchorId="351925CC" wp14:editId="20CBC7F9">
+          <wp:inline distT="0" distB="0" distL="0" distR="0" wp14:anchorId="0EB6DE21" wp14:editId="187461F2">
             <wp:extent cx="4500000" cy="5739130"/>
             <wp:effectExtent l="0" t="0" r="0" b="0"/>
             <wp:docPr id="8" name="Picture 8"/>
@@ -12240,7 +12240,7 @@
       <w:pPr>
         <w:pStyle w:val="Heading2"/>
       </w:pPr>
-      <w:bookmarkStart w:id="35" w:name="_Toc243441225"/>
+      <w:bookmarkStart w:id="35" w:name="_Toc243545581"/>
       <w:r>
         <w:t>10.8 A panel that explains its own failures</w:t>
       </w:r>
@@ -12266,7 +12266,7 @@
         <w:pStyle w:val="Heading1"/>
         <w:pageBreakBefore/>
       </w:pPr>
-      <w:bookmarkStart w:id="36" w:name="_Toc243441226"/>
+      <w:bookmarkStart w:id="36" w:name="_Toc243545582"/>
       <w:r>
         <w:lastRenderedPageBreak/>
         <w:t>11. The HomeMesh Designer (Desktop App)</w:t>
@@ -12289,7 +12289,7 @@
           <w:noProof/>
         </w:rPr>
         <w:drawing>
-          <wp:inline distT="0" distB="0" distL="0" distR="0" wp14:anchorId="44C34C29" wp14:editId="134D9D49">
+          <wp:inline distT="0" distB="0" distL="0" distR="0" wp14:anchorId="43DE3F1B" wp14:editId="4027BF82">
             <wp:extent cx="5760000" cy="3637895"/>
             <wp:effectExtent l="0" t="0" r="0" b="0"/>
             <wp:docPr id="9" name="Picture 9"/>
@@ -12350,7 +12350,7 @@
       <w:pPr>
         <w:pStyle w:val="Heading2"/>
       </w:pPr>
-      <w:bookmarkStart w:id="37" w:name="_Toc243441227"/>
+      <w:bookmarkStart w:id="37" w:name="_Toc243545583"/>
       <w:r>
         <w:t>11.1 What it does</w:t>
       </w:r>
@@ -12483,7 +12483,7 @@
       <w:pPr>
         <w:pStyle w:val="Heading2"/>
       </w:pPr>
-      <w:bookmarkStart w:id="38" w:name="_Toc243441228"/>
+      <w:bookmarkStart w:id="38" w:name="_Toc243545584"/>
       <w:r>
         <w:lastRenderedPageBreak/>
         <w:t>11.2 The simulator is the real interface</w:t>
@@ -12514,7 +12514,7 @@
       <w:pPr>
         <w:pStyle w:val="Heading2"/>
       </w:pPr>
-      <w:bookmarkStart w:id="39" w:name="_Toc243441229"/>
+      <w:bookmarkStart w:id="39" w:name="_Toc243545585"/>
       <w:r>
         <w:t>11.3 How the designer is tested</w:t>
       </w:r>
@@ -12580,7 +12580,7 @@
         <w:pStyle w:val="Heading1"/>
         <w:pageBreakBefore/>
       </w:pPr>
-      <w:bookmarkStart w:id="40" w:name="_Toc243441230"/>
+      <w:bookmarkStart w:id="40" w:name="_Toc243545586"/>
       <w:r>
         <w:lastRenderedPageBreak/>
         <w:t>12. System Operation</w:t>
@@ -12591,7 +12591,7 @@
       <w:pPr>
         <w:pStyle w:val="Heading2"/>
       </w:pPr>
-      <w:bookmarkStart w:id="41" w:name="_Toc243441231"/>
+      <w:bookmarkStart w:id="41" w:name="_Toc243545587"/>
       <w:r>
         <w:t>12.1 Network configuration</w:t>
       </w:r>
@@ -12919,7 +12919,7 @@
       <w:pPr>
         <w:pStyle w:val="Heading2"/>
       </w:pPr>
-      <w:bookmarkStart w:id="42" w:name="_Toc243441232"/>
+      <w:bookmarkStart w:id="42" w:name="_Toc243545588"/>
       <w:r>
         <w:t>12.2 Devices on the panel</w:t>
       </w:r>
@@ -13225,7 +13225,7 @@
       <w:pPr>
         <w:pStyle w:val="Heading2"/>
       </w:pPr>
-      <w:bookmarkStart w:id="43" w:name="_Toc243441233"/>
+      <w:bookmarkStart w:id="43" w:name="_Toc243545589"/>
       <w:r>
         <w:t>12.3 Changing what the panel shows</w:t>
       </w:r>
@@ -13318,7 +13318,7 @@
         <w:pStyle w:val="Heading1"/>
         <w:pageBreakBefore/>
       </w:pPr>
-      <w:bookmarkStart w:id="44" w:name="_Toc243441234"/>
+      <w:bookmarkStart w:id="44" w:name="_Toc243545590"/>
       <w:r>
         <w:lastRenderedPageBreak/>
         <w:t>13. Testing and Results</w:t>
@@ -13334,7 +13334,7 @@
       <w:pPr>
         <w:pStyle w:val="Heading2"/>
       </w:pPr>
-      <w:bookmarkStart w:id="45" w:name="_Toc243441235"/>
+      <w:bookmarkStart w:id="45" w:name="_Toc243545591"/>
       <w:r>
         <w:t>13.1 Message size and latency</w:t>
       </w:r>
@@ -13728,7 +13728,7 @@
           <w:noProof/>
         </w:rPr>
         <w:drawing>
-          <wp:inline distT="0" distB="0" distL="0" distR="0" wp14:anchorId="2397AB93" wp14:editId="0C9DE6C5">
+          <wp:inline distT="0" distB="0" distL="0" distR="0" wp14:anchorId="4FEAA9C1" wp14:editId="787F2E8C">
             <wp:extent cx="3960000" cy="1998857"/>
             <wp:effectExtent l="0" t="0" r="0" b="0"/>
             <wp:docPr id="10" name="Picture 10"/>
@@ -13794,7 +13794,7 @@
       <w:pPr>
         <w:pStyle w:val="Heading2"/>
       </w:pPr>
-      <w:bookmarkStart w:id="46" w:name="_Toc243441236"/>
+      <w:bookmarkStart w:id="46" w:name="_Toc243545592"/>
       <w:r>
         <w:t>13.2 Resource usage</w:t>
       </w:r>
@@ -14106,7 +14106,7 @@
       <w:pPr>
         <w:pStyle w:val="Heading2"/>
       </w:pPr>
-      <w:bookmarkStart w:id="47" w:name="_Toc243441237"/>
+      <w:bookmarkStart w:id="47" w:name="_Toc243545593"/>
       <w:r>
         <w:t>13.3 Functional verification</w:t>
       </w:r>
@@ -14683,7 +14683,7 @@
       <w:pPr>
         <w:pStyle w:val="Heading2"/>
       </w:pPr>
-      <w:bookmarkStart w:id="48" w:name="_Toc243441238"/>
+      <w:bookmarkStart w:id="48" w:name="_Toc243545594"/>
       <w:r>
         <w:t>13.4 Field case study: the connection that kept dropping</w:t>
       </w:r>
@@ -14779,7 +14779,7 @@
       <w:pPr>
         <w:pStyle w:val="Heading2"/>
       </w:pPr>
-      <w:bookmarkStart w:id="49" w:name="_Toc243441239"/>
+      <w:bookmarkStart w:id="49" w:name="_Toc243545595"/>
       <w:r>
         <w:lastRenderedPageBreak/>
         <w:t>13.5 Other challenges and their resolution</w:t>
@@ -15319,7 +15319,7 @@
       <w:pPr>
         <w:pStyle w:val="Heading1"/>
       </w:pPr>
-      <w:bookmarkStart w:id="50" w:name="_Toc243441240"/>
+      <w:bookmarkStart w:id="50" w:name="_Toc243545596"/>
       <w:r>
         <w:t>14. Future Scope</w:t>
       </w:r>
@@ -15437,7 +15437,7 @@
       <w:pPr>
         <w:pStyle w:val="Heading1"/>
       </w:pPr>
-      <w:bookmarkStart w:id="51" w:name="_Toc243441241"/>
+      <w:bookmarkStart w:id="51" w:name="_Toc243545597"/>
       <w:r>
         <w:t>15. Conclusion</w:t>
       </w:r>
@@ -15493,7 +15493,7 @@
       <w:pPr>
         <w:pStyle w:val="Heading1"/>
       </w:pPr>
-      <w:bookmarkStart w:id="52" w:name="_Toc243441242"/>
+      <w:bookmarkStart w:id="52" w:name="_Toc243545598"/>
       <w:r>
         <w:t>16. References</w:t>
       </w:r>
@@ -15503,7 +15503,7 @@
       <w:pPr>
         <w:pStyle w:val="Heading2"/>
       </w:pPr>
-      <w:bookmarkStart w:id="53" w:name="_Toc243441243"/>
+      <w:bookmarkStart w:id="53" w:name="_Toc243545599"/>
       <w:r>
         <w:t>16.1 Published literature</w:t>
       </w:r>
@@ -15948,7 +15948,7 @@
       <w:pPr>
         <w:pStyle w:val="Heading2"/>
       </w:pPr>
-      <w:bookmarkStart w:id="54" w:name="_Toc243441244"/>
+      <w:bookmarkStart w:id="54" w:name="_Toc243545600"/>
       <w:r>
         <w:t>16.2 Technical documentation</w:t>
       </w:r>
@@ -16127,7 +16127,7 @@
         <w:pStyle w:val="Heading1"/>
         <w:pageBreakBefore/>
       </w:pPr>
-      <w:bookmarkStart w:id="55" w:name="_Toc243441245"/>
+      <w:bookmarkStart w:id="55" w:name="_Toc243545601"/>
       <w:r>
         <w:lastRenderedPageBreak/>
         <w:t>Appendix A — Suggested Presentation Plan</w:t>
@@ -16138,7 +16138,7 @@
       <w:pPr>
         <w:pStyle w:val="Heading2"/>
       </w:pPr>
-      <w:bookmarkStart w:id="56" w:name="_Toc243441246"/>
+      <w:bookmarkStart w:id="56" w:name="_Toc243545602"/>
       <w:r>
         <w:t>Team roles</w:t>
       </w:r>
@@ -16630,7 +16630,7 @@
       <w:pPr>
         <w:pStyle w:val="Heading2"/>
       </w:pPr>
-      <w:bookmarkStart w:id="57" w:name="_Toc243441247"/>
+      <w:bookmarkStart w:id="57" w:name="_Toc243545603"/>
       <w:r>
         <w:t>Slides</w:t>
       </w:r>
@@ -18537,7 +18537,7 @@
       <w:pPr>
         <w:pStyle w:val="Heading2"/>
       </w:pPr>
-      <w:bookmarkStart w:id="58" w:name="_Toc243441248"/>
+      <w:bookmarkStart w:id="58" w:name="_Toc243545604"/>
       <w:r>
         <w:t>Figure files</w:t>
       </w:r>
@@ -19001,7 +19001,7 @@
       <w:pPr>
         <w:pStyle w:val="Heading2"/>
       </w:pPr>
-      <w:bookmarkStart w:id="59" w:name="_Toc243441249"/>
+      <w:bookmarkStart w:id="59" w:name="_Toc243545605"/>
       <w:r>
         <w:t>Presentation notes</w:t>
       </w:r>
@@ -19047,7 +19047,7 @@
       <w:pPr>
         <w:pStyle w:val="Heading2"/>
       </w:pPr>
-      <w:bookmarkStart w:id="60" w:name="_Toc243441250"/>
+      <w:bookmarkStart w:id="60" w:name="_Toc243545606"/>
       <w:r>
         <w:t>Anticipated questions</w:t>
       </w:r>
@@ -19799,7 +19799,7 @@
         <w:pStyle w:val="Heading1"/>
         <w:pageBreakBefore/>
       </w:pPr>
-      <w:bookmarkStart w:id="61" w:name="_Toc243441251"/>
+      <w:bookmarkStart w:id="61" w:name="_Toc243545607"/>
       <w:r>
         <w:lastRenderedPageBreak/>
         <w:t>Appendix B — Internal Note (Not for Presentation)</w:t>
@@ -19874,7 +19874,7 @@
       <w:pPr>
         <w:pStyle w:val="Heading2"/>
       </w:pPr>
-      <w:bookmarkStart w:id="62" w:name="_Toc243441252"/>
+      <w:bookmarkStart w:id="62" w:name="_Toc243545608"/>
       <w:r>
         <w:t>What is genuinely working</w:t>
       </w:r>
@@ -19943,7 +19943,7 @@
       <w:pPr>
         <w:pStyle w:val="Heading2"/>
       </w:pPr>
-      <w:bookmarkStart w:id="63" w:name="_Toc243441253"/>
+      <w:bookmarkStart w:id="63" w:name="_Toc243545609"/>
       <w:r>
         <w:t>What must not be claimed</w:t>
       </w:r>
@@ -20292,7 +20292,7 @@
       <w:pPr>
         <w:pStyle w:val="Heading2"/>
       </w:pPr>
-      <w:bookmarkStart w:id="64" w:name="_Toc243441254"/>
+      <w:bookmarkStart w:id="64" w:name="_Toc243545610"/>
       <w:r>
         <w:lastRenderedPageBreak/>
         <w:t>Check before the review: firmware on the board</w:t>
@@ -20341,7 +20341,7 @@
               <w:rPr>
                 <w:b/>
               </w:rPr>
-              <w:t>The board is running the 20 October firmware — flash the 21 October one</w:t>
+              <w:t>The board is running the 21 October firmware</w:t>
             </w:r>
           </w:p>
           <w:p>
@@ -20352,7 +20352,7 @@
               <w:rPr>
                 <w:sz w:val="20"/>
               </w:rPr>
-              <w:t>Flashed on 20 October with the fixes for long names and the light (Daylight) theme; the boot log matched the healthy one. Check the names and the Daylight theme on the real screen once before the review.</w:t>
+              <w:t>Flashed on 22 October, with fan speed, automation colours and the fixes for long names and the light (Daylight) theme. Check the names and the Daylight theme on the real screen once before the review, and push your layout again: the flash erased the one stored on the panel.</w:t>
             </w:r>
           </w:p>
           <w:p>
@@ -20364,52 +20364,13 @@
                 <w:b/>
                 <w:sz w:val="20"/>
               </w:rPr>
-              <w:t>The 21 October firmware adds fan speed and automation colours and is not flashed yet</w:t>
+              <w:t>The Wi-Fi link from the laptop to the panel is currently poor</w:t>
             </w:r>
             <w:r>
               <w:rPr>
                 <w:sz w:val="20"/>
               </w:rPr>
-              <w:t xml:space="preserve"> (the board was unplugged). Flash it (</w:t>
-            </w:r>
-            <w:r>
-              <w:rPr>
-                <w:rFonts w:ascii="Consolas" w:hAnsi="Consolas"/>
-                <w:sz w:val="18"/>
-              </w:rPr>
-              <w:t>pio run -e ha -t upload</w:t>
-            </w:r>
-            <w:r>
-              <w:rPr>
-                <w:sz w:val="20"/>
-              </w:rPr>
-              <w:t xml:space="preserve">, or </w:t>
-            </w:r>
-            <w:r>
-              <w:rPr>
-                <w:rFonts w:ascii="Consolas" w:hAnsi="Consolas"/>
-                <w:sz w:val="18"/>
-              </w:rPr>
-              <w:t>../homemesh_ha_firmware_21oct.bin</w:t>
-            </w:r>
-            <w:r>
-              <w:rPr>
-                <w:sz w:val="20"/>
-              </w:rPr>
-              <w:t xml:space="preserve">), check the boot log, then push the layout again. </w:t>
-            </w:r>
-            <w:r>
-              <w:rPr>
-                <w:b/>
-                <w:sz w:val="20"/>
-              </w:rPr>
-              <w:t>Until then, do not push a layout with a speed-controlled fan on it</w:t>
-            </w:r>
-            <w:r>
-              <w:rPr>
-                <w:sz w:val="20"/>
-              </w:rPr>
-              <w:t>: the old firmware would send the fan a light's brightness command, which Home Assistant rejects.</w:t>
+              <w:t xml:space="preserve"> (half the pings lost on 22 October; 0% on 18 October). After a push or a restart the panel can take minutes to reconnect. Test the demo in the room it will run in, with the panel's log open, and if it is slow try the phone hotspot route in "Before the presentation".</w:t>
             </w:r>
           </w:p>
           <w:p>
@@ -20485,7 +20446,7 @@
       <w:pPr>
         <w:pStyle w:val="Heading2"/>
       </w:pPr>
-      <w:bookmarkStart w:id="65" w:name="_Toc243441255"/>
+      <w:bookmarkStart w:id="65" w:name="_Toc243545611"/>
       <w:r>
         <w:t>Two quirks that may be noticed, and how to answer</w:t>
       </w:r>
@@ -20644,7 +20605,7 @@
       <w:pPr>
         <w:pStyle w:val="Heading2"/>
       </w:pPr>
-      <w:bookmarkStart w:id="66" w:name="_Toc243441256"/>
+      <w:bookmarkStart w:id="66" w:name="_Toc243545612"/>
       <w:r>
         <w:t>Before the presentation</w:t>
       </w:r>
@@ -21058,31 +21019,31 @@
       </w:rPr>
     </w:lvl>
   </w:abstractNum>
-  <w:num w:numId="1" w16cid:durableId="2059160341">
+  <w:num w:numId="1" w16cid:durableId="1163855188">
     <w:abstractNumId w:val="8"/>
   </w:num>
-  <w:num w:numId="2" w16cid:durableId="978729694">
+  <w:num w:numId="2" w16cid:durableId="1995907960">
     <w:abstractNumId w:val="6"/>
   </w:num>
-  <w:num w:numId="3" w16cid:durableId="1804080672">
+  <w:num w:numId="3" w16cid:durableId="199897645">
     <w:abstractNumId w:val="5"/>
   </w:num>
-  <w:num w:numId="4" w16cid:durableId="1185249720">
+  <w:num w:numId="4" w16cid:durableId="1382096669">
     <w:abstractNumId w:val="4"/>
   </w:num>
-  <w:num w:numId="5" w16cid:durableId="1350377364">
+  <w:num w:numId="5" w16cid:durableId="1223057336">
     <w:abstractNumId w:val="7"/>
   </w:num>
-  <w:num w:numId="6" w16cid:durableId="1333020863">
+  <w:num w:numId="6" w16cid:durableId="507447786">
     <w:abstractNumId w:val="3"/>
   </w:num>
-  <w:num w:numId="7" w16cid:durableId="261888297">
+  <w:num w:numId="7" w16cid:durableId="2063599632">
     <w:abstractNumId w:val="2"/>
   </w:num>
-  <w:num w:numId="8" w16cid:durableId="1019812779">
+  <w:num w:numId="8" w16cid:durableId="1294485417">
     <w:abstractNumId w:val="1"/>
   </w:num>
-  <w:num w:numId="9" w16cid:durableId="1201480509">
+  <w:num w:numId="9" w16cid:durableId="1415740082">
     <w:abstractNumId w:val="0"/>
   </w:num>
 </w:numbering>
@@ -32475,7 +32436,7 @@
     <w:autoRedefine/>
     <w:uiPriority w:val="39"/>
     <w:unhideWhenUsed/>
-    <w:rsid w:val="00CA124C"/>
+    <w:rsid w:val="009613B6"/>
     <w:pPr>
       <w:spacing w:after="100"/>
     </w:pPr>
@@ -32487,7 +32448,7 @@
     <w:autoRedefine/>
     <w:uiPriority w:val="39"/>
     <w:unhideWhenUsed/>
-    <w:rsid w:val="00CA124C"/>
+    <w:rsid w:val="009613B6"/>
     <w:pPr>
       <w:spacing w:after="100"/>
       <w:ind w:left="210"/>
@@ -32498,7 +32459,7 @@
     <w:basedOn w:val="DefaultParagraphFont"/>
     <w:uiPriority w:val="99"/>
     <w:unhideWhenUsed/>
-    <w:rsid w:val="00CA124C"/>
+    <w:rsid w:val="009613B6"/>
     <w:rPr>
       <w:color w:val="0000FF" w:themeColor="hyperlink"/>
       <w:u w:val="single"/>

</xml_diff>

<commit_message>
Presentation layout: four automations in their own colours
The demo layout keeps its five devices and adds All Off, Goodnight,
Movie Night and Welcome Home to the Automations screen. Pushed to the
panel and watched arriving: stored, restarted, reconnected.

Four rather than all six because of the 40 KB graphics pool: walking
every screen in the simulator (tests/stress_sim.mjs, new) left 5,020
bytes at worst with six, 7,316 with four, 11,760 with none.
</commit_message>
<xml_diff>
--- a/docs/HomeMesh_Panel_Project_Documentation.docx
+++ b/docs/HomeMesh_Panel_Project_Documentation.docx
@@ -513,7 +513,7 @@
       <w:r>
         <w:fldChar w:fldCharType="separate"/>
       </w:r>
-      <w:hyperlink w:anchor="_Toc243545546" w:history="1">
+      <w:hyperlink w:anchor="_Toc243546397" w:history="1">
         <w:r>
           <w:rPr>
             <w:rStyle w:val="Hyperlink"/>
@@ -540,7 +540,7 @@
             <w:noProof/>
             <w:webHidden/>
           </w:rPr>
-          <w:instrText xml:space="preserve"> PAGEREF _Toc243545546 \h </w:instrText>
+          <w:instrText xml:space="preserve"> PAGEREF _Toc243546397 \h </w:instrText>
         </w:r>
         <w:r>
           <w:rPr>
@@ -581,7 +581,7 @@
           <w:noProof/>
         </w:rPr>
       </w:pPr>
-      <w:hyperlink w:anchor="_Toc243545547" w:history="1">
+      <w:hyperlink w:anchor="_Toc243546398" w:history="1">
         <w:r>
           <w:rPr>
             <w:rStyle w:val="Hyperlink"/>
@@ -608,7 +608,7 @@
             <w:noProof/>
             <w:webHidden/>
           </w:rPr>
-          <w:instrText xml:space="preserve"> PAGEREF _Toc243545547 \h </w:instrText>
+          <w:instrText xml:space="preserve"> PAGEREF _Toc243546398 \h </w:instrText>
         </w:r>
         <w:r>
           <w:rPr>
@@ -649,7 +649,7 @@
           <w:noProof/>
         </w:rPr>
       </w:pPr>
-      <w:hyperlink w:anchor="_Toc243545548" w:history="1">
+      <w:hyperlink w:anchor="_Toc243546399" w:history="1">
         <w:r>
           <w:rPr>
             <w:rStyle w:val="Hyperlink"/>
@@ -676,7 +676,7 @@
             <w:noProof/>
             <w:webHidden/>
           </w:rPr>
-          <w:instrText xml:space="preserve"> PAGEREF _Toc243545548 \h </w:instrText>
+          <w:instrText xml:space="preserve"> PAGEREF _Toc243546399 \h </w:instrText>
         </w:r>
         <w:r>
           <w:rPr>
@@ -717,7 +717,7 @@
           <w:noProof/>
         </w:rPr>
       </w:pPr>
-      <w:hyperlink w:anchor="_Toc243545549" w:history="1">
+      <w:hyperlink w:anchor="_Toc243546400" w:history="1">
         <w:r>
           <w:rPr>
             <w:rStyle w:val="Hyperlink"/>
@@ -744,7 +744,7 @@
             <w:noProof/>
             <w:webHidden/>
           </w:rPr>
-          <w:instrText xml:space="preserve"> PAGEREF _Toc243545549 \h </w:instrText>
+          <w:instrText xml:space="preserve"> PAGEREF _Toc243546400 \h </w:instrText>
         </w:r>
         <w:r>
           <w:rPr>
@@ -785,7 +785,7 @@
           <w:noProof/>
         </w:rPr>
       </w:pPr>
-      <w:hyperlink w:anchor="_Toc243545550" w:history="1">
+      <w:hyperlink w:anchor="_Toc243546401" w:history="1">
         <w:r>
           <w:rPr>
             <w:rStyle w:val="Hyperlink"/>
@@ -812,7 +812,7 @@
             <w:noProof/>
             <w:webHidden/>
           </w:rPr>
-          <w:instrText xml:space="preserve"> PAGEREF _Toc243545550 \h </w:instrText>
+          <w:instrText xml:space="preserve"> PAGEREF _Toc243546401 \h </w:instrText>
         </w:r>
         <w:r>
           <w:rPr>
@@ -853,7 +853,7 @@
           <w:noProof/>
         </w:rPr>
       </w:pPr>
-      <w:hyperlink w:anchor="_Toc243545551" w:history="1">
+      <w:hyperlink w:anchor="_Toc243546402" w:history="1">
         <w:r>
           <w:rPr>
             <w:rStyle w:val="Hyperlink"/>
@@ -880,7 +880,7 @@
             <w:noProof/>
             <w:webHidden/>
           </w:rPr>
-          <w:instrText xml:space="preserve"> PAGEREF _Toc243545551 \h </w:instrText>
+          <w:instrText xml:space="preserve"> PAGEREF _Toc243546402 \h </w:instrText>
         </w:r>
         <w:r>
           <w:rPr>
@@ -921,7 +921,7 @@
           <w:noProof/>
         </w:rPr>
       </w:pPr>
-      <w:hyperlink w:anchor="_Toc243545552" w:history="1">
+      <w:hyperlink w:anchor="_Toc243546403" w:history="1">
         <w:r>
           <w:rPr>
             <w:rStyle w:val="Hyperlink"/>
@@ -948,7 +948,7 @@
             <w:noProof/>
             <w:webHidden/>
           </w:rPr>
-          <w:instrText xml:space="preserve"> PAGEREF _Toc243545552 \h </w:instrText>
+          <w:instrText xml:space="preserve"> PAGEREF _Toc243546403 \h </w:instrText>
         </w:r>
         <w:r>
           <w:rPr>
@@ -989,7 +989,7 @@
           <w:noProof/>
         </w:rPr>
       </w:pPr>
-      <w:hyperlink w:anchor="_Toc243545553" w:history="1">
+      <w:hyperlink w:anchor="_Toc243546404" w:history="1">
         <w:r>
           <w:rPr>
             <w:rStyle w:val="Hyperlink"/>
@@ -1016,7 +1016,7 @@
             <w:noProof/>
             <w:webHidden/>
           </w:rPr>
-          <w:instrText xml:space="preserve"> PAGEREF _Toc243545553 \h </w:instrText>
+          <w:instrText xml:space="preserve"> PAGEREF _Toc243546404 \h </w:instrText>
         </w:r>
         <w:r>
           <w:rPr>
@@ -1057,7 +1057,7 @@
           <w:noProof/>
         </w:rPr>
       </w:pPr>
-      <w:hyperlink w:anchor="_Toc243545554" w:history="1">
+      <w:hyperlink w:anchor="_Toc243546405" w:history="1">
         <w:r>
           <w:rPr>
             <w:rStyle w:val="Hyperlink"/>
@@ -1084,7 +1084,7 @@
             <w:noProof/>
             <w:webHidden/>
           </w:rPr>
-          <w:instrText xml:space="preserve"> PAGEREF _Toc243545554 \h </w:instrText>
+          <w:instrText xml:space="preserve"> PAGEREF _Toc243546405 \h </w:instrText>
         </w:r>
         <w:r>
           <w:rPr>
@@ -1125,7 +1125,7 @@
           <w:noProof/>
         </w:rPr>
       </w:pPr>
-      <w:hyperlink w:anchor="_Toc243545555" w:history="1">
+      <w:hyperlink w:anchor="_Toc243546406" w:history="1">
         <w:r>
           <w:rPr>
             <w:rStyle w:val="Hyperlink"/>
@@ -1152,7 +1152,7 @@
             <w:noProof/>
             <w:webHidden/>
           </w:rPr>
-          <w:instrText xml:space="preserve"> PAGEREF _Toc243545555 \h </w:instrText>
+          <w:instrText xml:space="preserve"> PAGEREF _Toc243546406 \h </w:instrText>
         </w:r>
         <w:r>
           <w:rPr>
@@ -1193,7 +1193,7 @@
           <w:noProof/>
         </w:rPr>
       </w:pPr>
-      <w:hyperlink w:anchor="_Toc243545556" w:history="1">
+      <w:hyperlink w:anchor="_Toc243546407" w:history="1">
         <w:r>
           <w:rPr>
             <w:rStyle w:val="Hyperlink"/>
@@ -1220,7 +1220,7 @@
             <w:noProof/>
             <w:webHidden/>
           </w:rPr>
-          <w:instrText xml:space="preserve"> PAGEREF _Toc243545556 \h </w:instrText>
+          <w:instrText xml:space="preserve"> PAGEREF _Toc243546407 \h </w:instrText>
         </w:r>
         <w:r>
           <w:rPr>
@@ -1261,7 +1261,7 @@
           <w:noProof/>
         </w:rPr>
       </w:pPr>
-      <w:hyperlink w:anchor="_Toc243545557" w:history="1">
+      <w:hyperlink w:anchor="_Toc243546408" w:history="1">
         <w:r>
           <w:rPr>
             <w:rStyle w:val="Hyperlink"/>
@@ -1288,7 +1288,7 @@
             <w:noProof/>
             <w:webHidden/>
           </w:rPr>
-          <w:instrText xml:space="preserve"> PAGEREF _Toc243545557 \h </w:instrText>
+          <w:instrText xml:space="preserve"> PAGEREF _Toc243546408 \h </w:instrText>
         </w:r>
         <w:r>
           <w:rPr>
@@ -1329,7 +1329,7 @@
           <w:noProof/>
         </w:rPr>
       </w:pPr>
-      <w:hyperlink w:anchor="_Toc243545558" w:history="1">
+      <w:hyperlink w:anchor="_Toc243546409" w:history="1">
         <w:r>
           <w:rPr>
             <w:rStyle w:val="Hyperlink"/>
@@ -1356,7 +1356,7 @@
             <w:noProof/>
             <w:webHidden/>
           </w:rPr>
-          <w:instrText xml:space="preserve"> PAGEREF _Toc243545558 \h </w:instrText>
+          <w:instrText xml:space="preserve"> PAGEREF _Toc243546409 \h </w:instrText>
         </w:r>
         <w:r>
           <w:rPr>
@@ -1397,7 +1397,7 @@
           <w:noProof/>
         </w:rPr>
       </w:pPr>
-      <w:hyperlink w:anchor="_Toc243545559" w:history="1">
+      <w:hyperlink w:anchor="_Toc243546410" w:history="1">
         <w:r>
           <w:rPr>
             <w:rStyle w:val="Hyperlink"/>
@@ -1424,7 +1424,7 @@
             <w:noProof/>
             <w:webHidden/>
           </w:rPr>
-          <w:instrText xml:space="preserve"> PAGEREF _Toc243545559 \h </w:instrText>
+          <w:instrText xml:space="preserve"> PAGEREF _Toc243546410 \h </w:instrText>
         </w:r>
         <w:r>
           <w:rPr>
@@ -1465,7 +1465,7 @@
           <w:noProof/>
         </w:rPr>
       </w:pPr>
-      <w:hyperlink w:anchor="_Toc243545560" w:history="1">
+      <w:hyperlink w:anchor="_Toc243546411" w:history="1">
         <w:r>
           <w:rPr>
             <w:rStyle w:val="Hyperlink"/>
@@ -1492,7 +1492,7 @@
             <w:noProof/>
             <w:webHidden/>
           </w:rPr>
-          <w:instrText xml:space="preserve"> PAGEREF _Toc243545560 \h </w:instrText>
+          <w:instrText xml:space="preserve"> PAGEREF _Toc243546411 \h </w:instrText>
         </w:r>
         <w:r>
           <w:rPr>
@@ -1533,7 +1533,7 @@
           <w:noProof/>
         </w:rPr>
       </w:pPr>
-      <w:hyperlink w:anchor="_Toc243545561" w:history="1">
+      <w:hyperlink w:anchor="_Toc243546412" w:history="1">
         <w:r>
           <w:rPr>
             <w:rStyle w:val="Hyperlink"/>
@@ -1560,7 +1560,7 @@
             <w:noProof/>
             <w:webHidden/>
           </w:rPr>
-          <w:instrText xml:space="preserve"> PAGEREF _Toc243545561 \h </w:instrText>
+          <w:instrText xml:space="preserve"> PAGEREF _Toc243546412 \h </w:instrText>
         </w:r>
         <w:r>
           <w:rPr>
@@ -1601,7 +1601,7 @@
           <w:noProof/>
         </w:rPr>
       </w:pPr>
-      <w:hyperlink w:anchor="_Toc243545562" w:history="1">
+      <w:hyperlink w:anchor="_Toc243546413" w:history="1">
         <w:r>
           <w:rPr>
             <w:rStyle w:val="Hyperlink"/>
@@ -1628,7 +1628,7 @@
             <w:noProof/>
             <w:webHidden/>
           </w:rPr>
-          <w:instrText xml:space="preserve"> PAGEREF _Toc243545562 \h </w:instrText>
+          <w:instrText xml:space="preserve"> PAGEREF _Toc243546413 \h </w:instrText>
         </w:r>
         <w:r>
           <w:rPr>
@@ -1669,7 +1669,7 @@
           <w:noProof/>
         </w:rPr>
       </w:pPr>
-      <w:hyperlink w:anchor="_Toc243545563" w:history="1">
+      <w:hyperlink w:anchor="_Toc243546414" w:history="1">
         <w:r>
           <w:rPr>
             <w:rStyle w:val="Hyperlink"/>
@@ -1696,7 +1696,7 @@
             <w:noProof/>
             <w:webHidden/>
           </w:rPr>
-          <w:instrText xml:space="preserve"> PAGEREF _Toc243545563 \h </w:instrText>
+          <w:instrText xml:space="preserve"> PAGEREF _Toc243546414 \h </w:instrText>
         </w:r>
         <w:r>
           <w:rPr>
@@ -1737,7 +1737,7 @@
           <w:noProof/>
         </w:rPr>
       </w:pPr>
-      <w:hyperlink w:anchor="_Toc243545564" w:history="1">
+      <w:hyperlink w:anchor="_Toc243546415" w:history="1">
         <w:r>
           <w:rPr>
             <w:rStyle w:val="Hyperlink"/>
@@ -1764,7 +1764,7 @@
             <w:noProof/>
             <w:webHidden/>
           </w:rPr>
-          <w:instrText xml:space="preserve"> PAGEREF _Toc243545564 \h </w:instrText>
+          <w:instrText xml:space="preserve"> PAGEREF _Toc243546415 \h </w:instrText>
         </w:r>
         <w:r>
           <w:rPr>
@@ -1805,7 +1805,7 @@
           <w:noProof/>
         </w:rPr>
       </w:pPr>
-      <w:hyperlink w:anchor="_Toc243545565" w:history="1">
+      <w:hyperlink w:anchor="_Toc243546416" w:history="1">
         <w:r>
           <w:rPr>
             <w:rStyle w:val="Hyperlink"/>
@@ -1832,7 +1832,7 @@
             <w:noProof/>
             <w:webHidden/>
           </w:rPr>
-          <w:instrText xml:space="preserve"> PAGEREF _Toc243545565 \h </w:instrText>
+          <w:instrText xml:space="preserve"> PAGEREF _Toc243546416 \h </w:instrText>
         </w:r>
         <w:r>
           <w:rPr>
@@ -1873,7 +1873,7 @@
           <w:noProof/>
         </w:rPr>
       </w:pPr>
-      <w:hyperlink w:anchor="_Toc243545566" w:history="1">
+      <w:hyperlink w:anchor="_Toc243546417" w:history="1">
         <w:r>
           <w:rPr>
             <w:rStyle w:val="Hyperlink"/>
@@ -1900,7 +1900,7 @@
             <w:noProof/>
             <w:webHidden/>
           </w:rPr>
-          <w:instrText xml:space="preserve"> PAGEREF _Toc243545566 \h </w:instrText>
+          <w:instrText xml:space="preserve"> PAGEREF _Toc243546417 \h </w:instrText>
         </w:r>
         <w:r>
           <w:rPr>
@@ -1941,7 +1941,7 @@
           <w:noProof/>
         </w:rPr>
       </w:pPr>
-      <w:hyperlink w:anchor="_Toc243545567" w:history="1">
+      <w:hyperlink w:anchor="_Toc243546418" w:history="1">
         <w:r>
           <w:rPr>
             <w:rStyle w:val="Hyperlink"/>
@@ -1968,7 +1968,7 @@
             <w:noProof/>
             <w:webHidden/>
           </w:rPr>
-          <w:instrText xml:space="preserve"> PAGEREF _Toc243545567 \h </w:instrText>
+          <w:instrText xml:space="preserve"> PAGEREF _Toc243546418 \h </w:instrText>
         </w:r>
         <w:r>
           <w:rPr>
@@ -2009,7 +2009,7 @@
           <w:noProof/>
         </w:rPr>
       </w:pPr>
-      <w:hyperlink w:anchor="_Toc243545568" w:history="1">
+      <w:hyperlink w:anchor="_Toc243546419" w:history="1">
         <w:r>
           <w:rPr>
             <w:rStyle w:val="Hyperlink"/>
@@ -2036,7 +2036,7 @@
             <w:noProof/>
             <w:webHidden/>
           </w:rPr>
-          <w:instrText xml:space="preserve"> PAGEREF _Toc243545568 \h </w:instrText>
+          <w:instrText xml:space="preserve"> PAGEREF _Toc243546419 \h </w:instrText>
         </w:r>
         <w:r>
           <w:rPr>
@@ -2077,7 +2077,7 @@
           <w:noProof/>
         </w:rPr>
       </w:pPr>
-      <w:hyperlink w:anchor="_Toc243545569" w:history="1">
+      <w:hyperlink w:anchor="_Toc243546420" w:history="1">
         <w:r>
           <w:rPr>
             <w:rStyle w:val="Hyperlink"/>
@@ -2104,7 +2104,7 @@
             <w:noProof/>
             <w:webHidden/>
           </w:rPr>
-          <w:instrText xml:space="preserve"> PAGEREF _Toc243545569 \h </w:instrText>
+          <w:instrText xml:space="preserve"> PAGEREF _Toc243546420 \h </w:instrText>
         </w:r>
         <w:r>
           <w:rPr>
@@ -2145,7 +2145,7 @@
           <w:noProof/>
         </w:rPr>
       </w:pPr>
-      <w:hyperlink w:anchor="_Toc243545570" w:history="1">
+      <w:hyperlink w:anchor="_Toc243546421" w:history="1">
         <w:r>
           <w:rPr>
             <w:rStyle w:val="Hyperlink"/>
@@ -2172,7 +2172,7 @@
             <w:noProof/>
             <w:webHidden/>
           </w:rPr>
-          <w:instrText xml:space="preserve"> PAGEREF _Toc243545570 \h </w:instrText>
+          <w:instrText xml:space="preserve"> PAGEREF _Toc243546421 \h </w:instrText>
         </w:r>
         <w:r>
           <w:rPr>
@@ -2213,7 +2213,7 @@
           <w:noProof/>
         </w:rPr>
       </w:pPr>
-      <w:hyperlink w:anchor="_Toc243545571" w:history="1">
+      <w:hyperlink w:anchor="_Toc243546422" w:history="1">
         <w:r>
           <w:rPr>
             <w:rStyle w:val="Hyperlink"/>
@@ -2240,7 +2240,7 @@
             <w:noProof/>
             <w:webHidden/>
           </w:rPr>
-          <w:instrText xml:space="preserve"> PAGEREF _Toc243545571 \h </w:instrText>
+          <w:instrText xml:space="preserve"> PAGEREF _Toc243546422 \h </w:instrText>
         </w:r>
         <w:r>
           <w:rPr>
@@ -2281,7 +2281,7 @@
           <w:noProof/>
         </w:rPr>
       </w:pPr>
-      <w:hyperlink w:anchor="_Toc243545572" w:history="1">
+      <w:hyperlink w:anchor="_Toc243546423" w:history="1">
         <w:r>
           <w:rPr>
             <w:rStyle w:val="Hyperlink"/>
@@ -2308,7 +2308,7 @@
             <w:noProof/>
             <w:webHidden/>
           </w:rPr>
-          <w:instrText xml:space="preserve"> PAGEREF _Toc243545572 \h </w:instrText>
+          <w:instrText xml:space="preserve"> PAGEREF _Toc243546423 \h </w:instrText>
         </w:r>
         <w:r>
           <w:rPr>
@@ -2349,7 +2349,7 @@
           <w:noProof/>
         </w:rPr>
       </w:pPr>
-      <w:hyperlink w:anchor="_Toc243545573" w:history="1">
+      <w:hyperlink w:anchor="_Toc243546424" w:history="1">
         <w:r>
           <w:rPr>
             <w:rStyle w:val="Hyperlink"/>
@@ -2376,7 +2376,7 @@
             <w:noProof/>
             <w:webHidden/>
           </w:rPr>
-          <w:instrText xml:space="preserve"> PAGEREF _Toc243545573 \h </w:instrText>
+          <w:instrText xml:space="preserve"> PAGEREF _Toc243546424 \h </w:instrText>
         </w:r>
         <w:r>
           <w:rPr>
@@ -2417,7 +2417,7 @@
           <w:noProof/>
         </w:rPr>
       </w:pPr>
-      <w:hyperlink w:anchor="_Toc243545574" w:history="1">
+      <w:hyperlink w:anchor="_Toc243546425" w:history="1">
         <w:r>
           <w:rPr>
             <w:rStyle w:val="Hyperlink"/>
@@ -2444,7 +2444,7 @@
             <w:noProof/>
             <w:webHidden/>
           </w:rPr>
-          <w:instrText xml:space="preserve"> PAGEREF _Toc243545574 \h </w:instrText>
+          <w:instrText xml:space="preserve"> PAGEREF _Toc243546425 \h </w:instrText>
         </w:r>
         <w:r>
           <w:rPr>
@@ -2485,7 +2485,7 @@
           <w:noProof/>
         </w:rPr>
       </w:pPr>
-      <w:hyperlink w:anchor="_Toc243545575" w:history="1">
+      <w:hyperlink w:anchor="_Toc243546426" w:history="1">
         <w:r>
           <w:rPr>
             <w:rStyle w:val="Hyperlink"/>
@@ -2512,7 +2512,7 @@
             <w:noProof/>
             <w:webHidden/>
           </w:rPr>
-          <w:instrText xml:space="preserve"> PAGEREF _Toc243545575 \h </w:instrText>
+          <w:instrText xml:space="preserve"> PAGEREF _Toc243546426 \h </w:instrText>
         </w:r>
         <w:r>
           <w:rPr>
@@ -2553,7 +2553,7 @@
           <w:noProof/>
         </w:rPr>
       </w:pPr>
-      <w:hyperlink w:anchor="_Toc243545576" w:history="1">
+      <w:hyperlink w:anchor="_Toc243546427" w:history="1">
         <w:r>
           <w:rPr>
             <w:rStyle w:val="Hyperlink"/>
@@ -2580,7 +2580,7 @@
             <w:noProof/>
             <w:webHidden/>
           </w:rPr>
-          <w:instrText xml:space="preserve"> PAGEREF _Toc243545576 \h </w:instrText>
+          <w:instrText xml:space="preserve"> PAGEREF _Toc243546427 \h </w:instrText>
         </w:r>
         <w:r>
           <w:rPr>
@@ -2621,7 +2621,7 @@
           <w:noProof/>
         </w:rPr>
       </w:pPr>
-      <w:hyperlink w:anchor="_Toc243545577" w:history="1">
+      <w:hyperlink w:anchor="_Toc243546428" w:history="1">
         <w:r>
           <w:rPr>
             <w:rStyle w:val="Hyperlink"/>
@@ -2648,7 +2648,7 @@
             <w:noProof/>
             <w:webHidden/>
           </w:rPr>
-          <w:instrText xml:space="preserve"> PAGEREF _Toc243545577 \h </w:instrText>
+          <w:instrText xml:space="preserve"> PAGEREF _Toc243546428 \h </w:instrText>
         </w:r>
         <w:r>
           <w:rPr>
@@ -2689,7 +2689,7 @@
           <w:noProof/>
         </w:rPr>
       </w:pPr>
-      <w:hyperlink w:anchor="_Toc243545578" w:history="1">
+      <w:hyperlink w:anchor="_Toc243546429" w:history="1">
         <w:r>
           <w:rPr>
             <w:rStyle w:val="Hyperlink"/>
@@ -2716,7 +2716,7 @@
             <w:noProof/>
             <w:webHidden/>
           </w:rPr>
-          <w:instrText xml:space="preserve"> PAGEREF _Toc243545578 \h </w:instrText>
+          <w:instrText xml:space="preserve"> PAGEREF _Toc243546429 \h </w:instrText>
         </w:r>
         <w:r>
           <w:rPr>
@@ -2757,7 +2757,7 @@
           <w:noProof/>
         </w:rPr>
       </w:pPr>
-      <w:hyperlink w:anchor="_Toc243545579" w:history="1">
+      <w:hyperlink w:anchor="_Toc243546430" w:history="1">
         <w:r>
           <w:rPr>
             <w:rStyle w:val="Hyperlink"/>
@@ -2784,7 +2784,7 @@
             <w:noProof/>
             <w:webHidden/>
           </w:rPr>
-          <w:instrText xml:space="preserve"> PAGEREF _Toc243545579 \h </w:instrText>
+          <w:instrText xml:space="preserve"> PAGEREF _Toc243546430 \h </w:instrText>
         </w:r>
         <w:r>
           <w:rPr>
@@ -2825,7 +2825,7 @@
           <w:noProof/>
         </w:rPr>
       </w:pPr>
-      <w:hyperlink w:anchor="_Toc243545580" w:history="1">
+      <w:hyperlink w:anchor="_Toc243546431" w:history="1">
         <w:r>
           <w:rPr>
             <w:rStyle w:val="Hyperlink"/>
@@ -2852,7 +2852,7 @@
             <w:noProof/>
             <w:webHidden/>
           </w:rPr>
-          <w:instrText xml:space="preserve"> PAGEREF _Toc243545580 \h </w:instrText>
+          <w:instrText xml:space="preserve"> PAGEREF _Toc243546431 \h </w:instrText>
         </w:r>
         <w:r>
           <w:rPr>
@@ -2893,7 +2893,7 @@
           <w:noProof/>
         </w:rPr>
       </w:pPr>
-      <w:hyperlink w:anchor="_Toc243545581" w:history="1">
+      <w:hyperlink w:anchor="_Toc243546432" w:history="1">
         <w:r>
           <w:rPr>
             <w:rStyle w:val="Hyperlink"/>
@@ -2920,7 +2920,7 @@
             <w:noProof/>
             <w:webHidden/>
           </w:rPr>
-          <w:instrText xml:space="preserve"> PAGEREF _Toc243545581 \h </w:instrText>
+          <w:instrText xml:space="preserve"> PAGEREF _Toc243546432 \h </w:instrText>
         </w:r>
         <w:r>
           <w:rPr>
@@ -2961,7 +2961,7 @@
           <w:noProof/>
         </w:rPr>
       </w:pPr>
-      <w:hyperlink w:anchor="_Toc243545582" w:history="1">
+      <w:hyperlink w:anchor="_Toc243546433" w:history="1">
         <w:r>
           <w:rPr>
             <w:rStyle w:val="Hyperlink"/>
@@ -2988,7 +2988,7 @@
             <w:noProof/>
             <w:webHidden/>
           </w:rPr>
-          <w:instrText xml:space="preserve"> PAGEREF _Toc243545582 \h </w:instrText>
+          <w:instrText xml:space="preserve"> PAGEREF _Toc243546433 \h </w:instrText>
         </w:r>
         <w:r>
           <w:rPr>
@@ -3029,7 +3029,7 @@
           <w:noProof/>
         </w:rPr>
       </w:pPr>
-      <w:hyperlink w:anchor="_Toc243545583" w:history="1">
+      <w:hyperlink w:anchor="_Toc243546434" w:history="1">
         <w:r>
           <w:rPr>
             <w:rStyle w:val="Hyperlink"/>
@@ -3056,7 +3056,7 @@
             <w:noProof/>
             <w:webHidden/>
           </w:rPr>
-          <w:instrText xml:space="preserve"> PAGEREF _Toc243545583 \h </w:instrText>
+          <w:instrText xml:space="preserve"> PAGEREF _Toc243546434 \h </w:instrText>
         </w:r>
         <w:r>
           <w:rPr>
@@ -3097,7 +3097,7 @@
           <w:noProof/>
         </w:rPr>
       </w:pPr>
-      <w:hyperlink w:anchor="_Toc243545584" w:history="1">
+      <w:hyperlink w:anchor="_Toc243546435" w:history="1">
         <w:r>
           <w:rPr>
             <w:rStyle w:val="Hyperlink"/>
@@ -3124,7 +3124,7 @@
             <w:noProof/>
             <w:webHidden/>
           </w:rPr>
-          <w:instrText xml:space="preserve"> PAGEREF _Toc243545584 \h </w:instrText>
+          <w:instrText xml:space="preserve"> PAGEREF _Toc243546435 \h </w:instrText>
         </w:r>
         <w:r>
           <w:rPr>
@@ -3165,7 +3165,7 @@
           <w:noProof/>
         </w:rPr>
       </w:pPr>
-      <w:hyperlink w:anchor="_Toc243545585" w:history="1">
+      <w:hyperlink w:anchor="_Toc243546436" w:history="1">
         <w:r>
           <w:rPr>
             <w:rStyle w:val="Hyperlink"/>
@@ -3192,7 +3192,7 @@
             <w:noProof/>
             <w:webHidden/>
           </w:rPr>
-          <w:instrText xml:space="preserve"> PAGEREF _Toc243545585 \h </w:instrText>
+          <w:instrText xml:space="preserve"> PAGEREF _Toc243546436 \h </w:instrText>
         </w:r>
         <w:r>
           <w:rPr>
@@ -3233,7 +3233,7 @@
           <w:noProof/>
         </w:rPr>
       </w:pPr>
-      <w:hyperlink w:anchor="_Toc243545586" w:history="1">
+      <w:hyperlink w:anchor="_Toc243546437" w:history="1">
         <w:r>
           <w:rPr>
             <w:rStyle w:val="Hyperlink"/>
@@ -3260,7 +3260,7 @@
             <w:noProof/>
             <w:webHidden/>
           </w:rPr>
-          <w:instrText xml:space="preserve"> PAGEREF _Toc243545586 \h </w:instrText>
+          <w:instrText xml:space="preserve"> PAGEREF _Toc243546437 \h </w:instrText>
         </w:r>
         <w:r>
           <w:rPr>
@@ -3301,7 +3301,7 @@
           <w:noProof/>
         </w:rPr>
       </w:pPr>
-      <w:hyperlink w:anchor="_Toc243545587" w:history="1">
+      <w:hyperlink w:anchor="_Toc243546438" w:history="1">
         <w:r>
           <w:rPr>
             <w:rStyle w:val="Hyperlink"/>
@@ -3328,7 +3328,7 @@
             <w:noProof/>
             <w:webHidden/>
           </w:rPr>
-          <w:instrText xml:space="preserve"> PAGEREF _Toc243545587 \h </w:instrText>
+          <w:instrText xml:space="preserve"> PAGEREF _Toc243546438 \h </w:instrText>
         </w:r>
         <w:r>
           <w:rPr>
@@ -3369,7 +3369,7 @@
           <w:noProof/>
         </w:rPr>
       </w:pPr>
-      <w:hyperlink w:anchor="_Toc243545588" w:history="1">
+      <w:hyperlink w:anchor="_Toc243546439" w:history="1">
         <w:r>
           <w:rPr>
             <w:rStyle w:val="Hyperlink"/>
@@ -3396,7 +3396,7 @@
             <w:noProof/>
             <w:webHidden/>
           </w:rPr>
-          <w:instrText xml:space="preserve"> PAGEREF _Toc243545588 \h </w:instrText>
+          <w:instrText xml:space="preserve"> PAGEREF _Toc243546439 \h </w:instrText>
         </w:r>
         <w:r>
           <w:rPr>
@@ -3437,7 +3437,7 @@
           <w:noProof/>
         </w:rPr>
       </w:pPr>
-      <w:hyperlink w:anchor="_Toc243545589" w:history="1">
+      <w:hyperlink w:anchor="_Toc243546440" w:history="1">
         <w:r>
           <w:rPr>
             <w:rStyle w:val="Hyperlink"/>
@@ -3464,7 +3464,7 @@
             <w:noProof/>
             <w:webHidden/>
           </w:rPr>
-          <w:instrText xml:space="preserve"> PAGEREF _Toc243545589 \h </w:instrText>
+          <w:instrText xml:space="preserve"> PAGEREF _Toc243546440 \h </w:instrText>
         </w:r>
         <w:r>
           <w:rPr>
@@ -3505,7 +3505,7 @@
           <w:noProof/>
         </w:rPr>
       </w:pPr>
-      <w:hyperlink w:anchor="_Toc243545590" w:history="1">
+      <w:hyperlink w:anchor="_Toc243546441" w:history="1">
         <w:r>
           <w:rPr>
             <w:rStyle w:val="Hyperlink"/>
@@ -3532,7 +3532,7 @@
             <w:noProof/>
             <w:webHidden/>
           </w:rPr>
-          <w:instrText xml:space="preserve"> PAGEREF _Toc243545590 \h </w:instrText>
+          <w:instrText xml:space="preserve"> PAGEREF _Toc243546441 \h </w:instrText>
         </w:r>
         <w:r>
           <w:rPr>
@@ -3573,7 +3573,7 @@
           <w:noProof/>
         </w:rPr>
       </w:pPr>
-      <w:hyperlink w:anchor="_Toc243545591" w:history="1">
+      <w:hyperlink w:anchor="_Toc243546442" w:history="1">
         <w:r>
           <w:rPr>
             <w:rStyle w:val="Hyperlink"/>
@@ -3600,7 +3600,7 @@
             <w:noProof/>
             <w:webHidden/>
           </w:rPr>
-          <w:instrText xml:space="preserve"> PAGEREF _Toc243545591 \h </w:instrText>
+          <w:instrText xml:space="preserve"> PAGEREF _Toc243546442 \h </w:instrText>
         </w:r>
         <w:r>
           <w:rPr>
@@ -3641,7 +3641,7 @@
           <w:noProof/>
         </w:rPr>
       </w:pPr>
-      <w:hyperlink w:anchor="_Toc243545592" w:history="1">
+      <w:hyperlink w:anchor="_Toc243546443" w:history="1">
         <w:r>
           <w:rPr>
             <w:rStyle w:val="Hyperlink"/>
@@ -3668,7 +3668,7 @@
             <w:noProof/>
             <w:webHidden/>
           </w:rPr>
-          <w:instrText xml:space="preserve"> PAGEREF _Toc243545592 \h </w:instrText>
+          <w:instrText xml:space="preserve"> PAGEREF _Toc243546443 \h </w:instrText>
         </w:r>
         <w:r>
           <w:rPr>
@@ -3709,7 +3709,7 @@
           <w:noProof/>
         </w:rPr>
       </w:pPr>
-      <w:hyperlink w:anchor="_Toc243545593" w:history="1">
+      <w:hyperlink w:anchor="_Toc243546444" w:history="1">
         <w:r>
           <w:rPr>
             <w:rStyle w:val="Hyperlink"/>
@@ -3736,7 +3736,7 @@
             <w:noProof/>
             <w:webHidden/>
           </w:rPr>
-          <w:instrText xml:space="preserve"> PAGEREF _Toc243545593 \h </w:instrText>
+          <w:instrText xml:space="preserve"> PAGEREF _Toc243546444 \h </w:instrText>
         </w:r>
         <w:r>
           <w:rPr>
@@ -3777,7 +3777,7 @@
           <w:noProof/>
         </w:rPr>
       </w:pPr>
-      <w:hyperlink w:anchor="_Toc243545594" w:history="1">
+      <w:hyperlink w:anchor="_Toc243546445" w:history="1">
         <w:r>
           <w:rPr>
             <w:rStyle w:val="Hyperlink"/>
@@ -3804,7 +3804,7 @@
             <w:noProof/>
             <w:webHidden/>
           </w:rPr>
-          <w:instrText xml:space="preserve"> PAGEREF _Toc243545594 \h </w:instrText>
+          <w:instrText xml:space="preserve"> PAGEREF _Toc243546445 \h </w:instrText>
         </w:r>
         <w:r>
           <w:rPr>
@@ -3845,7 +3845,7 @@
           <w:noProof/>
         </w:rPr>
       </w:pPr>
-      <w:hyperlink w:anchor="_Toc243545595" w:history="1">
+      <w:hyperlink w:anchor="_Toc243546446" w:history="1">
         <w:r>
           <w:rPr>
             <w:rStyle w:val="Hyperlink"/>
@@ -3872,7 +3872,7 @@
             <w:noProof/>
             <w:webHidden/>
           </w:rPr>
-          <w:instrText xml:space="preserve"> PAGEREF _Toc243545595 \h </w:instrText>
+          <w:instrText xml:space="preserve"> PAGEREF _Toc243546446 \h </w:instrText>
         </w:r>
         <w:r>
           <w:rPr>
@@ -3913,7 +3913,7 @@
           <w:noProof/>
         </w:rPr>
       </w:pPr>
-      <w:hyperlink w:anchor="_Toc243545596" w:history="1">
+      <w:hyperlink w:anchor="_Toc243546447" w:history="1">
         <w:r>
           <w:rPr>
             <w:rStyle w:val="Hyperlink"/>
@@ -3940,7 +3940,7 @@
             <w:noProof/>
             <w:webHidden/>
           </w:rPr>
-          <w:instrText xml:space="preserve"> PAGEREF _Toc243545596 \h </w:instrText>
+          <w:instrText xml:space="preserve"> PAGEREF _Toc243546447 \h </w:instrText>
         </w:r>
         <w:r>
           <w:rPr>
@@ -3981,7 +3981,7 @@
           <w:noProof/>
         </w:rPr>
       </w:pPr>
-      <w:hyperlink w:anchor="_Toc243545597" w:history="1">
+      <w:hyperlink w:anchor="_Toc243546448" w:history="1">
         <w:r>
           <w:rPr>
             <w:rStyle w:val="Hyperlink"/>
@@ -4008,7 +4008,7 @@
             <w:noProof/>
             <w:webHidden/>
           </w:rPr>
-          <w:instrText xml:space="preserve"> PAGEREF _Toc243545597 \h </w:instrText>
+          <w:instrText xml:space="preserve"> PAGEREF _Toc243546448 \h </w:instrText>
         </w:r>
         <w:r>
           <w:rPr>
@@ -4049,7 +4049,7 @@
           <w:noProof/>
         </w:rPr>
       </w:pPr>
-      <w:hyperlink w:anchor="_Toc243545598" w:history="1">
+      <w:hyperlink w:anchor="_Toc243546449" w:history="1">
         <w:r>
           <w:rPr>
             <w:rStyle w:val="Hyperlink"/>
@@ -4076,7 +4076,7 @@
             <w:noProof/>
             <w:webHidden/>
           </w:rPr>
-          <w:instrText xml:space="preserve"> PAGEREF _Toc243545598 \h </w:instrText>
+          <w:instrText xml:space="preserve"> PAGEREF _Toc243546449 \h </w:instrText>
         </w:r>
         <w:r>
           <w:rPr>
@@ -4117,7 +4117,7 @@
           <w:noProof/>
         </w:rPr>
       </w:pPr>
-      <w:hyperlink w:anchor="_Toc243545599" w:history="1">
+      <w:hyperlink w:anchor="_Toc243546450" w:history="1">
         <w:r>
           <w:rPr>
             <w:rStyle w:val="Hyperlink"/>
@@ -4144,7 +4144,7 @@
             <w:noProof/>
             <w:webHidden/>
           </w:rPr>
-          <w:instrText xml:space="preserve"> PAGEREF _Toc243545599 \h </w:instrText>
+          <w:instrText xml:space="preserve"> PAGEREF _Toc243546450 \h </w:instrText>
         </w:r>
         <w:r>
           <w:rPr>
@@ -4185,7 +4185,7 @@
           <w:noProof/>
         </w:rPr>
       </w:pPr>
-      <w:hyperlink w:anchor="_Toc243545600" w:history="1">
+      <w:hyperlink w:anchor="_Toc243546451" w:history="1">
         <w:r>
           <w:rPr>
             <w:rStyle w:val="Hyperlink"/>
@@ -4212,7 +4212,7 @@
             <w:noProof/>
             <w:webHidden/>
           </w:rPr>
-          <w:instrText xml:space="preserve"> PAGEREF _Toc243545600 \h </w:instrText>
+          <w:instrText xml:space="preserve"> PAGEREF _Toc243546451 \h </w:instrText>
         </w:r>
         <w:r>
           <w:rPr>
@@ -4253,7 +4253,7 @@
           <w:noProof/>
         </w:rPr>
       </w:pPr>
-      <w:hyperlink w:anchor="_Toc243545601" w:history="1">
+      <w:hyperlink w:anchor="_Toc243546452" w:history="1">
         <w:r>
           <w:rPr>
             <w:rStyle w:val="Hyperlink"/>
@@ -4280,7 +4280,7 @@
             <w:noProof/>
             <w:webHidden/>
           </w:rPr>
-          <w:instrText xml:space="preserve"> PAGEREF _Toc243545601 \h </w:instrText>
+          <w:instrText xml:space="preserve"> PAGEREF _Toc243546452 \h </w:instrText>
         </w:r>
         <w:r>
           <w:rPr>
@@ -4321,7 +4321,7 @@
           <w:noProof/>
         </w:rPr>
       </w:pPr>
-      <w:hyperlink w:anchor="_Toc243545602" w:history="1">
+      <w:hyperlink w:anchor="_Toc243546453" w:history="1">
         <w:r>
           <w:rPr>
             <w:rStyle w:val="Hyperlink"/>
@@ -4348,7 +4348,7 @@
             <w:noProof/>
             <w:webHidden/>
           </w:rPr>
-          <w:instrText xml:space="preserve"> PAGEREF _Toc243545602 \h </w:instrText>
+          <w:instrText xml:space="preserve"> PAGEREF _Toc243546453 \h </w:instrText>
         </w:r>
         <w:r>
           <w:rPr>
@@ -4389,7 +4389,7 @@
           <w:noProof/>
         </w:rPr>
       </w:pPr>
-      <w:hyperlink w:anchor="_Toc243545603" w:history="1">
+      <w:hyperlink w:anchor="_Toc243546454" w:history="1">
         <w:r>
           <w:rPr>
             <w:rStyle w:val="Hyperlink"/>
@@ -4416,7 +4416,7 @@
             <w:noProof/>
             <w:webHidden/>
           </w:rPr>
-          <w:instrText xml:space="preserve"> PAGEREF _Toc243545603 \h </w:instrText>
+          <w:instrText xml:space="preserve"> PAGEREF _Toc243546454 \h </w:instrText>
         </w:r>
         <w:r>
           <w:rPr>
@@ -4457,7 +4457,7 @@
           <w:noProof/>
         </w:rPr>
       </w:pPr>
-      <w:hyperlink w:anchor="_Toc243545604" w:history="1">
+      <w:hyperlink w:anchor="_Toc243546455" w:history="1">
         <w:r>
           <w:rPr>
             <w:rStyle w:val="Hyperlink"/>
@@ -4484,7 +4484,7 @@
             <w:noProof/>
             <w:webHidden/>
           </w:rPr>
-          <w:instrText xml:space="preserve"> PAGEREF _Toc243545604 \h </w:instrText>
+          <w:instrText xml:space="preserve"> PAGEREF _Toc243546455 \h </w:instrText>
         </w:r>
         <w:r>
           <w:rPr>
@@ -4525,7 +4525,7 @@
           <w:noProof/>
         </w:rPr>
       </w:pPr>
-      <w:hyperlink w:anchor="_Toc243545605" w:history="1">
+      <w:hyperlink w:anchor="_Toc243546456" w:history="1">
         <w:r>
           <w:rPr>
             <w:rStyle w:val="Hyperlink"/>
@@ -4552,7 +4552,7 @@
             <w:noProof/>
             <w:webHidden/>
           </w:rPr>
-          <w:instrText xml:space="preserve"> PAGEREF _Toc243545605 \h </w:instrText>
+          <w:instrText xml:space="preserve"> PAGEREF _Toc243546456 \h </w:instrText>
         </w:r>
         <w:r>
           <w:rPr>
@@ -4593,7 +4593,7 @@
           <w:noProof/>
         </w:rPr>
       </w:pPr>
-      <w:hyperlink w:anchor="_Toc243545606" w:history="1">
+      <w:hyperlink w:anchor="_Toc243546457" w:history="1">
         <w:r>
           <w:rPr>
             <w:rStyle w:val="Hyperlink"/>
@@ -4620,7 +4620,7 @@
             <w:noProof/>
             <w:webHidden/>
           </w:rPr>
-          <w:instrText xml:space="preserve"> PAGEREF _Toc243545606 \h </w:instrText>
+          <w:instrText xml:space="preserve"> PAGEREF _Toc243546457 \h </w:instrText>
         </w:r>
         <w:r>
           <w:rPr>
@@ -4661,7 +4661,7 @@
           <w:noProof/>
         </w:rPr>
       </w:pPr>
-      <w:hyperlink w:anchor="_Toc243545607" w:history="1">
+      <w:hyperlink w:anchor="_Toc243546458" w:history="1">
         <w:r>
           <w:rPr>
             <w:rStyle w:val="Hyperlink"/>
@@ -4688,7 +4688,7 @@
             <w:noProof/>
             <w:webHidden/>
           </w:rPr>
-          <w:instrText xml:space="preserve"> PAGEREF _Toc243545607 \h </w:instrText>
+          <w:instrText xml:space="preserve"> PAGEREF _Toc243546458 \h </w:instrText>
         </w:r>
         <w:r>
           <w:rPr>
@@ -4729,7 +4729,7 @@
           <w:noProof/>
         </w:rPr>
       </w:pPr>
-      <w:hyperlink w:anchor="_Toc243545608" w:history="1">
+      <w:hyperlink w:anchor="_Toc243546459" w:history="1">
         <w:r>
           <w:rPr>
             <w:rStyle w:val="Hyperlink"/>
@@ -4756,7 +4756,7 @@
             <w:noProof/>
             <w:webHidden/>
           </w:rPr>
-          <w:instrText xml:space="preserve"> PAGEREF _Toc243545608 \h </w:instrText>
+          <w:instrText xml:space="preserve"> PAGEREF _Toc243546459 \h </w:instrText>
         </w:r>
         <w:r>
           <w:rPr>
@@ -4797,7 +4797,7 @@
           <w:noProof/>
         </w:rPr>
       </w:pPr>
-      <w:hyperlink w:anchor="_Toc243545609" w:history="1">
+      <w:hyperlink w:anchor="_Toc243546460" w:history="1">
         <w:r>
           <w:rPr>
             <w:rStyle w:val="Hyperlink"/>
@@ -4824,7 +4824,7 @@
             <w:noProof/>
             <w:webHidden/>
           </w:rPr>
-          <w:instrText xml:space="preserve"> PAGEREF _Toc243545609 \h </w:instrText>
+          <w:instrText xml:space="preserve"> PAGEREF _Toc243546460 \h </w:instrText>
         </w:r>
         <w:r>
           <w:rPr>
@@ -4865,7 +4865,7 @@
           <w:noProof/>
         </w:rPr>
       </w:pPr>
-      <w:hyperlink w:anchor="_Toc243545610" w:history="1">
+      <w:hyperlink w:anchor="_Toc243546461" w:history="1">
         <w:r>
           <w:rPr>
             <w:rStyle w:val="Hyperlink"/>
@@ -4892,7 +4892,7 @@
             <w:noProof/>
             <w:webHidden/>
           </w:rPr>
-          <w:instrText xml:space="preserve"> PAGEREF _Toc243545610 \h </w:instrText>
+          <w:instrText xml:space="preserve"> PAGEREF _Toc243546461 \h </w:instrText>
         </w:r>
         <w:r>
           <w:rPr>
@@ -4933,7 +4933,7 @@
           <w:noProof/>
         </w:rPr>
       </w:pPr>
-      <w:hyperlink w:anchor="_Toc243545611" w:history="1">
+      <w:hyperlink w:anchor="_Toc243546462" w:history="1">
         <w:r>
           <w:rPr>
             <w:rStyle w:val="Hyperlink"/>
@@ -4960,7 +4960,7 @@
             <w:noProof/>
             <w:webHidden/>
           </w:rPr>
-          <w:instrText xml:space="preserve"> PAGEREF _Toc243545611 \h </w:instrText>
+          <w:instrText xml:space="preserve"> PAGEREF _Toc243546462 \h </w:instrText>
         </w:r>
         <w:r>
           <w:rPr>
@@ -5001,7 +5001,7 @@
           <w:noProof/>
         </w:rPr>
       </w:pPr>
-      <w:hyperlink w:anchor="_Toc243545612" w:history="1">
+      <w:hyperlink w:anchor="_Toc243546463" w:history="1">
         <w:r>
           <w:rPr>
             <w:rStyle w:val="Hyperlink"/>
@@ -5028,7 +5028,7 @@
             <w:noProof/>
             <w:webHidden/>
           </w:rPr>
-          <w:instrText xml:space="preserve"> PAGEREF _Toc243545612 \h </w:instrText>
+          <w:instrText xml:space="preserve"> PAGEREF _Toc243546463 \h </w:instrText>
         </w:r>
         <w:r>
           <w:rPr>
@@ -5069,7 +5069,7 @@
         <w:pStyle w:val="Heading1"/>
         <w:pageBreakBefore/>
       </w:pPr>
-      <w:bookmarkStart w:id="0" w:name="_Toc243545546"/>
+      <w:bookmarkStart w:id="0" w:name="_Toc243546397"/>
       <w:r>
         <w:lastRenderedPageBreak/>
         <w:t>How to Use This Document</w:t>
@@ -5403,7 +5403,7 @@
         <w:pStyle w:val="Heading1"/>
         <w:pageBreakBefore/>
       </w:pPr>
-      <w:bookmarkStart w:id="1" w:name="_Toc243545547"/>
+      <w:bookmarkStart w:id="1" w:name="_Toc243546398"/>
       <w:r>
         <w:lastRenderedPageBreak/>
         <w:t>1. Abstract</w:t>
@@ -5457,7 +5457,7 @@
       <w:pPr>
         <w:pStyle w:val="Heading1"/>
       </w:pPr>
-      <w:bookmarkStart w:id="2" w:name="_Toc243545548"/>
+      <w:bookmarkStart w:id="2" w:name="_Toc243546399"/>
       <w:r>
         <w:t>2. Introduction</w:t>
       </w:r>
@@ -5487,7 +5487,7 @@
       <w:pPr>
         <w:pStyle w:val="Heading2"/>
       </w:pPr>
-      <w:bookmarkStart w:id="3" w:name="_Toc243545549"/>
+      <w:bookmarkStart w:id="3" w:name="_Toc243546400"/>
       <w:r>
         <w:t>2.1 Home Assistant</w:t>
       </w:r>
@@ -5539,7 +5539,7 @@
       <w:pPr>
         <w:pStyle w:val="Heading2"/>
       </w:pPr>
-      <w:bookmarkStart w:id="4" w:name="_Toc243545550"/>
+      <w:bookmarkStart w:id="4" w:name="_Toc243546401"/>
       <w:r>
         <w:t>2.2 Literature survey</w:t>
       </w:r>
@@ -6024,7 +6024,7 @@
       <w:pPr>
         <w:pStyle w:val="Heading1"/>
       </w:pPr>
-      <w:bookmarkStart w:id="5" w:name="_Toc243545551"/>
+      <w:bookmarkStart w:id="5" w:name="_Toc243546402"/>
       <w:r>
         <w:t>3. Problem Statement</w:t>
       </w:r>
@@ -6137,7 +6137,7 @@
       <w:pPr>
         <w:pStyle w:val="Heading1"/>
       </w:pPr>
-      <w:bookmarkStart w:id="6" w:name="_Toc243545552"/>
+      <w:bookmarkStart w:id="6" w:name="_Toc243546403"/>
       <w:r>
         <w:lastRenderedPageBreak/>
         <w:t>4. Objectives</w:t>
@@ -6278,7 +6278,7 @@
       <w:pPr>
         <w:pStyle w:val="Heading1"/>
       </w:pPr>
-      <w:bookmarkStart w:id="7" w:name="_Toc243545553"/>
+      <w:bookmarkStart w:id="7" w:name="_Toc243546404"/>
       <w:r>
         <w:t>5. Existing Systems and Their Limitations</w:t>
       </w:r>
@@ -6547,7 +6547,7 @@
       <w:pPr>
         <w:pStyle w:val="Heading2"/>
       </w:pPr>
-      <w:bookmarkStart w:id="8" w:name="_Toc243545554"/>
+      <w:bookmarkStart w:id="8" w:name="_Toc243546405"/>
       <w:r>
         <w:t>5.1 Why the MQTT approach was rejected</w:t>
       </w:r>
@@ -6585,7 +6585,7 @@
       <w:pPr>
         <w:pStyle w:val="Heading2"/>
       </w:pPr>
-      <w:bookmarkStart w:id="9" w:name="_Toc243545555"/>
+      <w:bookmarkStart w:id="9" w:name="_Toc243546406"/>
       <w:r>
         <w:t>5.2 The three designs the project went through</w:t>
       </w:r>
@@ -6916,7 +6916,7 @@
       <w:pPr>
         <w:pStyle w:val="Heading1"/>
       </w:pPr>
-      <w:bookmarkStart w:id="10" w:name="_Toc243545556"/>
+      <w:bookmarkStart w:id="10" w:name="_Toc243546407"/>
       <w:r>
         <w:t>6. Proposed System</w:t>
       </w:r>
@@ -6994,7 +6994,7 @@
       <w:pPr>
         <w:pStyle w:val="Heading2"/>
       </w:pPr>
-      <w:bookmarkStart w:id="11" w:name="_Toc243545557"/>
+      <w:bookmarkStart w:id="11" w:name="_Toc243546408"/>
       <w:r>
         <w:t>6.1 The memory constraint and the split architecture</w:t>
       </w:r>
@@ -7098,7 +7098,7 @@
       <w:pPr>
         <w:pStyle w:val="Heading2"/>
       </w:pPr>
-      <w:bookmarkStart w:id="12" w:name="_Toc243545558"/>
+      <w:bookmarkStart w:id="12" w:name="_Toc243546409"/>
       <w:r>
         <w:lastRenderedPageBreak/>
         <w:t>6.2 The layout is data, not code</w:t>
@@ -7265,7 +7265,7 @@
         <w:pStyle w:val="Heading1"/>
         <w:pageBreakBefore/>
       </w:pPr>
-      <w:bookmarkStart w:id="13" w:name="_Toc243545559"/>
+      <w:bookmarkStart w:id="13" w:name="_Toc243546410"/>
       <w:r>
         <w:lastRenderedPageBreak/>
         <w:t>7. System Architecture</w:t>
@@ -7281,7 +7281,7 @@
       <w:pPr>
         <w:pStyle w:val="Heading2"/>
       </w:pPr>
-      <w:bookmarkStart w:id="14" w:name="_Toc243545560"/>
+      <w:bookmarkStart w:id="14" w:name="_Toc243546411"/>
       <w:r>
         <w:t>7.1 Overall system diagram</w:t>
       </w:r>
@@ -7298,7 +7298,7 @@
           <w:noProof/>
         </w:rPr>
         <w:drawing>
-          <wp:inline distT="0" distB="0" distL="0" distR="0" wp14:anchorId="5BAEB19D" wp14:editId="57E0B13F">
+          <wp:inline distT="0" distB="0" distL="0" distR="0" wp14:anchorId="431F916D" wp14:editId="2D1ACBA7">
             <wp:extent cx="5760000" cy="3246545"/>
             <wp:effectExtent l="0" t="0" r="0" b="0"/>
             <wp:docPr id="1" name="Picture 1"/>
@@ -7391,7 +7391,7 @@
       <w:pPr>
         <w:pStyle w:val="Heading2"/>
       </w:pPr>
-      <w:bookmarkStart w:id="15" w:name="_Toc243545561"/>
+      <w:bookmarkStart w:id="15" w:name="_Toc243546412"/>
       <w:r>
         <w:lastRenderedPageBreak/>
         <w:t>7.2 Hardware diagram</w:t>
@@ -7409,7 +7409,7 @@
           <w:noProof/>
         </w:rPr>
         <w:drawing>
-          <wp:inline distT="0" distB="0" distL="0" distR="0" wp14:anchorId="61FC963A" wp14:editId="321C0ED4">
+          <wp:inline distT="0" distB="0" distL="0" distR="0" wp14:anchorId="7803A353" wp14:editId="3E9DA94E">
             <wp:extent cx="5580000" cy="3195818"/>
             <wp:effectExtent l="0" t="0" r="0" b="0"/>
             <wp:docPr id="2" name="Picture 2"/>
@@ -7475,7 +7475,7 @@
       <w:pPr>
         <w:pStyle w:val="Heading2"/>
       </w:pPr>
-      <w:bookmarkStart w:id="16" w:name="_Toc243545562"/>
+      <w:bookmarkStart w:id="16" w:name="_Toc243546413"/>
       <w:r>
         <w:t>7.3 Software diagram</w:t>
       </w:r>
@@ -7492,7 +7492,7 @@
           <w:noProof/>
         </w:rPr>
         <w:drawing>
-          <wp:inline distT="0" distB="0" distL="0" distR="0" wp14:anchorId="7971BA19" wp14:editId="1AFD3E2E">
+          <wp:inline distT="0" distB="0" distL="0" distR="0" wp14:anchorId="4174DC71" wp14:editId="3B39C35A">
             <wp:extent cx="5760000" cy="3015000"/>
             <wp:effectExtent l="0" t="0" r="0" b="0"/>
             <wp:docPr id="3" name="Picture 3"/>
@@ -7562,7 +7562,7 @@
       <w:pPr>
         <w:pStyle w:val="Heading2"/>
       </w:pPr>
-      <w:bookmarkStart w:id="17" w:name="_Toc243545563"/>
+      <w:bookmarkStart w:id="17" w:name="_Toc243546414"/>
       <w:r>
         <w:t>7.4 Block diagram</w:t>
       </w:r>
@@ -7579,7 +7579,7 @@
           <w:noProof/>
         </w:rPr>
         <w:drawing>
-          <wp:inline distT="0" distB="0" distL="0" distR="0" wp14:anchorId="0047302C" wp14:editId="460FCA12">
+          <wp:inline distT="0" distB="0" distL="0" distR="0" wp14:anchorId="3208278B" wp14:editId="7DE1BCC9">
             <wp:extent cx="5760000" cy="2625488"/>
             <wp:effectExtent l="0" t="0" r="0" b="0"/>
             <wp:docPr id="4" name="Picture 4"/>
@@ -7641,7 +7641,7 @@
         <w:pStyle w:val="Heading1"/>
         <w:pageBreakBefore/>
       </w:pPr>
-      <w:bookmarkStart w:id="18" w:name="_Toc243545564"/>
+      <w:bookmarkStart w:id="18" w:name="_Toc243546415"/>
       <w:r>
         <w:lastRenderedPageBreak/>
         <w:t>8. Hardware Description</w:t>
@@ -7666,7 +7666,7 @@
       <w:pPr>
         <w:pStyle w:val="Heading2"/>
       </w:pPr>
-      <w:bookmarkStart w:id="19" w:name="_Toc243545565"/>
+      <w:bookmarkStart w:id="19" w:name="_Toc243546416"/>
       <w:r>
         <w:t>8.1 Components</w:t>
       </w:r>
@@ -8170,7 +8170,7 @@
       <w:pPr>
         <w:pStyle w:val="Heading2"/>
       </w:pPr>
-      <w:bookmarkStart w:id="20" w:name="_Toc243545566"/>
+      <w:bookmarkStart w:id="20" w:name="_Toc243546417"/>
       <w:r>
         <w:t>8.2 Pin assignment</w:t>
       </w:r>
@@ -8942,7 +8942,7 @@
       <w:pPr>
         <w:pStyle w:val="Heading2"/>
       </w:pPr>
-      <w:bookmarkStart w:id="21" w:name="_Toc243545567"/>
+      <w:bookmarkStart w:id="21" w:name="_Toc243546418"/>
       <w:r>
         <w:t>8.3 Batch variation in this board family</w:t>
       </w:r>
@@ -9177,7 +9177,7 @@
         <w:pStyle w:val="Heading1"/>
         <w:pageBreakBefore/>
       </w:pPr>
-      <w:bookmarkStart w:id="22" w:name="_Toc243545568"/>
+      <w:bookmarkStart w:id="22" w:name="_Toc243546419"/>
       <w:r>
         <w:lastRenderedPageBreak/>
         <w:t>9. Software Description</w:t>
@@ -9188,7 +9188,7 @@
       <w:pPr>
         <w:pStyle w:val="Heading2"/>
       </w:pPr>
-      <w:bookmarkStart w:id="23" w:name="_Toc243545569"/>
+      <w:bookmarkStart w:id="23" w:name="_Toc243546420"/>
       <w:r>
         <w:t>9.1 Panel firmware: environment and libraries</w:t>
       </w:r>
@@ -9869,7 +9869,7 @@
       <w:pPr>
         <w:pStyle w:val="Heading2"/>
       </w:pPr>
-      <w:bookmarkStart w:id="24" w:name="_Toc243545570"/>
+      <w:bookmarkStart w:id="24" w:name="_Toc243546421"/>
       <w:r>
         <w:t>9.2 Desktop designer: environment and libraries</w:t>
       </w:r>
@@ -10295,7 +10295,7 @@
       <w:pPr>
         <w:pStyle w:val="Heading2"/>
       </w:pPr>
-      <w:bookmarkStart w:id="25" w:name="_Toc243545571"/>
+      <w:bookmarkStart w:id="25" w:name="_Toc243546422"/>
       <w:r>
         <w:t>9.3 Source code organisation</w:t>
       </w:r>
@@ -10992,7 +10992,7 @@
       <w:pPr>
         <w:pStyle w:val="Heading2"/>
       </w:pPr>
-      <w:bookmarkStart w:id="26" w:name="_Toc243545572"/>
+      <w:bookmarkStart w:id="26" w:name="_Toc243546423"/>
       <w:r>
         <w:t>9.4 The transport interface</w:t>
       </w:r>
@@ -11216,7 +11216,7 @@
         <w:pStyle w:val="Heading1"/>
         <w:pageBreakBefore/>
       </w:pPr>
-      <w:bookmarkStart w:id="27" w:name="_Toc243545573"/>
+      <w:bookmarkStart w:id="27" w:name="_Toc243546424"/>
       <w:r>
         <w:lastRenderedPageBreak/>
         <w:t>10. Implementation</w:t>
@@ -11227,7 +11227,7 @@
       <w:pPr>
         <w:pStyle w:val="Heading2"/>
       </w:pPr>
-      <w:bookmarkStart w:id="28" w:name="_Toc243545574"/>
+      <w:bookmarkStart w:id="28" w:name="_Toc243546425"/>
       <w:r>
         <w:t>10.1 The communication protocol</w:t>
       </w:r>
@@ -11476,7 +11476,7 @@
           <w:noProof/>
         </w:rPr>
         <w:drawing>
-          <wp:inline distT="0" distB="0" distL="0" distR="0" wp14:anchorId="66C7F652" wp14:editId="20419197">
+          <wp:inline distT="0" distB="0" distL="0" distR="0" wp14:anchorId="58145B30" wp14:editId="1FFB1722">
             <wp:extent cx="3240000" cy="3536229"/>
             <wp:effectExtent l="0" t="0" r="0" b="0"/>
             <wp:docPr id="5" name="Picture 5"/>
@@ -11548,7 +11548,7 @@
       <w:pPr>
         <w:pStyle w:val="Heading2"/>
       </w:pPr>
-      <w:bookmarkStart w:id="29" w:name="_Toc243545575"/>
+      <w:bookmarkStart w:id="29" w:name="_Toc243546426"/>
       <w:r>
         <w:lastRenderedPageBreak/>
         <w:t>10.2 Task structure and interface responsiveness</w:t>
@@ -11643,7 +11643,7 @@
       <w:pPr>
         <w:pStyle w:val="Heading2"/>
       </w:pPr>
-      <w:bookmarkStart w:id="30" w:name="_Toc243545576"/>
+      <w:bookmarkStart w:id="30" w:name="_Toc243546427"/>
       <w:r>
         <w:t>10.3 Memory strategy</w:t>
       </w:r>
@@ -11748,7 +11748,7 @@
       <w:pPr>
         <w:pStyle w:val="Heading2"/>
       </w:pPr>
-      <w:bookmarkStart w:id="31" w:name="_Toc243545577"/>
+      <w:bookmarkStart w:id="31" w:name="_Toc243546428"/>
       <w:r>
         <w:t>10.4 Touch coordinate handling</w:t>
       </w:r>
@@ -11763,7 +11763,7 @@
       <w:pPr>
         <w:pStyle w:val="Heading2"/>
       </w:pPr>
-      <w:bookmarkStart w:id="32" w:name="_Toc243545578"/>
+      <w:bookmarkStart w:id="32" w:name="_Toc243546429"/>
       <w:r>
         <w:t>10.5 Receiving and storing a layout</w:t>
       </w:r>
@@ -11889,7 +11889,7 @@
       <w:pPr>
         <w:pStyle w:val="Heading2"/>
       </w:pPr>
-      <w:bookmarkStart w:id="33" w:name="_Toc243545579"/>
+      <w:bookmarkStart w:id="33" w:name="_Toc243546430"/>
       <w:r>
         <w:t>10.6 The user interface</w:t>
       </w:r>
@@ -11911,7 +11911,7 @@
           <w:noProof/>
         </w:rPr>
         <w:drawing>
-          <wp:inline distT="0" distB="0" distL="0" distR="0" wp14:anchorId="0E7B139E" wp14:editId="22AC4BFF">
+          <wp:inline distT="0" distB="0" distL="0" distR="0" wp14:anchorId="7EB32CE5" wp14:editId="3ACE3A36">
             <wp:extent cx="5400000" cy="2006192"/>
             <wp:effectExtent l="0" t="0" r="0" b="0"/>
             <wp:docPr id="6" name="Picture 6"/>
@@ -12095,7 +12095,7 @@
         </w:rPr>
         <w:lastRenderedPageBreak/>
         <w:drawing>
-          <wp:inline distT="0" distB="0" distL="0" distR="0" wp14:anchorId="46EC46EF" wp14:editId="716A1BBC">
+          <wp:inline distT="0" distB="0" distL="0" distR="0" wp14:anchorId="149C0E8C" wp14:editId="41E6DE09">
             <wp:extent cx="4860000" cy="3667362"/>
             <wp:effectExtent l="0" t="0" r="0" b="0"/>
             <wp:docPr id="7" name="Picture 7"/>
@@ -12156,7 +12156,7 @@
       <w:pPr>
         <w:pStyle w:val="Heading2"/>
       </w:pPr>
-      <w:bookmarkStart w:id="34" w:name="_Toc243545580"/>
+      <w:bookmarkStart w:id="34" w:name="_Toc243546431"/>
       <w:r>
         <w:t>10.7 Themes</w:t>
       </w:r>
@@ -12179,7 +12179,7 @@
         </w:rPr>
         <w:lastRenderedPageBreak/>
         <w:drawing>
-          <wp:inline distT="0" distB="0" distL="0" distR="0" wp14:anchorId="0EB6DE21" wp14:editId="187461F2">
+          <wp:inline distT="0" distB="0" distL="0" distR="0" wp14:anchorId="50E0DC8E" wp14:editId="5D7A12E5">
             <wp:extent cx="4500000" cy="5739130"/>
             <wp:effectExtent l="0" t="0" r="0" b="0"/>
             <wp:docPr id="8" name="Picture 8"/>
@@ -12240,7 +12240,7 @@
       <w:pPr>
         <w:pStyle w:val="Heading2"/>
       </w:pPr>
-      <w:bookmarkStart w:id="35" w:name="_Toc243545581"/>
+      <w:bookmarkStart w:id="35" w:name="_Toc243546432"/>
       <w:r>
         <w:t>10.8 A panel that explains its own failures</w:t>
       </w:r>
@@ -12266,7 +12266,7 @@
         <w:pStyle w:val="Heading1"/>
         <w:pageBreakBefore/>
       </w:pPr>
-      <w:bookmarkStart w:id="36" w:name="_Toc243545582"/>
+      <w:bookmarkStart w:id="36" w:name="_Toc243546433"/>
       <w:r>
         <w:lastRenderedPageBreak/>
         <w:t>11. The HomeMesh Designer (Desktop App)</w:t>
@@ -12289,7 +12289,7 @@
           <w:noProof/>
         </w:rPr>
         <w:drawing>
-          <wp:inline distT="0" distB="0" distL="0" distR="0" wp14:anchorId="43DE3F1B" wp14:editId="4027BF82">
+          <wp:inline distT="0" distB="0" distL="0" distR="0" wp14:anchorId="2F33B6D4" wp14:editId="6DF9C279">
             <wp:extent cx="5760000" cy="3637895"/>
             <wp:effectExtent l="0" t="0" r="0" b="0"/>
             <wp:docPr id="9" name="Picture 9"/>
@@ -12350,7 +12350,7 @@
       <w:pPr>
         <w:pStyle w:val="Heading2"/>
       </w:pPr>
-      <w:bookmarkStart w:id="37" w:name="_Toc243545583"/>
+      <w:bookmarkStart w:id="37" w:name="_Toc243546434"/>
       <w:r>
         <w:t>11.1 What it does</w:t>
       </w:r>
@@ -12483,7 +12483,7 @@
       <w:pPr>
         <w:pStyle w:val="Heading2"/>
       </w:pPr>
-      <w:bookmarkStart w:id="38" w:name="_Toc243545584"/>
+      <w:bookmarkStart w:id="38" w:name="_Toc243546435"/>
       <w:r>
         <w:lastRenderedPageBreak/>
         <w:t>11.2 The simulator is the real interface</w:t>
@@ -12514,7 +12514,7 @@
       <w:pPr>
         <w:pStyle w:val="Heading2"/>
       </w:pPr>
-      <w:bookmarkStart w:id="39" w:name="_Toc243545585"/>
+      <w:bookmarkStart w:id="39" w:name="_Toc243546436"/>
       <w:r>
         <w:t>11.3 How the designer is tested</w:t>
       </w:r>
@@ -12580,7 +12580,7 @@
         <w:pStyle w:val="Heading1"/>
         <w:pageBreakBefore/>
       </w:pPr>
-      <w:bookmarkStart w:id="40" w:name="_Toc243545586"/>
+      <w:bookmarkStart w:id="40" w:name="_Toc243546437"/>
       <w:r>
         <w:lastRenderedPageBreak/>
         <w:t>12. System Operation</w:t>
@@ -12591,7 +12591,7 @@
       <w:pPr>
         <w:pStyle w:val="Heading2"/>
       </w:pPr>
-      <w:bookmarkStart w:id="41" w:name="_Toc243545587"/>
+      <w:bookmarkStart w:id="41" w:name="_Toc243546438"/>
       <w:r>
         <w:t>12.1 Network configuration</w:t>
       </w:r>
@@ -12919,7 +12919,7 @@
       <w:pPr>
         <w:pStyle w:val="Heading2"/>
       </w:pPr>
-      <w:bookmarkStart w:id="42" w:name="_Toc243545588"/>
+      <w:bookmarkStart w:id="42" w:name="_Toc243546439"/>
       <w:r>
         <w:t>12.2 Devices on the panel</w:t>
       </w:r>
@@ -13225,7 +13225,7 @@
       <w:pPr>
         <w:pStyle w:val="Heading2"/>
       </w:pPr>
-      <w:bookmarkStart w:id="43" w:name="_Toc243545589"/>
+      <w:bookmarkStart w:id="43" w:name="_Toc243546440"/>
       <w:r>
         <w:t>12.3 Changing what the panel shows</w:t>
       </w:r>
@@ -13318,7 +13318,7 @@
         <w:pStyle w:val="Heading1"/>
         <w:pageBreakBefore/>
       </w:pPr>
-      <w:bookmarkStart w:id="44" w:name="_Toc243545590"/>
+      <w:bookmarkStart w:id="44" w:name="_Toc243546441"/>
       <w:r>
         <w:lastRenderedPageBreak/>
         <w:t>13. Testing and Results</w:t>
@@ -13334,7 +13334,7 @@
       <w:pPr>
         <w:pStyle w:val="Heading2"/>
       </w:pPr>
-      <w:bookmarkStart w:id="45" w:name="_Toc243545591"/>
+      <w:bookmarkStart w:id="45" w:name="_Toc243546442"/>
       <w:r>
         <w:t>13.1 Message size and latency</w:t>
       </w:r>
@@ -13728,7 +13728,7 @@
           <w:noProof/>
         </w:rPr>
         <w:drawing>
-          <wp:inline distT="0" distB="0" distL="0" distR="0" wp14:anchorId="4FEAA9C1" wp14:editId="787F2E8C">
+          <wp:inline distT="0" distB="0" distL="0" distR="0" wp14:anchorId="21A68588" wp14:editId="0C5D89B4">
             <wp:extent cx="3960000" cy="1998857"/>
             <wp:effectExtent l="0" t="0" r="0" b="0"/>
             <wp:docPr id="10" name="Picture 10"/>
@@ -13794,7 +13794,7 @@
       <w:pPr>
         <w:pStyle w:val="Heading2"/>
       </w:pPr>
-      <w:bookmarkStart w:id="46" w:name="_Toc243545592"/>
+      <w:bookmarkStart w:id="46" w:name="_Toc243546443"/>
       <w:r>
         <w:t>13.2 Resource usage</w:t>
       </w:r>
@@ -14106,7 +14106,7 @@
       <w:pPr>
         <w:pStyle w:val="Heading2"/>
       </w:pPr>
-      <w:bookmarkStart w:id="47" w:name="_Toc243545593"/>
+      <w:bookmarkStart w:id="47" w:name="_Toc243546444"/>
       <w:r>
         <w:t>13.3 Functional verification</w:t>
       </w:r>
@@ -14683,7 +14683,7 @@
       <w:pPr>
         <w:pStyle w:val="Heading2"/>
       </w:pPr>
-      <w:bookmarkStart w:id="48" w:name="_Toc243545594"/>
+      <w:bookmarkStart w:id="48" w:name="_Toc243546445"/>
       <w:r>
         <w:t>13.4 Field case study: the connection that kept dropping</w:t>
       </w:r>
@@ -14779,7 +14779,7 @@
       <w:pPr>
         <w:pStyle w:val="Heading2"/>
       </w:pPr>
-      <w:bookmarkStart w:id="49" w:name="_Toc243545595"/>
+      <w:bookmarkStart w:id="49" w:name="_Toc243546446"/>
       <w:r>
         <w:lastRenderedPageBreak/>
         <w:t>13.5 Other challenges and their resolution</w:t>
@@ -15319,7 +15319,7 @@
       <w:pPr>
         <w:pStyle w:val="Heading1"/>
       </w:pPr>
-      <w:bookmarkStart w:id="50" w:name="_Toc243545596"/>
+      <w:bookmarkStart w:id="50" w:name="_Toc243546447"/>
       <w:r>
         <w:t>14. Future Scope</w:t>
       </w:r>
@@ -15437,7 +15437,7 @@
       <w:pPr>
         <w:pStyle w:val="Heading1"/>
       </w:pPr>
-      <w:bookmarkStart w:id="51" w:name="_Toc243545597"/>
+      <w:bookmarkStart w:id="51" w:name="_Toc243546448"/>
       <w:r>
         <w:t>15. Conclusion</w:t>
       </w:r>
@@ -15493,7 +15493,7 @@
       <w:pPr>
         <w:pStyle w:val="Heading1"/>
       </w:pPr>
-      <w:bookmarkStart w:id="52" w:name="_Toc243545598"/>
+      <w:bookmarkStart w:id="52" w:name="_Toc243546449"/>
       <w:r>
         <w:t>16. References</w:t>
       </w:r>
@@ -15503,7 +15503,7 @@
       <w:pPr>
         <w:pStyle w:val="Heading2"/>
       </w:pPr>
-      <w:bookmarkStart w:id="53" w:name="_Toc243545599"/>
+      <w:bookmarkStart w:id="53" w:name="_Toc243546450"/>
       <w:r>
         <w:t>16.1 Published literature</w:t>
       </w:r>
@@ -15948,7 +15948,7 @@
       <w:pPr>
         <w:pStyle w:val="Heading2"/>
       </w:pPr>
-      <w:bookmarkStart w:id="54" w:name="_Toc243545600"/>
+      <w:bookmarkStart w:id="54" w:name="_Toc243546451"/>
       <w:r>
         <w:t>16.2 Technical documentation</w:t>
       </w:r>
@@ -16127,7 +16127,7 @@
         <w:pStyle w:val="Heading1"/>
         <w:pageBreakBefore/>
       </w:pPr>
-      <w:bookmarkStart w:id="55" w:name="_Toc243545601"/>
+      <w:bookmarkStart w:id="55" w:name="_Toc243546452"/>
       <w:r>
         <w:lastRenderedPageBreak/>
         <w:t>Appendix A — Suggested Presentation Plan</w:t>
@@ -16138,7 +16138,7 @@
       <w:pPr>
         <w:pStyle w:val="Heading2"/>
       </w:pPr>
-      <w:bookmarkStart w:id="56" w:name="_Toc243545602"/>
+      <w:bookmarkStart w:id="56" w:name="_Toc243546453"/>
       <w:r>
         <w:t>Team roles</w:t>
       </w:r>
@@ -16630,7 +16630,7 @@
       <w:pPr>
         <w:pStyle w:val="Heading2"/>
       </w:pPr>
-      <w:bookmarkStart w:id="57" w:name="_Toc243545603"/>
+      <w:bookmarkStart w:id="57" w:name="_Toc243546454"/>
       <w:r>
         <w:t>Slides</w:t>
       </w:r>
@@ -18537,7 +18537,7 @@
       <w:pPr>
         <w:pStyle w:val="Heading2"/>
       </w:pPr>
-      <w:bookmarkStart w:id="58" w:name="_Toc243545604"/>
+      <w:bookmarkStart w:id="58" w:name="_Toc243546455"/>
       <w:r>
         <w:t>Figure files</w:t>
       </w:r>
@@ -19001,7 +19001,7 @@
       <w:pPr>
         <w:pStyle w:val="Heading2"/>
       </w:pPr>
-      <w:bookmarkStart w:id="59" w:name="_Toc243545605"/>
+      <w:bookmarkStart w:id="59" w:name="_Toc243546456"/>
       <w:r>
         <w:t>Presentation notes</w:t>
       </w:r>
@@ -19047,7 +19047,7 @@
       <w:pPr>
         <w:pStyle w:val="Heading2"/>
       </w:pPr>
-      <w:bookmarkStart w:id="60" w:name="_Toc243545606"/>
+      <w:bookmarkStart w:id="60" w:name="_Toc243546457"/>
       <w:r>
         <w:t>Anticipated questions</w:t>
       </w:r>
@@ -19799,7 +19799,7 @@
         <w:pStyle w:val="Heading1"/>
         <w:pageBreakBefore/>
       </w:pPr>
-      <w:bookmarkStart w:id="61" w:name="_Toc243545607"/>
+      <w:bookmarkStart w:id="61" w:name="_Toc243546458"/>
       <w:r>
         <w:lastRenderedPageBreak/>
         <w:t>Appendix B — Internal Note (Not for Presentation)</w:t>
@@ -19874,7 +19874,7 @@
       <w:pPr>
         <w:pStyle w:val="Heading2"/>
       </w:pPr>
-      <w:bookmarkStart w:id="62" w:name="_Toc243545608"/>
+      <w:bookmarkStart w:id="62" w:name="_Toc243546459"/>
       <w:r>
         <w:t>What is genuinely working</w:t>
       </w:r>
@@ -19943,7 +19943,7 @@
       <w:pPr>
         <w:pStyle w:val="Heading2"/>
       </w:pPr>
-      <w:bookmarkStart w:id="63" w:name="_Toc243545609"/>
+      <w:bookmarkStart w:id="63" w:name="_Toc243546460"/>
       <w:r>
         <w:t>What must not be claimed</w:t>
       </w:r>
@@ -20292,7 +20292,7 @@
       <w:pPr>
         <w:pStyle w:val="Heading2"/>
       </w:pPr>
-      <w:bookmarkStart w:id="64" w:name="_Toc243545610"/>
+      <w:bookmarkStart w:id="64" w:name="_Toc243546461"/>
       <w:r>
         <w:lastRenderedPageBreak/>
         <w:t>Check before the review: firmware on the board</w:t>
@@ -20420,7 +20420,7 @@
               <w:rPr>
                 <w:sz w:val="20"/>
               </w:rPr>
-              <w:t>.</w:t>
+              <w:t>. (A push of the same event, sent the way the designer sends it, was watched arriving on 22 October.)</w:t>
             </w:r>
           </w:p>
           <w:p>
@@ -20431,7 +20431,20 @@
               <w:rPr>
                 <w:sz w:val="20"/>
               </w:rPr>
-              <w:t>The demo installation now has six for the Automations screen (added 21 October): scenes Movie Night and Bright, scripts All Off and Goodnight, automations Evening Lights and Welcome Home. Welcome Home is the one to show: turning the Panel Demo Switch on from the panel makes Home Assistant switch on the ceiling and entrance lights. Tick them in the designer and push to put them on the panel.</w:t>
+              <w:t xml:space="preserve">The demo installation now has six for the Automations screen (added 21 October): scenes Movie Night and Bright, scripts All Off and Goodnight, automations Evening Lights and Welcome Home. Welcome Home is the one to show: turning the Panel Demo Switch on from the panel makes Home Assistant switch on the ceiling and entrance lights. </w:t>
+            </w:r>
+            <w:r>
+              <w:rPr>
+                <w:b/>
+                <w:sz w:val="20"/>
+              </w:rPr>
+              <w:t>The panel has four of them, each in its own colour</w:t>
+            </w:r>
+            <w:r>
+              <w:rPr>
+                <w:sz w:val="20"/>
+              </w:rPr>
+              <w:t xml:space="preserve"> (All Off, Goodnight, Movie Night, Welcome Home; swipe up). Four fit one screen and keep the panel's graphics memory comfortable: with all six the least free memory in a full walk of every screen fell to 5 KB, with four it stays above 7 KB.</w:t>
             </w:r>
           </w:p>
         </w:tc>
@@ -20446,7 +20459,7 @@
       <w:pPr>
         <w:pStyle w:val="Heading2"/>
       </w:pPr>
-      <w:bookmarkStart w:id="65" w:name="_Toc243545611"/>
+      <w:bookmarkStart w:id="65" w:name="_Toc243546462"/>
       <w:r>
         <w:t>Two quirks that may be noticed, and how to answer</w:t>
       </w:r>
@@ -20605,7 +20618,7 @@
       <w:pPr>
         <w:pStyle w:val="Heading2"/>
       </w:pPr>
-      <w:bookmarkStart w:id="66" w:name="_Toc243545612"/>
+      <w:bookmarkStart w:id="66" w:name="_Toc243546463"/>
       <w:r>
         <w:t>Before the presentation</w:t>
       </w:r>
@@ -21019,31 +21032,31 @@
       </w:rPr>
     </w:lvl>
   </w:abstractNum>
-  <w:num w:numId="1" w16cid:durableId="1163855188">
+  <w:num w:numId="1" w16cid:durableId="2090418511">
     <w:abstractNumId w:val="8"/>
   </w:num>
-  <w:num w:numId="2" w16cid:durableId="1995907960">
+  <w:num w:numId="2" w16cid:durableId="651761441">
     <w:abstractNumId w:val="6"/>
   </w:num>
-  <w:num w:numId="3" w16cid:durableId="199897645">
+  <w:num w:numId="3" w16cid:durableId="1785834">
     <w:abstractNumId w:val="5"/>
   </w:num>
-  <w:num w:numId="4" w16cid:durableId="1382096669">
+  <w:num w:numId="4" w16cid:durableId="584143800">
     <w:abstractNumId w:val="4"/>
   </w:num>
-  <w:num w:numId="5" w16cid:durableId="1223057336">
+  <w:num w:numId="5" w16cid:durableId="214507328">
     <w:abstractNumId w:val="7"/>
   </w:num>
-  <w:num w:numId="6" w16cid:durableId="507447786">
+  <w:num w:numId="6" w16cid:durableId="681249531">
     <w:abstractNumId w:val="3"/>
   </w:num>
-  <w:num w:numId="7" w16cid:durableId="2063599632">
+  <w:num w:numId="7" w16cid:durableId="997224062">
     <w:abstractNumId w:val="2"/>
   </w:num>
-  <w:num w:numId="8" w16cid:durableId="1294485417">
+  <w:num w:numId="8" w16cid:durableId="224531484">
     <w:abstractNumId w:val="1"/>
   </w:num>
-  <w:num w:numId="9" w16cid:durableId="1415740082">
+  <w:num w:numId="9" w16cid:durableId="1211302054">
     <w:abstractNumId w:val="0"/>
   </w:num>
 </w:numbering>
@@ -32436,7 +32449,7 @@
     <w:autoRedefine/>
     <w:uiPriority w:val="39"/>
     <w:unhideWhenUsed/>
-    <w:rsid w:val="009613B6"/>
+    <w:rsid w:val="001F07E8"/>
     <w:pPr>
       <w:spacing w:after="100"/>
     </w:pPr>
@@ -32448,7 +32461,7 @@
     <w:autoRedefine/>
     <w:uiPriority w:val="39"/>
     <w:unhideWhenUsed/>
-    <w:rsid w:val="009613B6"/>
+    <w:rsid w:val="001F07E8"/>
     <w:pPr>
       <w:spacing w:after="100"/>
       <w:ind w:left="210"/>
@@ -32459,7 +32472,7 @@
     <w:basedOn w:val="DefaultParagraphFont"/>
     <w:uiPriority w:val="99"/>
     <w:unhideWhenUsed/>
-    <w:rsid w:val="009613B6"/>
+    <w:rsid w:val="001F07E8"/>
     <w:rPr>
       <w:color w:val="0000FF" w:themeColor="hyperlink"/>
       <w:u w:val="single"/>

</xml_diff>